<commit_message>
feat: add KHCN/KHDN customer modules, loan plan improvements, templates & migrations
- Add KHCN & KHDN customer pages with shared components (list, detail, new form)
- Add API routes for branches, config, loan plans, OCR, templates
- Add 11 prisma migrations (loan plan, collateral, credit info, beneficiary, etc.)
- Improve loan plan editor: trung dai han asset calc, xlsx import preview
- Add KHCN report templates (BCDXCV, disbursement, legal docs, etc.)
- Add utility scripts for DB migration, template creation
- Update docs and deployment guide
- Clean up old editor snapshots
</commit_message>
<xml_diff>
--- a/report_assets/KHCN templates/Báo cáo đề xuất/2268.02B BCDXCV ngan han HMTD.docx
+++ b/report_assets/KHCN templates/Báo cáo đề xuất/2268.02B BCDXCV ngan han HMTD.docx
@@ -114,7 +114,7 @@
                 </mc:Choice>
                 <mc:Fallback>
                   <w:pict>
-                    <v:line w14:anchorId="7939FA52" id="Straight Connector 1" o:spid="_x0000_s1026" style="position:absolute;z-index:251660288;visibility:visible;mso-wrap-style:square;mso-wrap-distance-left:9pt;mso-wrap-distance-top:0;mso-wrap-distance-right:9pt;mso-wrap-distance-bottom:0;mso-position-horizontal:center;mso-position-horizontal-relative:margin;mso-position-vertical:absolute;mso-position-vertical-relative:text" from="0,16.5pt" to="108pt,16.5pt" o:gfxdata="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">
+                    <v:line w14:anchorId="7CD0301C" id="Straight Connector 1" o:spid="_x0000_s1026" style="position:absolute;z-index:251660288;visibility:visible;mso-wrap-style:square;mso-wrap-distance-left:9pt;mso-wrap-distance-top:0;mso-wrap-distance-right:9pt;mso-wrap-distance-bottom:0;mso-position-horizontal:center;mso-position-horizontal-relative:margin;mso-position-vertical:absolute;mso-position-vertical-relative:text" from="0,16.5pt" to="108pt,16.5pt" o:gfxdata="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">
                       <w10:wrap anchorx="margin"/>
                     </v:line>
                   </w:pict>
@@ -266,7 +266,7 @@
                 </mc:Choice>
                 <mc:Fallback>
                   <w:pict>
-                    <v:shapetype w14:anchorId="4ED44019" id="_x0000_t32" coordsize="21600,21600" o:spt="32" o:oned="t" path="m,l21600,21600e" filled="f">
+                    <v:shapetype w14:anchorId="1CDAD95E" id="_x0000_t32" coordsize="21600,21600" o:spt="32" o:oned="t" path="m,l21600,21600e" filled="f">
                       <v:path arrowok="t" fillok="f" o:connecttype="none"/>
                       <o:lock v:ext="edit" shapetype="t"/>
                     </v:shapetype>
@@ -11330,27 +11330,27 @@
         <w:tblLook w:val="04A0" w:firstRow="1" w:lastRow="0" w:firstColumn="1" w:lastColumn="0" w:noHBand="0" w:noVBand="1"/>
       </w:tblPr>
       <w:tblGrid>
-        <w:gridCol w:w="2283"/>
-        <w:gridCol w:w="1634"/>
-        <w:gridCol w:w="1109"/>
-        <w:gridCol w:w="1016"/>
-        <w:gridCol w:w="1144"/>
-        <w:gridCol w:w="2667"/>
+        <w:gridCol w:w="1902"/>
+        <w:gridCol w:w="1527"/>
+        <w:gridCol w:w="1163"/>
+        <w:gridCol w:w="1207"/>
+        <w:gridCol w:w="1528"/>
+        <w:gridCol w:w="2526"/>
       </w:tblGrid>
       <w:tr>
         <w:trPr>
-          <w:trHeight w:val="624"/>
+          <w:trHeight w:val="312"/>
         </w:trPr>
         <w:tc>
           <w:tcPr>
-            <w:tcW w:w="1155" w:type="pct"/>
+            <w:tcW w:w="1028" w:type="pct"/>
             <w:tcBorders>
               <w:top w:val="single" w:sz="4" w:space="0" w:color="auto"/>
               <w:left w:val="single" w:sz="4" w:space="0" w:color="auto"/>
               <w:bottom w:val="single" w:sz="4" w:space="0" w:color="auto"/>
               <w:right w:val="single" w:sz="4" w:space="0" w:color="auto"/>
             </w:tcBorders>
-            <w:shd w:val="clear" w:color="000000" w:fill="FFFFFF"/>
+            <w:noWrap/>
             <w:vAlign w:val="center"/>
             <w:hideMark/>
           </w:tcPr>
@@ -11380,14 +11380,14 @@
         </w:tc>
         <w:tc>
           <w:tcPr>
-            <w:tcW w:w="830" w:type="pct"/>
+            <w:tcW w:w="766" w:type="pct"/>
             <w:tcBorders>
               <w:top w:val="single" w:sz="4" w:space="0" w:color="auto"/>
               <w:left w:val="nil"/>
               <w:bottom w:val="single" w:sz="4" w:space="0" w:color="auto"/>
               <w:right w:val="single" w:sz="4" w:space="0" w:color="auto"/>
             </w:tcBorders>
-            <w:shd w:val="clear" w:color="000000" w:fill="FFFFFF"/>
+            <w:noWrap/>
             <w:vAlign w:val="center"/>
             <w:hideMark/>
           </w:tcPr>
@@ -11417,14 +11417,14 @@
         </w:tc>
         <w:tc>
           <w:tcPr>
-            <w:tcW w:w="564" w:type="pct"/>
+            <w:tcW w:w="549" w:type="pct"/>
             <w:tcBorders>
               <w:top w:val="single" w:sz="4" w:space="0" w:color="auto"/>
               <w:left w:val="nil"/>
               <w:bottom w:val="single" w:sz="4" w:space="0" w:color="auto"/>
               <w:right w:val="single" w:sz="4" w:space="0" w:color="auto"/>
             </w:tcBorders>
-            <w:shd w:val="clear" w:color="000000" w:fill="FFFFFF"/>
+            <w:noWrap/>
             <w:vAlign w:val="center"/>
             <w:hideMark/>
           </w:tcPr>
@@ -11448,20 +11448,20 @@
                 <w:sz w:val="24"/>
                 <w:szCs w:val="24"/>
               </w:rPr>
-              <w:t>ĐƠN VỊ TÍNH</w:t>
-            </w:r>
-          </w:p>
-        </w:tc>
-        <w:tc>
-          <w:tcPr>
-            <w:tcW w:w="516" w:type="pct"/>
+              <w:t>Đơn vị tính</w:t>
+            </w:r>
+          </w:p>
+        </w:tc>
+        <w:tc>
+          <w:tcPr>
+            <w:tcW w:w="585" w:type="pct"/>
             <w:tcBorders>
               <w:top w:val="single" w:sz="4" w:space="0" w:color="auto"/>
               <w:left w:val="nil"/>
               <w:bottom w:val="single" w:sz="4" w:space="0" w:color="auto"/>
               <w:right w:val="single" w:sz="4" w:space="0" w:color="auto"/>
             </w:tcBorders>
-            <w:shd w:val="clear" w:color="000000" w:fill="FFFFFF"/>
+            <w:noWrap/>
             <w:vAlign w:val="center"/>
             <w:hideMark/>
           </w:tcPr>
@@ -11485,20 +11485,20 @@
                 <w:sz w:val="24"/>
                 <w:szCs w:val="24"/>
               </w:rPr>
-              <w:t>ĐƠN GIÁ</w:t>
-            </w:r>
-          </w:p>
-        </w:tc>
-        <w:tc>
-          <w:tcPr>
-            <w:tcW w:w="581" w:type="pct"/>
+              <w:t>Đơn giá</w:t>
+            </w:r>
+          </w:p>
+        </w:tc>
+        <w:tc>
+          <w:tcPr>
+            <w:tcW w:w="766" w:type="pct"/>
             <w:tcBorders>
               <w:top w:val="single" w:sz="4" w:space="0" w:color="auto"/>
               <w:left w:val="nil"/>
               <w:bottom w:val="single" w:sz="4" w:space="0" w:color="auto"/>
               <w:right w:val="single" w:sz="4" w:space="0" w:color="auto"/>
             </w:tcBorders>
-            <w:shd w:val="clear" w:color="000000" w:fill="FFFFFF"/>
+            <w:noWrap/>
             <w:vAlign w:val="center"/>
             <w:hideMark/>
           </w:tcPr>
@@ -11522,20 +11522,20 @@
                 <w:sz w:val="24"/>
                 <w:szCs w:val="24"/>
               </w:rPr>
-              <w:t>SỐ LƯỢNG</w:t>
-            </w:r>
-          </w:p>
-        </w:tc>
-        <w:tc>
-          <w:tcPr>
-            <w:tcW w:w="1353" w:type="pct"/>
+              <w:t>Số lượng</w:t>
+            </w:r>
+          </w:p>
+        </w:tc>
+        <w:tc>
+          <w:tcPr>
+            <w:tcW w:w="1306" w:type="pct"/>
             <w:tcBorders>
               <w:top w:val="single" w:sz="4" w:space="0" w:color="auto"/>
               <w:left w:val="nil"/>
               <w:bottom w:val="single" w:sz="4" w:space="0" w:color="auto"/>
               <w:right w:val="single" w:sz="4" w:space="0" w:color="auto"/>
             </w:tcBorders>
-            <w:shd w:val="clear" w:color="000000" w:fill="FFFFFF"/>
+            <w:noWrap/>
             <w:vAlign w:val="center"/>
             <w:hideMark/>
           </w:tcPr>
@@ -11559,25 +11559,25 @@
                 <w:sz w:val="24"/>
                 <w:szCs w:val="24"/>
               </w:rPr>
-              <w:t>THÀNH TIỀN</w:t>
+              <w:t>Thành tiền</w:t>
             </w:r>
           </w:p>
         </w:tc>
       </w:tr>
       <w:tr>
         <w:trPr>
-          <w:trHeight w:val="624"/>
+          <w:trHeight w:val="312"/>
         </w:trPr>
         <w:tc>
           <w:tcPr>
-            <w:tcW w:w="1155" w:type="pct"/>
+            <w:tcW w:w="1028" w:type="pct"/>
             <w:tcBorders>
               <w:top w:val="nil"/>
               <w:left w:val="single" w:sz="4" w:space="0" w:color="auto"/>
               <w:bottom w:val="single" w:sz="4" w:space="0" w:color="auto"/>
               <w:right w:val="single" w:sz="4" w:space="0" w:color="auto"/>
             </w:tcBorders>
-            <w:shd w:val="clear" w:color="000000" w:fill="FFFFFF"/>
+            <w:noWrap/>
             <w:vAlign w:val="center"/>
             <w:hideMark/>
           </w:tcPr>
@@ -11597,660 +11597,13 @@
                 <w:sz w:val="24"/>
                 <w:szCs w:val="24"/>
               </w:rPr>
-              <w:t>[#PA_DOANHTHU]</w:t>
-            </w:r>
-          </w:p>
-        </w:tc>
-        <w:tc>
-          <w:tcPr>
-            <w:tcW w:w="830" w:type="pct"/>
-            <w:tcBorders>
-              <w:top w:val="nil"/>
-              <w:left w:val="nil"/>
-              <w:bottom w:val="single" w:sz="4" w:space="0" w:color="auto"/>
-              <w:right w:val="single" w:sz="4" w:space="0" w:color="auto"/>
-            </w:tcBorders>
-            <w:shd w:val="clear" w:color="000000" w:fill="FFFFFF"/>
-            <w:vAlign w:val="center"/>
-            <w:hideMark/>
-          </w:tcPr>
-          <w:p>
-            <w:pPr>
-              <w:spacing w:after="0" w:line="240" w:lineRule="auto"/>
-              <w:rPr>
-                <w:rFonts w:ascii="Times New Roman" w:eastAsia="Times New Roman" w:hAnsi="Times New Roman" w:cs="Times New Roman"/>
-                <w:sz w:val="24"/>
-                <w:szCs w:val="24"/>
-              </w:rPr>
-            </w:pPr>
-            <w:r>
-              <w:rPr>
-                <w:rFonts w:ascii="Times New Roman" w:eastAsia="Times New Roman" w:hAnsi="Times New Roman" w:cs="Times New Roman"/>
-                <w:sz w:val="24"/>
-                <w:szCs w:val="24"/>
-              </w:rPr>
-              <w:t> </w:t>
-            </w:r>
-          </w:p>
-        </w:tc>
-        <w:tc>
-          <w:tcPr>
-            <w:tcW w:w="564" w:type="pct"/>
-            <w:tcBorders>
-              <w:top w:val="nil"/>
-              <w:left w:val="nil"/>
-              <w:bottom w:val="single" w:sz="4" w:space="0" w:color="auto"/>
-              <w:right w:val="single" w:sz="4" w:space="0" w:color="auto"/>
-            </w:tcBorders>
-            <w:shd w:val="clear" w:color="000000" w:fill="FFFFFF"/>
-            <w:vAlign w:val="center"/>
-            <w:hideMark/>
-          </w:tcPr>
-          <w:p>
-            <w:pPr>
-              <w:spacing w:after="0" w:line="240" w:lineRule="auto"/>
-              <w:jc w:val="center"/>
-              <w:rPr>
-                <w:rFonts w:ascii="Times New Roman" w:eastAsia="Times New Roman" w:hAnsi="Times New Roman" w:cs="Times New Roman"/>
-                <w:sz w:val="24"/>
-                <w:szCs w:val="24"/>
-              </w:rPr>
-            </w:pPr>
-            <w:r>
-              <w:rPr>
-                <w:rFonts w:ascii="Times New Roman" w:eastAsia="Times New Roman" w:hAnsi="Times New Roman" w:cs="Times New Roman"/>
-                <w:sz w:val="24"/>
-                <w:szCs w:val="24"/>
-              </w:rPr>
-              <w:t> </w:t>
-            </w:r>
-          </w:p>
-        </w:tc>
-        <w:tc>
-          <w:tcPr>
-            <w:tcW w:w="516" w:type="pct"/>
-            <w:tcBorders>
-              <w:top w:val="nil"/>
-              <w:left w:val="nil"/>
-              <w:bottom w:val="single" w:sz="4" w:space="0" w:color="auto"/>
-              <w:right w:val="single" w:sz="4" w:space="0" w:color="auto"/>
-            </w:tcBorders>
-            <w:shd w:val="clear" w:color="000000" w:fill="FFFFFF"/>
-            <w:vAlign w:val="center"/>
-            <w:hideMark/>
-          </w:tcPr>
-          <w:p>
-            <w:pPr>
-              <w:spacing w:after="0" w:line="240" w:lineRule="auto"/>
-              <w:jc w:val="right"/>
-              <w:rPr>
-                <w:rFonts w:ascii="Times New Roman" w:eastAsia="Times New Roman" w:hAnsi="Times New Roman" w:cs="Times New Roman"/>
-                <w:sz w:val="24"/>
-                <w:szCs w:val="24"/>
-              </w:rPr>
-            </w:pPr>
-            <w:r>
-              <w:rPr>
-                <w:rFonts w:ascii="Times New Roman" w:eastAsia="Times New Roman" w:hAnsi="Times New Roman" w:cs="Times New Roman"/>
-                <w:sz w:val="24"/>
-                <w:szCs w:val="24"/>
-              </w:rPr>
-              <w:t> </w:t>
-            </w:r>
-          </w:p>
-        </w:tc>
-        <w:tc>
-          <w:tcPr>
-            <w:tcW w:w="581" w:type="pct"/>
-            <w:tcBorders>
-              <w:top w:val="nil"/>
-              <w:left w:val="nil"/>
-              <w:bottom w:val="single" w:sz="4" w:space="0" w:color="auto"/>
-              <w:right w:val="single" w:sz="4" w:space="0" w:color="auto"/>
-            </w:tcBorders>
-            <w:shd w:val="clear" w:color="000000" w:fill="FFFFFF"/>
-            <w:vAlign w:val="center"/>
-            <w:hideMark/>
-          </w:tcPr>
-          <w:p>
-            <w:pPr>
-              <w:spacing w:after="0" w:line="240" w:lineRule="auto"/>
-              <w:jc w:val="right"/>
-              <w:rPr>
-                <w:rFonts w:ascii="Times New Roman" w:eastAsia="Times New Roman" w:hAnsi="Times New Roman" w:cs="Times New Roman"/>
-                <w:sz w:val="24"/>
-                <w:szCs w:val="24"/>
-              </w:rPr>
-            </w:pPr>
-            <w:r>
-              <w:rPr>
-                <w:rFonts w:ascii="Times New Roman" w:eastAsia="Times New Roman" w:hAnsi="Times New Roman" w:cs="Times New Roman"/>
-                <w:sz w:val="24"/>
-                <w:szCs w:val="24"/>
-              </w:rPr>
-              <w:t> </w:t>
-            </w:r>
-          </w:p>
-        </w:tc>
-        <w:tc>
-          <w:tcPr>
-            <w:tcW w:w="1353" w:type="pct"/>
-            <w:tcBorders>
-              <w:top w:val="nil"/>
-              <w:left w:val="nil"/>
-              <w:bottom w:val="single" w:sz="4" w:space="0" w:color="auto"/>
-              <w:right w:val="single" w:sz="4" w:space="0" w:color="auto"/>
-            </w:tcBorders>
-            <w:shd w:val="clear" w:color="000000" w:fill="FFFFFF"/>
-            <w:vAlign w:val="center"/>
-            <w:hideMark/>
-          </w:tcPr>
-          <w:p>
-            <w:pPr>
-              <w:spacing w:after="0" w:line="240" w:lineRule="auto"/>
-              <w:jc w:val="right"/>
-              <w:rPr>
-                <w:rFonts w:ascii="Times New Roman" w:eastAsia="Times New Roman" w:hAnsi="Times New Roman" w:cs="Times New Roman"/>
-                <w:sz w:val="24"/>
-                <w:szCs w:val="24"/>
-              </w:rPr>
-            </w:pPr>
-            <w:r>
-              <w:rPr>
-                <w:rFonts w:ascii="Times New Roman" w:eastAsia="Times New Roman" w:hAnsi="Times New Roman" w:cs="Times New Roman"/>
-                <w:sz w:val="24"/>
-                <w:szCs w:val="24"/>
-              </w:rPr>
-              <w:t> </w:t>
-            </w:r>
-          </w:p>
-        </w:tc>
-      </w:tr>
-      <w:tr>
-        <w:trPr>
-          <w:trHeight w:val="312"/>
-        </w:trPr>
-        <w:tc>
-          <w:tcPr>
-            <w:tcW w:w="1155" w:type="pct"/>
-            <w:tcBorders>
-              <w:top w:val="nil"/>
-              <w:left w:val="single" w:sz="4" w:space="0" w:color="auto"/>
-              <w:bottom w:val="single" w:sz="4" w:space="0" w:color="auto"/>
-              <w:right w:val="single" w:sz="4" w:space="0" w:color="auto"/>
-            </w:tcBorders>
-            <w:shd w:val="clear" w:color="000000" w:fill="FFFFFF"/>
-            <w:vAlign w:val="center"/>
-            <w:hideMark/>
-          </w:tcPr>
-          <w:p>
-            <w:pPr>
-              <w:spacing w:after="0" w:line="240" w:lineRule="auto"/>
-              <w:jc w:val="center"/>
-              <w:rPr>
-                <w:rFonts w:ascii="Times New Roman" w:eastAsia="Times New Roman" w:hAnsi="Times New Roman" w:cs="Times New Roman"/>
-                <w:sz w:val="24"/>
-                <w:szCs w:val="24"/>
-              </w:rPr>
-            </w:pPr>
-            <w:r>
-              <w:rPr>
-                <w:rFonts w:ascii="Times New Roman" w:eastAsia="Times New Roman" w:hAnsi="Times New Roman" w:cs="Times New Roman"/>
-                <w:sz w:val="24"/>
-                <w:szCs w:val="24"/>
-              </w:rPr>
-              <w:t>[STT]</w:t>
-            </w:r>
-          </w:p>
-        </w:tc>
-        <w:tc>
-          <w:tcPr>
-            <w:tcW w:w="830" w:type="pct"/>
-            <w:tcBorders>
-              <w:top w:val="nil"/>
-              <w:left w:val="nil"/>
-              <w:bottom w:val="single" w:sz="4" w:space="0" w:color="auto"/>
-              <w:right w:val="single" w:sz="4" w:space="0" w:color="auto"/>
-            </w:tcBorders>
-            <w:shd w:val="clear" w:color="000000" w:fill="FFFFFF"/>
-            <w:vAlign w:val="center"/>
-            <w:hideMark/>
-          </w:tcPr>
-          <w:p>
-            <w:pPr>
-              <w:spacing w:after="0" w:line="240" w:lineRule="auto"/>
-              <w:rPr>
-                <w:rFonts w:ascii="Times New Roman" w:eastAsia="Times New Roman" w:hAnsi="Times New Roman" w:cs="Times New Roman"/>
-                <w:sz w:val="24"/>
-                <w:szCs w:val="24"/>
-              </w:rPr>
-            </w:pPr>
-            <w:r>
-              <w:rPr>
-                <w:rFonts w:ascii="Times New Roman" w:eastAsia="Times New Roman" w:hAnsi="Times New Roman" w:cs="Times New Roman"/>
-                <w:sz w:val="24"/>
-                <w:szCs w:val="24"/>
-              </w:rPr>
-              <w:t>[Mô tả]</w:t>
-            </w:r>
-          </w:p>
-        </w:tc>
-        <w:tc>
-          <w:tcPr>
-            <w:tcW w:w="564" w:type="pct"/>
-            <w:tcBorders>
-              <w:top w:val="nil"/>
-              <w:left w:val="nil"/>
-              <w:bottom w:val="single" w:sz="4" w:space="0" w:color="auto"/>
-              <w:right w:val="single" w:sz="4" w:space="0" w:color="auto"/>
-            </w:tcBorders>
-            <w:shd w:val="clear" w:color="000000" w:fill="FFFFFF"/>
-            <w:vAlign w:val="center"/>
-            <w:hideMark/>
-          </w:tcPr>
-          <w:p>
-            <w:pPr>
-              <w:spacing w:after="0" w:line="240" w:lineRule="auto"/>
-              <w:jc w:val="center"/>
-              <w:rPr>
-                <w:rFonts w:ascii="Times New Roman" w:eastAsia="Times New Roman" w:hAnsi="Times New Roman" w:cs="Times New Roman"/>
-                <w:sz w:val="24"/>
-                <w:szCs w:val="24"/>
-              </w:rPr>
-            </w:pPr>
-            <w:r>
-              <w:rPr>
-                <w:rFonts w:ascii="Times New Roman" w:eastAsia="Times New Roman" w:hAnsi="Times New Roman" w:cs="Times New Roman"/>
-                <w:sz w:val="24"/>
-                <w:szCs w:val="24"/>
-              </w:rPr>
-              <w:t> </w:t>
-            </w:r>
-          </w:p>
-        </w:tc>
-        <w:tc>
-          <w:tcPr>
-            <w:tcW w:w="516" w:type="pct"/>
-            <w:tcBorders>
-              <w:top w:val="nil"/>
-              <w:left w:val="nil"/>
-              <w:bottom w:val="single" w:sz="4" w:space="0" w:color="auto"/>
-              <w:right w:val="single" w:sz="4" w:space="0" w:color="auto"/>
-            </w:tcBorders>
-            <w:shd w:val="clear" w:color="000000" w:fill="FFFFFF"/>
-            <w:vAlign w:val="center"/>
-            <w:hideMark/>
-          </w:tcPr>
-          <w:p>
-            <w:pPr>
-              <w:spacing w:after="0" w:line="240" w:lineRule="auto"/>
-              <w:jc w:val="right"/>
-              <w:rPr>
-                <w:rFonts w:ascii="Times New Roman" w:eastAsia="Times New Roman" w:hAnsi="Times New Roman" w:cs="Times New Roman"/>
-                <w:sz w:val="24"/>
-                <w:szCs w:val="24"/>
-              </w:rPr>
-            </w:pPr>
-            <w:r>
-              <w:rPr>
-                <w:rFonts w:ascii="Times New Roman" w:eastAsia="Times New Roman" w:hAnsi="Times New Roman" w:cs="Times New Roman"/>
-                <w:sz w:val="24"/>
-                <w:szCs w:val="24"/>
-              </w:rPr>
-              <w:t>[Đơn giá]</w:t>
-            </w:r>
-          </w:p>
-        </w:tc>
-        <w:tc>
-          <w:tcPr>
-            <w:tcW w:w="581" w:type="pct"/>
-            <w:tcBorders>
-              <w:top w:val="nil"/>
-              <w:left w:val="nil"/>
-              <w:bottom w:val="single" w:sz="4" w:space="0" w:color="auto"/>
-              <w:right w:val="single" w:sz="4" w:space="0" w:color="auto"/>
-            </w:tcBorders>
-            <w:shd w:val="clear" w:color="000000" w:fill="FFFFFF"/>
-            <w:vAlign w:val="center"/>
-            <w:hideMark/>
-          </w:tcPr>
-          <w:p>
-            <w:pPr>
-              <w:spacing w:after="0" w:line="240" w:lineRule="auto"/>
-              <w:jc w:val="right"/>
-              <w:rPr>
-                <w:rFonts w:ascii="Times New Roman" w:eastAsia="Times New Roman" w:hAnsi="Times New Roman" w:cs="Times New Roman"/>
-                <w:sz w:val="24"/>
-                <w:szCs w:val="24"/>
-              </w:rPr>
-            </w:pPr>
-            <w:r>
-              <w:rPr>
-                <w:rFonts w:ascii="Times New Roman" w:eastAsia="Times New Roman" w:hAnsi="Times New Roman" w:cs="Times New Roman"/>
-                <w:sz w:val="24"/>
-                <w:szCs w:val="24"/>
-              </w:rPr>
-              <w:t>[Số lượng]</w:t>
-            </w:r>
-          </w:p>
-        </w:tc>
-        <w:tc>
-          <w:tcPr>
-            <w:tcW w:w="1353" w:type="pct"/>
-            <w:tcBorders>
-              <w:top w:val="nil"/>
-              <w:left w:val="nil"/>
-              <w:bottom w:val="single" w:sz="4" w:space="0" w:color="auto"/>
-              <w:right w:val="single" w:sz="4" w:space="0" w:color="auto"/>
-            </w:tcBorders>
-            <w:shd w:val="clear" w:color="000000" w:fill="FFFFFF"/>
-            <w:vAlign w:val="center"/>
-            <w:hideMark/>
-          </w:tcPr>
-          <w:p>
-            <w:pPr>
-              <w:spacing w:after="0" w:line="240" w:lineRule="auto"/>
-              <w:jc w:val="right"/>
-              <w:rPr>
-                <w:rFonts w:ascii="Times New Roman" w:eastAsia="Times New Roman" w:hAnsi="Times New Roman" w:cs="Times New Roman"/>
-                <w:sz w:val="24"/>
-                <w:szCs w:val="24"/>
-              </w:rPr>
-            </w:pPr>
-            <w:r>
-              <w:rPr>
-                <w:rFonts w:ascii="Times New Roman" w:eastAsia="Times New Roman" w:hAnsi="Times New Roman" w:cs="Times New Roman"/>
-                <w:sz w:val="24"/>
-                <w:szCs w:val="24"/>
-              </w:rPr>
-              <w:t>[Thành tiền]</w:t>
-            </w:r>
-          </w:p>
-        </w:tc>
-      </w:tr>
-      <w:tr>
-        <w:trPr>
-          <w:trHeight w:val="624"/>
-        </w:trPr>
-        <w:tc>
-          <w:tcPr>
-            <w:tcW w:w="1155" w:type="pct"/>
-            <w:tcBorders>
-              <w:top w:val="nil"/>
-              <w:left w:val="single" w:sz="4" w:space="0" w:color="auto"/>
-              <w:bottom w:val="single" w:sz="4" w:space="0" w:color="auto"/>
-              <w:right w:val="single" w:sz="4" w:space="0" w:color="auto"/>
-            </w:tcBorders>
-            <w:shd w:val="clear" w:color="000000" w:fill="FFFFFF"/>
-            <w:vAlign w:val="center"/>
-            <w:hideMark/>
-          </w:tcPr>
-          <w:p>
-            <w:pPr>
-              <w:spacing w:after="0" w:line="240" w:lineRule="auto"/>
-              <w:jc w:val="center"/>
-              <w:rPr>
-                <w:rFonts w:ascii="Times New Roman" w:eastAsia="Times New Roman" w:hAnsi="Times New Roman" w:cs="Times New Roman"/>
-                <w:sz w:val="24"/>
-                <w:szCs w:val="24"/>
-              </w:rPr>
-            </w:pPr>
-            <w:r>
-              <w:rPr>
-                <w:rFonts w:ascii="Times New Roman" w:eastAsia="Times New Roman" w:hAnsi="Times New Roman" w:cs="Times New Roman"/>
-                <w:sz w:val="24"/>
-                <w:szCs w:val="24"/>
-              </w:rPr>
-              <w:t>[/PA_DOANHTHU]</w:t>
-            </w:r>
-          </w:p>
-        </w:tc>
-        <w:tc>
-          <w:tcPr>
-            <w:tcW w:w="830" w:type="pct"/>
-            <w:tcBorders>
-              <w:top w:val="nil"/>
-              <w:left w:val="nil"/>
-              <w:bottom w:val="single" w:sz="4" w:space="0" w:color="auto"/>
-              <w:right w:val="single" w:sz="4" w:space="0" w:color="auto"/>
-            </w:tcBorders>
-            <w:shd w:val="clear" w:color="000000" w:fill="FFFFFF"/>
-            <w:vAlign w:val="center"/>
-            <w:hideMark/>
-          </w:tcPr>
-          <w:p>
-            <w:pPr>
-              <w:spacing w:after="0" w:line="240" w:lineRule="auto"/>
-              <w:rPr>
-                <w:rFonts w:ascii="Times New Roman" w:eastAsia="Times New Roman" w:hAnsi="Times New Roman" w:cs="Times New Roman"/>
-                <w:sz w:val="24"/>
-                <w:szCs w:val="24"/>
-              </w:rPr>
-            </w:pPr>
-            <w:r>
-              <w:rPr>
-                <w:rFonts w:ascii="Times New Roman" w:eastAsia="Times New Roman" w:hAnsi="Times New Roman" w:cs="Times New Roman"/>
-                <w:sz w:val="24"/>
-                <w:szCs w:val="24"/>
-              </w:rPr>
-              <w:t> </w:t>
-            </w:r>
-          </w:p>
-        </w:tc>
-        <w:tc>
-          <w:tcPr>
-            <w:tcW w:w="564" w:type="pct"/>
-            <w:tcBorders>
-              <w:top w:val="nil"/>
-              <w:left w:val="nil"/>
-              <w:bottom w:val="single" w:sz="4" w:space="0" w:color="auto"/>
-              <w:right w:val="single" w:sz="4" w:space="0" w:color="auto"/>
-            </w:tcBorders>
-            <w:shd w:val="clear" w:color="000000" w:fill="FFFFFF"/>
-            <w:vAlign w:val="center"/>
-            <w:hideMark/>
-          </w:tcPr>
-          <w:p>
-            <w:pPr>
-              <w:spacing w:after="0" w:line="240" w:lineRule="auto"/>
-              <w:jc w:val="center"/>
-              <w:rPr>
-                <w:rFonts w:ascii="Times New Roman" w:eastAsia="Times New Roman" w:hAnsi="Times New Roman" w:cs="Times New Roman"/>
-                <w:sz w:val="24"/>
-                <w:szCs w:val="24"/>
-              </w:rPr>
-            </w:pPr>
-            <w:r>
-              <w:rPr>
-                <w:rFonts w:ascii="Times New Roman" w:eastAsia="Times New Roman" w:hAnsi="Times New Roman" w:cs="Times New Roman"/>
-                <w:sz w:val="24"/>
-                <w:szCs w:val="24"/>
-              </w:rPr>
-              <w:t> </w:t>
-            </w:r>
-          </w:p>
-        </w:tc>
-        <w:tc>
-          <w:tcPr>
-            <w:tcW w:w="516" w:type="pct"/>
-            <w:tcBorders>
-              <w:top w:val="nil"/>
-              <w:left w:val="nil"/>
-              <w:bottom w:val="single" w:sz="4" w:space="0" w:color="auto"/>
-              <w:right w:val="single" w:sz="4" w:space="0" w:color="auto"/>
-            </w:tcBorders>
-            <w:shd w:val="clear" w:color="000000" w:fill="FFFFFF"/>
-            <w:vAlign w:val="center"/>
-            <w:hideMark/>
-          </w:tcPr>
-          <w:p>
-            <w:pPr>
-              <w:spacing w:after="0" w:line="240" w:lineRule="auto"/>
-              <w:jc w:val="right"/>
-              <w:rPr>
-                <w:rFonts w:ascii="Times New Roman" w:eastAsia="Times New Roman" w:hAnsi="Times New Roman" w:cs="Times New Roman"/>
-                <w:sz w:val="24"/>
-                <w:szCs w:val="24"/>
-              </w:rPr>
-            </w:pPr>
-            <w:r>
-              <w:rPr>
-                <w:rFonts w:ascii="Times New Roman" w:eastAsia="Times New Roman" w:hAnsi="Times New Roman" w:cs="Times New Roman"/>
-                <w:sz w:val="24"/>
-                <w:szCs w:val="24"/>
-              </w:rPr>
-              <w:t> </w:t>
-            </w:r>
-          </w:p>
-        </w:tc>
-        <w:tc>
-          <w:tcPr>
-            <w:tcW w:w="581" w:type="pct"/>
-            <w:tcBorders>
-              <w:top w:val="nil"/>
-              <w:left w:val="nil"/>
-              <w:bottom w:val="single" w:sz="4" w:space="0" w:color="auto"/>
-              <w:right w:val="single" w:sz="4" w:space="0" w:color="auto"/>
-            </w:tcBorders>
-            <w:shd w:val="clear" w:color="000000" w:fill="FFFFFF"/>
-            <w:vAlign w:val="center"/>
-            <w:hideMark/>
-          </w:tcPr>
-          <w:p>
-            <w:pPr>
-              <w:spacing w:after="0" w:line="240" w:lineRule="auto"/>
-              <w:jc w:val="right"/>
-              <w:rPr>
-                <w:rFonts w:ascii="Times New Roman" w:eastAsia="Times New Roman" w:hAnsi="Times New Roman" w:cs="Times New Roman"/>
-                <w:sz w:val="24"/>
-                <w:szCs w:val="24"/>
-              </w:rPr>
-            </w:pPr>
-            <w:r>
-              <w:rPr>
-                <w:rFonts w:ascii="Times New Roman" w:eastAsia="Times New Roman" w:hAnsi="Times New Roman" w:cs="Times New Roman"/>
-                <w:sz w:val="24"/>
-                <w:szCs w:val="24"/>
-              </w:rPr>
-              <w:t> </w:t>
-            </w:r>
-          </w:p>
-        </w:tc>
-        <w:tc>
-          <w:tcPr>
-            <w:tcW w:w="1353" w:type="pct"/>
-            <w:tcBorders>
-              <w:top w:val="nil"/>
-              <w:left w:val="nil"/>
-              <w:bottom w:val="single" w:sz="4" w:space="0" w:color="auto"/>
-              <w:right w:val="single" w:sz="4" w:space="0" w:color="auto"/>
-            </w:tcBorders>
-            <w:shd w:val="clear" w:color="000000" w:fill="FFFFFF"/>
-            <w:vAlign w:val="center"/>
-            <w:hideMark/>
-          </w:tcPr>
-          <w:p>
-            <w:pPr>
-              <w:spacing w:after="0" w:line="240" w:lineRule="auto"/>
-              <w:jc w:val="right"/>
-              <w:rPr>
-                <w:rFonts w:ascii="Times New Roman" w:eastAsia="Times New Roman" w:hAnsi="Times New Roman" w:cs="Times New Roman"/>
-                <w:sz w:val="24"/>
-                <w:szCs w:val="24"/>
-              </w:rPr>
-            </w:pPr>
-            <w:r>
-              <w:rPr>
-                <w:rFonts w:ascii="Times New Roman" w:eastAsia="Times New Roman" w:hAnsi="Times New Roman" w:cs="Times New Roman"/>
-                <w:sz w:val="24"/>
-                <w:szCs w:val="24"/>
-              </w:rPr>
-              <w:t> </w:t>
-            </w:r>
-          </w:p>
-        </w:tc>
-      </w:tr>
-      <w:tr>
-        <w:trPr>
-          <w:trHeight w:val="312"/>
-        </w:trPr>
-        <w:tc>
-          <w:tcPr>
-            <w:tcW w:w="1155" w:type="pct"/>
-            <w:tcBorders>
-              <w:top w:val="nil"/>
-              <w:left w:val="single" w:sz="4" w:space="0" w:color="auto"/>
-              <w:bottom w:val="single" w:sz="4" w:space="0" w:color="auto"/>
-              <w:right w:val="single" w:sz="4" w:space="0" w:color="auto"/>
-            </w:tcBorders>
-            <w:shd w:val="clear" w:color="000000" w:fill="FFFFFF"/>
-            <w:vAlign w:val="center"/>
-            <w:hideMark/>
-          </w:tcPr>
-          <w:p>
-            <w:pPr>
-              <w:spacing w:after="0" w:line="240" w:lineRule="auto"/>
-              <w:jc w:val="center"/>
-              <w:rPr>
-                <w:rFonts w:ascii="Times New Roman" w:eastAsia="Times New Roman" w:hAnsi="Times New Roman" w:cs="Times New Roman"/>
-                <w:b/>
-                <w:bCs/>
-                <w:sz w:val="24"/>
-                <w:szCs w:val="24"/>
-              </w:rPr>
-            </w:pPr>
-            <w:r>
-              <w:rPr>
-                <w:rFonts w:ascii="Times New Roman" w:eastAsia="Times New Roman" w:hAnsi="Times New Roman" w:cs="Times New Roman"/>
-                <w:b/>
-                <w:bCs/>
-                <w:sz w:val="24"/>
-                <w:szCs w:val="24"/>
-              </w:rPr>
-              <w:t>II</w:t>
-            </w:r>
-          </w:p>
-        </w:tc>
-        <w:tc>
-          <w:tcPr>
-            <w:tcW w:w="830" w:type="pct"/>
-            <w:tcBorders>
-              <w:top w:val="nil"/>
-              <w:left w:val="nil"/>
-              <w:bottom w:val="single" w:sz="4" w:space="0" w:color="auto"/>
-              <w:right w:val="single" w:sz="4" w:space="0" w:color="auto"/>
-            </w:tcBorders>
-            <w:shd w:val="clear" w:color="000000" w:fill="FFFFFF"/>
-            <w:vAlign w:val="center"/>
-            <w:hideMark/>
-          </w:tcPr>
-          <w:p>
-            <w:pPr>
-              <w:spacing w:after="0" w:line="240" w:lineRule="auto"/>
-              <w:jc w:val="center"/>
-              <w:rPr>
-                <w:rFonts w:ascii="Times New Roman" w:eastAsia="Times New Roman" w:hAnsi="Times New Roman" w:cs="Times New Roman"/>
-                <w:b/>
-                <w:bCs/>
-                <w:sz w:val="24"/>
-                <w:szCs w:val="24"/>
-              </w:rPr>
-            </w:pPr>
-            <w:r>
-              <w:rPr>
-                <w:rFonts w:ascii="Times New Roman" w:eastAsia="Times New Roman" w:hAnsi="Times New Roman" w:cs="Times New Roman"/>
-                <w:b/>
-                <w:bCs/>
-                <w:sz w:val="24"/>
-                <w:szCs w:val="24"/>
-              </w:rPr>
-              <w:t>LÃI(+), LỖ(-)</w:t>
-            </w:r>
-          </w:p>
-        </w:tc>
-        <w:tc>
-          <w:tcPr>
-            <w:tcW w:w="564" w:type="pct"/>
+              <w:t>I</w:t>
+            </w:r>
+          </w:p>
+        </w:tc>
+        <w:tc>
+          <w:tcPr>
+            <w:tcW w:w="766" w:type="pct"/>
             <w:tcBorders>
               <w:top w:val="nil"/>
               <w:left w:val="nil"/>
@@ -12258,38 +11611,31 @@
               <w:right w:val="single" w:sz="4" w:space="0" w:color="auto"/>
             </w:tcBorders>
             <w:noWrap/>
-            <w:vAlign w:val="bottom"/>
+            <w:vAlign w:val="center"/>
             <w:hideMark/>
           </w:tcPr>
           <w:p>
             <w:pPr>
               <w:spacing w:after="0" w:line="240" w:lineRule="auto"/>
-              <w:jc w:val="center"/>
-              <w:rPr>
-                <w:rFonts w:ascii="Times New Roman" w:eastAsia="Times New Roman" w:hAnsi="Times New Roman" w:cs="Times New Roman"/>
-                <w:b/>
-                <w:bCs/>
-                <w:color w:val="000000"/>
-                <w:sz w:val="24"/>
-                <w:szCs w:val="24"/>
-              </w:rPr>
-            </w:pPr>
-            <w:r>
-              <w:rPr>
-                <w:rFonts w:ascii="Times New Roman" w:eastAsia="Times New Roman" w:hAnsi="Times New Roman" w:cs="Times New Roman"/>
-                <w:b/>
-                <w:bCs/>
-                <w:color w:val="000000"/>
-                <w:sz w:val="24"/>
-                <w:szCs w:val="24"/>
-              </w:rPr>
-              <w:t> </w:t>
-            </w:r>
-          </w:p>
-        </w:tc>
-        <w:tc>
-          <w:tcPr>
-            <w:tcW w:w="516" w:type="pct"/>
+              <w:rPr>
+                <w:rFonts w:ascii="Times New Roman" w:eastAsia="Times New Roman" w:hAnsi="Times New Roman" w:cs="Times New Roman"/>
+                <w:sz w:val="24"/>
+                <w:szCs w:val="24"/>
+              </w:rPr>
+            </w:pPr>
+            <w:r>
+              <w:rPr>
+                <w:rFonts w:ascii="Times New Roman" w:eastAsia="Times New Roman" w:hAnsi="Times New Roman" w:cs="Times New Roman"/>
+                <w:sz w:val="24"/>
+                <w:szCs w:val="24"/>
+              </w:rPr>
+              <w:t>TỔNG CHI PHÍ</w:t>
+            </w:r>
+          </w:p>
+        </w:tc>
+        <w:tc>
+          <w:tcPr>
+            <w:tcW w:w="549" w:type="pct"/>
             <w:tcBorders>
               <w:top w:val="nil"/>
               <w:left w:val="nil"/>
@@ -12297,27 +11643,22 @@
               <w:right w:val="single" w:sz="4" w:space="0" w:color="auto"/>
             </w:tcBorders>
             <w:noWrap/>
-            <w:vAlign w:val="bottom"/>
+            <w:vAlign w:val="center"/>
             <w:hideMark/>
           </w:tcPr>
           <w:p>
             <w:pPr>
               <w:spacing w:after="0" w:line="240" w:lineRule="auto"/>
-              <w:rPr>
-                <w:rFonts w:ascii="Times New Roman" w:eastAsia="Times New Roman" w:hAnsi="Times New Roman" w:cs="Times New Roman"/>
-                <w:b/>
-                <w:bCs/>
-                <w:color w:val="000000"/>
-                <w:sz w:val="24"/>
-                <w:szCs w:val="24"/>
-              </w:rPr>
-            </w:pPr>
-            <w:r>
-              <w:rPr>
-                <w:rFonts w:ascii="Times New Roman" w:eastAsia="Times New Roman" w:hAnsi="Times New Roman" w:cs="Times New Roman"/>
-                <w:b/>
-                <w:bCs/>
-                <w:color w:val="000000"/>
+              <w:jc w:val="center"/>
+              <w:rPr>
+                <w:rFonts w:ascii="Times New Roman" w:eastAsia="Times New Roman" w:hAnsi="Times New Roman" w:cs="Times New Roman"/>
+                <w:sz w:val="24"/>
+                <w:szCs w:val="24"/>
+              </w:rPr>
+            </w:pPr>
+            <w:r>
+              <w:rPr>
+                <w:rFonts w:ascii="Times New Roman" w:eastAsia="Times New Roman" w:hAnsi="Times New Roman" w:cs="Times New Roman"/>
                 <w:sz w:val="24"/>
                 <w:szCs w:val="24"/>
               </w:rPr>
@@ -12327,7 +11668,7 @@
         </w:tc>
         <w:tc>
           <w:tcPr>
-            <w:tcW w:w="581" w:type="pct"/>
+            <w:tcW w:w="585" w:type="pct"/>
             <w:tcBorders>
               <w:top w:val="nil"/>
               <w:left w:val="nil"/>
@@ -12335,7 +11676,7 @@
               <w:right w:val="single" w:sz="4" w:space="0" w:color="auto"/>
             </w:tcBorders>
             <w:noWrap/>
-            <w:vAlign w:val="bottom"/>
+            <w:vAlign w:val="center"/>
             <w:hideMark/>
           </w:tcPr>
           <w:p>
@@ -12343,19 +11684,13 @@
               <w:spacing w:after="0" w:line="240" w:lineRule="auto"/>
               <w:rPr>
                 <w:rFonts w:ascii="Times New Roman" w:eastAsia="Times New Roman" w:hAnsi="Times New Roman" w:cs="Times New Roman"/>
-                <w:b/>
-                <w:bCs/>
-                <w:color w:val="000000"/>
-                <w:sz w:val="24"/>
-                <w:szCs w:val="24"/>
-              </w:rPr>
-            </w:pPr>
-            <w:r>
-              <w:rPr>
-                <w:rFonts w:ascii="Times New Roman" w:eastAsia="Times New Roman" w:hAnsi="Times New Roman" w:cs="Times New Roman"/>
-                <w:b/>
-                <w:bCs/>
-                <w:color w:val="000000"/>
+                <w:sz w:val="24"/>
+                <w:szCs w:val="24"/>
+              </w:rPr>
+            </w:pPr>
+            <w:r>
+              <w:rPr>
+                <w:rFonts w:ascii="Times New Roman" w:eastAsia="Times New Roman" w:hAnsi="Times New Roman" w:cs="Times New Roman"/>
                 <w:sz w:val="24"/>
                 <w:szCs w:val="24"/>
               </w:rPr>
@@ -12365,7 +11700,7 @@
         </w:tc>
         <w:tc>
           <w:tcPr>
-            <w:tcW w:w="1353" w:type="pct"/>
+            <w:tcW w:w="766" w:type="pct"/>
             <w:tcBorders>
               <w:top w:val="nil"/>
               <w:left w:val="nil"/>
@@ -12373,28 +11708,1842 @@
               <w:right w:val="single" w:sz="4" w:space="0" w:color="auto"/>
             </w:tcBorders>
             <w:noWrap/>
-            <w:vAlign w:val="bottom"/>
+            <w:vAlign w:val="center"/>
             <w:hideMark/>
           </w:tcPr>
           <w:p>
             <w:pPr>
               <w:spacing w:after="0" w:line="240" w:lineRule="auto"/>
-              <w:jc w:val="right"/>
-              <w:rPr>
-                <w:rFonts w:ascii="Times New Roman" w:eastAsia="Times New Roman" w:hAnsi="Times New Roman" w:cs="Times New Roman"/>
-                <w:b/>
-                <w:bCs/>
-                <w:color w:val="000000"/>
-                <w:sz w:val="24"/>
-                <w:szCs w:val="24"/>
-              </w:rPr>
-            </w:pPr>
-            <w:r>
-              <w:rPr>
-                <w:rFonts w:ascii="Times New Roman" w:eastAsia="Times New Roman" w:hAnsi="Times New Roman" w:cs="Times New Roman"/>
-                <w:b/>
-                <w:bCs/>
-                <w:color w:val="000000"/>
+              <w:rPr>
+                <w:rFonts w:ascii="Times New Roman" w:eastAsia="Times New Roman" w:hAnsi="Times New Roman" w:cs="Times New Roman"/>
+                <w:sz w:val="24"/>
+                <w:szCs w:val="24"/>
+              </w:rPr>
+            </w:pPr>
+            <w:r>
+              <w:rPr>
+                <w:rFonts w:ascii="Times New Roman" w:eastAsia="Times New Roman" w:hAnsi="Times New Roman" w:cs="Times New Roman"/>
+                <w:sz w:val="24"/>
+                <w:szCs w:val="24"/>
+              </w:rPr>
+              <w:t> </w:t>
+            </w:r>
+          </w:p>
+        </w:tc>
+        <w:tc>
+          <w:tcPr>
+            <w:tcW w:w="1306" w:type="pct"/>
+            <w:tcBorders>
+              <w:top w:val="nil"/>
+              <w:left w:val="nil"/>
+              <w:bottom w:val="single" w:sz="4" w:space="0" w:color="auto"/>
+              <w:right w:val="single" w:sz="4" w:space="0" w:color="auto"/>
+            </w:tcBorders>
+            <w:noWrap/>
+            <w:vAlign w:val="center"/>
+            <w:hideMark/>
+          </w:tcPr>
+          <w:p>
+            <w:pPr>
+              <w:spacing w:after="0" w:line="240" w:lineRule="auto"/>
+              <w:rPr>
+                <w:rFonts w:ascii="Times New Roman" w:eastAsia="Times New Roman" w:hAnsi="Times New Roman" w:cs="Times New Roman"/>
+                <w:sz w:val="24"/>
+                <w:szCs w:val="24"/>
+              </w:rPr>
+            </w:pPr>
+            <w:r>
+              <w:rPr>
+                <w:rFonts w:ascii="Times New Roman" w:eastAsia="Times New Roman" w:hAnsi="Times New Roman" w:cs="Times New Roman"/>
+                <w:sz w:val="24"/>
+                <w:szCs w:val="24"/>
+              </w:rPr>
+              <w:t>[PA.Tổng chi phí]</w:t>
+            </w:r>
+          </w:p>
+        </w:tc>
+      </w:tr>
+      <w:tr>
+        <w:trPr>
+          <w:trHeight w:val="312"/>
+        </w:trPr>
+        <w:tc>
+          <w:tcPr>
+            <w:tcW w:w="1028" w:type="pct"/>
+            <w:tcBorders>
+              <w:top w:val="nil"/>
+              <w:left w:val="single" w:sz="4" w:space="0" w:color="auto"/>
+              <w:bottom w:val="single" w:sz="4" w:space="0" w:color="auto"/>
+              <w:right w:val="single" w:sz="4" w:space="0" w:color="auto"/>
+            </w:tcBorders>
+            <w:noWrap/>
+            <w:vAlign w:val="center"/>
+            <w:hideMark/>
+          </w:tcPr>
+          <w:p>
+            <w:pPr>
+              <w:spacing w:after="0" w:line="240" w:lineRule="auto"/>
+              <w:jc w:val="center"/>
+              <w:rPr>
+                <w:rFonts w:ascii="Times New Roman" w:eastAsia="Times New Roman" w:hAnsi="Times New Roman" w:cs="Times New Roman"/>
+                <w:sz w:val="24"/>
+                <w:szCs w:val="24"/>
+              </w:rPr>
+            </w:pPr>
+            <w:r>
+              <w:rPr>
+                <w:rFonts w:ascii="Times New Roman" w:eastAsia="Times New Roman" w:hAnsi="Times New Roman" w:cs="Times New Roman"/>
+                <w:sz w:val="24"/>
+                <w:szCs w:val="24"/>
+              </w:rPr>
+              <w:t>1</w:t>
+            </w:r>
+          </w:p>
+        </w:tc>
+        <w:tc>
+          <w:tcPr>
+            <w:tcW w:w="766" w:type="pct"/>
+            <w:tcBorders>
+              <w:top w:val="nil"/>
+              <w:left w:val="nil"/>
+              <w:bottom w:val="single" w:sz="4" w:space="0" w:color="auto"/>
+              <w:right w:val="single" w:sz="4" w:space="0" w:color="auto"/>
+            </w:tcBorders>
+            <w:noWrap/>
+            <w:vAlign w:val="center"/>
+            <w:hideMark/>
+          </w:tcPr>
+          <w:p>
+            <w:pPr>
+              <w:spacing w:after="0" w:line="240" w:lineRule="auto"/>
+              <w:rPr>
+                <w:rFonts w:ascii="Times New Roman" w:eastAsia="Times New Roman" w:hAnsi="Times New Roman" w:cs="Times New Roman"/>
+                <w:sz w:val="24"/>
+                <w:szCs w:val="24"/>
+              </w:rPr>
+            </w:pPr>
+            <w:r>
+              <w:rPr>
+                <w:rFonts w:ascii="Times New Roman" w:eastAsia="Times New Roman" w:hAnsi="Times New Roman" w:cs="Times New Roman"/>
+                <w:sz w:val="24"/>
+                <w:szCs w:val="24"/>
+              </w:rPr>
+              <w:t>Chi phí trực tiếp</w:t>
+            </w:r>
+          </w:p>
+        </w:tc>
+        <w:tc>
+          <w:tcPr>
+            <w:tcW w:w="549" w:type="pct"/>
+            <w:tcBorders>
+              <w:top w:val="nil"/>
+              <w:left w:val="nil"/>
+              <w:bottom w:val="single" w:sz="4" w:space="0" w:color="auto"/>
+              <w:right w:val="single" w:sz="4" w:space="0" w:color="auto"/>
+            </w:tcBorders>
+            <w:noWrap/>
+            <w:vAlign w:val="center"/>
+            <w:hideMark/>
+          </w:tcPr>
+          <w:p>
+            <w:pPr>
+              <w:spacing w:after="0" w:line="240" w:lineRule="auto"/>
+              <w:jc w:val="center"/>
+              <w:rPr>
+                <w:rFonts w:ascii="Times New Roman" w:eastAsia="Times New Roman" w:hAnsi="Times New Roman" w:cs="Times New Roman"/>
+                <w:sz w:val="24"/>
+                <w:szCs w:val="24"/>
+              </w:rPr>
+            </w:pPr>
+            <w:r>
+              <w:rPr>
+                <w:rFonts w:ascii="Times New Roman" w:eastAsia="Times New Roman" w:hAnsi="Times New Roman" w:cs="Times New Roman"/>
+                <w:sz w:val="24"/>
+                <w:szCs w:val="24"/>
+              </w:rPr>
+              <w:t> </w:t>
+            </w:r>
+          </w:p>
+        </w:tc>
+        <w:tc>
+          <w:tcPr>
+            <w:tcW w:w="585" w:type="pct"/>
+            <w:tcBorders>
+              <w:top w:val="nil"/>
+              <w:left w:val="nil"/>
+              <w:bottom w:val="single" w:sz="4" w:space="0" w:color="auto"/>
+              <w:right w:val="single" w:sz="4" w:space="0" w:color="auto"/>
+            </w:tcBorders>
+            <w:noWrap/>
+            <w:vAlign w:val="center"/>
+            <w:hideMark/>
+          </w:tcPr>
+          <w:p>
+            <w:pPr>
+              <w:spacing w:after="0" w:line="240" w:lineRule="auto"/>
+              <w:rPr>
+                <w:rFonts w:ascii="Times New Roman" w:eastAsia="Times New Roman" w:hAnsi="Times New Roman" w:cs="Times New Roman"/>
+                <w:sz w:val="24"/>
+                <w:szCs w:val="24"/>
+              </w:rPr>
+            </w:pPr>
+            <w:r>
+              <w:rPr>
+                <w:rFonts w:ascii="Times New Roman" w:eastAsia="Times New Roman" w:hAnsi="Times New Roman" w:cs="Times New Roman"/>
+                <w:sz w:val="24"/>
+                <w:szCs w:val="24"/>
+              </w:rPr>
+              <w:t> </w:t>
+            </w:r>
+          </w:p>
+        </w:tc>
+        <w:tc>
+          <w:tcPr>
+            <w:tcW w:w="766" w:type="pct"/>
+            <w:tcBorders>
+              <w:top w:val="nil"/>
+              <w:left w:val="nil"/>
+              <w:bottom w:val="single" w:sz="4" w:space="0" w:color="auto"/>
+              <w:right w:val="single" w:sz="4" w:space="0" w:color="auto"/>
+            </w:tcBorders>
+            <w:noWrap/>
+            <w:vAlign w:val="center"/>
+            <w:hideMark/>
+          </w:tcPr>
+          <w:p>
+            <w:pPr>
+              <w:spacing w:after="0" w:line="240" w:lineRule="auto"/>
+              <w:rPr>
+                <w:rFonts w:ascii="Times New Roman" w:eastAsia="Times New Roman" w:hAnsi="Times New Roman" w:cs="Times New Roman"/>
+                <w:sz w:val="24"/>
+                <w:szCs w:val="24"/>
+              </w:rPr>
+            </w:pPr>
+            <w:r>
+              <w:rPr>
+                <w:rFonts w:ascii="Times New Roman" w:eastAsia="Times New Roman" w:hAnsi="Times New Roman" w:cs="Times New Roman"/>
+                <w:sz w:val="24"/>
+                <w:szCs w:val="24"/>
+              </w:rPr>
+              <w:t> </w:t>
+            </w:r>
+          </w:p>
+        </w:tc>
+        <w:tc>
+          <w:tcPr>
+            <w:tcW w:w="1306" w:type="pct"/>
+            <w:tcBorders>
+              <w:top w:val="nil"/>
+              <w:left w:val="nil"/>
+              <w:bottom w:val="single" w:sz="4" w:space="0" w:color="auto"/>
+              <w:right w:val="single" w:sz="4" w:space="0" w:color="auto"/>
+            </w:tcBorders>
+            <w:noWrap/>
+            <w:vAlign w:val="center"/>
+            <w:hideMark/>
+          </w:tcPr>
+          <w:p>
+            <w:pPr>
+              <w:spacing w:after="0" w:line="240" w:lineRule="auto"/>
+              <w:rPr>
+                <w:rFonts w:ascii="Times New Roman" w:eastAsia="Times New Roman" w:hAnsi="Times New Roman" w:cs="Times New Roman"/>
+                <w:sz w:val="24"/>
+                <w:szCs w:val="24"/>
+              </w:rPr>
+            </w:pPr>
+            <w:r>
+              <w:rPr>
+                <w:rFonts w:ascii="Times New Roman" w:eastAsia="Times New Roman" w:hAnsi="Times New Roman" w:cs="Times New Roman"/>
+                <w:sz w:val="24"/>
+                <w:szCs w:val="24"/>
+              </w:rPr>
+              <w:t>[PA.Tổng chi phí trực tiếp]</w:t>
+            </w:r>
+          </w:p>
+        </w:tc>
+      </w:tr>
+      <w:tr>
+        <w:trPr>
+          <w:trHeight w:val="312"/>
+        </w:trPr>
+        <w:tc>
+          <w:tcPr>
+            <w:tcW w:w="1028" w:type="pct"/>
+            <w:tcBorders>
+              <w:top w:val="nil"/>
+              <w:left w:val="single" w:sz="4" w:space="0" w:color="auto"/>
+              <w:bottom w:val="single" w:sz="4" w:space="0" w:color="auto"/>
+              <w:right w:val="single" w:sz="4" w:space="0" w:color="auto"/>
+            </w:tcBorders>
+            <w:noWrap/>
+            <w:vAlign w:val="center"/>
+            <w:hideMark/>
+          </w:tcPr>
+          <w:p>
+            <w:pPr>
+              <w:spacing w:after="0" w:line="240" w:lineRule="auto"/>
+              <w:jc w:val="center"/>
+              <w:rPr>
+                <w:rFonts w:ascii="Times New Roman" w:eastAsia="Times New Roman" w:hAnsi="Times New Roman" w:cs="Times New Roman"/>
+                <w:sz w:val="24"/>
+                <w:szCs w:val="24"/>
+              </w:rPr>
+            </w:pPr>
+            <w:r>
+              <w:rPr>
+                <w:rFonts w:ascii="Times New Roman" w:eastAsia="Times New Roman" w:hAnsi="Times New Roman" w:cs="Times New Roman"/>
+                <w:sz w:val="24"/>
+                <w:szCs w:val="24"/>
+              </w:rPr>
+              <w:t>2</w:t>
+            </w:r>
+          </w:p>
+        </w:tc>
+        <w:tc>
+          <w:tcPr>
+            <w:tcW w:w="766" w:type="pct"/>
+            <w:tcBorders>
+              <w:top w:val="nil"/>
+              <w:left w:val="nil"/>
+              <w:bottom w:val="single" w:sz="4" w:space="0" w:color="auto"/>
+              <w:right w:val="single" w:sz="4" w:space="0" w:color="auto"/>
+            </w:tcBorders>
+            <w:noWrap/>
+            <w:vAlign w:val="center"/>
+            <w:hideMark/>
+          </w:tcPr>
+          <w:p>
+            <w:pPr>
+              <w:spacing w:after="0" w:line="240" w:lineRule="auto"/>
+              <w:rPr>
+                <w:rFonts w:ascii="Times New Roman" w:eastAsia="Times New Roman" w:hAnsi="Times New Roman" w:cs="Times New Roman"/>
+                <w:sz w:val="24"/>
+                <w:szCs w:val="24"/>
+              </w:rPr>
+            </w:pPr>
+            <w:r>
+              <w:rPr>
+                <w:rFonts w:ascii="Times New Roman" w:eastAsia="Times New Roman" w:hAnsi="Times New Roman" w:cs="Times New Roman"/>
+                <w:sz w:val="24"/>
+                <w:szCs w:val="24"/>
+              </w:rPr>
+              <w:t>Chi phí gián tiếp</w:t>
+            </w:r>
+          </w:p>
+        </w:tc>
+        <w:tc>
+          <w:tcPr>
+            <w:tcW w:w="549" w:type="pct"/>
+            <w:tcBorders>
+              <w:top w:val="nil"/>
+              <w:left w:val="nil"/>
+              <w:bottom w:val="single" w:sz="4" w:space="0" w:color="auto"/>
+              <w:right w:val="single" w:sz="4" w:space="0" w:color="auto"/>
+            </w:tcBorders>
+            <w:noWrap/>
+            <w:vAlign w:val="center"/>
+            <w:hideMark/>
+          </w:tcPr>
+          <w:p>
+            <w:pPr>
+              <w:spacing w:after="0" w:line="240" w:lineRule="auto"/>
+              <w:jc w:val="center"/>
+              <w:rPr>
+                <w:rFonts w:ascii="Times New Roman" w:eastAsia="Times New Roman" w:hAnsi="Times New Roman" w:cs="Times New Roman"/>
+                <w:sz w:val="24"/>
+                <w:szCs w:val="24"/>
+              </w:rPr>
+            </w:pPr>
+            <w:r>
+              <w:rPr>
+                <w:rFonts w:ascii="Times New Roman" w:eastAsia="Times New Roman" w:hAnsi="Times New Roman" w:cs="Times New Roman"/>
+                <w:sz w:val="24"/>
+                <w:szCs w:val="24"/>
+              </w:rPr>
+              <w:t> </w:t>
+            </w:r>
+          </w:p>
+        </w:tc>
+        <w:tc>
+          <w:tcPr>
+            <w:tcW w:w="585" w:type="pct"/>
+            <w:tcBorders>
+              <w:top w:val="nil"/>
+              <w:left w:val="nil"/>
+              <w:bottom w:val="single" w:sz="4" w:space="0" w:color="auto"/>
+              <w:right w:val="single" w:sz="4" w:space="0" w:color="auto"/>
+            </w:tcBorders>
+            <w:noWrap/>
+            <w:vAlign w:val="center"/>
+            <w:hideMark/>
+          </w:tcPr>
+          <w:p>
+            <w:pPr>
+              <w:spacing w:after="0" w:line="240" w:lineRule="auto"/>
+              <w:rPr>
+                <w:rFonts w:ascii="Times New Roman" w:eastAsia="Times New Roman" w:hAnsi="Times New Roman" w:cs="Times New Roman"/>
+                <w:sz w:val="24"/>
+                <w:szCs w:val="24"/>
+              </w:rPr>
+            </w:pPr>
+            <w:r>
+              <w:rPr>
+                <w:rFonts w:ascii="Times New Roman" w:eastAsia="Times New Roman" w:hAnsi="Times New Roman" w:cs="Times New Roman"/>
+                <w:sz w:val="24"/>
+                <w:szCs w:val="24"/>
+              </w:rPr>
+              <w:t> </w:t>
+            </w:r>
+          </w:p>
+        </w:tc>
+        <w:tc>
+          <w:tcPr>
+            <w:tcW w:w="766" w:type="pct"/>
+            <w:tcBorders>
+              <w:top w:val="nil"/>
+              <w:left w:val="nil"/>
+              <w:bottom w:val="single" w:sz="4" w:space="0" w:color="auto"/>
+              <w:right w:val="single" w:sz="4" w:space="0" w:color="auto"/>
+            </w:tcBorders>
+            <w:noWrap/>
+            <w:vAlign w:val="center"/>
+            <w:hideMark/>
+          </w:tcPr>
+          <w:p>
+            <w:pPr>
+              <w:spacing w:after="0" w:line="240" w:lineRule="auto"/>
+              <w:rPr>
+                <w:rFonts w:ascii="Times New Roman" w:eastAsia="Times New Roman" w:hAnsi="Times New Roman" w:cs="Times New Roman"/>
+                <w:sz w:val="24"/>
+                <w:szCs w:val="24"/>
+              </w:rPr>
+            </w:pPr>
+            <w:r>
+              <w:rPr>
+                <w:rFonts w:ascii="Times New Roman" w:eastAsia="Times New Roman" w:hAnsi="Times New Roman" w:cs="Times New Roman"/>
+                <w:sz w:val="24"/>
+                <w:szCs w:val="24"/>
+              </w:rPr>
+              <w:t> </w:t>
+            </w:r>
+          </w:p>
+        </w:tc>
+        <w:tc>
+          <w:tcPr>
+            <w:tcW w:w="1306" w:type="pct"/>
+            <w:tcBorders>
+              <w:top w:val="nil"/>
+              <w:left w:val="nil"/>
+              <w:bottom w:val="single" w:sz="4" w:space="0" w:color="auto"/>
+              <w:right w:val="single" w:sz="4" w:space="0" w:color="auto"/>
+            </w:tcBorders>
+            <w:noWrap/>
+            <w:vAlign w:val="center"/>
+            <w:hideMark/>
+          </w:tcPr>
+          <w:p>
+            <w:pPr>
+              <w:spacing w:after="0" w:line="240" w:lineRule="auto"/>
+              <w:rPr>
+                <w:rFonts w:ascii="Times New Roman" w:eastAsia="Times New Roman" w:hAnsi="Times New Roman" w:cs="Times New Roman"/>
+                <w:sz w:val="24"/>
+                <w:szCs w:val="24"/>
+              </w:rPr>
+            </w:pPr>
+            <w:r>
+              <w:rPr>
+                <w:rFonts w:ascii="Times New Roman" w:eastAsia="Times New Roman" w:hAnsi="Times New Roman" w:cs="Times New Roman"/>
+                <w:sz w:val="24"/>
+                <w:szCs w:val="24"/>
+              </w:rPr>
+              <w:t>[PA.Tổng chi phí gián tiếp]</w:t>
+            </w:r>
+          </w:p>
+        </w:tc>
+      </w:tr>
+      <w:tr>
+        <w:trPr>
+          <w:trHeight w:val="312"/>
+        </w:trPr>
+        <w:tc>
+          <w:tcPr>
+            <w:tcW w:w="1028" w:type="pct"/>
+            <w:tcBorders>
+              <w:top w:val="nil"/>
+              <w:left w:val="single" w:sz="4" w:space="0" w:color="auto"/>
+              <w:bottom w:val="single" w:sz="4" w:space="0" w:color="auto"/>
+              <w:right w:val="single" w:sz="4" w:space="0" w:color="auto"/>
+            </w:tcBorders>
+            <w:noWrap/>
+            <w:vAlign w:val="center"/>
+            <w:hideMark/>
+          </w:tcPr>
+          <w:p>
+            <w:pPr>
+              <w:spacing w:after="0" w:line="240" w:lineRule="auto"/>
+              <w:jc w:val="center"/>
+              <w:rPr>
+                <w:rFonts w:ascii="Times New Roman" w:eastAsia="Times New Roman" w:hAnsi="Times New Roman" w:cs="Times New Roman"/>
+                <w:sz w:val="24"/>
+                <w:szCs w:val="24"/>
+              </w:rPr>
+            </w:pPr>
+            <w:r>
+              <w:rPr>
+                <w:rFonts w:ascii="Times New Roman" w:eastAsia="Times New Roman" w:hAnsi="Times New Roman" w:cs="Times New Roman"/>
+                <w:sz w:val="24"/>
+                <w:szCs w:val="24"/>
+              </w:rPr>
+              <w:t>2.1</w:t>
+            </w:r>
+          </w:p>
+        </w:tc>
+        <w:tc>
+          <w:tcPr>
+            <w:tcW w:w="766" w:type="pct"/>
+            <w:tcBorders>
+              <w:top w:val="nil"/>
+              <w:left w:val="nil"/>
+              <w:bottom w:val="single" w:sz="4" w:space="0" w:color="auto"/>
+              <w:right w:val="single" w:sz="4" w:space="0" w:color="auto"/>
+            </w:tcBorders>
+            <w:noWrap/>
+            <w:vAlign w:val="center"/>
+            <w:hideMark/>
+          </w:tcPr>
+          <w:p>
+            <w:pPr>
+              <w:spacing w:after="0" w:line="240" w:lineRule="auto"/>
+              <w:rPr>
+                <w:rFonts w:ascii="Times New Roman" w:eastAsia="Times New Roman" w:hAnsi="Times New Roman" w:cs="Times New Roman"/>
+                <w:sz w:val="24"/>
+                <w:szCs w:val="24"/>
+              </w:rPr>
+            </w:pPr>
+            <w:r>
+              <w:rPr>
+                <w:rFonts w:ascii="Times New Roman" w:eastAsia="Times New Roman" w:hAnsi="Times New Roman" w:cs="Times New Roman"/>
+                <w:sz w:val="24"/>
+                <w:szCs w:val="24"/>
+              </w:rPr>
+              <w:t>Lãi vay</w:t>
+            </w:r>
+          </w:p>
+        </w:tc>
+        <w:tc>
+          <w:tcPr>
+            <w:tcW w:w="549" w:type="pct"/>
+            <w:tcBorders>
+              <w:top w:val="nil"/>
+              <w:left w:val="nil"/>
+              <w:bottom w:val="single" w:sz="4" w:space="0" w:color="auto"/>
+              <w:right w:val="single" w:sz="4" w:space="0" w:color="auto"/>
+            </w:tcBorders>
+            <w:noWrap/>
+            <w:vAlign w:val="center"/>
+            <w:hideMark/>
+          </w:tcPr>
+          <w:p>
+            <w:pPr>
+              <w:spacing w:after="0" w:line="240" w:lineRule="auto"/>
+              <w:jc w:val="center"/>
+              <w:rPr>
+                <w:rFonts w:ascii="Times New Roman" w:eastAsia="Times New Roman" w:hAnsi="Times New Roman" w:cs="Times New Roman"/>
+                <w:sz w:val="24"/>
+                <w:szCs w:val="24"/>
+              </w:rPr>
+            </w:pPr>
+            <w:r>
+              <w:rPr>
+                <w:rFonts w:ascii="Times New Roman" w:eastAsia="Times New Roman" w:hAnsi="Times New Roman" w:cs="Times New Roman"/>
+                <w:sz w:val="24"/>
+                <w:szCs w:val="24"/>
+              </w:rPr>
+              <w:t>đ</w:t>
+            </w:r>
+          </w:p>
+        </w:tc>
+        <w:tc>
+          <w:tcPr>
+            <w:tcW w:w="585" w:type="pct"/>
+            <w:tcBorders>
+              <w:top w:val="nil"/>
+              <w:left w:val="nil"/>
+              <w:bottom w:val="single" w:sz="4" w:space="0" w:color="auto"/>
+              <w:right w:val="single" w:sz="4" w:space="0" w:color="auto"/>
+            </w:tcBorders>
+            <w:noWrap/>
+            <w:vAlign w:val="center"/>
+            <w:hideMark/>
+          </w:tcPr>
+          <w:p>
+            <w:pPr>
+              <w:spacing w:after="0" w:line="240" w:lineRule="auto"/>
+              <w:rPr>
+                <w:rFonts w:ascii="Times New Roman" w:eastAsia="Times New Roman" w:hAnsi="Times New Roman" w:cs="Times New Roman"/>
+                <w:sz w:val="24"/>
+                <w:szCs w:val="24"/>
+              </w:rPr>
+            </w:pPr>
+            <w:r>
+              <w:rPr>
+                <w:rFonts w:ascii="Times New Roman" w:eastAsia="Times New Roman" w:hAnsi="Times New Roman" w:cs="Times New Roman"/>
+                <w:sz w:val="24"/>
+                <w:szCs w:val="24"/>
+              </w:rPr>
+              <w:t>[PA.LS vay]</w:t>
+            </w:r>
+          </w:p>
+        </w:tc>
+        <w:tc>
+          <w:tcPr>
+            <w:tcW w:w="766" w:type="pct"/>
+            <w:tcBorders>
+              <w:top w:val="nil"/>
+              <w:left w:val="nil"/>
+              <w:bottom w:val="single" w:sz="4" w:space="0" w:color="auto"/>
+              <w:right w:val="single" w:sz="4" w:space="0" w:color="auto"/>
+            </w:tcBorders>
+            <w:noWrap/>
+            <w:vAlign w:val="center"/>
+            <w:hideMark/>
+          </w:tcPr>
+          <w:p>
+            <w:pPr>
+              <w:spacing w:after="0" w:line="240" w:lineRule="auto"/>
+              <w:rPr>
+                <w:rFonts w:ascii="Times New Roman" w:eastAsia="Times New Roman" w:hAnsi="Times New Roman" w:cs="Times New Roman"/>
+                <w:sz w:val="24"/>
+                <w:szCs w:val="24"/>
+              </w:rPr>
+            </w:pPr>
+            <w:r>
+              <w:rPr>
+                <w:rFonts w:ascii="Times New Roman" w:eastAsia="Times New Roman" w:hAnsi="Times New Roman" w:cs="Times New Roman"/>
+                <w:sz w:val="24"/>
+                <w:szCs w:val="24"/>
+              </w:rPr>
+              <w:t>[PA.Số tiền vay]</w:t>
+            </w:r>
+          </w:p>
+        </w:tc>
+        <w:tc>
+          <w:tcPr>
+            <w:tcW w:w="1306" w:type="pct"/>
+            <w:tcBorders>
+              <w:top w:val="nil"/>
+              <w:left w:val="nil"/>
+              <w:bottom w:val="single" w:sz="4" w:space="0" w:color="auto"/>
+              <w:right w:val="single" w:sz="4" w:space="0" w:color="auto"/>
+            </w:tcBorders>
+            <w:noWrap/>
+            <w:vAlign w:val="center"/>
+            <w:hideMark/>
+          </w:tcPr>
+          <w:p>
+            <w:pPr>
+              <w:spacing w:after="0" w:line="240" w:lineRule="auto"/>
+              <w:rPr>
+                <w:rFonts w:ascii="Times New Roman" w:eastAsia="Times New Roman" w:hAnsi="Times New Roman" w:cs="Times New Roman"/>
+                <w:sz w:val="24"/>
+                <w:szCs w:val="24"/>
+              </w:rPr>
+            </w:pPr>
+            <w:r>
+              <w:rPr>
+                <w:rFonts w:ascii="Times New Roman" w:eastAsia="Times New Roman" w:hAnsi="Times New Roman" w:cs="Times New Roman"/>
+                <w:sz w:val="24"/>
+                <w:szCs w:val="24"/>
+              </w:rPr>
+              <w:t>[PA.Lãi vay NH]</w:t>
+            </w:r>
+          </w:p>
+        </w:tc>
+      </w:tr>
+      <w:tr>
+        <w:trPr>
+          <w:trHeight w:val="312"/>
+        </w:trPr>
+        <w:tc>
+          <w:tcPr>
+            <w:tcW w:w="1028" w:type="pct"/>
+            <w:tcBorders>
+              <w:top w:val="nil"/>
+              <w:left w:val="single" w:sz="4" w:space="0" w:color="auto"/>
+              <w:bottom w:val="single" w:sz="4" w:space="0" w:color="auto"/>
+              <w:right w:val="single" w:sz="4" w:space="0" w:color="auto"/>
+            </w:tcBorders>
+            <w:noWrap/>
+            <w:vAlign w:val="center"/>
+            <w:hideMark/>
+          </w:tcPr>
+          <w:p>
+            <w:pPr>
+              <w:spacing w:after="0" w:line="240" w:lineRule="auto"/>
+              <w:jc w:val="center"/>
+              <w:rPr>
+                <w:rFonts w:ascii="Times New Roman" w:eastAsia="Times New Roman" w:hAnsi="Times New Roman" w:cs="Times New Roman"/>
+                <w:sz w:val="24"/>
+                <w:szCs w:val="24"/>
+              </w:rPr>
+            </w:pPr>
+            <w:r>
+              <w:rPr>
+                <w:rFonts w:ascii="Times New Roman" w:eastAsia="Times New Roman" w:hAnsi="Times New Roman" w:cs="Times New Roman"/>
+                <w:sz w:val="24"/>
+                <w:szCs w:val="24"/>
+              </w:rPr>
+              <w:t>2.2</w:t>
+            </w:r>
+          </w:p>
+        </w:tc>
+        <w:tc>
+          <w:tcPr>
+            <w:tcW w:w="766" w:type="pct"/>
+            <w:tcBorders>
+              <w:top w:val="nil"/>
+              <w:left w:val="nil"/>
+              <w:bottom w:val="single" w:sz="4" w:space="0" w:color="auto"/>
+              <w:right w:val="single" w:sz="4" w:space="0" w:color="auto"/>
+            </w:tcBorders>
+            <w:noWrap/>
+            <w:vAlign w:val="center"/>
+            <w:hideMark/>
+          </w:tcPr>
+          <w:p>
+            <w:pPr>
+              <w:spacing w:after="0" w:line="240" w:lineRule="auto"/>
+              <w:rPr>
+                <w:rFonts w:ascii="Times New Roman" w:eastAsia="Times New Roman" w:hAnsi="Times New Roman" w:cs="Times New Roman"/>
+                <w:sz w:val="24"/>
+                <w:szCs w:val="24"/>
+              </w:rPr>
+            </w:pPr>
+            <w:r>
+              <w:rPr>
+                <w:rFonts w:ascii="Times New Roman" w:eastAsia="Times New Roman" w:hAnsi="Times New Roman" w:cs="Times New Roman"/>
+                <w:sz w:val="24"/>
+                <w:szCs w:val="24"/>
+              </w:rPr>
+              <w:t>Thuế</w:t>
+            </w:r>
+          </w:p>
+        </w:tc>
+        <w:tc>
+          <w:tcPr>
+            <w:tcW w:w="549" w:type="pct"/>
+            <w:tcBorders>
+              <w:top w:val="nil"/>
+              <w:left w:val="nil"/>
+              <w:bottom w:val="single" w:sz="4" w:space="0" w:color="auto"/>
+              <w:right w:val="single" w:sz="4" w:space="0" w:color="auto"/>
+            </w:tcBorders>
+            <w:noWrap/>
+            <w:vAlign w:val="center"/>
+            <w:hideMark/>
+          </w:tcPr>
+          <w:p>
+            <w:pPr>
+              <w:spacing w:after="0" w:line="240" w:lineRule="auto"/>
+              <w:jc w:val="center"/>
+              <w:rPr>
+                <w:rFonts w:ascii="Times New Roman" w:eastAsia="Times New Roman" w:hAnsi="Times New Roman" w:cs="Times New Roman"/>
+                <w:sz w:val="24"/>
+                <w:szCs w:val="24"/>
+              </w:rPr>
+            </w:pPr>
+            <w:r>
+              <w:rPr>
+                <w:rFonts w:ascii="Times New Roman" w:eastAsia="Times New Roman" w:hAnsi="Times New Roman" w:cs="Times New Roman"/>
+                <w:sz w:val="24"/>
+                <w:szCs w:val="24"/>
+              </w:rPr>
+              <w:t>tháng</w:t>
+            </w:r>
+          </w:p>
+        </w:tc>
+        <w:tc>
+          <w:tcPr>
+            <w:tcW w:w="585" w:type="pct"/>
+            <w:tcBorders>
+              <w:top w:val="nil"/>
+              <w:left w:val="nil"/>
+              <w:bottom w:val="single" w:sz="4" w:space="0" w:color="auto"/>
+              <w:right w:val="single" w:sz="4" w:space="0" w:color="auto"/>
+            </w:tcBorders>
+            <w:noWrap/>
+            <w:vAlign w:val="center"/>
+            <w:hideMark/>
+          </w:tcPr>
+          <w:p>
+            <w:pPr>
+              <w:spacing w:after="0" w:line="240" w:lineRule="auto"/>
+              <w:rPr>
+                <w:rFonts w:ascii="Times New Roman" w:eastAsia="Times New Roman" w:hAnsi="Times New Roman" w:cs="Times New Roman"/>
+                <w:sz w:val="24"/>
+                <w:szCs w:val="24"/>
+              </w:rPr>
+            </w:pPr>
+            <w:r>
+              <w:rPr>
+                <w:rFonts w:ascii="Times New Roman" w:eastAsia="Times New Roman" w:hAnsi="Times New Roman" w:cs="Times New Roman"/>
+                <w:sz w:val="24"/>
+                <w:szCs w:val="24"/>
+              </w:rPr>
+              <w:t> </w:t>
+            </w:r>
+          </w:p>
+        </w:tc>
+        <w:tc>
+          <w:tcPr>
+            <w:tcW w:w="766" w:type="pct"/>
+            <w:tcBorders>
+              <w:top w:val="nil"/>
+              <w:left w:val="nil"/>
+              <w:bottom w:val="single" w:sz="4" w:space="0" w:color="auto"/>
+              <w:right w:val="single" w:sz="4" w:space="0" w:color="auto"/>
+            </w:tcBorders>
+            <w:noWrap/>
+            <w:vAlign w:val="center"/>
+            <w:hideMark/>
+          </w:tcPr>
+          <w:p>
+            <w:pPr>
+              <w:spacing w:after="0" w:line="240" w:lineRule="auto"/>
+              <w:rPr>
+                <w:rFonts w:ascii="Times New Roman" w:eastAsia="Times New Roman" w:hAnsi="Times New Roman" w:cs="Times New Roman"/>
+                <w:sz w:val="24"/>
+                <w:szCs w:val="24"/>
+              </w:rPr>
+            </w:pPr>
+            <w:r>
+              <w:rPr>
+                <w:rFonts w:ascii="Times New Roman" w:eastAsia="Times New Roman" w:hAnsi="Times New Roman" w:cs="Times New Roman"/>
+                <w:sz w:val="24"/>
+                <w:szCs w:val="24"/>
+              </w:rPr>
+              <w:t> </w:t>
+            </w:r>
+          </w:p>
+        </w:tc>
+        <w:tc>
+          <w:tcPr>
+            <w:tcW w:w="1306" w:type="pct"/>
+            <w:tcBorders>
+              <w:top w:val="nil"/>
+              <w:left w:val="nil"/>
+              <w:bottom w:val="single" w:sz="4" w:space="0" w:color="auto"/>
+              <w:right w:val="single" w:sz="4" w:space="0" w:color="auto"/>
+            </w:tcBorders>
+            <w:noWrap/>
+            <w:vAlign w:val="center"/>
+            <w:hideMark/>
+          </w:tcPr>
+          <w:p>
+            <w:pPr>
+              <w:spacing w:after="0" w:line="240" w:lineRule="auto"/>
+              <w:rPr>
+                <w:rFonts w:ascii="Times New Roman" w:eastAsia="Times New Roman" w:hAnsi="Times New Roman" w:cs="Times New Roman"/>
+                <w:sz w:val="24"/>
+                <w:szCs w:val="24"/>
+              </w:rPr>
+            </w:pPr>
+            <w:r>
+              <w:rPr>
+                <w:rFonts w:ascii="Times New Roman" w:eastAsia="Times New Roman" w:hAnsi="Times New Roman" w:cs="Times New Roman"/>
+                <w:sz w:val="24"/>
+                <w:szCs w:val="24"/>
+              </w:rPr>
+              <w:t>[PA.Thuế]</w:t>
+            </w:r>
+          </w:p>
+        </w:tc>
+      </w:tr>
+      <w:tr>
+        <w:trPr>
+          <w:trHeight w:val="312"/>
+        </w:trPr>
+        <w:tc>
+          <w:tcPr>
+            <w:tcW w:w="1028" w:type="pct"/>
+            <w:tcBorders>
+              <w:top w:val="nil"/>
+              <w:left w:val="single" w:sz="4" w:space="0" w:color="auto"/>
+              <w:bottom w:val="single" w:sz="4" w:space="0" w:color="auto"/>
+              <w:right w:val="single" w:sz="4" w:space="0" w:color="auto"/>
+            </w:tcBorders>
+            <w:noWrap/>
+            <w:vAlign w:val="center"/>
+            <w:hideMark/>
+          </w:tcPr>
+          <w:p>
+            <w:pPr>
+              <w:spacing w:after="0" w:line="240" w:lineRule="auto"/>
+              <w:jc w:val="center"/>
+              <w:rPr>
+                <w:rFonts w:ascii="Times New Roman" w:eastAsia="Times New Roman" w:hAnsi="Times New Roman" w:cs="Times New Roman"/>
+                <w:sz w:val="24"/>
+                <w:szCs w:val="24"/>
+              </w:rPr>
+            </w:pPr>
+            <w:r>
+              <w:rPr>
+                <w:rFonts w:ascii="Times New Roman" w:eastAsia="Times New Roman" w:hAnsi="Times New Roman" w:cs="Times New Roman"/>
+                <w:sz w:val="24"/>
+                <w:szCs w:val="24"/>
+              </w:rPr>
+              <w:t>II</w:t>
+            </w:r>
+          </w:p>
+        </w:tc>
+        <w:tc>
+          <w:tcPr>
+            <w:tcW w:w="766" w:type="pct"/>
+            <w:tcBorders>
+              <w:top w:val="nil"/>
+              <w:left w:val="nil"/>
+              <w:bottom w:val="single" w:sz="4" w:space="0" w:color="auto"/>
+              <w:right w:val="single" w:sz="4" w:space="0" w:color="auto"/>
+            </w:tcBorders>
+            <w:noWrap/>
+            <w:vAlign w:val="center"/>
+            <w:hideMark/>
+          </w:tcPr>
+          <w:p>
+            <w:pPr>
+              <w:spacing w:after="0" w:line="240" w:lineRule="auto"/>
+              <w:rPr>
+                <w:rFonts w:ascii="Times New Roman" w:eastAsia="Times New Roman" w:hAnsi="Times New Roman" w:cs="Times New Roman"/>
+                <w:sz w:val="24"/>
+                <w:szCs w:val="24"/>
+              </w:rPr>
+            </w:pPr>
+            <w:r>
+              <w:rPr>
+                <w:rFonts w:ascii="Times New Roman" w:eastAsia="Times New Roman" w:hAnsi="Times New Roman" w:cs="Times New Roman"/>
+                <w:sz w:val="24"/>
+                <w:szCs w:val="24"/>
+              </w:rPr>
+              <w:t>Doanh thu</w:t>
+            </w:r>
+          </w:p>
+        </w:tc>
+        <w:tc>
+          <w:tcPr>
+            <w:tcW w:w="549" w:type="pct"/>
+            <w:tcBorders>
+              <w:top w:val="nil"/>
+              <w:left w:val="nil"/>
+              <w:bottom w:val="single" w:sz="4" w:space="0" w:color="auto"/>
+              <w:right w:val="single" w:sz="4" w:space="0" w:color="auto"/>
+            </w:tcBorders>
+            <w:noWrap/>
+            <w:vAlign w:val="center"/>
+            <w:hideMark/>
+          </w:tcPr>
+          <w:p>
+            <w:pPr>
+              <w:spacing w:after="0" w:line="240" w:lineRule="auto"/>
+              <w:jc w:val="center"/>
+              <w:rPr>
+                <w:rFonts w:ascii="Times New Roman" w:eastAsia="Times New Roman" w:hAnsi="Times New Roman" w:cs="Times New Roman"/>
+                <w:sz w:val="24"/>
+                <w:szCs w:val="24"/>
+              </w:rPr>
+            </w:pPr>
+            <w:r>
+              <w:rPr>
+                <w:rFonts w:ascii="Times New Roman" w:eastAsia="Times New Roman" w:hAnsi="Times New Roman" w:cs="Times New Roman"/>
+                <w:sz w:val="24"/>
+                <w:szCs w:val="24"/>
+              </w:rPr>
+              <w:t> </w:t>
+            </w:r>
+          </w:p>
+        </w:tc>
+        <w:tc>
+          <w:tcPr>
+            <w:tcW w:w="585" w:type="pct"/>
+            <w:tcBorders>
+              <w:top w:val="nil"/>
+              <w:left w:val="nil"/>
+              <w:bottom w:val="single" w:sz="4" w:space="0" w:color="auto"/>
+              <w:right w:val="single" w:sz="4" w:space="0" w:color="auto"/>
+            </w:tcBorders>
+            <w:noWrap/>
+            <w:vAlign w:val="center"/>
+            <w:hideMark/>
+          </w:tcPr>
+          <w:p>
+            <w:pPr>
+              <w:spacing w:after="0" w:line="240" w:lineRule="auto"/>
+              <w:rPr>
+                <w:rFonts w:ascii="Times New Roman" w:eastAsia="Times New Roman" w:hAnsi="Times New Roman" w:cs="Times New Roman"/>
+                <w:sz w:val="24"/>
+                <w:szCs w:val="24"/>
+              </w:rPr>
+            </w:pPr>
+            <w:r>
+              <w:rPr>
+                <w:rFonts w:ascii="Times New Roman" w:eastAsia="Times New Roman" w:hAnsi="Times New Roman" w:cs="Times New Roman"/>
+                <w:sz w:val="24"/>
+                <w:szCs w:val="24"/>
+              </w:rPr>
+              <w:t> </w:t>
+            </w:r>
+          </w:p>
+        </w:tc>
+        <w:tc>
+          <w:tcPr>
+            <w:tcW w:w="766" w:type="pct"/>
+            <w:tcBorders>
+              <w:top w:val="nil"/>
+              <w:left w:val="nil"/>
+              <w:bottom w:val="single" w:sz="4" w:space="0" w:color="auto"/>
+              <w:right w:val="single" w:sz="4" w:space="0" w:color="auto"/>
+            </w:tcBorders>
+            <w:noWrap/>
+            <w:vAlign w:val="center"/>
+            <w:hideMark/>
+          </w:tcPr>
+          <w:p>
+            <w:pPr>
+              <w:spacing w:after="0" w:line="240" w:lineRule="auto"/>
+              <w:rPr>
+                <w:rFonts w:ascii="Times New Roman" w:eastAsia="Times New Roman" w:hAnsi="Times New Roman" w:cs="Times New Roman"/>
+                <w:sz w:val="24"/>
+                <w:szCs w:val="24"/>
+              </w:rPr>
+            </w:pPr>
+            <w:r>
+              <w:rPr>
+                <w:rFonts w:ascii="Times New Roman" w:eastAsia="Times New Roman" w:hAnsi="Times New Roman" w:cs="Times New Roman"/>
+                <w:sz w:val="24"/>
+                <w:szCs w:val="24"/>
+              </w:rPr>
+              <w:t> </w:t>
+            </w:r>
+          </w:p>
+        </w:tc>
+        <w:tc>
+          <w:tcPr>
+            <w:tcW w:w="1306" w:type="pct"/>
+            <w:tcBorders>
+              <w:top w:val="nil"/>
+              <w:left w:val="nil"/>
+              <w:bottom w:val="single" w:sz="4" w:space="0" w:color="auto"/>
+              <w:right w:val="single" w:sz="4" w:space="0" w:color="auto"/>
+            </w:tcBorders>
+            <w:noWrap/>
+            <w:vAlign w:val="center"/>
+            <w:hideMark/>
+          </w:tcPr>
+          <w:p>
+            <w:pPr>
+              <w:spacing w:after="0" w:line="240" w:lineRule="auto"/>
+              <w:rPr>
+                <w:rFonts w:ascii="Times New Roman" w:eastAsia="Times New Roman" w:hAnsi="Times New Roman" w:cs="Times New Roman"/>
+                <w:sz w:val="24"/>
+                <w:szCs w:val="24"/>
+              </w:rPr>
+            </w:pPr>
+            <w:r>
+              <w:rPr>
+                <w:rFonts w:ascii="Times New Roman" w:eastAsia="Times New Roman" w:hAnsi="Times New Roman" w:cs="Times New Roman"/>
+                <w:sz w:val="24"/>
+                <w:szCs w:val="24"/>
+              </w:rPr>
+              <w:t>[PA.Tổng doanh thu dự kiến]</w:t>
+            </w:r>
+          </w:p>
+        </w:tc>
+      </w:tr>
+      <w:tr>
+        <w:trPr>
+          <w:trHeight w:val="312"/>
+        </w:trPr>
+        <w:tc>
+          <w:tcPr>
+            <w:tcW w:w="1028" w:type="pct"/>
+            <w:tcBorders>
+              <w:top w:val="nil"/>
+              <w:left w:val="single" w:sz="4" w:space="0" w:color="auto"/>
+              <w:bottom w:val="single" w:sz="4" w:space="0" w:color="auto"/>
+              <w:right w:val="single" w:sz="4" w:space="0" w:color="auto"/>
+            </w:tcBorders>
+            <w:noWrap/>
+            <w:vAlign w:val="center"/>
+            <w:hideMark/>
+          </w:tcPr>
+          <w:p>
+            <w:pPr>
+              <w:spacing w:after="0" w:line="240" w:lineRule="auto"/>
+              <w:rPr>
+                <w:rFonts w:ascii="Times New Roman" w:eastAsia="Times New Roman" w:hAnsi="Times New Roman" w:cs="Times New Roman"/>
+                <w:sz w:val="24"/>
+                <w:szCs w:val="24"/>
+              </w:rPr>
+            </w:pPr>
+            <w:r>
+              <w:rPr>
+                <w:rFonts w:ascii="Times New Roman" w:eastAsia="Times New Roman" w:hAnsi="Times New Roman" w:cs="Times New Roman"/>
+                <w:sz w:val="24"/>
+                <w:szCs w:val="24"/>
+              </w:rPr>
+              <w:t>[#PA_DOANHTHU]</w:t>
+            </w:r>
+          </w:p>
+        </w:tc>
+        <w:tc>
+          <w:tcPr>
+            <w:tcW w:w="766" w:type="pct"/>
+            <w:tcBorders>
+              <w:top w:val="nil"/>
+              <w:left w:val="nil"/>
+              <w:bottom w:val="single" w:sz="4" w:space="0" w:color="auto"/>
+              <w:right w:val="single" w:sz="4" w:space="0" w:color="auto"/>
+            </w:tcBorders>
+            <w:noWrap/>
+            <w:vAlign w:val="center"/>
+            <w:hideMark/>
+          </w:tcPr>
+          <w:p>
+            <w:pPr>
+              <w:spacing w:after="0" w:line="240" w:lineRule="auto"/>
+              <w:rPr>
+                <w:rFonts w:ascii="Times New Roman" w:eastAsia="Times New Roman" w:hAnsi="Times New Roman" w:cs="Times New Roman"/>
+                <w:sz w:val="24"/>
+                <w:szCs w:val="24"/>
+              </w:rPr>
+            </w:pPr>
+            <w:r>
+              <w:rPr>
+                <w:rFonts w:ascii="Times New Roman" w:eastAsia="Times New Roman" w:hAnsi="Times New Roman" w:cs="Times New Roman"/>
+                <w:sz w:val="24"/>
+                <w:szCs w:val="24"/>
+              </w:rPr>
+              <w:t> </w:t>
+            </w:r>
+          </w:p>
+        </w:tc>
+        <w:tc>
+          <w:tcPr>
+            <w:tcW w:w="549" w:type="pct"/>
+            <w:tcBorders>
+              <w:top w:val="nil"/>
+              <w:left w:val="nil"/>
+              <w:bottom w:val="single" w:sz="4" w:space="0" w:color="auto"/>
+              <w:right w:val="single" w:sz="4" w:space="0" w:color="auto"/>
+            </w:tcBorders>
+            <w:noWrap/>
+            <w:vAlign w:val="center"/>
+            <w:hideMark/>
+          </w:tcPr>
+          <w:p>
+            <w:pPr>
+              <w:spacing w:after="0" w:line="240" w:lineRule="auto"/>
+              <w:jc w:val="center"/>
+              <w:rPr>
+                <w:rFonts w:ascii="Times New Roman" w:eastAsia="Times New Roman" w:hAnsi="Times New Roman" w:cs="Times New Roman"/>
+                <w:sz w:val="24"/>
+                <w:szCs w:val="24"/>
+              </w:rPr>
+            </w:pPr>
+            <w:r>
+              <w:rPr>
+                <w:rFonts w:ascii="Times New Roman" w:eastAsia="Times New Roman" w:hAnsi="Times New Roman" w:cs="Times New Roman"/>
+                <w:sz w:val="24"/>
+                <w:szCs w:val="24"/>
+              </w:rPr>
+              <w:t> </w:t>
+            </w:r>
+          </w:p>
+        </w:tc>
+        <w:tc>
+          <w:tcPr>
+            <w:tcW w:w="585" w:type="pct"/>
+            <w:tcBorders>
+              <w:top w:val="nil"/>
+              <w:left w:val="nil"/>
+              <w:bottom w:val="single" w:sz="4" w:space="0" w:color="auto"/>
+              <w:right w:val="single" w:sz="4" w:space="0" w:color="auto"/>
+            </w:tcBorders>
+            <w:noWrap/>
+            <w:vAlign w:val="center"/>
+            <w:hideMark/>
+          </w:tcPr>
+          <w:p>
+            <w:pPr>
+              <w:spacing w:after="0" w:line="240" w:lineRule="auto"/>
+              <w:rPr>
+                <w:rFonts w:ascii="Times New Roman" w:eastAsia="Times New Roman" w:hAnsi="Times New Roman" w:cs="Times New Roman"/>
+                <w:sz w:val="24"/>
+                <w:szCs w:val="24"/>
+              </w:rPr>
+            </w:pPr>
+            <w:r>
+              <w:rPr>
+                <w:rFonts w:ascii="Times New Roman" w:eastAsia="Times New Roman" w:hAnsi="Times New Roman" w:cs="Times New Roman"/>
+                <w:sz w:val="24"/>
+                <w:szCs w:val="24"/>
+              </w:rPr>
+              <w:t> </w:t>
+            </w:r>
+          </w:p>
+        </w:tc>
+        <w:tc>
+          <w:tcPr>
+            <w:tcW w:w="766" w:type="pct"/>
+            <w:tcBorders>
+              <w:top w:val="nil"/>
+              <w:left w:val="nil"/>
+              <w:bottom w:val="single" w:sz="4" w:space="0" w:color="auto"/>
+              <w:right w:val="single" w:sz="4" w:space="0" w:color="auto"/>
+            </w:tcBorders>
+            <w:noWrap/>
+            <w:vAlign w:val="center"/>
+            <w:hideMark/>
+          </w:tcPr>
+          <w:p>
+            <w:pPr>
+              <w:spacing w:after="0" w:line="240" w:lineRule="auto"/>
+              <w:rPr>
+                <w:rFonts w:ascii="Times New Roman" w:eastAsia="Times New Roman" w:hAnsi="Times New Roman" w:cs="Times New Roman"/>
+                <w:sz w:val="24"/>
+                <w:szCs w:val="24"/>
+              </w:rPr>
+            </w:pPr>
+            <w:r>
+              <w:rPr>
+                <w:rFonts w:ascii="Times New Roman" w:eastAsia="Times New Roman" w:hAnsi="Times New Roman" w:cs="Times New Roman"/>
+                <w:sz w:val="24"/>
+                <w:szCs w:val="24"/>
+              </w:rPr>
+              <w:t> </w:t>
+            </w:r>
+          </w:p>
+        </w:tc>
+        <w:tc>
+          <w:tcPr>
+            <w:tcW w:w="1306" w:type="pct"/>
+            <w:tcBorders>
+              <w:top w:val="nil"/>
+              <w:left w:val="nil"/>
+              <w:bottom w:val="single" w:sz="4" w:space="0" w:color="auto"/>
+              <w:right w:val="single" w:sz="4" w:space="0" w:color="auto"/>
+            </w:tcBorders>
+            <w:noWrap/>
+            <w:vAlign w:val="center"/>
+            <w:hideMark/>
+          </w:tcPr>
+          <w:p>
+            <w:pPr>
+              <w:spacing w:after="0" w:line="240" w:lineRule="auto"/>
+              <w:rPr>
+                <w:rFonts w:ascii="Times New Roman" w:eastAsia="Times New Roman" w:hAnsi="Times New Roman" w:cs="Times New Roman"/>
+                <w:sz w:val="24"/>
+                <w:szCs w:val="24"/>
+              </w:rPr>
+            </w:pPr>
+            <w:r>
+              <w:rPr>
+                <w:rFonts w:ascii="Times New Roman" w:eastAsia="Times New Roman" w:hAnsi="Times New Roman" w:cs="Times New Roman"/>
+                <w:sz w:val="24"/>
+                <w:szCs w:val="24"/>
+              </w:rPr>
+              <w:t> </w:t>
+            </w:r>
+          </w:p>
+        </w:tc>
+      </w:tr>
+      <w:tr>
+        <w:trPr>
+          <w:trHeight w:val="312"/>
+        </w:trPr>
+        <w:tc>
+          <w:tcPr>
+            <w:tcW w:w="1028" w:type="pct"/>
+            <w:tcBorders>
+              <w:top w:val="nil"/>
+              <w:left w:val="single" w:sz="4" w:space="0" w:color="auto"/>
+              <w:bottom w:val="single" w:sz="4" w:space="0" w:color="auto"/>
+              <w:right w:val="single" w:sz="4" w:space="0" w:color="auto"/>
+            </w:tcBorders>
+            <w:noWrap/>
+            <w:vAlign w:val="center"/>
+            <w:hideMark/>
+          </w:tcPr>
+          <w:p>
+            <w:pPr>
+              <w:spacing w:after="0" w:line="240" w:lineRule="auto"/>
+              <w:jc w:val="center"/>
+              <w:rPr>
+                <w:rFonts w:ascii="Times New Roman" w:eastAsia="Times New Roman" w:hAnsi="Times New Roman" w:cs="Times New Roman"/>
+                <w:sz w:val="24"/>
+                <w:szCs w:val="24"/>
+              </w:rPr>
+            </w:pPr>
+            <w:r>
+              <w:rPr>
+                <w:rFonts w:ascii="Times New Roman" w:eastAsia="Times New Roman" w:hAnsi="Times New Roman" w:cs="Times New Roman"/>
+                <w:sz w:val="24"/>
+                <w:szCs w:val="24"/>
+              </w:rPr>
+              <w:t>[STT]</w:t>
+            </w:r>
+          </w:p>
+        </w:tc>
+        <w:tc>
+          <w:tcPr>
+            <w:tcW w:w="766" w:type="pct"/>
+            <w:tcBorders>
+              <w:top w:val="nil"/>
+              <w:left w:val="nil"/>
+              <w:bottom w:val="single" w:sz="4" w:space="0" w:color="auto"/>
+              <w:right w:val="single" w:sz="4" w:space="0" w:color="auto"/>
+            </w:tcBorders>
+            <w:noWrap/>
+            <w:vAlign w:val="center"/>
+            <w:hideMark/>
+          </w:tcPr>
+          <w:p>
+            <w:pPr>
+              <w:spacing w:after="0" w:line="240" w:lineRule="auto"/>
+              <w:rPr>
+                <w:rFonts w:ascii="Times New Roman" w:eastAsia="Times New Roman" w:hAnsi="Times New Roman" w:cs="Times New Roman"/>
+                <w:sz w:val="24"/>
+                <w:szCs w:val="24"/>
+              </w:rPr>
+            </w:pPr>
+            <w:r>
+              <w:rPr>
+                <w:rFonts w:ascii="Times New Roman" w:eastAsia="Times New Roman" w:hAnsi="Times New Roman" w:cs="Times New Roman"/>
+                <w:sz w:val="24"/>
+                <w:szCs w:val="24"/>
+              </w:rPr>
+              <w:t>[Hạng mục]</w:t>
+            </w:r>
+          </w:p>
+        </w:tc>
+        <w:tc>
+          <w:tcPr>
+            <w:tcW w:w="549" w:type="pct"/>
+            <w:tcBorders>
+              <w:top w:val="nil"/>
+              <w:left w:val="nil"/>
+              <w:bottom w:val="single" w:sz="4" w:space="0" w:color="auto"/>
+              <w:right w:val="single" w:sz="4" w:space="0" w:color="auto"/>
+            </w:tcBorders>
+            <w:noWrap/>
+            <w:vAlign w:val="center"/>
+            <w:hideMark/>
+          </w:tcPr>
+          <w:p>
+            <w:pPr>
+              <w:spacing w:after="0" w:line="240" w:lineRule="auto"/>
+              <w:jc w:val="center"/>
+              <w:rPr>
+                <w:rFonts w:ascii="Times New Roman" w:eastAsia="Times New Roman" w:hAnsi="Times New Roman" w:cs="Times New Roman"/>
+                <w:sz w:val="24"/>
+                <w:szCs w:val="24"/>
+              </w:rPr>
+            </w:pPr>
+            <w:r>
+              <w:rPr>
+                <w:rFonts w:ascii="Times New Roman" w:eastAsia="Times New Roman" w:hAnsi="Times New Roman" w:cs="Times New Roman"/>
+                <w:sz w:val="24"/>
+                <w:szCs w:val="24"/>
+              </w:rPr>
+              <w:t>[ĐVT]</w:t>
+            </w:r>
+          </w:p>
+        </w:tc>
+        <w:tc>
+          <w:tcPr>
+            <w:tcW w:w="585" w:type="pct"/>
+            <w:tcBorders>
+              <w:top w:val="nil"/>
+              <w:left w:val="nil"/>
+              <w:bottom w:val="single" w:sz="4" w:space="0" w:color="auto"/>
+              <w:right w:val="single" w:sz="4" w:space="0" w:color="auto"/>
+            </w:tcBorders>
+            <w:noWrap/>
+            <w:vAlign w:val="center"/>
+            <w:hideMark/>
+          </w:tcPr>
+          <w:p>
+            <w:pPr>
+              <w:spacing w:after="0" w:line="240" w:lineRule="auto"/>
+              <w:rPr>
+                <w:rFonts w:ascii="Times New Roman" w:eastAsia="Times New Roman" w:hAnsi="Times New Roman" w:cs="Times New Roman"/>
+                <w:sz w:val="24"/>
+                <w:szCs w:val="24"/>
+              </w:rPr>
+            </w:pPr>
+            <w:r>
+              <w:rPr>
+                <w:rFonts w:ascii="Times New Roman" w:eastAsia="Times New Roman" w:hAnsi="Times New Roman" w:cs="Times New Roman"/>
+                <w:sz w:val="24"/>
+                <w:szCs w:val="24"/>
+              </w:rPr>
+              <w:t>[Đơn giá]</w:t>
+            </w:r>
+          </w:p>
+        </w:tc>
+        <w:tc>
+          <w:tcPr>
+            <w:tcW w:w="766" w:type="pct"/>
+            <w:tcBorders>
+              <w:top w:val="nil"/>
+              <w:left w:val="nil"/>
+              <w:bottom w:val="single" w:sz="4" w:space="0" w:color="auto"/>
+              <w:right w:val="single" w:sz="4" w:space="0" w:color="auto"/>
+            </w:tcBorders>
+            <w:noWrap/>
+            <w:vAlign w:val="center"/>
+            <w:hideMark/>
+          </w:tcPr>
+          <w:p>
+            <w:pPr>
+              <w:spacing w:after="0" w:line="240" w:lineRule="auto"/>
+              <w:rPr>
+                <w:rFonts w:ascii="Times New Roman" w:eastAsia="Times New Roman" w:hAnsi="Times New Roman" w:cs="Times New Roman"/>
+                <w:sz w:val="24"/>
+                <w:szCs w:val="24"/>
+              </w:rPr>
+            </w:pPr>
+            <w:r>
+              <w:rPr>
+                <w:rFonts w:ascii="Times New Roman" w:eastAsia="Times New Roman" w:hAnsi="Times New Roman" w:cs="Times New Roman"/>
+                <w:sz w:val="24"/>
+                <w:szCs w:val="24"/>
+              </w:rPr>
+              <w:t>[Số lượng]</w:t>
+            </w:r>
+          </w:p>
+        </w:tc>
+        <w:tc>
+          <w:tcPr>
+            <w:tcW w:w="1306" w:type="pct"/>
+            <w:tcBorders>
+              <w:top w:val="nil"/>
+              <w:left w:val="nil"/>
+              <w:bottom w:val="single" w:sz="4" w:space="0" w:color="auto"/>
+              <w:right w:val="single" w:sz="4" w:space="0" w:color="auto"/>
+            </w:tcBorders>
+            <w:noWrap/>
+            <w:vAlign w:val="center"/>
+            <w:hideMark/>
+          </w:tcPr>
+          <w:p>
+            <w:pPr>
+              <w:spacing w:after="0" w:line="240" w:lineRule="auto"/>
+              <w:rPr>
+                <w:rFonts w:ascii="Times New Roman" w:eastAsia="Times New Roman" w:hAnsi="Times New Roman" w:cs="Times New Roman"/>
+                <w:sz w:val="24"/>
+                <w:szCs w:val="24"/>
+              </w:rPr>
+            </w:pPr>
+            <w:r>
+              <w:rPr>
+                <w:rFonts w:ascii="Times New Roman" w:eastAsia="Times New Roman" w:hAnsi="Times New Roman" w:cs="Times New Roman"/>
+                <w:sz w:val="24"/>
+                <w:szCs w:val="24"/>
+              </w:rPr>
+              <w:t>[Thành tiền]</w:t>
+            </w:r>
+          </w:p>
+        </w:tc>
+      </w:tr>
+      <w:tr>
+        <w:trPr>
+          <w:trHeight w:val="312"/>
+        </w:trPr>
+        <w:tc>
+          <w:tcPr>
+            <w:tcW w:w="1028" w:type="pct"/>
+            <w:tcBorders>
+              <w:top w:val="nil"/>
+              <w:left w:val="single" w:sz="4" w:space="0" w:color="auto"/>
+              <w:bottom w:val="single" w:sz="4" w:space="0" w:color="auto"/>
+              <w:right w:val="single" w:sz="4" w:space="0" w:color="auto"/>
+            </w:tcBorders>
+            <w:noWrap/>
+            <w:vAlign w:val="center"/>
+            <w:hideMark/>
+          </w:tcPr>
+          <w:p>
+            <w:pPr>
+              <w:spacing w:after="0" w:line="240" w:lineRule="auto"/>
+              <w:rPr>
+                <w:rFonts w:ascii="Times New Roman" w:eastAsia="Times New Roman" w:hAnsi="Times New Roman" w:cs="Times New Roman"/>
+                <w:sz w:val="24"/>
+                <w:szCs w:val="24"/>
+              </w:rPr>
+            </w:pPr>
+            <w:r>
+              <w:rPr>
+                <w:rFonts w:ascii="Times New Roman" w:eastAsia="Times New Roman" w:hAnsi="Times New Roman" w:cs="Times New Roman"/>
+                <w:sz w:val="24"/>
+                <w:szCs w:val="24"/>
+              </w:rPr>
+              <w:t>[/PA_DOANHTHU]</w:t>
+            </w:r>
+          </w:p>
+        </w:tc>
+        <w:tc>
+          <w:tcPr>
+            <w:tcW w:w="766" w:type="pct"/>
+            <w:tcBorders>
+              <w:top w:val="nil"/>
+              <w:left w:val="nil"/>
+              <w:bottom w:val="single" w:sz="4" w:space="0" w:color="auto"/>
+              <w:right w:val="single" w:sz="4" w:space="0" w:color="auto"/>
+            </w:tcBorders>
+            <w:noWrap/>
+            <w:vAlign w:val="center"/>
+            <w:hideMark/>
+          </w:tcPr>
+          <w:p>
+            <w:pPr>
+              <w:spacing w:after="0" w:line="240" w:lineRule="auto"/>
+              <w:rPr>
+                <w:rFonts w:ascii="Times New Roman" w:eastAsia="Times New Roman" w:hAnsi="Times New Roman" w:cs="Times New Roman"/>
+                <w:sz w:val="24"/>
+                <w:szCs w:val="24"/>
+              </w:rPr>
+            </w:pPr>
+            <w:r>
+              <w:rPr>
+                <w:rFonts w:ascii="Times New Roman" w:eastAsia="Times New Roman" w:hAnsi="Times New Roman" w:cs="Times New Roman"/>
+                <w:sz w:val="24"/>
+                <w:szCs w:val="24"/>
+              </w:rPr>
+              <w:t> </w:t>
+            </w:r>
+          </w:p>
+        </w:tc>
+        <w:tc>
+          <w:tcPr>
+            <w:tcW w:w="549" w:type="pct"/>
+            <w:tcBorders>
+              <w:top w:val="nil"/>
+              <w:left w:val="nil"/>
+              <w:bottom w:val="single" w:sz="4" w:space="0" w:color="auto"/>
+              <w:right w:val="single" w:sz="4" w:space="0" w:color="auto"/>
+            </w:tcBorders>
+            <w:noWrap/>
+            <w:vAlign w:val="center"/>
+            <w:hideMark/>
+          </w:tcPr>
+          <w:p>
+            <w:pPr>
+              <w:spacing w:after="0" w:line="240" w:lineRule="auto"/>
+              <w:jc w:val="center"/>
+              <w:rPr>
+                <w:rFonts w:ascii="Times New Roman" w:eastAsia="Times New Roman" w:hAnsi="Times New Roman" w:cs="Times New Roman"/>
+                <w:sz w:val="24"/>
+                <w:szCs w:val="24"/>
+              </w:rPr>
+            </w:pPr>
+            <w:r>
+              <w:rPr>
+                <w:rFonts w:ascii="Times New Roman" w:eastAsia="Times New Roman" w:hAnsi="Times New Roman" w:cs="Times New Roman"/>
+                <w:sz w:val="24"/>
+                <w:szCs w:val="24"/>
+              </w:rPr>
+              <w:t> </w:t>
+            </w:r>
+          </w:p>
+        </w:tc>
+        <w:tc>
+          <w:tcPr>
+            <w:tcW w:w="585" w:type="pct"/>
+            <w:tcBorders>
+              <w:top w:val="nil"/>
+              <w:left w:val="nil"/>
+              <w:bottom w:val="single" w:sz="4" w:space="0" w:color="auto"/>
+              <w:right w:val="single" w:sz="4" w:space="0" w:color="auto"/>
+            </w:tcBorders>
+            <w:noWrap/>
+            <w:vAlign w:val="center"/>
+            <w:hideMark/>
+          </w:tcPr>
+          <w:p>
+            <w:pPr>
+              <w:spacing w:after="0" w:line="240" w:lineRule="auto"/>
+              <w:rPr>
+                <w:rFonts w:ascii="Times New Roman" w:eastAsia="Times New Roman" w:hAnsi="Times New Roman" w:cs="Times New Roman"/>
+                <w:sz w:val="24"/>
+                <w:szCs w:val="24"/>
+              </w:rPr>
+            </w:pPr>
+            <w:r>
+              <w:rPr>
+                <w:rFonts w:ascii="Times New Roman" w:eastAsia="Times New Roman" w:hAnsi="Times New Roman" w:cs="Times New Roman"/>
+                <w:sz w:val="24"/>
+                <w:szCs w:val="24"/>
+              </w:rPr>
+              <w:t> </w:t>
+            </w:r>
+          </w:p>
+        </w:tc>
+        <w:tc>
+          <w:tcPr>
+            <w:tcW w:w="766" w:type="pct"/>
+            <w:tcBorders>
+              <w:top w:val="nil"/>
+              <w:left w:val="nil"/>
+              <w:bottom w:val="single" w:sz="4" w:space="0" w:color="auto"/>
+              <w:right w:val="single" w:sz="4" w:space="0" w:color="auto"/>
+            </w:tcBorders>
+            <w:noWrap/>
+            <w:vAlign w:val="center"/>
+            <w:hideMark/>
+          </w:tcPr>
+          <w:p>
+            <w:pPr>
+              <w:spacing w:after="0" w:line="240" w:lineRule="auto"/>
+              <w:rPr>
+                <w:rFonts w:ascii="Times New Roman" w:eastAsia="Times New Roman" w:hAnsi="Times New Roman" w:cs="Times New Roman"/>
+                <w:sz w:val="24"/>
+                <w:szCs w:val="24"/>
+              </w:rPr>
+            </w:pPr>
+            <w:r>
+              <w:rPr>
+                <w:rFonts w:ascii="Times New Roman" w:eastAsia="Times New Roman" w:hAnsi="Times New Roman" w:cs="Times New Roman"/>
+                <w:sz w:val="24"/>
+                <w:szCs w:val="24"/>
+              </w:rPr>
+              <w:t> </w:t>
+            </w:r>
+          </w:p>
+        </w:tc>
+        <w:tc>
+          <w:tcPr>
+            <w:tcW w:w="1306" w:type="pct"/>
+            <w:tcBorders>
+              <w:top w:val="nil"/>
+              <w:left w:val="nil"/>
+              <w:bottom w:val="single" w:sz="4" w:space="0" w:color="auto"/>
+              <w:right w:val="single" w:sz="4" w:space="0" w:color="auto"/>
+            </w:tcBorders>
+            <w:noWrap/>
+            <w:vAlign w:val="center"/>
+            <w:hideMark/>
+          </w:tcPr>
+          <w:p>
+            <w:pPr>
+              <w:spacing w:after="0" w:line="240" w:lineRule="auto"/>
+              <w:rPr>
+                <w:rFonts w:ascii="Times New Roman" w:eastAsia="Times New Roman" w:hAnsi="Times New Roman" w:cs="Times New Roman"/>
+                <w:sz w:val="24"/>
+                <w:szCs w:val="24"/>
+              </w:rPr>
+            </w:pPr>
+            <w:r>
+              <w:rPr>
+                <w:rFonts w:ascii="Times New Roman" w:eastAsia="Times New Roman" w:hAnsi="Times New Roman" w:cs="Times New Roman"/>
+                <w:sz w:val="24"/>
+                <w:szCs w:val="24"/>
+              </w:rPr>
+              <w:t> </w:t>
+            </w:r>
+          </w:p>
+        </w:tc>
+      </w:tr>
+      <w:tr>
+        <w:trPr>
+          <w:trHeight w:val="312"/>
+        </w:trPr>
+        <w:tc>
+          <w:tcPr>
+            <w:tcW w:w="1028" w:type="pct"/>
+            <w:tcBorders>
+              <w:top w:val="nil"/>
+              <w:left w:val="single" w:sz="4" w:space="0" w:color="auto"/>
+              <w:bottom w:val="single" w:sz="4" w:space="0" w:color="auto"/>
+              <w:right w:val="single" w:sz="4" w:space="0" w:color="auto"/>
+            </w:tcBorders>
+            <w:noWrap/>
+            <w:vAlign w:val="center"/>
+            <w:hideMark/>
+          </w:tcPr>
+          <w:p>
+            <w:pPr>
+              <w:spacing w:after="0" w:line="240" w:lineRule="auto"/>
+              <w:jc w:val="center"/>
+              <w:rPr>
+                <w:rFonts w:ascii="Times New Roman" w:eastAsia="Times New Roman" w:hAnsi="Times New Roman" w:cs="Times New Roman"/>
+                <w:sz w:val="24"/>
+                <w:szCs w:val="24"/>
+              </w:rPr>
+            </w:pPr>
+            <w:r>
+              <w:rPr>
+                <w:rFonts w:ascii="Times New Roman" w:eastAsia="Times New Roman" w:hAnsi="Times New Roman" w:cs="Times New Roman"/>
+                <w:sz w:val="24"/>
+                <w:szCs w:val="24"/>
+              </w:rPr>
+              <w:t>III</w:t>
+            </w:r>
+          </w:p>
+        </w:tc>
+        <w:tc>
+          <w:tcPr>
+            <w:tcW w:w="766" w:type="pct"/>
+            <w:tcBorders>
+              <w:top w:val="nil"/>
+              <w:left w:val="nil"/>
+              <w:bottom w:val="single" w:sz="4" w:space="0" w:color="auto"/>
+              <w:right w:val="single" w:sz="4" w:space="0" w:color="auto"/>
+            </w:tcBorders>
+            <w:noWrap/>
+            <w:vAlign w:val="center"/>
+            <w:hideMark/>
+          </w:tcPr>
+          <w:p>
+            <w:pPr>
+              <w:spacing w:after="0" w:line="240" w:lineRule="auto"/>
+              <w:rPr>
+                <w:rFonts w:ascii="Times New Roman" w:eastAsia="Times New Roman" w:hAnsi="Times New Roman" w:cs="Times New Roman"/>
+                <w:sz w:val="24"/>
+                <w:szCs w:val="24"/>
+              </w:rPr>
+            </w:pPr>
+            <w:r>
+              <w:rPr>
+                <w:rFonts w:ascii="Times New Roman" w:eastAsia="Times New Roman" w:hAnsi="Times New Roman" w:cs="Times New Roman"/>
+                <w:sz w:val="24"/>
+                <w:szCs w:val="24"/>
+              </w:rPr>
+              <w:t>LÃI(+), LỖ(-)</w:t>
+            </w:r>
+          </w:p>
+        </w:tc>
+        <w:tc>
+          <w:tcPr>
+            <w:tcW w:w="549" w:type="pct"/>
+            <w:tcBorders>
+              <w:top w:val="nil"/>
+              <w:left w:val="nil"/>
+              <w:bottom w:val="single" w:sz="4" w:space="0" w:color="auto"/>
+              <w:right w:val="single" w:sz="4" w:space="0" w:color="auto"/>
+            </w:tcBorders>
+            <w:noWrap/>
+            <w:vAlign w:val="center"/>
+            <w:hideMark/>
+          </w:tcPr>
+          <w:p>
+            <w:pPr>
+              <w:spacing w:after="0" w:line="240" w:lineRule="auto"/>
+              <w:jc w:val="center"/>
+              <w:rPr>
+                <w:rFonts w:ascii="Times New Roman" w:eastAsia="Times New Roman" w:hAnsi="Times New Roman" w:cs="Times New Roman"/>
+                <w:sz w:val="24"/>
+                <w:szCs w:val="24"/>
+              </w:rPr>
+            </w:pPr>
+            <w:r>
+              <w:rPr>
+                <w:rFonts w:ascii="Times New Roman" w:eastAsia="Times New Roman" w:hAnsi="Times New Roman" w:cs="Times New Roman"/>
+                <w:sz w:val="24"/>
+                <w:szCs w:val="24"/>
+              </w:rPr>
+              <w:t> </w:t>
+            </w:r>
+          </w:p>
+        </w:tc>
+        <w:tc>
+          <w:tcPr>
+            <w:tcW w:w="585" w:type="pct"/>
+            <w:tcBorders>
+              <w:top w:val="nil"/>
+              <w:left w:val="nil"/>
+              <w:bottom w:val="single" w:sz="4" w:space="0" w:color="auto"/>
+              <w:right w:val="single" w:sz="4" w:space="0" w:color="auto"/>
+            </w:tcBorders>
+            <w:noWrap/>
+            <w:vAlign w:val="center"/>
+            <w:hideMark/>
+          </w:tcPr>
+          <w:p>
+            <w:pPr>
+              <w:spacing w:after="0" w:line="240" w:lineRule="auto"/>
+              <w:rPr>
+                <w:rFonts w:ascii="Times New Roman" w:eastAsia="Times New Roman" w:hAnsi="Times New Roman" w:cs="Times New Roman"/>
+                <w:sz w:val="24"/>
+                <w:szCs w:val="24"/>
+              </w:rPr>
+            </w:pPr>
+            <w:r>
+              <w:rPr>
+                <w:rFonts w:ascii="Times New Roman" w:eastAsia="Times New Roman" w:hAnsi="Times New Roman" w:cs="Times New Roman"/>
+                <w:sz w:val="24"/>
+                <w:szCs w:val="24"/>
+              </w:rPr>
+              <w:t> </w:t>
+            </w:r>
+          </w:p>
+        </w:tc>
+        <w:tc>
+          <w:tcPr>
+            <w:tcW w:w="766" w:type="pct"/>
+            <w:tcBorders>
+              <w:top w:val="nil"/>
+              <w:left w:val="nil"/>
+              <w:bottom w:val="single" w:sz="4" w:space="0" w:color="auto"/>
+              <w:right w:val="single" w:sz="4" w:space="0" w:color="auto"/>
+            </w:tcBorders>
+            <w:noWrap/>
+            <w:vAlign w:val="center"/>
+            <w:hideMark/>
+          </w:tcPr>
+          <w:p>
+            <w:pPr>
+              <w:spacing w:after="0" w:line="240" w:lineRule="auto"/>
+              <w:rPr>
+                <w:rFonts w:ascii="Times New Roman" w:eastAsia="Times New Roman" w:hAnsi="Times New Roman" w:cs="Times New Roman"/>
+                <w:sz w:val="24"/>
+                <w:szCs w:val="24"/>
+              </w:rPr>
+            </w:pPr>
+            <w:r>
+              <w:rPr>
+                <w:rFonts w:ascii="Times New Roman" w:eastAsia="Times New Roman" w:hAnsi="Times New Roman" w:cs="Times New Roman"/>
+                <w:sz w:val="24"/>
+                <w:szCs w:val="24"/>
+              </w:rPr>
+              <w:t> </w:t>
+            </w:r>
+          </w:p>
+        </w:tc>
+        <w:tc>
+          <w:tcPr>
+            <w:tcW w:w="1306" w:type="pct"/>
+            <w:tcBorders>
+              <w:top w:val="nil"/>
+              <w:left w:val="nil"/>
+              <w:bottom w:val="single" w:sz="4" w:space="0" w:color="auto"/>
+              <w:right w:val="single" w:sz="4" w:space="0" w:color="auto"/>
+            </w:tcBorders>
+            <w:noWrap/>
+            <w:vAlign w:val="center"/>
+            <w:hideMark/>
+          </w:tcPr>
+          <w:p>
+            <w:pPr>
+              <w:spacing w:after="0" w:line="240" w:lineRule="auto"/>
+              <w:rPr>
+                <w:rFonts w:ascii="Times New Roman" w:eastAsia="Times New Roman" w:hAnsi="Times New Roman" w:cs="Times New Roman"/>
+                <w:sz w:val="24"/>
+                <w:szCs w:val="24"/>
+              </w:rPr>
+            </w:pPr>
+            <w:r>
+              <w:rPr>
+                <w:rFonts w:ascii="Times New Roman" w:eastAsia="Times New Roman" w:hAnsi="Times New Roman" w:cs="Times New Roman"/>
                 <w:sz w:val="24"/>
                 <w:szCs w:val="24"/>
               </w:rPr>
@@ -12850,6 +13999,7 @@
           <w:szCs w:val="28"/>
           <w:lang w:val="de-DE"/>
         </w:rPr>
+        <w:lastRenderedPageBreak/>
         <w:t xml:space="preserve">* Nhận xét khả năng, nguồn trả nợ của khách hàng: Nguồn trả nợ của khách hàng hợp pháp, </w:t>
       </w:r>
       <w:r>
@@ -13149,7 +14299,6 @@
                 <w:color w:val="000000"/>
                 <w:sz w:val="26"/>
               </w:rPr>
-              <w:lastRenderedPageBreak/>
               <w:t>[#NLQ]</w:t>
             </w:r>
           </w:p>
@@ -14343,6 +15492,7 @@
           <w:szCs w:val="28"/>
           <w:lang w:val="pt-BR"/>
         </w:rPr>
+        <w:lastRenderedPageBreak/>
         <w:t>- Mục đích vay: [HĐTD.Mục đích vay]</w:t>
       </w:r>
       <w:r>

</xml_diff>

<commit_message>
docs: update KHCN report templates and add new forms
- Update 6 existing BCDXCV/HDTD/nghiệm thu templates
- Add BCDXCV ngắn hạn có TSBĐ, HDTD trung dài hạn, PASDV, phiếu tra cứu
- Move PASDV from xlsx to PASDV folder
</commit_message>
<xml_diff>
--- a/report_assets/KHCN templates/Báo cáo đề xuất/2268.02B BCDXCV ngan han HMTD.docx
+++ b/report_assets/KHCN templates/Báo cáo đề xuất/2268.02B BCDXCV ngan han HMTD.docx
@@ -114,7 +114,7 @@
                 </mc:Choice>
                 <mc:Fallback>
                   <w:pict>
-                    <v:line w14:anchorId="7CD0301C" id="Straight Connector 1" o:spid="_x0000_s1026" style="position:absolute;z-index:251660288;visibility:visible;mso-wrap-style:square;mso-wrap-distance-left:9pt;mso-wrap-distance-top:0;mso-wrap-distance-right:9pt;mso-wrap-distance-bottom:0;mso-position-horizontal:center;mso-position-horizontal-relative:margin;mso-position-vertical:absolute;mso-position-vertical-relative:text" from="0,16.5pt" to="108pt,16.5pt" o:gfxdata="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">
+                    <v:line w14:anchorId="4A45B643" id="Straight Connector 1" o:spid="_x0000_s1026" style="position:absolute;z-index:251660288;visibility:visible;mso-wrap-style:square;mso-wrap-distance-left:9pt;mso-wrap-distance-top:0;mso-wrap-distance-right:9pt;mso-wrap-distance-bottom:0;mso-position-horizontal:center;mso-position-horizontal-relative:margin;mso-position-vertical:absolute;mso-position-vertical-relative:text" from="0,16.5pt" to="108pt,16.5pt" o:gfxdata="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">
                       <w10:wrap anchorx="margin"/>
                     </v:line>
                   </w:pict>
@@ -266,7 +266,7 @@
                 </mc:Choice>
                 <mc:Fallback>
                   <w:pict>
-                    <v:shapetype w14:anchorId="1CDAD95E" id="_x0000_t32" coordsize="21600,21600" o:spt="32" o:oned="t" path="m,l21600,21600e" filled="f">
+                    <v:shapetype w14:anchorId="3553722B" id="_x0000_t32" coordsize="21600,21600" o:spt="32" o:oned="t" path="m,l21600,21600e" filled="f">
                       <v:path arrowok="t" fillok="f" o:connecttype="none"/>
                       <o:lock v:ext="edit" shapetype="t"/>
                     </v:shapetype>
@@ -6177,6 +6177,139 @@
           <w:szCs w:val="26"/>
         </w:rPr>
         <w:t>- Ghi chú: [Ghi chú]</w:t>
+      </w:r>
+    </w:p>
+    <w:p>
+      <w:pPr>
+        <w:widowControl w:val="0"/>
+        <w:spacing w:line="276" w:lineRule="auto"/>
+        <w:ind w:firstLine="567"/>
+        <w:contextualSpacing/>
+        <w:jc w:val="both"/>
+        <w:rPr>
+          <w:rFonts w:ascii="Times New Roman" w:hAnsi="Times New Roman"/>
+          <w:bCs/>
+          <w:sz w:val="26"/>
+          <w:szCs w:val="26"/>
+          <w:lang w:val="fr-FR"/>
+        </w:rPr>
+      </w:pPr>
+      <w:r>
+        <w:rPr>
+          <w:rFonts w:ascii="Times New Roman" w:hAnsi="Times New Roman"/>
+          <w:bCs/>
+          <w:sz w:val="26"/>
+          <w:szCs w:val="26"/>
+          <w:lang w:val="fr-FR"/>
+        </w:rPr>
+        <w:t xml:space="preserve">c) Xác định tình trạng tài sản: [Tình trạng sử dụng TS] </w:t>
+      </w:r>
+    </w:p>
+    <w:p>
+      <w:pPr>
+        <w:widowControl w:val="0"/>
+        <w:spacing w:line="276" w:lineRule="auto"/>
+        <w:ind w:firstLine="567"/>
+        <w:contextualSpacing/>
+        <w:jc w:val="both"/>
+        <w:rPr>
+          <w:rFonts w:ascii="Times New Roman" w:hAnsi="Times New Roman"/>
+          <w:bCs/>
+          <w:sz w:val="26"/>
+          <w:szCs w:val="26"/>
+          <w:lang w:val="fr-FR"/>
+        </w:rPr>
+      </w:pPr>
+      <w:r>
+        <w:rPr>
+          <w:rFonts w:ascii="Times New Roman" w:hAnsi="Times New Roman"/>
+          <w:bCs/>
+          <w:sz w:val="26"/>
+          <w:szCs w:val="26"/>
+          <w:lang w:val="fr-FR"/>
+        </w:rPr>
+        <w:t>d)</w:t>
+      </w:r>
+      <w:r>
+        <w:rPr>
+          <w:rFonts w:ascii="Times New Roman" w:hAnsi="Times New Roman"/>
+          <w:bCs/>
+          <w:sz w:val="26"/>
+          <w:szCs w:val="26"/>
+          <w:lang w:val="fr-FR"/>
+        </w:rPr>
+        <w:t xml:space="preserve"> Xác định tính tranh chấp của tài sản: </w:t>
+      </w:r>
+    </w:p>
+    <w:p>
+      <w:pPr>
+        <w:widowControl w:val="0"/>
+        <w:spacing w:line="276" w:lineRule="auto"/>
+        <w:ind w:firstLine="567"/>
+        <w:contextualSpacing/>
+        <w:jc w:val="both"/>
+        <w:rPr>
+          <w:rFonts w:ascii="Times New Roman" w:hAnsi="Times New Roman"/>
+          <w:bCs/>
+          <w:sz w:val="26"/>
+          <w:szCs w:val="26"/>
+          <w:lang w:val="fr-FR"/>
+        </w:rPr>
+      </w:pPr>
+      <w:r>
+        <w:rPr>
+          <w:rFonts w:ascii="Times New Roman" w:hAnsi="Times New Roman"/>
+          <w:bCs/>
+          <w:sz w:val="26"/>
+          <w:szCs w:val="26"/>
+          <w:lang w:val="fr-FR"/>
+        </w:rPr>
+        <w:t>- Người sử dụng đồng thời là chủ sở hữu tài sản: [Tên chủ sở hữu TS].</w:t>
+      </w:r>
+    </w:p>
+    <w:p>
+      <w:pPr>
+        <w:widowControl w:val="0"/>
+        <w:spacing w:after="0" w:line="276" w:lineRule="auto"/>
+        <w:ind w:firstLine="567"/>
+        <w:contextualSpacing/>
+        <w:jc w:val="both"/>
+        <w:rPr>
+          <w:rFonts w:ascii="Times New Roman" w:eastAsia="Times New Roman" w:hAnsi="Times New Roman" w:cs="Times New Roman"/>
+          <w:sz w:val="26"/>
+          <w:szCs w:val="26"/>
+        </w:rPr>
+      </w:pPr>
+      <w:r>
+        <w:rPr>
+          <w:rFonts w:ascii="Times New Roman" w:hAnsi="Times New Roman"/>
+          <w:bCs/>
+          <w:sz w:val="26"/>
+          <w:szCs w:val="26"/>
+          <w:lang w:val="fr-FR"/>
+        </w:rPr>
+        <w:t xml:space="preserve">- Tại thời điểm thẩm định, tài sản không có tranh chấp, </w:t>
+      </w:r>
+      <w:r>
+        <w:rPr>
+          <w:rFonts w:ascii="Times New Roman" w:hAnsi="Times New Roman"/>
+          <w:bCs/>
+          <w:color w:val="000000" w:themeColor="text1"/>
+          <w:sz w:val="26"/>
+          <w:szCs w:val="26"/>
+          <w:lang w:val="fr-FR"/>
+        </w:rPr>
+        <w:t>toàn bộ thuộc tài sản thế chấp</w:t>
+      </w:r>
+      <w:r>
+        <w:rPr>
+          <w:rFonts w:ascii="Times New Roman" w:hAnsi="Times New Roman"/>
+          <w:bCs/>
+          <w:sz w:val="26"/>
+          <w:szCs w:val="26"/>
+          <w:lang w:val="fr-FR"/>
+        </w:rPr>
+        <w:t>.</w:t>
       </w:r>
     </w:p>
     <w:p>
@@ -7721,7 +7854,18 @@
           <w:szCs w:val="26"/>
           <w:lang w:val="fr-FR"/>
         </w:rPr>
-        <w:t xml:space="preserve"> với phạm vi bảo đảm như sau: Tổng dư nợ gốc và số dư bảo lãnh (nếu có) của tất cả các hợp đồng cấp tín dụng ký giữa Agribank [Tên chi nhánh/PGD</w:t>
+        <w:t xml:space="preserve"> với phạm vi bảo đảm như sau: Tổng dư nợ gốc và số dư bảo lãnh (nếu có) của tất cả các hợp đồng cấp tín dụng ký giữa Agribank [Tên chi </w:t>
+      </w:r>
+      <w:r>
+        <w:rPr>
+          <w:rFonts w:ascii="Times New Roman" w:eastAsia="Calibri" w:hAnsi="Times New Roman" w:cs="Times New Roman"/>
+          <w:bCs/>
+          <w:sz w:val="26"/>
+          <w:szCs w:val="26"/>
+          <w:lang w:val="fr-FR"/>
+        </w:rPr>
+        <w:lastRenderedPageBreak/>
+        <w:t>nhánh/PGD</w:t>
       </w:r>
       <w:r>
         <w:rPr>
@@ -7897,7 +8041,6 @@
           <w:szCs w:val="26"/>
           <w:lang w:val="fr-FR"/>
         </w:rPr>
-        <w:lastRenderedPageBreak/>
         <w:t>- Không giới hạn đối với các khoản lãi trong hạn, lãi quá hạn, các khoản phí và chi phí phát sinh khác liên quan (nếu có).</w:t>
       </w:r>
     </w:p>
@@ -9123,6 +9266,7 @@
           <w:szCs w:val="28"/>
           <w:lang w:val="de-DE"/>
         </w:rPr>
+        <w:lastRenderedPageBreak/>
         <w:t xml:space="preserve">3. Thẩm định </w:t>
       </w:r>
       <w:r>
@@ -9253,7 +9397,6 @@
           <w:szCs w:val="28"/>
           <w:lang w:val="de-DE"/>
         </w:rPr>
-        <w:lastRenderedPageBreak/>
         <w:t>3.2. Phương án sử dụng vốn:</w:t>
       </w:r>
     </w:p>
@@ -11117,6 +11260,7 @@
           <w:szCs w:val="28"/>
           <w:lang w:val="de-DE"/>
         </w:rPr>
+        <w:lastRenderedPageBreak/>
         <w:t>- Năng lực về máy móc, thiết bị, công nghệ: Khách hàng có đầy đủ cơ sở vật chất như nhà kính, hệ thống tưới và các thiết bị khác đảm bảo chất lượng đầu ra của hoa thành phẩm.</w:t>
       </w:r>
     </w:p>
@@ -11139,7 +11283,6 @@
           <w:szCs w:val="28"/>
           <w:lang w:val="de-DE"/>
         </w:rPr>
-        <w:lastRenderedPageBreak/>
         <w:t xml:space="preserve">- Năng lực về nhân công: Khách hàng </w:t>
       </w:r>
       <w:r>
@@ -13973,6 +14116,7 @@
           <w:szCs w:val="28"/>
           <w:lang w:val="de-DE"/>
         </w:rPr>
+        <w:lastRenderedPageBreak/>
         <w:t>+ Dư nợ trung dài hạn là [TCTD.Dư nợ trung dài hạn] mục đích [TCTD.Mục đích trung dài hạn], nguồn trả nợ từ [TCTD.Nguồn trả nợ];</w:t>
       </w:r>
     </w:p>
@@ -13999,7 +14143,6 @@
           <w:szCs w:val="28"/>
           <w:lang w:val="de-DE"/>
         </w:rPr>
-        <w:lastRenderedPageBreak/>
         <w:t xml:space="preserve">* Nhận xét khả năng, nguồn trả nợ của khách hàng: Nguồn trả nợ của khách hàng hợp pháp, </w:t>
       </w:r>
       <w:r>
@@ -15441,6 +15584,7 @@
           <w:szCs w:val="28"/>
           <w:lang w:val="pt-BR"/>
         </w:rPr>
+        <w:lastRenderedPageBreak/>
         <w:t xml:space="preserve">- Số tiền cho vay: </w:t>
       </w:r>
       <w:r>
@@ -15492,7 +15636,6 @@
           <w:szCs w:val="28"/>
           <w:lang w:val="pt-BR"/>
         </w:rPr>
-        <w:lastRenderedPageBreak/>
         <w:t>- Mục đích vay: [HĐTD.Mục đích vay]</w:t>
       </w:r>
       <w:r>

</xml_diff>

<commit_message>
feat: UI accessibility quick wins — metadata, role=alert, ArrowLeft icons
- Loan list: restore table/card toggle view with clickable contract links
- Disbursement table: add invoice completion progress bar (green/amber/gray)
- KHCN disbursement: add danh mục hồ sơ giải ngân, remove HĐ cung ứng/BB giao nhận
- Collateral form: expose ownership_form and asset_usage_status fields
- Updated DOCX templates for BCĐX and PASDV
</commit_message>
<xml_diff>
--- a/report_assets/KHCN templates/Báo cáo đề xuất/2268.02B BCDXCV ngan han HMTD.docx
+++ b/report_assets/KHCN templates/Báo cáo đề xuất/2268.02B BCDXCV ngan han HMTD.docx
@@ -114,7 +114,7 @@
                 </mc:Choice>
                 <mc:Fallback>
                   <w:pict>
-                    <v:line w14:anchorId="4A45B643" id="Straight Connector 1" o:spid="_x0000_s1026" style="position:absolute;z-index:251660288;visibility:visible;mso-wrap-style:square;mso-wrap-distance-left:9pt;mso-wrap-distance-top:0;mso-wrap-distance-right:9pt;mso-wrap-distance-bottom:0;mso-position-horizontal:center;mso-position-horizontal-relative:margin;mso-position-vertical:absolute;mso-position-vertical-relative:text" from="0,16.5pt" to="108pt,16.5pt" o:gfxdata="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">
+                    <v:line w14:anchorId="63555E13" id="Straight Connector 1" o:spid="_x0000_s1026" style="position:absolute;z-index:251660288;visibility:visible;mso-wrap-style:square;mso-wrap-distance-left:9pt;mso-wrap-distance-top:0;mso-wrap-distance-right:9pt;mso-wrap-distance-bottom:0;mso-position-horizontal:center;mso-position-horizontal-relative:margin;mso-position-vertical:absolute;mso-position-vertical-relative:text" from="0,16.5pt" to="108pt,16.5pt" o:gfxdata="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">
                       <w10:wrap anchorx="margin"/>
                     </v:line>
                   </w:pict>
@@ -266,7 +266,7 @@
                 </mc:Choice>
                 <mc:Fallback>
                   <w:pict>
-                    <v:shapetype w14:anchorId="3553722B" id="_x0000_t32" coordsize="21600,21600" o:spt="32" o:oned="t" path="m,l21600,21600e" filled="f">
+                    <v:shapetype w14:anchorId="748A76C2" id="_x0000_t32" coordsize="21600,21600" o:spt="32" o:oned="t" path="m,l21600,21600e" filled="f">
                       <v:path arrowok="t" fillok="f" o:connecttype="none"/>
                       <o:lock v:ext="edit" shapetype="t"/>
                     </v:shapetype>
@@ -5685,6 +5685,8 @@
         <w:jc w:val="both"/>
         <w:rPr>
           <w:rFonts w:ascii="Times New Roman" w:eastAsia="Times New Roman" w:hAnsi="Times New Roman" w:cs="Times New Roman"/>
+          <w:b/>
+          <w:bCs/>
           <w:sz w:val="26"/>
           <w:szCs w:val="26"/>
         </w:rPr>
@@ -5692,10 +5694,22 @@
       <w:r>
         <w:rPr>
           <w:rFonts w:ascii="Times New Roman" w:eastAsia="Times New Roman" w:hAnsi="Times New Roman" w:cs="Times New Roman"/>
+          <w:b/>
+          <w:bCs/>
           <w:sz w:val="26"/>
           <w:szCs w:val="26"/>
         </w:rPr>
-        <w:t>4.[STT]. Chi tiết tài sản</w:t>
+        <w:t>Chi tiết tài sản</w:t>
+      </w:r>
+      <w:r>
+        <w:rPr>
+          <w:rFonts w:ascii="Times New Roman" w:eastAsia="Times New Roman" w:hAnsi="Times New Roman" w:cs="Times New Roman"/>
+          <w:b/>
+          <w:bCs/>
+          <w:sz w:val="26"/>
+          <w:szCs w:val="26"/>
+        </w:rPr>
+        <w:t xml:space="preserve"> thứ [STT]</w:t>
       </w:r>
     </w:p>
     <w:p>
@@ -5792,7 +5806,24 @@
           <w:sz w:val="26"/>
           <w:szCs w:val="26"/>
         </w:rPr>
-        <w:t>- Diện tích: [Diện tích đất] m2  (Bằng chữ: [DTĐ bằng chữ])</w:t>
+        <w:t>- Diện tích: [Diện tích đất] m</w:t>
+      </w:r>
+      <w:r>
+        <w:rPr>
+          <w:rFonts w:ascii="Times New Roman" w:eastAsia="Times New Roman" w:hAnsi="Times New Roman" w:cs="Times New Roman"/>
+          <w:sz w:val="26"/>
+          <w:szCs w:val="26"/>
+          <w:vertAlign w:val="superscript"/>
+        </w:rPr>
+        <w:t>2</w:t>
+      </w:r>
+      <w:r>
+        <w:rPr>
+          <w:rFonts w:ascii="Times New Roman" w:eastAsia="Times New Roman" w:hAnsi="Times New Roman" w:cs="Times New Roman"/>
+          <w:sz w:val="26"/>
+          <w:szCs w:val="26"/>
+        </w:rPr>
+        <w:t xml:space="preserve">  (Bằng chữ: [DTĐ bằng chữ])</w:t>
       </w:r>
     </w:p>
     <w:p>
@@ -6425,7 +6456,7 @@
           <w:szCs w:val="26"/>
           <w:lang w:val="fr-FR"/>
         </w:rPr>
-        <w:t>4.</w:t>
+        <w:t>4.2</w:t>
       </w:r>
       <w:r>
         <w:rPr>
@@ -6436,7 +6467,7 @@
           <w:szCs w:val="26"/>
           <w:lang w:val="fr-FR"/>
         </w:rPr>
-        <w:t>7. Xác định giá trị TSBĐ:</w:t>
+        <w:t>. Xác định giá trị TSBĐ:</w:t>
       </w:r>
     </w:p>
     <w:p>
@@ -6487,938 +6518,562 @@
     </w:p>
     <w:tbl>
       <w:tblPr>
-        <w:tblW w:w="4318" w:type="pct"/>
-        <w:tblBorders>
-          <w:top w:val="single" w:sz="4" w:space="0" w:color="auto"/>
-          <w:left w:val="single" w:sz="4" w:space="0" w:color="auto"/>
-          <w:bottom w:val="single" w:sz="4" w:space="0" w:color="auto"/>
-          <w:right w:val="single" w:sz="4" w:space="0" w:color="auto"/>
-          <w:insideH w:val="single" w:sz="4" w:space="0" w:color="auto"/>
-          <w:insideV w:val="single" w:sz="4" w:space="0" w:color="auto"/>
-        </w:tblBorders>
+        <w:tblW w:w="5000" w:type="pct"/>
+        <w:tblLayout w:type="fixed"/>
         <w:tblLook w:val="04A0" w:firstRow="1" w:lastRow="0" w:firstColumn="1" w:lastColumn="0" w:noHBand="0" w:noVBand="1"/>
       </w:tblPr>
       <w:tblGrid>
-        <w:gridCol w:w="2018"/>
-        <w:gridCol w:w="1223"/>
-        <w:gridCol w:w="923"/>
-        <w:gridCol w:w="1384"/>
-        <w:gridCol w:w="1162"/>
-        <w:gridCol w:w="1207"/>
-        <w:gridCol w:w="1936"/>
+        <w:gridCol w:w="919"/>
+        <w:gridCol w:w="1888"/>
+        <w:gridCol w:w="1649"/>
+        <w:gridCol w:w="1649"/>
+        <w:gridCol w:w="1417"/>
+        <w:gridCol w:w="2331"/>
       </w:tblGrid>
-      <w:tr>
-        <w:trPr>
-          <w:trHeight w:val="324"/>
-        </w:trPr>
-        <w:tc>
-          <w:tcPr>
-            <w:tcW w:w="397" w:type="pct"/>
-            <w:noWrap/>
-            <w:vAlign w:val="center"/>
-            <w:hideMark/>
-          </w:tcPr>
-          <w:p>
-            <w:pPr>
-              <w:spacing w:after="0" w:line="240" w:lineRule="auto"/>
-              <w:jc w:val="center"/>
-              <w:rPr>
-                <w:rFonts w:ascii="Times New Roman" w:eastAsia="Times New Roman" w:hAnsi="Times New Roman" w:cs="Times New Roman"/>
-                <w:b/>
-                <w:bCs/>
-                <w:sz w:val="24"/>
-                <w:szCs w:val="24"/>
-              </w:rPr>
-            </w:pPr>
-            <w:r>
-              <w:rPr>
-                <w:rFonts w:ascii="Times New Roman" w:eastAsia="Times New Roman" w:hAnsi="Times New Roman" w:cs="Times New Roman"/>
-                <w:b/>
-                <w:bCs/>
-                <w:sz w:val="24"/>
-                <w:szCs w:val="24"/>
-              </w:rPr>
-              <w:t>STT</w:t>
-            </w:r>
-          </w:p>
-        </w:tc>
-        <w:tc>
-          <w:tcPr>
-            <w:tcW w:w="719" w:type="pct"/>
-            <w:noWrap/>
-            <w:vAlign w:val="center"/>
-            <w:hideMark/>
-          </w:tcPr>
-          <w:p>
-            <w:pPr>
-              <w:spacing w:after="0" w:line="240" w:lineRule="auto"/>
-              <w:jc w:val="center"/>
-              <w:rPr>
-                <w:rFonts w:ascii="Times New Roman" w:eastAsia="Times New Roman" w:hAnsi="Times New Roman" w:cs="Times New Roman"/>
-                <w:b/>
-                <w:bCs/>
-                <w:sz w:val="24"/>
-                <w:szCs w:val="24"/>
-              </w:rPr>
-            </w:pPr>
-            <w:r>
-              <w:rPr>
-                <w:rFonts w:ascii="Times New Roman" w:eastAsia="Times New Roman" w:hAnsi="Times New Roman" w:cs="Times New Roman"/>
-                <w:b/>
-                <w:bCs/>
-                <w:sz w:val="24"/>
-                <w:szCs w:val="24"/>
-              </w:rPr>
-              <w:t>Tên TSBĐ</w:t>
-            </w:r>
-          </w:p>
-        </w:tc>
-        <w:tc>
-          <w:tcPr>
-            <w:tcW w:w="542" w:type="pct"/>
-            <w:noWrap/>
-            <w:vAlign w:val="center"/>
-            <w:hideMark/>
-          </w:tcPr>
-          <w:p>
-            <w:pPr>
-              <w:spacing w:after="0" w:line="240" w:lineRule="auto"/>
-              <w:jc w:val="center"/>
-              <w:rPr>
-                <w:rFonts w:ascii="Times New Roman" w:eastAsia="Times New Roman" w:hAnsi="Times New Roman" w:cs="Times New Roman"/>
-                <w:b/>
-                <w:bCs/>
-                <w:sz w:val="24"/>
-                <w:szCs w:val="24"/>
-              </w:rPr>
-            </w:pPr>
-            <w:r>
-              <w:rPr>
-                <w:rFonts w:ascii="Times New Roman" w:eastAsia="Times New Roman" w:hAnsi="Times New Roman" w:cs="Times New Roman"/>
-                <w:b/>
-                <w:bCs/>
-                <w:sz w:val="24"/>
-                <w:szCs w:val="24"/>
-              </w:rPr>
-              <w:t xml:space="preserve">Số </w:t>
-            </w:r>
-            <w:r>
-              <w:rPr>
-                <w:rFonts w:ascii="Times New Roman" w:eastAsia="Times New Roman" w:hAnsi="Times New Roman" w:cs="Times New Roman"/>
-                <w:b/>
-                <w:bCs/>
-                <w:sz w:val="24"/>
-                <w:szCs w:val="24"/>
-              </w:rPr>
-              <w:t>GCN</w:t>
-            </w:r>
-          </w:p>
-        </w:tc>
-        <w:tc>
-          <w:tcPr>
-            <w:tcW w:w="813" w:type="pct"/>
-            <w:noWrap/>
-            <w:vAlign w:val="center"/>
-            <w:hideMark/>
-          </w:tcPr>
-          <w:p>
-            <w:pPr>
-              <w:spacing w:after="0" w:line="240" w:lineRule="auto"/>
-              <w:jc w:val="center"/>
-              <w:rPr>
-                <w:rFonts w:ascii="Times New Roman" w:eastAsia="Times New Roman" w:hAnsi="Times New Roman" w:cs="Times New Roman"/>
-                <w:b/>
-                <w:bCs/>
-                <w:sz w:val="24"/>
-                <w:szCs w:val="24"/>
-              </w:rPr>
-            </w:pPr>
-            <w:r>
-              <w:rPr>
-                <w:rFonts w:ascii="Times New Roman" w:eastAsia="Times New Roman" w:hAnsi="Times New Roman" w:cs="Times New Roman"/>
-                <w:b/>
-                <w:bCs/>
-                <w:sz w:val="24"/>
-                <w:szCs w:val="24"/>
-              </w:rPr>
-              <w:t>Diện tích</w:t>
-            </w:r>
-            <w:r>
-              <w:rPr>
-                <w:rFonts w:ascii="Times New Roman" w:eastAsia="Times New Roman" w:hAnsi="Times New Roman" w:cs="Times New Roman"/>
-                <w:b/>
-                <w:bCs/>
-                <w:sz w:val="24"/>
-                <w:szCs w:val="24"/>
-              </w:rPr>
-              <w:t xml:space="preserve"> đất</w:t>
-            </w:r>
-          </w:p>
-        </w:tc>
-        <w:tc>
-          <w:tcPr>
-            <w:tcW w:w="683" w:type="pct"/>
-            <w:noWrap/>
-            <w:vAlign w:val="center"/>
-            <w:hideMark/>
-          </w:tcPr>
-          <w:p>
-            <w:pPr>
-              <w:spacing w:after="0" w:line="240" w:lineRule="auto"/>
-              <w:jc w:val="center"/>
-              <w:rPr>
-                <w:rFonts w:ascii="Times New Roman" w:eastAsia="Times New Roman" w:hAnsi="Times New Roman" w:cs="Times New Roman"/>
-                <w:b/>
-                <w:bCs/>
-                <w:sz w:val="24"/>
-                <w:szCs w:val="24"/>
-              </w:rPr>
-            </w:pPr>
-            <w:r>
-              <w:rPr>
-                <w:rFonts w:ascii="Times New Roman" w:eastAsia="Times New Roman" w:hAnsi="Times New Roman" w:cs="Times New Roman"/>
-                <w:b/>
-                <w:bCs/>
-                <w:sz w:val="24"/>
-                <w:szCs w:val="24"/>
-              </w:rPr>
-              <w:t>GT đất</w:t>
-            </w:r>
-          </w:p>
-        </w:tc>
-        <w:tc>
-          <w:tcPr>
-            <w:tcW w:w="709" w:type="pct"/>
-            <w:noWrap/>
-            <w:vAlign w:val="center"/>
-            <w:hideMark/>
-          </w:tcPr>
-          <w:p>
-            <w:pPr>
-              <w:spacing w:after="0" w:line="240" w:lineRule="auto"/>
-              <w:jc w:val="center"/>
-              <w:rPr>
-                <w:rFonts w:ascii="Times New Roman" w:eastAsia="Times New Roman" w:hAnsi="Times New Roman" w:cs="Times New Roman"/>
-                <w:b/>
-                <w:bCs/>
-                <w:sz w:val="24"/>
-                <w:szCs w:val="24"/>
-              </w:rPr>
-            </w:pPr>
-            <w:r>
-              <w:rPr>
-                <w:rFonts w:ascii="Times New Roman" w:eastAsia="Times New Roman" w:hAnsi="Times New Roman" w:cs="Times New Roman"/>
-                <w:b/>
-                <w:bCs/>
-                <w:sz w:val="24"/>
-                <w:szCs w:val="24"/>
-              </w:rPr>
-              <w:t>GT nhà</w:t>
-            </w:r>
-          </w:p>
-        </w:tc>
-        <w:tc>
-          <w:tcPr>
-            <w:tcW w:w="1137" w:type="pct"/>
-            <w:noWrap/>
-            <w:vAlign w:val="center"/>
-            <w:hideMark/>
-          </w:tcPr>
-          <w:p>
-            <w:pPr>
-              <w:spacing w:after="0" w:line="240" w:lineRule="auto"/>
-              <w:jc w:val="center"/>
-              <w:rPr>
-                <w:rFonts w:ascii="Times New Roman" w:eastAsia="Times New Roman" w:hAnsi="Times New Roman" w:cs="Times New Roman"/>
-                <w:b/>
-                <w:bCs/>
-                <w:sz w:val="24"/>
-                <w:szCs w:val="24"/>
-              </w:rPr>
-            </w:pPr>
-            <w:r>
-              <w:rPr>
-                <w:rFonts w:ascii="Times New Roman" w:eastAsia="Times New Roman" w:hAnsi="Times New Roman" w:cs="Times New Roman"/>
-                <w:b/>
-                <w:bCs/>
-                <w:sz w:val="24"/>
-                <w:szCs w:val="24"/>
-              </w:rPr>
-              <w:t>Tổng giá trị TS</w:t>
-            </w:r>
-          </w:p>
-        </w:tc>
-      </w:tr>
       <w:tr>
         <w:trPr>
           <w:trHeight w:val="312"/>
         </w:trPr>
         <w:tc>
           <w:tcPr>
-            <w:tcW w:w="397" w:type="pct"/>
-            <w:noWrap/>
+            <w:tcW w:w="466" w:type="pct"/>
+            <w:tcBorders>
+              <w:top w:val="single" w:sz="4" w:space="0" w:color="auto"/>
+              <w:left w:val="single" w:sz="4" w:space="0" w:color="auto"/>
+              <w:bottom w:val="single" w:sz="4" w:space="0" w:color="auto"/>
+              <w:right w:val="single" w:sz="4" w:space="0" w:color="auto"/>
+            </w:tcBorders>
+            <w:shd w:val="clear" w:color="000000" w:fill="FFFFFF"/>
             <w:vAlign w:val="center"/>
             <w:hideMark/>
           </w:tcPr>
           <w:p>
             <w:pPr>
-              <w:spacing w:after="0" w:line="240" w:lineRule="auto"/>
+              <w:spacing w:after="0"/>
               <w:jc w:val="center"/>
               <w:rPr>
-                <w:rFonts w:ascii="Times New Roman" w:eastAsia="Times New Roman" w:hAnsi="Times New Roman" w:cs="Times New Roman"/>
-                <w:color w:val="000000"/>
-                <w:sz w:val="24"/>
-                <w:szCs w:val="24"/>
-              </w:rPr>
-            </w:pPr>
-            <w:r>
-              <w:rPr>
-                <w:rFonts w:ascii="Times New Roman" w:eastAsia="Times New Roman" w:hAnsi="Times New Roman" w:cs="Times New Roman"/>
-                <w:color w:val="000000"/>
-                <w:sz w:val="24"/>
-                <w:szCs w:val="24"/>
-              </w:rPr>
-              <w:t>[#TSBD_DINH_GIA]</w:t>
+                <w:rFonts w:ascii="Times New Roman" w:hAnsi="Times New Roman"/>
+                <w:b/>
+                <w:bCs/>
+                <w:sz w:val="26"/>
+                <w:szCs w:val="26"/>
+              </w:rPr>
+            </w:pPr>
+            <w:r>
+              <w:rPr>
+                <w:rFonts w:ascii="Times New Roman" w:hAnsi="Times New Roman"/>
+                <w:b/>
+                <w:bCs/>
+                <w:sz w:val="26"/>
+                <w:szCs w:val="26"/>
+              </w:rPr>
+              <w:t>STT</w:t>
+            </w:r>
+          </w:p>
+        </w:tc>
+        <w:tc>
+          <w:tcPr>
+            <w:tcW w:w="958" w:type="pct"/>
+            <w:tcBorders>
+              <w:top w:val="single" w:sz="4" w:space="0" w:color="auto"/>
+              <w:left w:val="nil"/>
+              <w:bottom w:val="single" w:sz="4" w:space="0" w:color="auto"/>
+              <w:right w:val="single" w:sz="4" w:space="0" w:color="auto"/>
+            </w:tcBorders>
+            <w:shd w:val="clear" w:color="000000" w:fill="FFFFFF"/>
+            <w:vAlign w:val="center"/>
+            <w:hideMark/>
+          </w:tcPr>
+          <w:p>
+            <w:pPr>
+              <w:spacing w:after="0"/>
+              <w:jc w:val="center"/>
+              <w:rPr>
+                <w:rFonts w:ascii="Times New Roman" w:hAnsi="Times New Roman"/>
+                <w:b/>
+                <w:bCs/>
+                <w:sz w:val="26"/>
+                <w:szCs w:val="26"/>
+              </w:rPr>
+            </w:pPr>
+            <w:r>
+              <w:rPr>
+                <w:rFonts w:ascii="Times New Roman" w:hAnsi="Times New Roman"/>
+                <w:b/>
+                <w:bCs/>
+                <w:sz w:val="26"/>
+                <w:szCs w:val="26"/>
+              </w:rPr>
+              <w:t>Loại tài sản</w:t>
+            </w:r>
+          </w:p>
+        </w:tc>
+        <w:tc>
+          <w:tcPr>
+            <w:tcW w:w="837" w:type="pct"/>
+            <w:tcBorders>
+              <w:top w:val="single" w:sz="4" w:space="0" w:color="auto"/>
+              <w:bottom w:val="single" w:sz="4" w:space="0" w:color="auto"/>
+              <w:right w:val="single" w:sz="4" w:space="0" w:color="auto"/>
+            </w:tcBorders>
+            <w:vAlign w:val="center"/>
+          </w:tcPr>
+          <w:p>
+            <w:pPr>
+              <w:spacing w:after="0"/>
+              <w:jc w:val="center"/>
+              <w:rPr>
+                <w:rFonts w:ascii="Times New Roman" w:hAnsi="Times New Roman"/>
+                <w:b/>
+                <w:bCs/>
+                <w:sz w:val="26"/>
+                <w:szCs w:val="26"/>
+              </w:rPr>
+            </w:pPr>
+            <w:r>
+              <w:rPr>
+                <w:rFonts w:ascii="Times New Roman" w:eastAsia="Times New Roman" w:hAnsi="Times New Roman" w:cs="Times New Roman"/>
+                <w:b/>
+                <w:bCs/>
+                <w:sz w:val="24"/>
+                <w:szCs w:val="24"/>
+              </w:rPr>
+              <w:t xml:space="preserve">Số </w:t>
+            </w:r>
+            <w:r>
+              <w:rPr>
+                <w:rFonts w:ascii="Times New Roman" w:eastAsia="Times New Roman" w:hAnsi="Times New Roman" w:cs="Times New Roman"/>
+                <w:b/>
+                <w:bCs/>
+                <w:sz w:val="24"/>
+                <w:szCs w:val="24"/>
+              </w:rPr>
+              <w:t>GCN</w:t>
+            </w:r>
+          </w:p>
+        </w:tc>
+        <w:tc>
+          <w:tcPr>
+            <w:tcW w:w="837" w:type="pct"/>
+            <w:tcBorders>
+              <w:top w:val="single" w:sz="4" w:space="0" w:color="auto"/>
+              <w:left w:val="single" w:sz="4" w:space="0" w:color="auto"/>
+              <w:bottom w:val="single" w:sz="4" w:space="0" w:color="auto"/>
+              <w:right w:val="single" w:sz="4" w:space="0" w:color="auto"/>
+            </w:tcBorders>
+            <w:shd w:val="clear" w:color="000000" w:fill="FFFFFF"/>
+            <w:vAlign w:val="center"/>
+            <w:hideMark/>
+          </w:tcPr>
+          <w:p>
+            <w:pPr>
+              <w:spacing w:after="0"/>
+              <w:jc w:val="center"/>
+              <w:rPr>
+                <w:rFonts w:ascii="Times New Roman" w:hAnsi="Times New Roman"/>
+                <w:b/>
+                <w:bCs/>
+                <w:sz w:val="26"/>
+                <w:szCs w:val="26"/>
+              </w:rPr>
+            </w:pPr>
+            <w:r>
+              <w:rPr>
+                <w:rFonts w:ascii="Times New Roman" w:hAnsi="Times New Roman"/>
+                <w:b/>
+                <w:bCs/>
+                <w:sz w:val="26"/>
+                <w:szCs w:val="26"/>
+              </w:rPr>
+              <w:t>Diện tích (m</w:t>
+            </w:r>
+            <w:r>
+              <w:rPr>
+                <w:rFonts w:ascii="Times New Roman" w:hAnsi="Times New Roman"/>
+                <w:b/>
+                <w:bCs/>
+                <w:sz w:val="26"/>
+                <w:szCs w:val="26"/>
+                <w:vertAlign w:val="superscript"/>
+              </w:rPr>
+              <w:t>2</w:t>
+            </w:r>
+            <w:r>
+              <w:rPr>
+                <w:rFonts w:ascii="Times New Roman" w:hAnsi="Times New Roman"/>
+                <w:b/>
+                <w:bCs/>
+                <w:sz w:val="26"/>
+                <w:szCs w:val="26"/>
+              </w:rPr>
+              <w:t>)</w:t>
             </w:r>
           </w:p>
         </w:tc>
         <w:tc>
           <w:tcPr>
             <w:tcW w:w="719" w:type="pct"/>
-            <w:noWrap/>
+            <w:tcBorders>
+              <w:top w:val="single" w:sz="4" w:space="0" w:color="auto"/>
+              <w:left w:val="nil"/>
+              <w:bottom w:val="single" w:sz="4" w:space="0" w:color="auto"/>
+              <w:right w:val="single" w:sz="4" w:space="0" w:color="auto"/>
+            </w:tcBorders>
+            <w:shd w:val="clear" w:color="000000" w:fill="FFFFFF"/>
             <w:vAlign w:val="center"/>
             <w:hideMark/>
           </w:tcPr>
           <w:p>
             <w:pPr>
-              <w:spacing w:after="0" w:line="240" w:lineRule="auto"/>
-              <w:rPr>
-                <w:rFonts w:ascii="Times New Roman" w:eastAsia="Times New Roman" w:hAnsi="Times New Roman" w:cs="Times New Roman"/>
-                <w:color w:val="000000"/>
-                <w:sz w:val="24"/>
-                <w:szCs w:val="24"/>
-              </w:rPr>
-            </w:pPr>
-            <w:r>
-              <w:rPr>
-                <w:rFonts w:ascii="Times New Roman" w:eastAsia="Times New Roman" w:hAnsi="Times New Roman" w:cs="Times New Roman"/>
-                <w:color w:val="000000"/>
-                <w:sz w:val="24"/>
-                <w:szCs w:val="24"/>
-              </w:rPr>
-              <w:t> </w:t>
-            </w:r>
-          </w:p>
-        </w:tc>
-        <w:tc>
-          <w:tcPr>
-            <w:tcW w:w="542" w:type="pct"/>
-            <w:noWrap/>
+              <w:spacing w:after="0"/>
+              <w:jc w:val="center"/>
+              <w:rPr>
+                <w:rFonts w:ascii="Times New Roman" w:hAnsi="Times New Roman"/>
+                <w:b/>
+                <w:bCs/>
+                <w:sz w:val="26"/>
+                <w:szCs w:val="26"/>
+              </w:rPr>
+            </w:pPr>
+            <w:r>
+              <w:rPr>
+                <w:rFonts w:ascii="Times New Roman" w:hAnsi="Times New Roman"/>
+                <w:b/>
+                <w:bCs/>
+                <w:sz w:val="26"/>
+                <w:szCs w:val="26"/>
+              </w:rPr>
+              <w:t>Đơn giá (đồng/m</w:t>
+            </w:r>
+            <w:r>
+              <w:rPr>
+                <w:rFonts w:ascii="Times New Roman" w:hAnsi="Times New Roman"/>
+                <w:b/>
+                <w:bCs/>
+                <w:sz w:val="26"/>
+                <w:szCs w:val="26"/>
+                <w:vertAlign w:val="superscript"/>
+              </w:rPr>
+              <w:t>2</w:t>
+            </w:r>
+            <w:r>
+              <w:rPr>
+                <w:rFonts w:ascii="Times New Roman" w:hAnsi="Times New Roman"/>
+                <w:b/>
+                <w:bCs/>
+                <w:sz w:val="26"/>
+                <w:szCs w:val="26"/>
+              </w:rPr>
+              <w:t>)</w:t>
+            </w:r>
+          </w:p>
+        </w:tc>
+        <w:tc>
+          <w:tcPr>
+            <w:tcW w:w="1183" w:type="pct"/>
+            <w:tcBorders>
+              <w:top w:val="single" w:sz="4" w:space="0" w:color="auto"/>
+              <w:left w:val="nil"/>
+              <w:bottom w:val="single" w:sz="4" w:space="0" w:color="auto"/>
+              <w:right w:val="single" w:sz="4" w:space="0" w:color="auto"/>
+            </w:tcBorders>
+            <w:shd w:val="clear" w:color="000000" w:fill="FFFFFF"/>
             <w:vAlign w:val="center"/>
             <w:hideMark/>
           </w:tcPr>
           <w:p>
             <w:pPr>
-              <w:spacing w:after="0" w:line="240" w:lineRule="auto"/>
-              <w:rPr>
-                <w:rFonts w:ascii="Times New Roman" w:eastAsia="Times New Roman" w:hAnsi="Times New Roman" w:cs="Times New Roman"/>
-                <w:color w:val="000000"/>
-                <w:sz w:val="24"/>
-                <w:szCs w:val="24"/>
-              </w:rPr>
-            </w:pPr>
-            <w:r>
-              <w:rPr>
-                <w:rFonts w:ascii="Times New Roman" w:eastAsia="Times New Roman" w:hAnsi="Times New Roman" w:cs="Times New Roman"/>
-                <w:color w:val="000000"/>
-                <w:sz w:val="24"/>
-                <w:szCs w:val="24"/>
-              </w:rPr>
-              <w:t> </w:t>
-            </w:r>
-          </w:p>
-        </w:tc>
-        <w:tc>
-          <w:tcPr>
-            <w:tcW w:w="813" w:type="pct"/>
-            <w:noWrap/>
-            <w:vAlign w:val="center"/>
-            <w:hideMark/>
-          </w:tcPr>
-          <w:p>
-            <w:pPr>
-              <w:spacing w:after="0" w:line="240" w:lineRule="auto"/>
-              <w:rPr>
-                <w:rFonts w:ascii="Times New Roman" w:eastAsia="Times New Roman" w:hAnsi="Times New Roman" w:cs="Times New Roman"/>
-                <w:color w:val="000000"/>
-                <w:sz w:val="24"/>
-                <w:szCs w:val="24"/>
-              </w:rPr>
-            </w:pPr>
-            <w:r>
-              <w:rPr>
-                <w:rFonts w:ascii="Times New Roman" w:eastAsia="Times New Roman" w:hAnsi="Times New Roman" w:cs="Times New Roman"/>
-                <w:color w:val="000000"/>
-                <w:sz w:val="24"/>
-                <w:szCs w:val="24"/>
-              </w:rPr>
-              <w:t> </w:t>
-            </w:r>
-          </w:p>
-        </w:tc>
-        <w:tc>
-          <w:tcPr>
-            <w:tcW w:w="683" w:type="pct"/>
-            <w:noWrap/>
-            <w:vAlign w:val="center"/>
-            <w:hideMark/>
-          </w:tcPr>
-          <w:p>
-            <w:pPr>
-              <w:spacing w:after="0" w:line="240" w:lineRule="auto"/>
-              <w:rPr>
-                <w:rFonts w:ascii="Times New Roman" w:eastAsia="Times New Roman" w:hAnsi="Times New Roman" w:cs="Times New Roman"/>
-                <w:color w:val="000000"/>
-                <w:sz w:val="24"/>
-                <w:szCs w:val="24"/>
-              </w:rPr>
-            </w:pPr>
-            <w:r>
-              <w:rPr>
-                <w:rFonts w:ascii="Times New Roman" w:eastAsia="Times New Roman" w:hAnsi="Times New Roman" w:cs="Times New Roman"/>
-                <w:color w:val="000000"/>
-                <w:sz w:val="24"/>
-                <w:szCs w:val="24"/>
-              </w:rPr>
-              <w:t> </w:t>
-            </w:r>
-          </w:p>
-        </w:tc>
-        <w:tc>
-          <w:tcPr>
-            <w:tcW w:w="709" w:type="pct"/>
-            <w:noWrap/>
-            <w:vAlign w:val="center"/>
-            <w:hideMark/>
-          </w:tcPr>
-          <w:p>
-            <w:pPr>
-              <w:spacing w:after="0" w:line="240" w:lineRule="auto"/>
-              <w:rPr>
-                <w:rFonts w:ascii="Times New Roman" w:eastAsia="Times New Roman" w:hAnsi="Times New Roman" w:cs="Times New Roman"/>
-                <w:color w:val="000000"/>
-                <w:sz w:val="24"/>
-                <w:szCs w:val="24"/>
-              </w:rPr>
-            </w:pPr>
-            <w:r>
-              <w:rPr>
-                <w:rFonts w:ascii="Times New Roman" w:eastAsia="Times New Roman" w:hAnsi="Times New Roman" w:cs="Times New Roman"/>
-                <w:color w:val="000000"/>
-                <w:sz w:val="24"/>
-                <w:szCs w:val="24"/>
-              </w:rPr>
-              <w:t> </w:t>
-            </w:r>
-          </w:p>
-        </w:tc>
-        <w:tc>
-          <w:tcPr>
-            <w:tcW w:w="1137" w:type="pct"/>
-            <w:noWrap/>
-            <w:vAlign w:val="center"/>
-            <w:hideMark/>
-          </w:tcPr>
-          <w:p>
-            <w:pPr>
-              <w:spacing w:after="0" w:line="240" w:lineRule="auto"/>
-              <w:rPr>
-                <w:rFonts w:ascii="Times New Roman" w:eastAsia="Times New Roman" w:hAnsi="Times New Roman" w:cs="Times New Roman"/>
-                <w:color w:val="000000"/>
-                <w:sz w:val="24"/>
-                <w:szCs w:val="24"/>
-              </w:rPr>
-            </w:pPr>
-            <w:r>
-              <w:rPr>
-                <w:rFonts w:ascii="Times New Roman" w:eastAsia="Times New Roman" w:hAnsi="Times New Roman" w:cs="Times New Roman"/>
-                <w:color w:val="000000"/>
-                <w:sz w:val="24"/>
-                <w:szCs w:val="24"/>
-              </w:rPr>
-              <w:t> </w:t>
+              <w:spacing w:after="0"/>
+              <w:jc w:val="center"/>
+              <w:rPr>
+                <w:rFonts w:ascii="Times New Roman" w:hAnsi="Times New Roman"/>
+                <w:b/>
+                <w:bCs/>
+                <w:sz w:val="26"/>
+                <w:szCs w:val="26"/>
+              </w:rPr>
+            </w:pPr>
+            <w:r>
+              <w:rPr>
+                <w:rFonts w:ascii="Times New Roman" w:hAnsi="Times New Roman"/>
+                <w:b/>
+                <w:bCs/>
+                <w:sz w:val="26"/>
+                <w:szCs w:val="26"/>
+              </w:rPr>
+              <w:t>Giá trị (đồng)</w:t>
             </w:r>
           </w:p>
         </w:tc>
       </w:tr>
       <w:tr>
         <w:trPr>
-          <w:trHeight w:val="312"/>
+          <w:trHeight w:val="368"/>
         </w:trPr>
         <w:tc>
           <w:tcPr>
-            <w:tcW w:w="397" w:type="pct"/>
-            <w:noWrap/>
+            <w:tcW w:w="466" w:type="pct"/>
+            <w:tcBorders>
+              <w:top w:val="nil"/>
+              <w:left w:val="single" w:sz="4" w:space="0" w:color="auto"/>
+              <w:bottom w:val="single" w:sz="4" w:space="0" w:color="auto"/>
+              <w:right w:val="single" w:sz="4" w:space="0" w:color="auto"/>
+            </w:tcBorders>
+            <w:shd w:val="clear" w:color="000000" w:fill="FFFFFF"/>
             <w:vAlign w:val="center"/>
             <w:hideMark/>
           </w:tcPr>
           <w:p>
             <w:pPr>
-              <w:spacing w:after="0" w:line="240" w:lineRule="auto"/>
+              <w:spacing w:after="0"/>
               <w:jc w:val="center"/>
               <w:rPr>
+                <w:rFonts w:ascii="Times New Roman" w:hAnsi="Times New Roman"/>
+                <w:sz w:val="26"/>
+                <w:szCs w:val="26"/>
+              </w:rPr>
+            </w:pPr>
+            <w:r>
+              <w:rPr>
+                <w:rFonts w:ascii="Times New Roman" w:hAnsi="Times New Roman"/>
+                <w:sz w:val="26"/>
+                <w:szCs w:val="26"/>
+              </w:rPr>
+              <w:t>[#DINH_GIA][STT]</w:t>
+            </w:r>
+          </w:p>
+        </w:tc>
+        <w:tc>
+          <w:tcPr>
+            <w:tcW w:w="958" w:type="pct"/>
+            <w:tcBorders>
+              <w:top w:val="nil"/>
+              <w:left w:val="nil"/>
+              <w:bottom w:val="single" w:sz="4" w:space="0" w:color="auto"/>
+              <w:right w:val="single" w:sz="4" w:space="0" w:color="auto"/>
+            </w:tcBorders>
+            <w:shd w:val="clear" w:color="000000" w:fill="FFFFFF"/>
+            <w:vAlign w:val="center"/>
+            <w:hideMark/>
+          </w:tcPr>
+          <w:p>
+            <w:pPr>
+              <w:spacing w:after="0"/>
+              <w:rPr>
+                <w:rFonts w:ascii="Times New Roman" w:hAnsi="Times New Roman"/>
+                <w:sz w:val="26"/>
+                <w:szCs w:val="26"/>
+              </w:rPr>
+            </w:pPr>
+            <w:r>
+              <w:rPr>
+                <w:rFonts w:ascii="Times New Roman" w:hAnsi="Times New Roman"/>
+                <w:sz w:val="26"/>
+                <w:szCs w:val="26"/>
+              </w:rPr>
+              <w:t>[Loại]</w:t>
+            </w:r>
+          </w:p>
+        </w:tc>
+        <w:tc>
+          <w:tcPr>
+            <w:tcW w:w="837" w:type="pct"/>
+            <w:tcBorders>
+              <w:top w:val="single" w:sz="4" w:space="0" w:color="auto"/>
+              <w:bottom w:val="single" w:sz="4" w:space="0" w:color="auto"/>
+              <w:right w:val="single" w:sz="4" w:space="0" w:color="auto"/>
+            </w:tcBorders>
+            <w:vAlign w:val="center"/>
+          </w:tcPr>
+          <w:p>
+            <w:pPr>
+              <w:spacing w:after="0"/>
+              <w:jc w:val="right"/>
+              <w:rPr>
+                <w:rFonts w:ascii="Times New Roman" w:hAnsi="Times New Roman"/>
+                <w:sz w:val="26"/>
+                <w:szCs w:val="26"/>
+              </w:rPr>
+            </w:pPr>
+            <w:r>
+              <w:rPr>
                 <w:rFonts w:ascii="Times New Roman" w:eastAsia="Times New Roman" w:hAnsi="Times New Roman" w:cs="Times New Roman"/>
                 <w:color w:val="000000"/>
-                <w:sz w:val="24"/>
-                <w:szCs w:val="24"/>
-              </w:rPr>
-            </w:pPr>
-            <w:r>
-              <w:rPr>
-                <w:rFonts w:ascii="Times New Roman" w:eastAsia="Times New Roman" w:hAnsi="Times New Roman" w:cs="Times New Roman"/>
-                <w:color w:val="000000"/>
-                <w:sz w:val="24"/>
-                <w:szCs w:val="24"/>
-              </w:rPr>
-              <w:t>[STT]</w:t>
+                <w:sz w:val="26"/>
+                <w:szCs w:val="26"/>
+              </w:rPr>
+              <w:t>[Số seri]</w:t>
+            </w:r>
+          </w:p>
+        </w:tc>
+        <w:tc>
+          <w:tcPr>
+            <w:tcW w:w="837" w:type="pct"/>
+            <w:tcBorders>
+              <w:top w:val="nil"/>
+              <w:left w:val="single" w:sz="4" w:space="0" w:color="auto"/>
+              <w:bottom w:val="single" w:sz="4" w:space="0" w:color="auto"/>
+              <w:right w:val="single" w:sz="4" w:space="0" w:color="auto"/>
+            </w:tcBorders>
+            <w:shd w:val="clear" w:color="000000" w:fill="FFFFFF"/>
+            <w:vAlign w:val="center"/>
+            <w:hideMark/>
+          </w:tcPr>
+          <w:p>
+            <w:pPr>
+              <w:spacing w:after="0"/>
+              <w:jc w:val="right"/>
+              <w:rPr>
+                <w:rFonts w:ascii="Times New Roman" w:hAnsi="Times New Roman"/>
+                <w:sz w:val="26"/>
+                <w:szCs w:val="26"/>
+              </w:rPr>
+            </w:pPr>
+            <w:r>
+              <w:rPr>
+                <w:rFonts w:ascii="Times New Roman" w:hAnsi="Times New Roman"/>
+                <w:sz w:val="26"/>
+                <w:szCs w:val="26"/>
+              </w:rPr>
+              <w:t>[Diện tích]</w:t>
             </w:r>
           </w:p>
         </w:tc>
         <w:tc>
           <w:tcPr>
             <w:tcW w:w="719" w:type="pct"/>
-            <w:noWrap/>
+            <w:tcBorders>
+              <w:top w:val="nil"/>
+              <w:left w:val="nil"/>
+              <w:bottom w:val="single" w:sz="4" w:space="0" w:color="auto"/>
+              <w:right w:val="single" w:sz="4" w:space="0" w:color="auto"/>
+            </w:tcBorders>
+            <w:shd w:val="clear" w:color="000000" w:fill="FFFFFF"/>
             <w:vAlign w:val="center"/>
             <w:hideMark/>
           </w:tcPr>
           <w:p>
             <w:pPr>
-              <w:spacing w:after="0" w:line="240" w:lineRule="auto"/>
-              <w:rPr>
-                <w:rFonts w:ascii="Times New Roman" w:eastAsia="Times New Roman" w:hAnsi="Times New Roman" w:cs="Times New Roman"/>
-                <w:color w:val="000000"/>
-                <w:sz w:val="24"/>
-                <w:szCs w:val="24"/>
-              </w:rPr>
-            </w:pPr>
-            <w:r>
-              <w:rPr>
-                <w:rFonts w:ascii="Times New Roman" w:eastAsia="Times New Roman" w:hAnsi="Times New Roman" w:cs="Times New Roman"/>
-                <w:color w:val="000000"/>
-                <w:sz w:val="24"/>
-                <w:szCs w:val="24"/>
-              </w:rPr>
-              <w:t>[Tên TSBĐ]</w:t>
-            </w:r>
-          </w:p>
-        </w:tc>
-        <w:tc>
-          <w:tcPr>
-            <w:tcW w:w="542" w:type="pct"/>
-            <w:noWrap/>
+              <w:spacing w:after="0"/>
+              <w:jc w:val="right"/>
+              <w:rPr>
+                <w:rFonts w:ascii="Times New Roman" w:hAnsi="Times New Roman"/>
+                <w:sz w:val="26"/>
+                <w:szCs w:val="26"/>
+              </w:rPr>
+            </w:pPr>
+            <w:r>
+              <w:rPr>
+                <w:rFonts w:ascii="Times New Roman" w:hAnsi="Times New Roman"/>
+                <w:sz w:val="26"/>
+                <w:szCs w:val="26"/>
+              </w:rPr>
+              <w:t>[Đơn giá]</w:t>
+            </w:r>
+          </w:p>
+        </w:tc>
+        <w:tc>
+          <w:tcPr>
+            <w:tcW w:w="1183" w:type="pct"/>
+            <w:tcBorders>
+              <w:top w:val="nil"/>
+              <w:left w:val="nil"/>
+              <w:bottom w:val="single" w:sz="4" w:space="0" w:color="auto"/>
+              <w:right w:val="single" w:sz="4" w:space="0" w:color="auto"/>
+            </w:tcBorders>
+            <w:shd w:val="clear" w:color="000000" w:fill="FFFFFF"/>
             <w:vAlign w:val="center"/>
             <w:hideMark/>
           </w:tcPr>
           <w:p>
             <w:pPr>
-              <w:spacing w:after="0" w:line="240" w:lineRule="auto"/>
-              <w:jc w:val="center"/>
-              <w:rPr>
-                <w:rFonts w:ascii="Times New Roman" w:eastAsia="Times New Roman" w:hAnsi="Times New Roman" w:cs="Times New Roman"/>
-                <w:color w:val="000000"/>
-                <w:sz w:val="24"/>
-                <w:szCs w:val="24"/>
-              </w:rPr>
-            </w:pPr>
-            <w:r>
-              <w:rPr>
-                <w:rFonts w:ascii="Times New Roman" w:eastAsia="Times New Roman" w:hAnsi="Times New Roman" w:cs="Times New Roman"/>
-                <w:color w:val="000000"/>
-                <w:sz w:val="24"/>
-                <w:szCs w:val="24"/>
-              </w:rPr>
-              <w:t>[Số seri]</w:t>
-            </w:r>
-          </w:p>
-        </w:tc>
-        <w:tc>
-          <w:tcPr>
-            <w:tcW w:w="813" w:type="pct"/>
-            <w:noWrap/>
-            <w:vAlign w:val="center"/>
-            <w:hideMark/>
-          </w:tcPr>
-          <w:p>
-            <w:pPr>
-              <w:spacing w:after="0" w:line="240" w:lineRule="auto"/>
+              <w:spacing w:after="0"/>
               <w:jc w:val="right"/>
               <w:rPr>
-                <w:rFonts w:ascii="Times New Roman" w:eastAsia="Times New Roman" w:hAnsi="Times New Roman" w:cs="Times New Roman"/>
-                <w:color w:val="000000"/>
-                <w:sz w:val="24"/>
-                <w:szCs w:val="24"/>
-              </w:rPr>
-            </w:pPr>
-            <w:r>
-              <w:rPr>
-                <w:rFonts w:ascii="Times New Roman" w:eastAsia="Times New Roman" w:hAnsi="Times New Roman" w:cs="Times New Roman"/>
-                <w:color w:val="000000"/>
-                <w:sz w:val="24"/>
-                <w:szCs w:val="24"/>
-              </w:rPr>
-              <w:t>[Diện tích đất]</w:t>
-            </w:r>
-          </w:p>
-        </w:tc>
-        <w:tc>
-          <w:tcPr>
-            <w:tcW w:w="683" w:type="pct"/>
-            <w:noWrap/>
-            <w:vAlign w:val="center"/>
-            <w:hideMark/>
-          </w:tcPr>
-          <w:p>
-            <w:pPr>
-              <w:spacing w:after="0" w:line="240" w:lineRule="auto"/>
-              <w:jc w:val="right"/>
-              <w:rPr>
-                <w:rFonts w:ascii="Times New Roman" w:eastAsia="Times New Roman" w:hAnsi="Times New Roman" w:cs="Times New Roman"/>
-                <w:color w:val="000000"/>
-                <w:sz w:val="24"/>
-                <w:szCs w:val="24"/>
-              </w:rPr>
-            </w:pPr>
-            <w:r>
-              <w:rPr>
-                <w:rFonts w:ascii="Times New Roman" w:eastAsia="Times New Roman" w:hAnsi="Times New Roman" w:cs="Times New Roman"/>
-                <w:color w:val="000000"/>
-                <w:sz w:val="24"/>
-                <w:szCs w:val="24"/>
-              </w:rPr>
-              <w:t>[Giá trị đất]</w:t>
-            </w:r>
-          </w:p>
-        </w:tc>
-        <w:tc>
-          <w:tcPr>
-            <w:tcW w:w="709" w:type="pct"/>
-            <w:noWrap/>
-            <w:vAlign w:val="center"/>
-          </w:tcPr>
-          <w:p>
-            <w:pPr>
-              <w:spacing w:after="0" w:line="240" w:lineRule="auto"/>
-              <w:jc w:val="right"/>
-              <w:rPr>
-                <w:rFonts w:ascii="Times New Roman" w:eastAsia="Times New Roman" w:hAnsi="Times New Roman" w:cs="Times New Roman"/>
-                <w:color w:val="000000"/>
-                <w:sz w:val="24"/>
-                <w:szCs w:val="24"/>
-              </w:rPr>
-            </w:pPr>
-            <w:r>
-              <w:rPr>
-                <w:rFonts w:ascii="Times New Roman" w:eastAsia="Times New Roman" w:hAnsi="Times New Roman" w:cs="Times New Roman"/>
-                <w:color w:val="000000"/>
-                <w:sz w:val="24"/>
-                <w:szCs w:val="24"/>
-              </w:rPr>
-              <w:t>[Giá trị nhà]</w:t>
-            </w:r>
-          </w:p>
-        </w:tc>
-        <w:tc>
-          <w:tcPr>
-            <w:tcW w:w="1137" w:type="pct"/>
-            <w:noWrap/>
-            <w:vAlign w:val="center"/>
-            <w:hideMark/>
-          </w:tcPr>
-          <w:p>
-            <w:pPr>
-              <w:spacing w:after="0" w:line="240" w:lineRule="auto"/>
-              <w:jc w:val="right"/>
-              <w:rPr>
-                <w:rFonts w:ascii="Times New Roman" w:eastAsia="Times New Roman" w:hAnsi="Times New Roman" w:cs="Times New Roman"/>
-                <w:color w:val="000000"/>
-                <w:sz w:val="24"/>
-                <w:szCs w:val="24"/>
-              </w:rPr>
-            </w:pPr>
-            <w:r>
-              <w:rPr>
-                <w:rFonts w:ascii="Times New Roman" w:eastAsia="Times New Roman" w:hAnsi="Times New Roman" w:cs="Times New Roman"/>
-                <w:color w:val="000000"/>
-                <w:sz w:val="24"/>
-                <w:szCs w:val="24"/>
-              </w:rPr>
-              <w:t>[Tổng giá trị TS]</w:t>
+                <w:rFonts w:ascii="Times New Roman" w:hAnsi="Times New Roman"/>
+                <w:sz w:val="26"/>
+                <w:szCs w:val="26"/>
+              </w:rPr>
+            </w:pPr>
+            <w:r>
+              <w:rPr>
+                <w:rFonts w:ascii="Times New Roman" w:hAnsi="Times New Roman"/>
+                <w:sz w:val="26"/>
+                <w:szCs w:val="26"/>
+              </w:rPr>
+              <w:t>[Giá trị][/DINH_GIA]</w:t>
             </w:r>
           </w:p>
         </w:tc>
       </w:tr>
       <w:tr>
         <w:trPr>
-          <w:trHeight w:val="324"/>
+          <w:trHeight w:val="415"/>
         </w:trPr>
         <w:tc>
           <w:tcPr>
-            <w:tcW w:w="397" w:type="pct"/>
-            <w:noWrap/>
+            <w:tcW w:w="466" w:type="pct"/>
+            <w:tcBorders>
+              <w:top w:val="nil"/>
+              <w:left w:val="single" w:sz="4" w:space="0" w:color="auto"/>
+              <w:bottom w:val="single" w:sz="4" w:space="0" w:color="auto"/>
+              <w:right w:val="single" w:sz="4" w:space="0" w:color="auto"/>
+            </w:tcBorders>
+            <w:shd w:val="clear" w:color="000000" w:fill="FFFFFF"/>
             <w:vAlign w:val="center"/>
             <w:hideMark/>
           </w:tcPr>
           <w:p>
             <w:pPr>
-              <w:spacing w:after="0" w:line="240" w:lineRule="auto"/>
+              <w:spacing w:after="0"/>
+              <w:rPr>
+                <w:rFonts w:ascii="Times New Roman" w:hAnsi="Times New Roman"/>
+                <w:sz w:val="26"/>
+                <w:szCs w:val="26"/>
+              </w:rPr>
+            </w:pPr>
+            <w:r>
+              <w:rPr>
+                <w:rFonts w:ascii="Times New Roman" w:hAnsi="Times New Roman"/>
+                <w:sz w:val="26"/>
+                <w:szCs w:val="26"/>
+              </w:rPr>
+              <w:t> </w:t>
+            </w:r>
+          </w:p>
+        </w:tc>
+        <w:tc>
+          <w:tcPr>
+            <w:tcW w:w="958" w:type="pct"/>
+            <w:tcBorders>
+              <w:top w:val="nil"/>
+              <w:left w:val="nil"/>
+              <w:bottom w:val="single" w:sz="4" w:space="0" w:color="auto"/>
+              <w:right w:val="single" w:sz="4" w:space="0" w:color="auto"/>
+            </w:tcBorders>
+            <w:shd w:val="clear" w:color="000000" w:fill="FFFFFF"/>
+            <w:vAlign w:val="center"/>
+            <w:hideMark/>
+          </w:tcPr>
+          <w:p>
+            <w:pPr>
+              <w:spacing w:after="0"/>
               <w:jc w:val="center"/>
               <w:rPr>
-                <w:rFonts w:ascii="Times New Roman" w:eastAsia="Times New Roman" w:hAnsi="Times New Roman" w:cs="Times New Roman"/>
-                <w:color w:val="000000"/>
-                <w:sz w:val="24"/>
-                <w:szCs w:val="24"/>
-              </w:rPr>
-            </w:pPr>
-            <w:r>
-              <w:rPr>
-                <w:rFonts w:ascii="Times New Roman" w:eastAsia="Times New Roman" w:hAnsi="Times New Roman" w:cs="Times New Roman"/>
-                <w:color w:val="000000"/>
-                <w:sz w:val="24"/>
-                <w:szCs w:val="24"/>
-              </w:rPr>
-              <w:t>[/TSBD_DINH_GIA]</w:t>
-            </w:r>
-          </w:p>
-        </w:tc>
-        <w:tc>
-          <w:tcPr>
-            <w:tcW w:w="719" w:type="pct"/>
-            <w:noWrap/>
-            <w:vAlign w:val="center"/>
-            <w:hideMark/>
-          </w:tcPr>
-          <w:p>
-            <w:pPr>
-              <w:spacing w:after="0" w:line="240" w:lineRule="auto"/>
-              <w:rPr>
-                <w:rFonts w:ascii="Times New Roman" w:eastAsia="Times New Roman" w:hAnsi="Times New Roman" w:cs="Times New Roman"/>
-                <w:color w:val="000000"/>
-                <w:sz w:val="24"/>
-                <w:szCs w:val="24"/>
-              </w:rPr>
-            </w:pPr>
-            <w:r>
-              <w:rPr>
-                <w:rFonts w:ascii="Times New Roman" w:eastAsia="Times New Roman" w:hAnsi="Times New Roman" w:cs="Times New Roman"/>
-                <w:color w:val="000000"/>
-                <w:sz w:val="24"/>
-                <w:szCs w:val="24"/>
-              </w:rPr>
-              <w:t> </w:t>
-            </w:r>
-          </w:p>
-        </w:tc>
-        <w:tc>
-          <w:tcPr>
-            <w:tcW w:w="542" w:type="pct"/>
-            <w:noWrap/>
-            <w:vAlign w:val="center"/>
-            <w:hideMark/>
-          </w:tcPr>
-          <w:p>
-            <w:pPr>
-              <w:spacing w:after="0" w:line="240" w:lineRule="auto"/>
-              <w:rPr>
-                <w:rFonts w:ascii="Times New Roman" w:eastAsia="Times New Roman" w:hAnsi="Times New Roman" w:cs="Times New Roman"/>
-                <w:color w:val="000000"/>
-                <w:sz w:val="24"/>
-                <w:szCs w:val="24"/>
-              </w:rPr>
-            </w:pPr>
-            <w:r>
-              <w:rPr>
-                <w:rFonts w:ascii="Times New Roman" w:eastAsia="Times New Roman" w:hAnsi="Times New Roman" w:cs="Times New Roman"/>
-                <w:color w:val="000000"/>
-                <w:sz w:val="24"/>
-                <w:szCs w:val="24"/>
-              </w:rPr>
-              <w:t> </w:t>
-            </w:r>
-          </w:p>
-        </w:tc>
-        <w:tc>
-          <w:tcPr>
-            <w:tcW w:w="813" w:type="pct"/>
-            <w:noWrap/>
-            <w:vAlign w:val="center"/>
-            <w:hideMark/>
-          </w:tcPr>
-          <w:p>
-            <w:pPr>
-              <w:spacing w:after="0" w:line="240" w:lineRule="auto"/>
-              <w:rPr>
-                <w:rFonts w:ascii="Times New Roman" w:eastAsia="Times New Roman" w:hAnsi="Times New Roman" w:cs="Times New Roman"/>
-                <w:color w:val="000000"/>
-                <w:sz w:val="24"/>
-                <w:szCs w:val="24"/>
-              </w:rPr>
-            </w:pPr>
-            <w:r>
-              <w:rPr>
-                <w:rFonts w:ascii="Times New Roman" w:eastAsia="Times New Roman" w:hAnsi="Times New Roman" w:cs="Times New Roman"/>
-                <w:color w:val="000000"/>
-                <w:sz w:val="24"/>
-                <w:szCs w:val="24"/>
-              </w:rPr>
-              <w:t> </w:t>
-            </w:r>
-          </w:p>
-        </w:tc>
-        <w:tc>
-          <w:tcPr>
-            <w:tcW w:w="683" w:type="pct"/>
-            <w:noWrap/>
-            <w:vAlign w:val="center"/>
-            <w:hideMark/>
-          </w:tcPr>
-          <w:p>
-            <w:pPr>
-              <w:spacing w:after="0" w:line="240" w:lineRule="auto"/>
-              <w:rPr>
-                <w:rFonts w:ascii="Times New Roman" w:eastAsia="Times New Roman" w:hAnsi="Times New Roman" w:cs="Times New Roman"/>
-                <w:color w:val="000000"/>
-                <w:sz w:val="24"/>
-                <w:szCs w:val="24"/>
-              </w:rPr>
-            </w:pPr>
-            <w:r>
-              <w:rPr>
-                <w:rFonts w:ascii="Times New Roman" w:eastAsia="Times New Roman" w:hAnsi="Times New Roman" w:cs="Times New Roman"/>
-                <w:color w:val="000000"/>
-                <w:sz w:val="24"/>
-                <w:szCs w:val="24"/>
-              </w:rPr>
-              <w:t> </w:t>
-            </w:r>
-          </w:p>
-        </w:tc>
-        <w:tc>
-          <w:tcPr>
-            <w:tcW w:w="709" w:type="pct"/>
-            <w:noWrap/>
-            <w:vAlign w:val="center"/>
-            <w:hideMark/>
-          </w:tcPr>
-          <w:p>
-            <w:pPr>
-              <w:spacing w:after="0" w:line="240" w:lineRule="auto"/>
-              <w:rPr>
-                <w:rFonts w:ascii="Times New Roman" w:eastAsia="Times New Roman" w:hAnsi="Times New Roman" w:cs="Times New Roman"/>
-                <w:color w:val="000000"/>
-                <w:sz w:val="24"/>
-                <w:szCs w:val="24"/>
-              </w:rPr>
-            </w:pPr>
-            <w:r>
-              <w:rPr>
-                <w:rFonts w:ascii="Times New Roman" w:eastAsia="Times New Roman" w:hAnsi="Times New Roman" w:cs="Times New Roman"/>
-                <w:color w:val="000000"/>
-                <w:sz w:val="24"/>
-                <w:szCs w:val="24"/>
-              </w:rPr>
-              <w:t> </w:t>
-            </w:r>
-          </w:p>
-        </w:tc>
-        <w:tc>
-          <w:tcPr>
-            <w:tcW w:w="1137" w:type="pct"/>
-            <w:noWrap/>
-            <w:vAlign w:val="center"/>
-            <w:hideMark/>
-          </w:tcPr>
-          <w:p>
-            <w:pPr>
-              <w:spacing w:after="0" w:line="240" w:lineRule="auto"/>
-              <w:rPr>
-                <w:rFonts w:ascii="Times New Roman" w:eastAsia="Times New Roman" w:hAnsi="Times New Roman" w:cs="Times New Roman"/>
-                <w:color w:val="000000"/>
-                <w:sz w:val="24"/>
-                <w:szCs w:val="24"/>
-              </w:rPr>
-            </w:pPr>
-            <w:r>
-              <w:rPr>
-                <w:rFonts w:ascii="Times New Roman" w:eastAsia="Times New Roman" w:hAnsi="Times New Roman" w:cs="Times New Roman"/>
-                <w:color w:val="000000"/>
-                <w:sz w:val="24"/>
-                <w:szCs w:val="24"/>
-              </w:rPr>
-              <w:t> </w:t>
-            </w:r>
-          </w:p>
-        </w:tc>
-      </w:tr>
-      <w:tr>
-        <w:trPr>
-          <w:trHeight w:val="324"/>
-        </w:trPr>
-        <w:tc>
-          <w:tcPr>
-            <w:tcW w:w="397" w:type="pct"/>
-            <w:noWrap/>
-            <w:vAlign w:val="center"/>
-            <w:hideMark/>
-          </w:tcPr>
-          <w:p>
-            <w:pPr>
-              <w:spacing w:after="0" w:line="240" w:lineRule="auto"/>
-              <w:jc w:val="center"/>
-              <w:rPr>
-                <w:rFonts w:ascii="Times New Roman" w:eastAsia="Times New Roman" w:hAnsi="Times New Roman" w:cs="Times New Roman"/>
-                <w:color w:val="000000"/>
-                <w:sz w:val="24"/>
-                <w:szCs w:val="24"/>
-              </w:rPr>
-            </w:pPr>
-            <w:r>
-              <w:rPr>
-                <w:rFonts w:ascii="Times New Roman" w:eastAsia="Times New Roman" w:hAnsi="Times New Roman" w:cs="Times New Roman"/>
-                <w:color w:val="000000"/>
-                <w:sz w:val="24"/>
-                <w:szCs w:val="24"/>
-              </w:rPr>
-              <w:t> </w:t>
-            </w:r>
-          </w:p>
-        </w:tc>
-        <w:tc>
-          <w:tcPr>
-            <w:tcW w:w="719" w:type="pct"/>
-            <w:noWrap/>
-            <w:vAlign w:val="center"/>
-            <w:hideMark/>
-          </w:tcPr>
-          <w:p>
-            <w:pPr>
-              <w:spacing w:after="0" w:line="240" w:lineRule="auto"/>
-              <w:rPr>
-                <w:rFonts w:ascii="Times New Roman" w:eastAsia="Times New Roman" w:hAnsi="Times New Roman" w:cs="Times New Roman"/>
+                <w:rFonts w:ascii="Times New Roman" w:hAnsi="Times New Roman"/>
                 <w:b/>
                 <w:bCs/>
-                <w:color w:val="000000"/>
-                <w:sz w:val="24"/>
-                <w:szCs w:val="24"/>
-              </w:rPr>
-            </w:pPr>
-            <w:r>
-              <w:rPr>
-                <w:rFonts w:ascii="Times New Roman" w:eastAsia="Times New Roman" w:hAnsi="Times New Roman" w:cs="Times New Roman"/>
+                <w:sz w:val="26"/>
+                <w:szCs w:val="26"/>
+              </w:rPr>
+            </w:pPr>
+            <w:r>
+              <w:rPr>
+                <w:rFonts w:ascii="Times New Roman" w:hAnsi="Times New Roman"/>
                 <w:b/>
                 <w:bCs/>
-                <w:color w:val="000000"/>
-                <w:sz w:val="24"/>
-                <w:szCs w:val="24"/>
+                <w:sz w:val="26"/>
+                <w:szCs w:val="26"/>
               </w:rPr>
               <w:t>Tổng cộng</w:t>
             </w:r>
@@ -7426,27 +7081,51 @@
         </w:tc>
         <w:tc>
           <w:tcPr>
-            <w:tcW w:w="542" w:type="pct"/>
-            <w:noWrap/>
+            <w:tcW w:w="837" w:type="pct"/>
+            <w:tcBorders>
+              <w:top w:val="single" w:sz="4" w:space="0" w:color="auto"/>
+              <w:bottom w:val="single" w:sz="4" w:space="0" w:color="auto"/>
+              <w:right w:val="single" w:sz="4" w:space="0" w:color="auto"/>
+            </w:tcBorders>
+          </w:tcPr>
+          <w:p>
+            <w:pPr>
+              <w:spacing w:after="0"/>
+              <w:rPr>
+                <w:rFonts w:ascii="Times New Roman" w:hAnsi="Times New Roman"/>
+                <w:sz w:val="26"/>
+                <w:szCs w:val="26"/>
+              </w:rPr>
+            </w:pPr>
+          </w:p>
+        </w:tc>
+        <w:tc>
+          <w:tcPr>
+            <w:tcW w:w="837" w:type="pct"/>
+            <w:tcBorders>
+              <w:top w:val="nil"/>
+              <w:left w:val="single" w:sz="4" w:space="0" w:color="auto"/>
+              <w:bottom w:val="single" w:sz="4" w:space="0" w:color="auto"/>
+              <w:right w:val="single" w:sz="4" w:space="0" w:color="auto"/>
+            </w:tcBorders>
+            <w:shd w:val="clear" w:color="000000" w:fill="FFFFFF"/>
             <w:vAlign w:val="center"/>
             <w:hideMark/>
           </w:tcPr>
           <w:p>
             <w:pPr>
-              <w:spacing w:after="0" w:line="240" w:lineRule="auto"/>
-              <w:rPr>
-                <w:rFonts w:ascii="Times New Roman" w:eastAsia="Times New Roman" w:hAnsi="Times New Roman" w:cs="Times New Roman"/>
-                <w:color w:val="000000"/>
-                <w:sz w:val="24"/>
-                <w:szCs w:val="24"/>
-              </w:rPr>
-            </w:pPr>
-            <w:r>
-              <w:rPr>
-                <w:rFonts w:ascii="Times New Roman" w:eastAsia="Times New Roman" w:hAnsi="Times New Roman" w:cs="Times New Roman"/>
-                <w:color w:val="000000"/>
-                <w:sz w:val="24"/>
-                <w:szCs w:val="24"/>
+              <w:spacing w:after="0"/>
+              <w:rPr>
+                <w:rFonts w:ascii="Times New Roman" w:hAnsi="Times New Roman"/>
+                <w:sz w:val="26"/>
+                <w:szCs w:val="26"/>
+              </w:rPr>
+            </w:pPr>
+            <w:r>
+              <w:rPr>
+                <w:rFonts w:ascii="Times New Roman" w:hAnsi="Times New Roman"/>
+                <w:sz w:val="26"/>
+                <w:szCs w:val="26"/>
               </w:rPr>
               <w:t> </w:t>
             </w:r>
@@ -7454,27 +7133,31 @@
         </w:tc>
         <w:tc>
           <w:tcPr>
-            <w:tcW w:w="813" w:type="pct"/>
-            <w:noWrap/>
+            <w:tcW w:w="719" w:type="pct"/>
+            <w:tcBorders>
+              <w:top w:val="nil"/>
+              <w:left w:val="nil"/>
+              <w:bottom w:val="single" w:sz="4" w:space="0" w:color="auto"/>
+              <w:right w:val="single" w:sz="4" w:space="0" w:color="auto"/>
+            </w:tcBorders>
+            <w:shd w:val="clear" w:color="000000" w:fill="FFFFFF"/>
             <w:vAlign w:val="center"/>
             <w:hideMark/>
           </w:tcPr>
           <w:p>
             <w:pPr>
-              <w:spacing w:after="0" w:line="240" w:lineRule="auto"/>
-              <w:rPr>
-                <w:rFonts w:ascii="Times New Roman" w:eastAsia="Times New Roman" w:hAnsi="Times New Roman" w:cs="Times New Roman"/>
-                <w:color w:val="000000"/>
-                <w:sz w:val="24"/>
-                <w:szCs w:val="24"/>
-              </w:rPr>
-            </w:pPr>
-            <w:r>
-              <w:rPr>
-                <w:rFonts w:ascii="Times New Roman" w:eastAsia="Times New Roman" w:hAnsi="Times New Roman" w:cs="Times New Roman"/>
-                <w:color w:val="000000"/>
-                <w:sz w:val="24"/>
-                <w:szCs w:val="24"/>
+              <w:spacing w:after="0"/>
+              <w:rPr>
+                <w:rFonts w:ascii="Times New Roman" w:hAnsi="Times New Roman"/>
+                <w:sz w:val="26"/>
+                <w:szCs w:val="26"/>
+              </w:rPr>
+            </w:pPr>
+            <w:r>
+              <w:rPr>
+                <w:rFonts w:ascii="Times New Roman" w:hAnsi="Times New Roman"/>
+                <w:sz w:val="26"/>
+                <w:szCs w:val="26"/>
               </w:rPr>
               <w:t> </w:t>
             </w:r>
@@ -7482,90 +7165,38 @@
         </w:tc>
         <w:tc>
           <w:tcPr>
-            <w:tcW w:w="683" w:type="pct"/>
-            <w:noWrap/>
+            <w:tcW w:w="1183" w:type="pct"/>
+            <w:tcBorders>
+              <w:top w:val="nil"/>
+              <w:left w:val="nil"/>
+              <w:bottom w:val="single" w:sz="4" w:space="0" w:color="auto"/>
+              <w:right w:val="single" w:sz="4" w:space="0" w:color="auto"/>
+            </w:tcBorders>
+            <w:shd w:val="clear" w:color="000000" w:fill="FFFFFF"/>
             <w:vAlign w:val="center"/>
             <w:hideMark/>
           </w:tcPr>
           <w:p>
             <w:pPr>
-              <w:spacing w:after="0" w:line="240" w:lineRule="auto"/>
-              <w:rPr>
-                <w:rFonts w:ascii="Times New Roman" w:eastAsia="Times New Roman" w:hAnsi="Times New Roman" w:cs="Times New Roman"/>
-                <w:color w:val="000000"/>
-                <w:sz w:val="24"/>
-                <w:szCs w:val="24"/>
-              </w:rPr>
-            </w:pPr>
-            <w:r>
-              <w:rPr>
-                <w:rFonts w:ascii="Times New Roman" w:eastAsia="Times New Roman" w:hAnsi="Times New Roman" w:cs="Times New Roman"/>
-                <w:color w:val="000000"/>
-                <w:sz w:val="24"/>
-                <w:szCs w:val="24"/>
-              </w:rPr>
-              <w:t> </w:t>
-            </w:r>
-          </w:p>
-        </w:tc>
-        <w:tc>
-          <w:tcPr>
-            <w:tcW w:w="709" w:type="pct"/>
-            <w:noWrap/>
-            <w:vAlign w:val="center"/>
-            <w:hideMark/>
-          </w:tcPr>
-          <w:p>
-            <w:pPr>
-              <w:spacing w:after="0" w:line="240" w:lineRule="auto"/>
-              <w:rPr>
-                <w:rFonts w:ascii="Times New Roman" w:eastAsia="Times New Roman" w:hAnsi="Times New Roman" w:cs="Times New Roman"/>
-                <w:color w:val="000000"/>
-                <w:sz w:val="24"/>
-                <w:szCs w:val="24"/>
-              </w:rPr>
-            </w:pPr>
-            <w:r>
-              <w:rPr>
-                <w:rFonts w:ascii="Times New Roman" w:eastAsia="Times New Roman" w:hAnsi="Times New Roman" w:cs="Times New Roman"/>
-                <w:color w:val="000000"/>
-                <w:sz w:val="24"/>
-                <w:szCs w:val="24"/>
-              </w:rPr>
-              <w:t> </w:t>
-            </w:r>
-          </w:p>
-        </w:tc>
-        <w:tc>
-          <w:tcPr>
-            <w:tcW w:w="1137" w:type="pct"/>
-            <w:noWrap/>
-            <w:vAlign w:val="center"/>
-            <w:hideMark/>
-          </w:tcPr>
-          <w:p>
-            <w:pPr>
-              <w:spacing w:after="0" w:line="240" w:lineRule="auto"/>
+              <w:spacing w:after="0"/>
               <w:jc w:val="right"/>
               <w:rPr>
-                <w:rFonts w:ascii="Times New Roman" w:eastAsia="Times New Roman" w:hAnsi="Times New Roman" w:cs="Times New Roman"/>
+                <w:rFonts w:ascii="Times New Roman" w:hAnsi="Times New Roman"/>
                 <w:b/>
                 <w:bCs/>
-                <w:color w:val="000000"/>
-                <w:sz w:val="24"/>
-                <w:szCs w:val="24"/>
-              </w:rPr>
-            </w:pPr>
-            <w:r>
-              <w:rPr>
-                <w:rFonts w:ascii="Times New Roman" w:eastAsia="Times New Roman" w:hAnsi="Times New Roman" w:cs="Times New Roman"/>
+                <w:sz w:val="26"/>
+                <w:szCs w:val="26"/>
+              </w:rPr>
+            </w:pPr>
+            <w:r>
+              <w:rPr>
+                <w:rFonts w:ascii="Times New Roman" w:hAnsi="Times New Roman"/>
                 <w:b/>
                 <w:bCs/>
-                <w:color w:val="000000"/>
-                <w:sz w:val="24"/>
-                <w:szCs w:val="24"/>
-              </w:rPr>
-              <w:t>[Tổng giá trị TSBĐ]</w:t>
+                <w:sz w:val="26"/>
+                <w:szCs w:val="26"/>
+              </w:rPr>
+              <w:t>[SĐ.Tổng giá trị tất cả TS]</w:t>
             </w:r>
           </w:p>
         </w:tc>
@@ -7667,7 +7298,7 @@
           <w:szCs w:val="26"/>
           <w:lang w:val="fr-FR"/>
         </w:rPr>
-        <w:t>4.</w:t>
+        <w:t>4.3</w:t>
       </w:r>
       <w:r>
         <w:rPr>
@@ -7678,7 +7309,7 @@
           <w:szCs w:val="26"/>
           <w:lang w:val="fr-FR"/>
         </w:rPr>
-        <w:t>8. Mức cho vay có bảo đảm bằng tài sả</w:t>
+        <w:t>. Mức cho vay có bảo đảm bằng tài sả</w:t>
       </w:r>
       <w:r>
         <w:rPr>
@@ -7737,7 +7368,7 @@
           <w:szCs w:val="26"/>
           <w:lang w:val="fr-FR"/>
         </w:rPr>
-        <w:t>4.</w:t>
+        <w:t>4.4</w:t>
       </w:r>
       <w:r>
         <w:rPr>
@@ -7748,7 +7379,7 @@
           <w:szCs w:val="26"/>
           <w:lang w:val="fr-FR"/>
         </w:rPr>
-        <w:t>9. Nghĩa vụ được bảo đảm, phạm vi bảo đảm</w:t>
+        <w:t>. Nghĩa vụ được bảo đảm, phạm vi bảo đảm</w:t>
       </w:r>
     </w:p>
     <w:p>
@@ -11470,14 +11101,15 @@
     <w:tbl>
       <w:tblPr>
         <w:tblW w:w="5000" w:type="pct"/>
+        <w:tblLayout w:type="fixed"/>
         <w:tblLook w:val="04A0" w:firstRow="1" w:lastRow="0" w:firstColumn="1" w:lastColumn="0" w:noHBand="0" w:noVBand="1"/>
       </w:tblPr>
       <w:tblGrid>
-        <w:gridCol w:w="1902"/>
+        <w:gridCol w:w="960"/>
+        <w:gridCol w:w="2469"/>
+        <w:gridCol w:w="1163"/>
+        <w:gridCol w:w="1208"/>
         <w:gridCol w:w="1527"/>
-        <w:gridCol w:w="1163"/>
-        <w:gridCol w:w="1207"/>
-        <w:gridCol w:w="1528"/>
         <w:gridCol w:w="2526"/>
       </w:tblGrid>
       <w:tr>
@@ -11486,7 +11118,7 @@
         </w:trPr>
         <w:tc>
           <w:tcPr>
-            <w:tcW w:w="1028" w:type="pct"/>
+            <w:tcW w:w="487" w:type="pct"/>
             <w:tcBorders>
               <w:top w:val="single" w:sz="4" w:space="0" w:color="auto"/>
               <w:left w:val="single" w:sz="4" w:space="0" w:color="auto"/>
@@ -11523,7 +11155,7 @@
         </w:tc>
         <w:tc>
           <w:tcPr>
-            <w:tcW w:w="766" w:type="pct"/>
+            <w:tcW w:w="1253" w:type="pct"/>
             <w:tcBorders>
               <w:top w:val="single" w:sz="4" w:space="0" w:color="auto"/>
               <w:left w:val="nil"/>
@@ -11560,7 +11192,7 @@
         </w:tc>
         <w:tc>
           <w:tcPr>
-            <w:tcW w:w="549" w:type="pct"/>
+            <w:tcW w:w="590" w:type="pct"/>
             <w:tcBorders>
               <w:top w:val="single" w:sz="4" w:space="0" w:color="auto"/>
               <w:left w:val="nil"/>
@@ -11597,7 +11229,7 @@
         </w:tc>
         <w:tc>
           <w:tcPr>
-            <w:tcW w:w="585" w:type="pct"/>
+            <w:tcW w:w="613" w:type="pct"/>
             <w:tcBorders>
               <w:top w:val="single" w:sz="4" w:space="0" w:color="auto"/>
               <w:left w:val="nil"/>
@@ -11634,7 +11266,7 @@
         </w:tc>
         <w:tc>
           <w:tcPr>
-            <w:tcW w:w="766" w:type="pct"/>
+            <w:tcW w:w="775" w:type="pct"/>
             <w:tcBorders>
               <w:top w:val="single" w:sz="4" w:space="0" w:color="auto"/>
               <w:left w:val="nil"/>
@@ -11671,7 +11303,7 @@
         </w:tc>
         <w:tc>
           <w:tcPr>
-            <w:tcW w:w="1306" w:type="pct"/>
+            <w:tcW w:w="1282" w:type="pct"/>
             <w:tcBorders>
               <w:top w:val="single" w:sz="4" w:space="0" w:color="auto"/>
               <w:left w:val="nil"/>
@@ -11713,7 +11345,7 @@
         </w:trPr>
         <w:tc>
           <w:tcPr>
-            <w:tcW w:w="1028" w:type="pct"/>
+            <w:tcW w:w="487" w:type="pct"/>
             <w:tcBorders>
               <w:top w:val="nil"/>
               <w:left w:val="single" w:sz="4" w:space="0" w:color="auto"/>
@@ -11746,7 +11378,7 @@
         </w:tc>
         <w:tc>
           <w:tcPr>
-            <w:tcW w:w="766" w:type="pct"/>
+            <w:tcW w:w="1253" w:type="pct"/>
             <w:tcBorders>
               <w:top w:val="nil"/>
               <w:left w:val="nil"/>
@@ -11778,7 +11410,7 @@
         </w:tc>
         <w:tc>
           <w:tcPr>
-            <w:tcW w:w="549" w:type="pct"/>
+            <w:tcW w:w="590" w:type="pct"/>
             <w:tcBorders>
               <w:top w:val="nil"/>
               <w:left w:val="nil"/>
@@ -11811,7 +11443,7 @@
         </w:tc>
         <w:tc>
           <w:tcPr>
-            <w:tcW w:w="585" w:type="pct"/>
+            <w:tcW w:w="613" w:type="pct"/>
             <w:tcBorders>
               <w:top w:val="nil"/>
               <w:left w:val="nil"/>
@@ -11825,6 +11457,7 @@
           <w:p>
             <w:pPr>
               <w:spacing w:after="0" w:line="240" w:lineRule="auto"/>
+              <w:jc w:val="right"/>
               <w:rPr>
                 <w:rFonts w:ascii="Times New Roman" w:eastAsia="Times New Roman" w:hAnsi="Times New Roman" w:cs="Times New Roman"/>
                 <w:sz w:val="24"/>
@@ -11843,7 +11476,7 @@
         </w:tc>
         <w:tc>
           <w:tcPr>
-            <w:tcW w:w="766" w:type="pct"/>
+            <w:tcW w:w="775" w:type="pct"/>
             <w:tcBorders>
               <w:top w:val="nil"/>
               <w:left w:val="nil"/>
@@ -11857,6 +11490,7 @@
           <w:p>
             <w:pPr>
               <w:spacing w:after="0" w:line="240" w:lineRule="auto"/>
+              <w:jc w:val="right"/>
               <w:rPr>
                 <w:rFonts w:ascii="Times New Roman" w:eastAsia="Times New Roman" w:hAnsi="Times New Roman" w:cs="Times New Roman"/>
                 <w:sz w:val="24"/>
@@ -11875,7 +11509,7 @@
         </w:tc>
         <w:tc>
           <w:tcPr>
-            <w:tcW w:w="1306" w:type="pct"/>
+            <w:tcW w:w="1282" w:type="pct"/>
             <w:tcBorders>
               <w:top w:val="nil"/>
               <w:left w:val="nil"/>
@@ -11889,6 +11523,7 @@
           <w:p>
             <w:pPr>
               <w:spacing w:after="0" w:line="240" w:lineRule="auto"/>
+              <w:jc w:val="right"/>
               <w:rPr>
                 <w:rFonts w:ascii="Times New Roman" w:eastAsia="Times New Roman" w:hAnsi="Times New Roman" w:cs="Times New Roman"/>
                 <w:sz w:val="24"/>
@@ -11912,7 +11547,7 @@
         </w:trPr>
         <w:tc>
           <w:tcPr>
-            <w:tcW w:w="1028" w:type="pct"/>
+            <w:tcW w:w="487" w:type="pct"/>
             <w:tcBorders>
               <w:top w:val="nil"/>
               <w:left w:val="single" w:sz="4" w:space="0" w:color="auto"/>
@@ -11945,7 +11580,7 @@
         </w:tc>
         <w:tc>
           <w:tcPr>
-            <w:tcW w:w="766" w:type="pct"/>
+            <w:tcW w:w="1253" w:type="pct"/>
             <w:tcBorders>
               <w:top w:val="nil"/>
               <w:left w:val="nil"/>
@@ -11977,7 +11612,7 @@
         </w:tc>
         <w:tc>
           <w:tcPr>
-            <w:tcW w:w="549" w:type="pct"/>
+            <w:tcW w:w="590" w:type="pct"/>
             <w:tcBorders>
               <w:top w:val="nil"/>
               <w:left w:val="nil"/>
@@ -12010,7 +11645,7 @@
         </w:tc>
         <w:tc>
           <w:tcPr>
-            <w:tcW w:w="585" w:type="pct"/>
+            <w:tcW w:w="613" w:type="pct"/>
             <w:tcBorders>
               <w:top w:val="nil"/>
               <w:left w:val="nil"/>
@@ -12024,6 +11659,7 @@
           <w:p>
             <w:pPr>
               <w:spacing w:after="0" w:line="240" w:lineRule="auto"/>
+              <w:jc w:val="right"/>
               <w:rPr>
                 <w:rFonts w:ascii="Times New Roman" w:eastAsia="Times New Roman" w:hAnsi="Times New Roman" w:cs="Times New Roman"/>
                 <w:sz w:val="24"/>
@@ -12042,7 +11678,7 @@
         </w:tc>
         <w:tc>
           <w:tcPr>
-            <w:tcW w:w="766" w:type="pct"/>
+            <w:tcW w:w="775" w:type="pct"/>
             <w:tcBorders>
               <w:top w:val="nil"/>
               <w:left w:val="nil"/>
@@ -12056,6 +11692,7 @@
           <w:p>
             <w:pPr>
               <w:spacing w:after="0" w:line="240" w:lineRule="auto"/>
+              <w:jc w:val="right"/>
               <w:rPr>
                 <w:rFonts w:ascii="Times New Roman" w:eastAsia="Times New Roman" w:hAnsi="Times New Roman" w:cs="Times New Roman"/>
                 <w:sz w:val="24"/>
@@ -12074,7 +11711,7 @@
         </w:tc>
         <w:tc>
           <w:tcPr>
-            <w:tcW w:w="1306" w:type="pct"/>
+            <w:tcW w:w="1282" w:type="pct"/>
             <w:tcBorders>
               <w:top w:val="nil"/>
               <w:left w:val="nil"/>
@@ -12088,6 +11725,7 @@
           <w:p>
             <w:pPr>
               <w:spacing w:after="0" w:line="240" w:lineRule="auto"/>
+              <w:jc w:val="right"/>
               <w:rPr>
                 <w:rFonts w:ascii="Times New Roman" w:eastAsia="Times New Roman" w:hAnsi="Times New Roman" w:cs="Times New Roman"/>
                 <w:sz w:val="24"/>
@@ -12111,7 +11749,7 @@
         </w:trPr>
         <w:tc>
           <w:tcPr>
-            <w:tcW w:w="1028" w:type="pct"/>
+            <w:tcW w:w="487" w:type="pct"/>
             <w:tcBorders>
               <w:top w:val="nil"/>
               <w:left w:val="single" w:sz="4" w:space="0" w:color="auto"/>
@@ -12144,7 +11782,7 @@
         </w:tc>
         <w:tc>
           <w:tcPr>
-            <w:tcW w:w="766" w:type="pct"/>
+            <w:tcW w:w="1253" w:type="pct"/>
             <w:tcBorders>
               <w:top w:val="nil"/>
               <w:left w:val="nil"/>
@@ -12176,7 +11814,7 @@
         </w:tc>
         <w:tc>
           <w:tcPr>
-            <w:tcW w:w="549" w:type="pct"/>
+            <w:tcW w:w="590" w:type="pct"/>
             <w:tcBorders>
               <w:top w:val="nil"/>
               <w:left w:val="nil"/>
@@ -12209,7 +11847,7 @@
         </w:tc>
         <w:tc>
           <w:tcPr>
-            <w:tcW w:w="585" w:type="pct"/>
+            <w:tcW w:w="613" w:type="pct"/>
             <w:tcBorders>
               <w:top w:val="nil"/>
               <w:left w:val="nil"/>
@@ -12223,6 +11861,7 @@
           <w:p>
             <w:pPr>
               <w:spacing w:after="0" w:line="240" w:lineRule="auto"/>
+              <w:jc w:val="right"/>
               <w:rPr>
                 <w:rFonts w:ascii="Times New Roman" w:eastAsia="Times New Roman" w:hAnsi="Times New Roman" w:cs="Times New Roman"/>
                 <w:sz w:val="24"/>
@@ -12241,7 +11880,7 @@
         </w:tc>
         <w:tc>
           <w:tcPr>
-            <w:tcW w:w="766" w:type="pct"/>
+            <w:tcW w:w="775" w:type="pct"/>
             <w:tcBorders>
               <w:top w:val="nil"/>
               <w:left w:val="nil"/>
@@ -12255,6 +11894,7 @@
           <w:p>
             <w:pPr>
               <w:spacing w:after="0" w:line="240" w:lineRule="auto"/>
+              <w:jc w:val="right"/>
               <w:rPr>
                 <w:rFonts w:ascii="Times New Roman" w:eastAsia="Times New Roman" w:hAnsi="Times New Roman" w:cs="Times New Roman"/>
                 <w:sz w:val="24"/>
@@ -12273,7 +11913,7 @@
         </w:tc>
         <w:tc>
           <w:tcPr>
-            <w:tcW w:w="1306" w:type="pct"/>
+            <w:tcW w:w="1282" w:type="pct"/>
             <w:tcBorders>
               <w:top w:val="nil"/>
               <w:left w:val="nil"/>
@@ -12287,6 +11927,7 @@
           <w:p>
             <w:pPr>
               <w:spacing w:after="0" w:line="240" w:lineRule="auto"/>
+              <w:jc w:val="right"/>
               <w:rPr>
                 <w:rFonts w:ascii="Times New Roman" w:eastAsia="Times New Roman" w:hAnsi="Times New Roman" w:cs="Times New Roman"/>
                 <w:sz w:val="24"/>
@@ -12310,7 +11951,7 @@
         </w:trPr>
         <w:tc>
           <w:tcPr>
-            <w:tcW w:w="1028" w:type="pct"/>
+            <w:tcW w:w="487" w:type="pct"/>
             <w:tcBorders>
               <w:top w:val="nil"/>
               <w:left w:val="single" w:sz="4" w:space="0" w:color="auto"/>
@@ -12343,7 +11984,7 @@
         </w:tc>
         <w:tc>
           <w:tcPr>
-            <w:tcW w:w="766" w:type="pct"/>
+            <w:tcW w:w="1253" w:type="pct"/>
             <w:tcBorders>
               <w:top w:val="nil"/>
               <w:left w:val="nil"/>
@@ -12375,7 +12016,7 @@
         </w:tc>
         <w:tc>
           <w:tcPr>
-            <w:tcW w:w="549" w:type="pct"/>
+            <w:tcW w:w="590" w:type="pct"/>
             <w:tcBorders>
               <w:top w:val="nil"/>
               <w:left w:val="nil"/>
@@ -12408,7 +12049,7 @@
         </w:tc>
         <w:tc>
           <w:tcPr>
-            <w:tcW w:w="585" w:type="pct"/>
+            <w:tcW w:w="613" w:type="pct"/>
             <w:tcBorders>
               <w:top w:val="nil"/>
               <w:left w:val="nil"/>
@@ -12422,6 +12063,7 @@
           <w:p>
             <w:pPr>
               <w:spacing w:after="0" w:line="240" w:lineRule="auto"/>
+              <w:jc w:val="right"/>
               <w:rPr>
                 <w:rFonts w:ascii="Times New Roman" w:eastAsia="Times New Roman" w:hAnsi="Times New Roman" w:cs="Times New Roman"/>
                 <w:sz w:val="24"/>
@@ -12440,7 +12082,7 @@
         </w:tc>
         <w:tc>
           <w:tcPr>
-            <w:tcW w:w="766" w:type="pct"/>
+            <w:tcW w:w="775" w:type="pct"/>
             <w:tcBorders>
               <w:top w:val="nil"/>
               <w:left w:val="nil"/>
@@ -12454,6 +12096,7 @@
           <w:p>
             <w:pPr>
               <w:spacing w:after="0" w:line="240" w:lineRule="auto"/>
+              <w:jc w:val="right"/>
               <w:rPr>
                 <w:rFonts w:ascii="Times New Roman" w:eastAsia="Times New Roman" w:hAnsi="Times New Roman" w:cs="Times New Roman"/>
                 <w:sz w:val="24"/>
@@ -12472,7 +12115,7 @@
         </w:tc>
         <w:tc>
           <w:tcPr>
-            <w:tcW w:w="1306" w:type="pct"/>
+            <w:tcW w:w="1282" w:type="pct"/>
             <w:tcBorders>
               <w:top w:val="nil"/>
               <w:left w:val="nil"/>
@@ -12486,6 +12129,7 @@
           <w:p>
             <w:pPr>
               <w:spacing w:after="0" w:line="240" w:lineRule="auto"/>
+              <w:jc w:val="right"/>
               <w:rPr>
                 <w:rFonts w:ascii="Times New Roman" w:eastAsia="Times New Roman" w:hAnsi="Times New Roman" w:cs="Times New Roman"/>
                 <w:sz w:val="24"/>
@@ -12509,7 +12153,7 @@
         </w:trPr>
         <w:tc>
           <w:tcPr>
-            <w:tcW w:w="1028" w:type="pct"/>
+            <w:tcW w:w="487" w:type="pct"/>
             <w:tcBorders>
               <w:top w:val="nil"/>
               <w:left w:val="single" w:sz="4" w:space="0" w:color="auto"/>
@@ -12542,7 +12186,7 @@
         </w:tc>
         <w:tc>
           <w:tcPr>
-            <w:tcW w:w="766" w:type="pct"/>
+            <w:tcW w:w="1253" w:type="pct"/>
             <w:tcBorders>
               <w:top w:val="nil"/>
               <w:left w:val="nil"/>
@@ -12574,7 +12218,7 @@
         </w:tc>
         <w:tc>
           <w:tcPr>
-            <w:tcW w:w="549" w:type="pct"/>
+            <w:tcW w:w="590" w:type="pct"/>
             <w:tcBorders>
               <w:top w:val="nil"/>
               <w:left w:val="nil"/>
@@ -12607,7 +12251,7 @@
         </w:tc>
         <w:tc>
           <w:tcPr>
-            <w:tcW w:w="585" w:type="pct"/>
+            <w:tcW w:w="613" w:type="pct"/>
             <w:tcBorders>
               <w:top w:val="nil"/>
               <w:left w:val="nil"/>
@@ -12621,6 +12265,7 @@
           <w:p>
             <w:pPr>
               <w:spacing w:after="0" w:line="240" w:lineRule="auto"/>
+              <w:jc w:val="right"/>
               <w:rPr>
                 <w:rFonts w:ascii="Times New Roman" w:eastAsia="Times New Roman" w:hAnsi="Times New Roman" w:cs="Times New Roman"/>
                 <w:sz w:val="24"/>
@@ -12639,7 +12284,7 @@
         </w:tc>
         <w:tc>
           <w:tcPr>
-            <w:tcW w:w="766" w:type="pct"/>
+            <w:tcW w:w="775" w:type="pct"/>
             <w:tcBorders>
               <w:top w:val="nil"/>
               <w:left w:val="nil"/>
@@ -12653,6 +12298,7 @@
           <w:p>
             <w:pPr>
               <w:spacing w:after="0" w:line="240" w:lineRule="auto"/>
+              <w:jc w:val="right"/>
               <w:rPr>
                 <w:rFonts w:ascii="Times New Roman" w:eastAsia="Times New Roman" w:hAnsi="Times New Roman" w:cs="Times New Roman"/>
                 <w:sz w:val="24"/>
@@ -12671,7 +12317,7 @@
         </w:tc>
         <w:tc>
           <w:tcPr>
-            <w:tcW w:w="1306" w:type="pct"/>
+            <w:tcW w:w="1282" w:type="pct"/>
             <w:tcBorders>
               <w:top w:val="nil"/>
               <w:left w:val="nil"/>
@@ -12685,6 +12331,7 @@
           <w:p>
             <w:pPr>
               <w:spacing w:after="0" w:line="240" w:lineRule="auto"/>
+              <w:jc w:val="right"/>
               <w:rPr>
                 <w:rFonts w:ascii="Times New Roman" w:eastAsia="Times New Roman" w:hAnsi="Times New Roman" w:cs="Times New Roman"/>
                 <w:sz w:val="24"/>
@@ -12708,7 +12355,7 @@
         </w:trPr>
         <w:tc>
           <w:tcPr>
-            <w:tcW w:w="1028" w:type="pct"/>
+            <w:tcW w:w="487" w:type="pct"/>
             <w:tcBorders>
               <w:top w:val="nil"/>
               <w:left w:val="single" w:sz="4" w:space="0" w:color="auto"/>
@@ -12741,7 +12388,7 @@
         </w:tc>
         <w:tc>
           <w:tcPr>
-            <w:tcW w:w="766" w:type="pct"/>
+            <w:tcW w:w="1253" w:type="pct"/>
             <w:tcBorders>
               <w:top w:val="nil"/>
               <w:left w:val="nil"/>
@@ -12773,7 +12420,7 @@
         </w:tc>
         <w:tc>
           <w:tcPr>
-            <w:tcW w:w="549" w:type="pct"/>
+            <w:tcW w:w="590" w:type="pct"/>
             <w:tcBorders>
               <w:top w:val="nil"/>
               <w:left w:val="nil"/>
@@ -12806,7 +12453,7 @@
         </w:tc>
         <w:tc>
           <w:tcPr>
-            <w:tcW w:w="585" w:type="pct"/>
+            <w:tcW w:w="613" w:type="pct"/>
             <w:tcBorders>
               <w:top w:val="nil"/>
               <w:left w:val="nil"/>
@@ -12820,6 +12467,7 @@
           <w:p>
             <w:pPr>
               <w:spacing w:after="0" w:line="240" w:lineRule="auto"/>
+              <w:jc w:val="right"/>
               <w:rPr>
                 <w:rFonts w:ascii="Times New Roman" w:eastAsia="Times New Roman" w:hAnsi="Times New Roman" w:cs="Times New Roman"/>
                 <w:sz w:val="24"/>
@@ -12838,7 +12486,7 @@
         </w:tc>
         <w:tc>
           <w:tcPr>
-            <w:tcW w:w="766" w:type="pct"/>
+            <w:tcW w:w="775" w:type="pct"/>
             <w:tcBorders>
               <w:top w:val="nil"/>
               <w:left w:val="nil"/>
@@ -12852,6 +12500,7 @@
           <w:p>
             <w:pPr>
               <w:spacing w:after="0" w:line="240" w:lineRule="auto"/>
+              <w:jc w:val="right"/>
               <w:rPr>
                 <w:rFonts w:ascii="Times New Roman" w:eastAsia="Times New Roman" w:hAnsi="Times New Roman" w:cs="Times New Roman"/>
                 <w:sz w:val="24"/>
@@ -12870,7 +12519,7 @@
         </w:tc>
         <w:tc>
           <w:tcPr>
-            <w:tcW w:w="1306" w:type="pct"/>
+            <w:tcW w:w="1282" w:type="pct"/>
             <w:tcBorders>
               <w:top w:val="nil"/>
               <w:left w:val="nil"/>
@@ -12884,6 +12533,7 @@
           <w:p>
             <w:pPr>
               <w:spacing w:after="0" w:line="240" w:lineRule="auto"/>
+              <w:jc w:val="right"/>
               <w:rPr>
                 <w:rFonts w:ascii="Times New Roman" w:eastAsia="Times New Roman" w:hAnsi="Times New Roman" w:cs="Times New Roman"/>
                 <w:sz w:val="24"/>
@@ -12907,7 +12557,7 @@
         </w:trPr>
         <w:tc>
           <w:tcPr>
-            <w:tcW w:w="1028" w:type="pct"/>
+            <w:tcW w:w="487" w:type="pct"/>
             <w:tcBorders>
               <w:top w:val="nil"/>
               <w:left w:val="single" w:sz="4" w:space="0" w:color="auto"/>
@@ -12939,7 +12589,7 @@
         </w:tc>
         <w:tc>
           <w:tcPr>
-            <w:tcW w:w="766" w:type="pct"/>
+            <w:tcW w:w="1253" w:type="pct"/>
             <w:tcBorders>
               <w:top w:val="nil"/>
               <w:left w:val="nil"/>
@@ -12971,7 +12621,7 @@
         </w:tc>
         <w:tc>
           <w:tcPr>
-            <w:tcW w:w="549" w:type="pct"/>
+            <w:tcW w:w="590" w:type="pct"/>
             <w:tcBorders>
               <w:top w:val="nil"/>
               <w:left w:val="nil"/>
@@ -13004,7 +12654,7 @@
         </w:tc>
         <w:tc>
           <w:tcPr>
-            <w:tcW w:w="585" w:type="pct"/>
+            <w:tcW w:w="613" w:type="pct"/>
             <w:tcBorders>
               <w:top w:val="nil"/>
               <w:left w:val="nil"/>
@@ -13018,6 +12668,7 @@
           <w:p>
             <w:pPr>
               <w:spacing w:after="0" w:line="240" w:lineRule="auto"/>
+              <w:jc w:val="right"/>
               <w:rPr>
                 <w:rFonts w:ascii="Times New Roman" w:eastAsia="Times New Roman" w:hAnsi="Times New Roman" w:cs="Times New Roman"/>
                 <w:sz w:val="24"/>
@@ -13036,7 +12687,7 @@
         </w:tc>
         <w:tc>
           <w:tcPr>
-            <w:tcW w:w="766" w:type="pct"/>
+            <w:tcW w:w="775" w:type="pct"/>
             <w:tcBorders>
               <w:top w:val="nil"/>
               <w:left w:val="nil"/>
@@ -13050,6 +12701,7 @@
           <w:p>
             <w:pPr>
               <w:spacing w:after="0" w:line="240" w:lineRule="auto"/>
+              <w:jc w:val="right"/>
               <w:rPr>
                 <w:rFonts w:ascii="Times New Roman" w:eastAsia="Times New Roman" w:hAnsi="Times New Roman" w:cs="Times New Roman"/>
                 <w:sz w:val="24"/>
@@ -13068,7 +12720,7 @@
         </w:tc>
         <w:tc>
           <w:tcPr>
-            <w:tcW w:w="1306" w:type="pct"/>
+            <w:tcW w:w="1282" w:type="pct"/>
             <w:tcBorders>
               <w:top w:val="nil"/>
               <w:left w:val="nil"/>
@@ -13082,6 +12734,7 @@
           <w:p>
             <w:pPr>
               <w:spacing w:after="0" w:line="240" w:lineRule="auto"/>
+              <w:jc w:val="right"/>
               <w:rPr>
                 <w:rFonts w:ascii="Times New Roman" w:eastAsia="Times New Roman" w:hAnsi="Times New Roman" w:cs="Times New Roman"/>
                 <w:sz w:val="24"/>
@@ -13105,7 +12758,7 @@
         </w:trPr>
         <w:tc>
           <w:tcPr>
-            <w:tcW w:w="1028" w:type="pct"/>
+            <w:tcW w:w="487" w:type="pct"/>
             <w:tcBorders>
               <w:top w:val="nil"/>
               <w:left w:val="single" w:sz="4" w:space="0" w:color="auto"/>
@@ -13138,7 +12791,7 @@
         </w:tc>
         <w:tc>
           <w:tcPr>
-            <w:tcW w:w="766" w:type="pct"/>
+            <w:tcW w:w="1253" w:type="pct"/>
             <w:tcBorders>
               <w:top w:val="nil"/>
               <w:left w:val="nil"/>
@@ -13170,7 +12823,7 @@
         </w:tc>
         <w:tc>
           <w:tcPr>
-            <w:tcW w:w="549" w:type="pct"/>
+            <w:tcW w:w="590" w:type="pct"/>
             <w:tcBorders>
               <w:top w:val="nil"/>
               <w:left w:val="nil"/>
@@ -13203,7 +12856,7 @@
         </w:tc>
         <w:tc>
           <w:tcPr>
-            <w:tcW w:w="585" w:type="pct"/>
+            <w:tcW w:w="613" w:type="pct"/>
             <w:tcBorders>
               <w:top w:val="nil"/>
               <w:left w:val="nil"/>
@@ -13217,6 +12870,7 @@
           <w:p>
             <w:pPr>
               <w:spacing w:after="0" w:line="240" w:lineRule="auto"/>
+              <w:jc w:val="right"/>
               <w:rPr>
                 <w:rFonts w:ascii="Times New Roman" w:eastAsia="Times New Roman" w:hAnsi="Times New Roman" w:cs="Times New Roman"/>
                 <w:sz w:val="24"/>
@@ -13235,7 +12889,7 @@
         </w:tc>
         <w:tc>
           <w:tcPr>
-            <w:tcW w:w="766" w:type="pct"/>
+            <w:tcW w:w="775" w:type="pct"/>
             <w:tcBorders>
               <w:top w:val="nil"/>
               <w:left w:val="nil"/>
@@ -13249,6 +12903,7 @@
           <w:p>
             <w:pPr>
               <w:spacing w:after="0" w:line="240" w:lineRule="auto"/>
+              <w:jc w:val="right"/>
               <w:rPr>
                 <w:rFonts w:ascii="Times New Roman" w:eastAsia="Times New Roman" w:hAnsi="Times New Roman" w:cs="Times New Roman"/>
                 <w:sz w:val="24"/>
@@ -13267,7 +12922,7 @@
         </w:tc>
         <w:tc>
           <w:tcPr>
-            <w:tcW w:w="1306" w:type="pct"/>
+            <w:tcW w:w="1282" w:type="pct"/>
             <w:tcBorders>
               <w:top w:val="nil"/>
               <w:left w:val="nil"/>
@@ -13281,6 +12936,7 @@
           <w:p>
             <w:pPr>
               <w:spacing w:after="0" w:line="240" w:lineRule="auto"/>
+              <w:jc w:val="right"/>
               <w:rPr>
                 <w:rFonts w:ascii="Times New Roman" w:eastAsia="Times New Roman" w:hAnsi="Times New Roman" w:cs="Times New Roman"/>
                 <w:sz w:val="24"/>
@@ -13304,7 +12960,7 @@
         </w:trPr>
         <w:tc>
           <w:tcPr>
-            <w:tcW w:w="1028" w:type="pct"/>
+            <w:tcW w:w="487" w:type="pct"/>
             <w:tcBorders>
               <w:top w:val="nil"/>
               <w:left w:val="single" w:sz="4" w:space="0" w:color="auto"/>
@@ -13336,7 +12992,7 @@
         </w:tc>
         <w:tc>
           <w:tcPr>
-            <w:tcW w:w="766" w:type="pct"/>
+            <w:tcW w:w="1253" w:type="pct"/>
             <w:tcBorders>
               <w:top w:val="nil"/>
               <w:left w:val="nil"/>
@@ -13368,7 +13024,7 @@
         </w:tc>
         <w:tc>
           <w:tcPr>
-            <w:tcW w:w="549" w:type="pct"/>
+            <w:tcW w:w="590" w:type="pct"/>
             <w:tcBorders>
               <w:top w:val="nil"/>
               <w:left w:val="nil"/>
@@ -13401,7 +13057,7 @@
         </w:tc>
         <w:tc>
           <w:tcPr>
-            <w:tcW w:w="585" w:type="pct"/>
+            <w:tcW w:w="613" w:type="pct"/>
             <w:tcBorders>
               <w:top w:val="nil"/>
               <w:left w:val="nil"/>
@@ -13415,6 +13071,7 @@
           <w:p>
             <w:pPr>
               <w:spacing w:after="0" w:line="240" w:lineRule="auto"/>
+              <w:jc w:val="right"/>
               <w:rPr>
                 <w:rFonts w:ascii="Times New Roman" w:eastAsia="Times New Roman" w:hAnsi="Times New Roman" w:cs="Times New Roman"/>
                 <w:sz w:val="24"/>
@@ -13433,7 +13090,7 @@
         </w:tc>
         <w:tc>
           <w:tcPr>
-            <w:tcW w:w="766" w:type="pct"/>
+            <w:tcW w:w="775" w:type="pct"/>
             <w:tcBorders>
               <w:top w:val="nil"/>
               <w:left w:val="nil"/>
@@ -13447,6 +13104,7 @@
           <w:p>
             <w:pPr>
               <w:spacing w:after="0" w:line="240" w:lineRule="auto"/>
+              <w:jc w:val="right"/>
               <w:rPr>
                 <w:rFonts w:ascii="Times New Roman" w:eastAsia="Times New Roman" w:hAnsi="Times New Roman" w:cs="Times New Roman"/>
                 <w:sz w:val="24"/>
@@ -13465,7 +13123,7 @@
         </w:tc>
         <w:tc>
           <w:tcPr>
-            <w:tcW w:w="1306" w:type="pct"/>
+            <w:tcW w:w="1282" w:type="pct"/>
             <w:tcBorders>
               <w:top w:val="nil"/>
               <w:left w:val="nil"/>
@@ -13479,6 +13137,7 @@
           <w:p>
             <w:pPr>
               <w:spacing w:after="0" w:line="240" w:lineRule="auto"/>
+              <w:jc w:val="right"/>
               <w:rPr>
                 <w:rFonts w:ascii="Times New Roman" w:eastAsia="Times New Roman" w:hAnsi="Times New Roman" w:cs="Times New Roman"/>
                 <w:sz w:val="24"/>
@@ -13502,7 +13161,7 @@
         </w:trPr>
         <w:tc>
           <w:tcPr>
-            <w:tcW w:w="1028" w:type="pct"/>
+            <w:tcW w:w="487" w:type="pct"/>
             <w:tcBorders>
               <w:top w:val="nil"/>
               <w:left w:val="single" w:sz="4" w:space="0" w:color="auto"/>
@@ -13535,7 +13194,7 @@
         </w:tc>
         <w:tc>
           <w:tcPr>
-            <w:tcW w:w="766" w:type="pct"/>
+            <w:tcW w:w="1253" w:type="pct"/>
             <w:tcBorders>
               <w:top w:val="nil"/>
               <w:left w:val="nil"/>
@@ -13567,7 +13226,7 @@
         </w:tc>
         <w:tc>
           <w:tcPr>
-            <w:tcW w:w="549" w:type="pct"/>
+            <w:tcW w:w="590" w:type="pct"/>
             <w:tcBorders>
               <w:top w:val="nil"/>
               <w:left w:val="nil"/>
@@ -13600,7 +13259,7 @@
         </w:tc>
         <w:tc>
           <w:tcPr>
-            <w:tcW w:w="585" w:type="pct"/>
+            <w:tcW w:w="613" w:type="pct"/>
             <w:tcBorders>
               <w:top w:val="nil"/>
               <w:left w:val="nil"/>
@@ -13614,6 +13273,7 @@
           <w:p>
             <w:pPr>
               <w:spacing w:after="0" w:line="240" w:lineRule="auto"/>
+              <w:jc w:val="right"/>
               <w:rPr>
                 <w:rFonts w:ascii="Times New Roman" w:eastAsia="Times New Roman" w:hAnsi="Times New Roman" w:cs="Times New Roman"/>
                 <w:sz w:val="24"/>
@@ -13632,7 +13292,7 @@
         </w:tc>
         <w:tc>
           <w:tcPr>
-            <w:tcW w:w="766" w:type="pct"/>
+            <w:tcW w:w="775" w:type="pct"/>
             <w:tcBorders>
               <w:top w:val="nil"/>
               <w:left w:val="nil"/>
@@ -13646,6 +13306,7 @@
           <w:p>
             <w:pPr>
               <w:spacing w:after="0" w:line="240" w:lineRule="auto"/>
+              <w:jc w:val="right"/>
               <w:rPr>
                 <w:rFonts w:ascii="Times New Roman" w:eastAsia="Times New Roman" w:hAnsi="Times New Roman" w:cs="Times New Roman"/>
                 <w:sz w:val="24"/>
@@ -13664,7 +13325,7 @@
         </w:tc>
         <w:tc>
           <w:tcPr>
-            <w:tcW w:w="1306" w:type="pct"/>
+            <w:tcW w:w="1282" w:type="pct"/>
             <w:tcBorders>
               <w:top w:val="nil"/>
               <w:left w:val="nil"/>
@@ -13678,6 +13339,7 @@
           <w:p>
             <w:pPr>
               <w:spacing w:after="0" w:line="240" w:lineRule="auto"/>
+              <w:jc w:val="right"/>
               <w:rPr>
                 <w:rFonts w:ascii="Times New Roman" w:eastAsia="Times New Roman" w:hAnsi="Times New Roman" w:cs="Times New Roman"/>
                 <w:sz w:val="24"/>
@@ -14093,6 +13755,7 @@
           <w:szCs w:val="28"/>
           <w:lang w:val="de-DE"/>
         </w:rPr>
+        <w:lastRenderedPageBreak/>
         <w:t>+ Dư nợ ngắn hạn là [TCTD.Dư nợ ngắn hạn] mục đích [TCTD.Mục đích ngắn hạn], nguồn trả nợ từ [TCTD.Nguồn trả nợ];</w:t>
       </w:r>
     </w:p>
@@ -14116,7 +13779,6 @@
           <w:szCs w:val="28"/>
           <w:lang w:val="de-DE"/>
         </w:rPr>
-        <w:lastRenderedPageBreak/>
         <w:t>+ Dư nợ trung dài hạn là [TCTD.Dư nợ trung dài hạn] mục đích [TCTD.Mục đích trung dài hạn], nguồn trả nợ từ [TCTD.Nguồn trả nợ];</w:t>
       </w:r>
     </w:p>
@@ -15529,6 +15191,7 @@
           <w:szCs w:val="28"/>
           <w:lang w:val="pt-BR"/>
         </w:rPr>
+        <w:lastRenderedPageBreak/>
         <w:t>Trên cơ sở hồ sơ vay vốn, đề xuất của Người quan hệ khách hàng, Người thẩm định đã tiến hành thẩm định và đề xuất như sau:</w:t>
       </w:r>
     </w:p>
@@ -15584,7 +15247,6 @@
           <w:szCs w:val="28"/>
           <w:lang w:val="pt-BR"/>
         </w:rPr>
-        <w:lastRenderedPageBreak/>
         <w:t xml:space="preserve">- Số tiền cho vay: </w:t>
       </w:r>
       <w:r>

</xml_diff>

<commit_message>
chore: remove generated files, test scripts, and sample assets
</commit_message>
<xml_diff>
--- a/report_assets/KHCN templates/Báo cáo đề xuất/2268.02B BCDXCV ngan han HMTD.docx
+++ b/report_assets/KHCN templates/Báo cáo đề xuất/2268.02B BCDXCV ngan han HMTD.docx
@@ -114,7 +114,7 @@
                 </mc:Choice>
                 <mc:Fallback>
                   <w:pict>
-                    <v:line w14:anchorId="63555E13" id="Straight Connector 1" o:spid="_x0000_s1026" style="position:absolute;z-index:251660288;visibility:visible;mso-wrap-style:square;mso-wrap-distance-left:9pt;mso-wrap-distance-top:0;mso-wrap-distance-right:9pt;mso-wrap-distance-bottom:0;mso-position-horizontal:center;mso-position-horizontal-relative:margin;mso-position-vertical:absolute;mso-position-vertical-relative:text" from="0,16.5pt" to="108pt,16.5pt" o:gfxdata="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">
+                    <v:line w14:anchorId="436307B6" id="Straight Connector 1" o:spid="_x0000_s1026" style="position:absolute;z-index:251660288;visibility:visible;mso-wrap-style:square;mso-wrap-distance-left:9pt;mso-wrap-distance-top:0;mso-wrap-distance-right:9pt;mso-wrap-distance-bottom:0;mso-position-horizontal:center;mso-position-horizontal-relative:margin;mso-position-vertical:absolute;mso-position-vertical-relative:text" from="0,16.5pt" to="108pt,16.5pt" o:gfxdata="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">
                       <w10:wrap anchorx="margin"/>
                     </v:line>
                   </w:pict>
@@ -266,7 +266,7 @@
                 </mc:Choice>
                 <mc:Fallback>
                   <w:pict>
-                    <v:shapetype w14:anchorId="748A76C2" id="_x0000_t32" coordsize="21600,21600" o:spt="32" o:oned="t" path="m,l21600,21600e" filled="f">
+                    <v:shapetype w14:anchorId="2E5F3940" id="_x0000_t32" coordsize="21600,21600" o:spt="32" o:oned="t" path="m,l21600,21600e" filled="f">
                       <v:path arrowok="t" fillok="f" o:connecttype="none"/>
                       <o:lock v:ext="edit" shapetype="t"/>
                     </v:shapetype>
@@ -856,8 +856,6 @@
               <w:jc w:val="both"/>
               <w:rPr>
                 <w:rFonts w:ascii="Times New Roman" w:hAnsi="Times New Roman"/>
-                <w:b/>
-                <w:bCs/>
                 <w:sz w:val="26"/>
                 <w:szCs w:val="26"/>
                 <w:lang w:val="es-MX"/>
@@ -866,7 +864,6 @@
             <w:r>
               <w:rPr>
                 <w:rFonts w:ascii="Times New Roman" w:hAnsi="Times New Roman"/>
-                <w:b/>
                 <w:sz w:val="26"/>
                 <w:szCs w:val="26"/>
                 <w:lang w:val="en-AU"/>
@@ -876,50 +873,11 @@
             <w:r>
               <w:rPr>
                 <w:rFonts w:ascii="Times New Roman" w:hAnsi="Times New Roman"/>
-                <w:b/>
                 <w:sz w:val="26"/>
                 <w:szCs w:val="26"/>
                 <w:lang w:val="en-AU"/>
               </w:rPr>
-              <w:t>1. [Danh xưng]:</w:t>
-            </w:r>
-            <w:r>
-              <w:rPr>
-                <w:rFonts w:ascii="Times New Roman" w:hAnsi="Times New Roman"/>
-                <w:sz w:val="26"/>
-                <w:szCs w:val="26"/>
-                <w:lang w:val="en-AU"/>
-              </w:rPr>
-              <w:t xml:space="preserve"> </w:t>
-            </w:r>
-            <w:r>
-              <w:rPr>
-                <w:rFonts w:ascii="Times New Roman" w:hAnsi="Times New Roman"/>
-                <w:b/>
-                <w:sz w:val="26"/>
-                <w:szCs w:val="26"/>
-                <w:lang w:val="en-AU"/>
-              </w:rPr>
-              <w:t>[Tên khách hàng]</w:t>
-            </w:r>
-            <w:r>
-              <w:rPr>
-                <w:rFonts w:ascii="Times New Roman" w:hAnsi="Times New Roman"/>
-                <w:sz w:val="26"/>
-                <w:szCs w:val="26"/>
-                <w:lang w:val="en-AU"/>
-              </w:rPr>
-              <w:t>.</w:t>
-            </w:r>
-            <w:r>
-              <w:rPr>
-                <w:rFonts w:ascii="Times New Roman" w:hAnsi="Times New Roman"/>
-                <w:b/>
-                <w:sz w:val="26"/>
-                <w:szCs w:val="26"/>
-                <w:lang w:val="en-AU"/>
-              </w:rPr>
-              <w:t xml:space="preserve"> </w:t>
+              <w:t xml:space="preserve">1. [Danh xưng]: [Tên khách hàng]. </w:t>
             </w:r>
             <w:r>
               <w:rPr>
@@ -928,17 +886,7 @@
                 <w:szCs w:val="26"/>
                 <w:lang w:val="es-MX"/>
               </w:rPr>
-              <w:t>Sinh năm:</w:t>
-            </w:r>
-            <w:r>
-              <w:rPr>
-                <w:rFonts w:ascii="Times New Roman" w:hAnsi="Times New Roman"/>
-                <w:b/>
-                <w:sz w:val="26"/>
-                <w:szCs w:val="26"/>
-                <w:lang w:val="es-MX"/>
-              </w:rPr>
-              <w:t xml:space="preserve"> </w:t>
+              <w:t xml:space="preserve">Sinh năm: </w:t>
             </w:r>
             <w:r>
               <w:rPr>
@@ -968,26 +916,7 @@
                 <w:szCs w:val="26"/>
                 <w:lang w:val="pt-BR"/>
               </w:rPr>
-              <w:t xml:space="preserve">[Loại giấy tờ tùy thân] số: </w:t>
-            </w:r>
-            <w:r>
-              <w:rPr>
-                <w:rFonts w:ascii="Times New Roman" w:hAnsi="Times New Roman"/>
-                <w:b/>
-                <w:sz w:val="26"/>
-                <w:szCs w:val="26"/>
-                <w:lang w:val="pt-BR"/>
-              </w:rPr>
-              <w:t>[CMND]</w:t>
-            </w:r>
-            <w:r>
-              <w:rPr>
-                <w:rFonts w:ascii="Times New Roman" w:hAnsi="Times New Roman"/>
-                <w:sz w:val="26"/>
-                <w:szCs w:val="26"/>
-                <w:lang w:val="pt-BR"/>
-              </w:rPr>
-              <w:t xml:space="preserve"> cấp ngày: [Ngày cấp]. Nơi cấp: [Nơi cấp]</w:t>
+              <w:t>[Loại giấy tờ tùy thân] số: [CMND] cấp ngày: [Ngày cấp]. Nơi cấp: [Nơi cấp]</w:t>
             </w:r>
           </w:p>
           <w:p>
@@ -1050,7 +979,6 @@
               <w:jc w:val="both"/>
               <w:rPr>
                 <w:rFonts w:ascii="Times New Roman" w:hAnsi="Times New Roman"/>
-                <w:b/>
                 <w:sz w:val="26"/>
                 <w:szCs w:val="26"/>
                 <w:lang w:val="en-AU"/>
@@ -1127,8 +1055,6 @@
               <w:jc w:val="both"/>
               <w:rPr>
                 <w:rFonts w:ascii="Times New Roman" w:hAnsi="Times New Roman"/>
-                <w:b/>
-                <w:bCs/>
                 <w:sz w:val="26"/>
                 <w:szCs w:val="26"/>
                 <w:lang w:val="es-MX"/>
@@ -1137,7 +1063,6 @@
             <w:r>
               <w:rPr>
                 <w:rFonts w:ascii="Times New Roman" w:hAnsi="Times New Roman"/>
-                <w:b/>
                 <w:sz w:val="26"/>
                 <w:szCs w:val="26"/>
                 <w:lang w:val="en-AU"/>
@@ -1147,12 +1072,11 @@
             <w:r>
               <w:rPr>
                 <w:rFonts w:ascii="Times New Roman" w:hAnsi="Times New Roman"/>
-                <w:b/>
                 <w:sz w:val="26"/>
                 <w:szCs w:val="26"/>
                 <w:lang w:val="en-AU"/>
               </w:rPr>
-              <w:t>[TV.START2]. [TV.Danh xưng]:</w:t>
+              <w:t>2</w:t>
             </w:r>
             <w:r>
               <w:rPr>
@@ -1161,36 +1085,7 @@
                 <w:szCs w:val="26"/>
                 <w:lang w:val="en-AU"/>
               </w:rPr>
-              <w:t xml:space="preserve"> </w:t>
-            </w:r>
-            <w:r>
-              <w:rPr>
-                <w:rFonts w:ascii="Times New Roman" w:hAnsi="Times New Roman"/>
-                <w:b/>
-                <w:sz w:val="26"/>
-                <w:szCs w:val="26"/>
-                <w:lang w:val="en-AU"/>
-              </w:rPr>
-              <w:t>[TV.Họ và tên]</w:t>
-            </w:r>
-            <w:r>
-              <w:rPr>
-                <w:rFonts w:ascii="Times New Roman" w:hAnsi="Times New Roman"/>
-                <w:sz w:val="26"/>
-                <w:szCs w:val="26"/>
-                <w:lang w:val="en-AU"/>
-              </w:rPr>
-              <w:t>.</w:t>
-            </w:r>
-            <w:r>
-              <w:rPr>
-                <w:rFonts w:ascii="Times New Roman" w:hAnsi="Times New Roman"/>
-                <w:b/>
-                <w:sz w:val="26"/>
-                <w:szCs w:val="26"/>
-                <w:lang w:val="en-AU"/>
-              </w:rPr>
-              <w:t xml:space="preserve"> </w:t>
+              <w:t xml:space="preserve">. [TV.Danh xưng]: [TV.Họ và tên]. </w:t>
             </w:r>
             <w:r>
               <w:rPr>
@@ -1199,17 +1094,7 @@
                 <w:szCs w:val="26"/>
                 <w:lang w:val="es-MX"/>
               </w:rPr>
-              <w:t>Sinh năm:</w:t>
-            </w:r>
-            <w:r>
-              <w:rPr>
-                <w:rFonts w:ascii="Times New Roman" w:hAnsi="Times New Roman"/>
-                <w:b/>
-                <w:sz w:val="26"/>
-                <w:szCs w:val="26"/>
-                <w:lang w:val="es-MX"/>
-              </w:rPr>
-              <w:t xml:space="preserve"> </w:t>
+              <w:t xml:space="preserve">Sinh năm: </w:t>
             </w:r>
             <w:r>
               <w:rPr>
@@ -1239,26 +1124,7 @@
                 <w:szCs w:val="26"/>
                 <w:lang w:val="es-MX"/>
               </w:rPr>
-              <w:t xml:space="preserve">[TV.Loại giấy tờ tùy thân] số: </w:t>
-            </w:r>
-            <w:r>
-              <w:rPr>
-                <w:rFonts w:ascii="Times New Roman" w:hAnsi="Times New Roman"/>
-                <w:b/>
-                <w:sz w:val="26"/>
-                <w:szCs w:val="26"/>
-                <w:lang w:val="es-MX"/>
-              </w:rPr>
-              <w:t xml:space="preserve">[TV.CMND] </w:t>
-            </w:r>
-            <w:r>
-              <w:rPr>
-                <w:rFonts w:ascii="Times New Roman" w:hAnsi="Times New Roman"/>
-                <w:sz w:val="26"/>
-                <w:szCs w:val="26"/>
-                <w:lang w:val="es-MX"/>
-              </w:rPr>
-              <w:t>cấp ngày: [TV.Ngày cấp]. Nơi cấp: [TV.Nơi cấp]</w:t>
+              <w:t>[TV.Loại giấy tờ tùy thân] số: [TV.CMND] cấp ngày: [TV.Ngày cấp]. Nơi cấp: [TV.Nơi cấp]</w:t>
             </w:r>
           </w:p>
           <w:p>
@@ -1361,6 +1227,151 @@
         </w:rPr>
         <w:t>[HĐTD.Giấy tờ ủy quyền]</w:t>
       </w:r>
+    </w:p>
+    <w:p>
+      <w:pPr>
+        <w:spacing w:after="0" w:line="276" w:lineRule="auto"/>
+        <w:ind w:firstLine="567"/>
+        <w:jc w:val="both"/>
+        <w:rPr>
+          <w:rFonts w:ascii="Times New Roman" w:eastAsia="Times New Roman" w:hAnsi="Times New Roman"/>
+          <w:sz w:val="26"/>
+          <w:szCs w:val="26"/>
+        </w:rPr>
+      </w:pPr>
+      <w:r>
+        <w:rPr>
+          <w:rFonts w:ascii="Times New Roman" w:eastAsia="Times New Roman" w:hAnsi="Times New Roman"/>
+          <w:sz w:val="26"/>
+          <w:szCs w:val="26"/>
+        </w:rPr>
+        <w:t>[#TLPA]</w:t>
+      </w:r>
+    </w:p>
+    <w:p>
+      <w:pPr>
+        <w:spacing w:after="0" w:line="276" w:lineRule="auto"/>
+        <w:ind w:firstLine="567"/>
+        <w:jc w:val="both"/>
+        <w:rPr>
+          <w:rFonts w:ascii="Times New Roman" w:eastAsia="Times New Roman" w:hAnsi="Times New Roman"/>
+          <w:sz w:val="26"/>
+          <w:szCs w:val="26"/>
+        </w:rPr>
+      </w:pPr>
+      <w:r>
+        <w:rPr>
+          <w:rFonts w:ascii="Times New Roman" w:eastAsia="Times New Roman" w:hAnsi="Times New Roman"/>
+          <w:sz w:val="26"/>
+          <w:szCs w:val="26"/>
+        </w:rPr>
+        <w:t>-</w:t>
+      </w:r>
+      <w:r>
+        <w:rPr>
+          <w:rFonts w:ascii="Times New Roman" w:eastAsia="Times New Roman" w:hAnsi="Times New Roman"/>
+          <w:sz w:val="26"/>
+          <w:szCs w:val="26"/>
+        </w:rPr>
+        <w:t xml:space="preserve"> [TLPA.Loại tài liệu]</w:t>
+      </w:r>
+      <w:r>
+        <w:rPr>
+          <w:rFonts w:ascii="Times New Roman" w:eastAsia="Times New Roman" w:hAnsi="Times New Roman"/>
+          <w:sz w:val="26"/>
+          <w:szCs w:val="26"/>
+        </w:rPr>
+        <w:t xml:space="preserve"> số </w:t>
+      </w:r>
+      <w:r>
+        <w:rPr>
+          <w:rFonts w:ascii="Times New Roman" w:eastAsia="Times New Roman" w:hAnsi="Times New Roman"/>
+          <w:sz w:val="26"/>
+          <w:szCs w:val="26"/>
+        </w:rPr>
+        <w:t>[TLPA.Số tài liệu]</w:t>
+      </w:r>
+      <w:r>
+        <w:rPr>
+          <w:rFonts w:ascii="Times New Roman" w:eastAsia="Times New Roman" w:hAnsi="Times New Roman"/>
+          <w:sz w:val="26"/>
+          <w:szCs w:val="26"/>
+        </w:rPr>
+        <w:t xml:space="preserve">; </w:t>
+      </w:r>
+      <w:r>
+        <w:rPr>
+          <w:rFonts w:ascii="Times New Roman" w:eastAsia="Times New Roman" w:hAnsi="Times New Roman"/>
+          <w:sz w:val="26"/>
+          <w:szCs w:val="26"/>
+        </w:rPr>
+        <w:t>Cơ quan cấp: [TLPA.Cơ quan cấp]</w:t>
+      </w:r>
+      <w:r>
+        <w:rPr>
+          <w:rFonts w:ascii="Times New Roman" w:eastAsia="Times New Roman" w:hAnsi="Times New Roman"/>
+          <w:sz w:val="26"/>
+          <w:szCs w:val="26"/>
+        </w:rPr>
+        <w:t xml:space="preserve">; </w:t>
+      </w:r>
+      <w:r>
+        <w:rPr>
+          <w:rFonts w:ascii="Times New Roman" w:eastAsia="Times New Roman" w:hAnsi="Times New Roman"/>
+          <w:sz w:val="26"/>
+          <w:szCs w:val="26"/>
+        </w:rPr>
+        <w:t>Ngày cấp: [TLPA.Ngày cấp]</w:t>
+      </w:r>
+      <w:r>
+        <w:rPr>
+          <w:rFonts w:ascii="Times New Roman" w:eastAsia="Times New Roman" w:hAnsi="Times New Roman"/>
+          <w:sz w:val="26"/>
+          <w:szCs w:val="26"/>
+        </w:rPr>
+        <w:t xml:space="preserve">; </w:t>
+      </w:r>
+      <w:r>
+        <w:rPr>
+          <w:rFonts w:ascii="Times New Roman" w:eastAsia="Times New Roman" w:hAnsi="Times New Roman"/>
+          <w:sz w:val="26"/>
+          <w:szCs w:val="26"/>
+        </w:rPr>
+        <w:t>[TLPA.Ghi chú]</w:t>
+      </w:r>
+    </w:p>
+    <w:p>
+      <w:pPr>
+        <w:spacing w:after="0" w:line="276" w:lineRule="auto"/>
+        <w:ind w:firstLine="567"/>
+        <w:jc w:val="both"/>
+        <w:rPr>
+          <w:rFonts w:ascii="Times New Roman" w:eastAsia="Times New Roman" w:hAnsi="Times New Roman"/>
+          <w:sz w:val="26"/>
+          <w:szCs w:val="26"/>
+        </w:rPr>
+      </w:pPr>
+      <w:r>
+        <w:rPr>
+          <w:rFonts w:ascii="Times New Roman" w:eastAsia="Times New Roman" w:hAnsi="Times New Roman"/>
+          <w:sz w:val="26"/>
+          <w:szCs w:val="26"/>
+        </w:rPr>
+        <w:t>[/TLPA]</w:t>
+      </w:r>
+    </w:p>
+    <w:p>
+      <w:pPr>
+        <w:spacing w:after="0" w:line="276" w:lineRule="auto"/>
+        <w:ind w:firstLine="567"/>
+        <w:jc w:val="both"/>
+        <w:rPr>
+          <w:rFonts w:ascii="Times New Roman" w:eastAsia="Times New Roman" w:hAnsi="Times New Roman"/>
+          <w:sz w:val="26"/>
+          <w:szCs w:val="26"/>
+          <w:lang w:val="es-MX"/>
+        </w:rPr>
+      </w:pPr>
     </w:p>
     <w:p>
       <w:pPr>
@@ -1436,101 +1447,39 @@
         <w:ind w:firstLine="567"/>
         <w:jc w:val="both"/>
         <w:rPr>
-          <w:rFonts w:ascii="Times New Roman" w:eastAsia="Calibri" w:hAnsi="Times New Roman" w:cs="Times New Roman"/>
-          <w:sz w:val="26"/>
-          <w:szCs w:val="28"/>
-          <w:lang w:val="de-DE"/>
-        </w:rPr>
-      </w:pPr>
-      <w:r>
-        <w:rPr>
-          <w:rFonts w:ascii="Times New Roman" w:eastAsia="Times New Roman" w:hAnsi="Times New Roman" w:cs="Times New Roman"/>
-          <w:sz w:val="26"/>
-          <w:szCs w:val="28"/>
-          <w:lang w:val="de-DE"/>
-        </w:rPr>
-        <w:t>-</w:t>
-      </w:r>
-      <w:r>
-        <w:rPr>
-          <w:rFonts w:ascii="Times New Roman" w:eastAsia="Times New Roman" w:hAnsi="Times New Roman" w:cs="Times New Roman"/>
-          <w:sz w:val="26"/>
-          <w:szCs w:val="28"/>
-          <w:lang w:val="de-DE"/>
-        </w:rPr>
-        <w:t xml:space="preserve"> Tại Agribank: </w:t>
-      </w:r>
-      <w:r>
-        <w:rPr>
-          <w:rFonts w:ascii="Times New Roman" w:eastAsia="Times New Roman" w:hAnsi="Times New Roman" w:cs="Times New Roman"/>
-          <w:sz w:val="26"/>
-          <w:szCs w:val="28"/>
-          <w:lang w:val="de-DE"/>
-        </w:rPr>
-        <w:t xml:space="preserve">Khách hàng hiện có tổng dư nợ </w:t>
-      </w:r>
-      <w:r>
-        <w:rPr>
-          <w:rFonts w:ascii="Times New Roman" w:eastAsia="Times New Roman" w:hAnsi="Times New Roman" w:cs="Times New Roman"/>
-          <w:sz w:val="26"/>
-          <w:szCs w:val="28"/>
-          <w:lang w:val="de-DE"/>
-        </w:rPr>
-        <w:t>[HĐTD.Dư nợ tại Agribank] đồng</w:t>
-      </w:r>
-      <w:r>
-        <w:rPr>
-          <w:rFonts w:ascii="Times New Roman" w:eastAsia="Times New Roman" w:hAnsi="Times New Roman" w:cs="Times New Roman"/>
-          <w:sz w:val="26"/>
-          <w:szCs w:val="28"/>
-          <w:lang w:val="de-DE"/>
-        </w:rPr>
-        <w:t xml:space="preserve"> tại Agribank [Tên chi nhánh/PGD]</w:t>
-      </w:r>
-      <w:r>
-        <w:rPr>
-          <w:rFonts w:ascii="Times New Roman" w:eastAsia="Times New Roman" w:hAnsi="Times New Roman" w:cs="Times New Roman"/>
-          <w:sz w:val="26"/>
-          <w:szCs w:val="28"/>
-          <w:lang w:val="de-DE"/>
-        </w:rPr>
-        <w:t>; Nhóm nợ</w:t>
-      </w:r>
-      <w:r>
-        <w:rPr>
-          <w:rFonts w:ascii="Times New Roman" w:eastAsia="Calibri" w:hAnsi="Times New Roman" w:cs="Times New Roman"/>
-          <w:sz w:val="26"/>
-          <w:szCs w:val="28"/>
-          <w:lang w:val="de-DE"/>
-        </w:rPr>
-        <w:t xml:space="preserve">: </w:t>
-      </w:r>
-      <w:r>
-        <w:rPr>
-          <w:rFonts w:ascii="Times New Roman" w:eastAsia="Calibri" w:hAnsi="Times New Roman" w:cs="Times New Roman"/>
-          <w:sz w:val="26"/>
-          <w:szCs w:val="28"/>
-          <w:lang w:val="de-DE"/>
-        </w:rPr>
-        <w:t>[HĐTD.Nhóm nợ]</w:t>
-      </w:r>
-      <w:r>
-        <w:rPr>
-          <w:rFonts w:ascii="Times New Roman" w:eastAsia="Calibri" w:hAnsi="Times New Roman" w:cs="Times New Roman"/>
-          <w:sz w:val="26"/>
-          <w:szCs w:val="28"/>
-          <w:lang w:val="de-DE"/>
-        </w:rPr>
-        <w:t xml:space="preserve">. </w:t>
-      </w:r>
-      <w:r>
-        <w:rPr>
-          <w:rFonts w:ascii="Times New Roman" w:eastAsia="Calibri" w:hAnsi="Times New Roman" w:cs="Times New Roman"/>
-          <w:sz w:val="26"/>
-          <w:szCs w:val="28"/>
-          <w:lang w:val="de-DE"/>
-        </w:rPr>
-        <w:t>Trong đó:</w:t>
+          <w:rFonts w:ascii="Times New Roman" w:eastAsia="Times New Roman" w:hAnsi="Times New Roman" w:cs="Times New Roman"/>
+          <w:sz w:val="26"/>
+          <w:szCs w:val="28"/>
+        </w:rPr>
+      </w:pPr>
+      <w:r>
+        <w:rPr>
+          <w:rFonts w:ascii="Times New Roman" w:eastAsia="Times New Roman" w:hAnsi="Times New Roman" w:cs="Times New Roman"/>
+          <w:sz w:val="26"/>
+          <w:szCs w:val="28"/>
+        </w:rPr>
+        <w:t>[#DUNỢ]</w:t>
+      </w:r>
+    </w:p>
+    <w:p>
+      <w:pPr>
+        <w:shd w:val="clear" w:color="auto" w:fill="FFFFFF"/>
+        <w:spacing w:after="0" w:line="276" w:lineRule="auto"/>
+        <w:ind w:firstLine="567"/>
+        <w:jc w:val="both"/>
+        <w:rPr>
+          <w:rFonts w:ascii="Times New Roman" w:eastAsia="Times New Roman" w:hAnsi="Times New Roman" w:cs="Times New Roman"/>
+          <w:sz w:val="26"/>
+          <w:szCs w:val="28"/>
+        </w:rPr>
+      </w:pPr>
+      <w:r>
+        <w:rPr>
+          <w:rFonts w:ascii="Times New Roman" w:eastAsia="Times New Roman" w:hAnsi="Times New Roman" w:cs="Times New Roman"/>
+          <w:sz w:val="26"/>
+          <w:szCs w:val="28"/>
+        </w:rPr>
+        <w:t>- Tại [Tên tổ chức]: Tổng dư nợ [Tổng dư nợ] đồng; Nhóm nợ: [Nhóm nợ]</w:t>
       </w:r>
     </w:p>
     <w:p>
@@ -1543,27 +1492,15 @@
           <w:rFonts w:ascii="Times New Roman" w:eastAsia="Times New Roman" w:hAnsi="Times New Roman" w:cs="Times New Roman"/>
           <w:sz w:val="26"/>
           <w:szCs w:val="28"/>
-          <w:lang w:val="de-DE"/>
-        </w:rPr>
-      </w:pPr>
-      <w:r>
-        <w:rPr>
-          <w:rFonts w:ascii="Times New Roman" w:eastAsia="Calibri" w:hAnsi="Times New Roman" w:cs="Times New Roman"/>
-          <w:sz w:val="26"/>
-          <w:szCs w:val="28"/>
-          <w:lang w:val="de-DE"/>
-        </w:rPr>
-        <w:lastRenderedPageBreak/>
-        <w:t>+ D</w:t>
-      </w:r>
-      <w:r>
-        <w:rPr>
-          <w:rFonts w:ascii="Times New Roman" w:eastAsia="Times New Roman" w:hAnsi="Times New Roman" w:cs="Times New Roman"/>
-          <w:sz w:val="26"/>
-          <w:szCs w:val="28"/>
-          <w:lang w:val="de-DE"/>
-        </w:rPr>
-        <w:t>ư nợ ngắn hạn là [VBA.Dư nợ ngắn hạn] mục đích [VBA.Mục đích ngắn hạn], nguồn trả nợ từ [VBA.Nguồn trả nợ];</w:t>
+        </w:rPr>
+      </w:pPr>
+      <w:r>
+        <w:rPr>
+          <w:rFonts w:ascii="Times New Roman" w:eastAsia="Times New Roman" w:hAnsi="Times New Roman" w:cs="Times New Roman"/>
+          <w:sz w:val="26"/>
+          <w:szCs w:val="28"/>
+        </w:rPr>
+        <w:t>+ Ngắn hạn: [Dư nợ ngắn hạn], mục đích [Mục đích ngắn hạn]</w:t>
       </w:r>
     </w:p>
     <w:p>
@@ -1573,20 +1510,39 @@
         <w:ind w:firstLine="851"/>
         <w:jc w:val="both"/>
         <w:rPr>
-          <w:rFonts w:ascii="Times New Roman" w:eastAsia="Calibri" w:hAnsi="Times New Roman" w:cs="Times New Roman"/>
-          <w:sz w:val="26"/>
-          <w:szCs w:val="28"/>
-          <w:lang w:val="de-DE"/>
-        </w:rPr>
-      </w:pPr>
-      <w:r>
-        <w:rPr>
-          <w:rFonts w:ascii="Times New Roman" w:eastAsia="Times New Roman" w:hAnsi="Times New Roman" w:cs="Times New Roman"/>
-          <w:sz w:val="26"/>
-          <w:szCs w:val="28"/>
-          <w:lang w:val="de-DE"/>
-        </w:rPr>
-        <w:t>+ Dư nợ trung dài hạn là [VBA.Dư nợ trung dài hạn] mục đích [VBA.Mục đích trung dài hạn], nguồn trả nợ từ [VBA.Nguồn trả nợ];</w:t>
+          <w:rFonts w:ascii="Times New Roman" w:eastAsia="Times New Roman" w:hAnsi="Times New Roman" w:cs="Times New Roman"/>
+          <w:sz w:val="26"/>
+          <w:szCs w:val="28"/>
+        </w:rPr>
+      </w:pPr>
+      <w:r>
+        <w:rPr>
+          <w:rFonts w:ascii="Times New Roman" w:eastAsia="Times New Roman" w:hAnsi="Times New Roman" w:cs="Times New Roman"/>
+          <w:sz w:val="26"/>
+          <w:szCs w:val="28"/>
+        </w:rPr>
+        <w:t>+ Trung dài hạn: [Dư nợ trung dài hạn], mục đích [Mục đích trung dài hạn]</w:t>
+      </w:r>
+    </w:p>
+    <w:p>
+      <w:pPr>
+        <w:shd w:val="clear" w:color="auto" w:fill="FFFFFF"/>
+        <w:spacing w:after="0" w:line="276" w:lineRule="auto"/>
+        <w:ind w:firstLine="851"/>
+        <w:jc w:val="both"/>
+        <w:rPr>
+          <w:rFonts w:ascii="Times New Roman" w:eastAsia="Times New Roman" w:hAnsi="Times New Roman" w:cs="Times New Roman"/>
+          <w:sz w:val="26"/>
+          <w:szCs w:val="28"/>
+        </w:rPr>
+      </w:pPr>
+      <w:r>
+        <w:rPr>
+          <w:rFonts w:ascii="Times New Roman" w:eastAsia="Times New Roman" w:hAnsi="Times New Roman" w:cs="Times New Roman"/>
+          <w:sz w:val="26"/>
+          <w:szCs w:val="28"/>
+        </w:rPr>
+        <w:t>+ Nguồn trả nợ: [Nguồn trả nợ]</w:t>
       </w:r>
     </w:p>
     <w:p>
@@ -1599,252 +1555,15 @@
           <w:rFonts w:ascii="Times New Roman" w:eastAsia="Times New Roman" w:hAnsi="Times New Roman" w:cs="Times New Roman"/>
           <w:sz w:val="26"/>
           <w:szCs w:val="28"/>
-          <w:lang w:val="de-DE"/>
-        </w:rPr>
-      </w:pPr>
-      <w:r>
-        <w:rPr>
-          <w:rFonts w:ascii="Times New Roman" w:eastAsia="Calibri" w:hAnsi="Times New Roman" w:cs="Times New Roman"/>
-          <w:sz w:val="26"/>
-          <w:szCs w:val="28"/>
-          <w:lang w:val="de-DE"/>
-        </w:rPr>
-        <w:t>-</w:t>
-      </w:r>
-      <w:r>
-        <w:rPr>
-          <w:rFonts w:ascii="Times New Roman" w:eastAsia="Calibri" w:hAnsi="Times New Roman" w:cs="Times New Roman"/>
-          <w:sz w:val="26"/>
-          <w:szCs w:val="28"/>
-          <w:lang w:val="de-DE"/>
-        </w:rPr>
-        <w:t xml:space="preserve"> Tại các TCTD khác</w:t>
-      </w:r>
-      <w:r>
-        <w:rPr>
-          <w:rFonts w:ascii="Times New Roman" w:eastAsia="Calibri" w:hAnsi="Times New Roman" w:cs="Times New Roman"/>
-          <w:sz w:val="26"/>
-          <w:szCs w:val="28"/>
-          <w:lang w:val="de-DE"/>
-        </w:rPr>
-        <w:t xml:space="preserve"> </w:t>
-      </w:r>
-      <w:r>
-        <w:rPr>
-          <w:rFonts w:ascii="Times New Roman" w:eastAsia="Calibri" w:hAnsi="Times New Roman" w:cs="Times New Roman"/>
-          <w:sz w:val="26"/>
-          <w:szCs w:val="28"/>
-          <w:lang w:val="de-DE"/>
-        </w:rPr>
-        <w:t xml:space="preserve">Khách hàng hiện có tổng dư nợ </w:t>
-      </w:r>
-      <w:r>
-        <w:rPr>
-          <w:rFonts w:ascii="Times New Roman" w:eastAsia="Times New Roman" w:hAnsi="Times New Roman" w:cs="Times New Roman"/>
-          <w:sz w:val="26"/>
-          <w:szCs w:val="28"/>
-          <w:lang w:val="de-DE"/>
-        </w:rPr>
-        <w:t>[</w:t>
-      </w:r>
-      <w:r>
-        <w:rPr>
-          <w:rFonts w:ascii="Times New Roman" w:eastAsia="Times New Roman" w:hAnsi="Times New Roman" w:cs="Times New Roman"/>
-          <w:sz w:val="26"/>
-          <w:szCs w:val="28"/>
-          <w:lang w:val="de-DE"/>
-        </w:rPr>
-        <w:t>TCTD</w:t>
-      </w:r>
-      <w:r>
-        <w:rPr>
-          <w:rFonts w:ascii="Times New Roman" w:eastAsia="Times New Roman" w:hAnsi="Times New Roman" w:cs="Times New Roman"/>
-          <w:sz w:val="26"/>
-          <w:szCs w:val="28"/>
-          <w:lang w:val="de-DE"/>
-        </w:rPr>
-        <w:t>.</w:t>
-      </w:r>
-      <w:r>
-        <w:rPr>
-          <w:rFonts w:ascii="Times New Roman" w:eastAsia="Times New Roman" w:hAnsi="Times New Roman" w:cs="Times New Roman"/>
-          <w:sz w:val="26"/>
-          <w:szCs w:val="28"/>
-          <w:lang w:val="de-DE"/>
-        </w:rPr>
-        <w:t>Tổng dư nợ</w:t>
-      </w:r>
-      <w:r>
-        <w:rPr>
-          <w:rFonts w:ascii="Times New Roman" w:eastAsia="Times New Roman" w:hAnsi="Times New Roman" w:cs="Times New Roman"/>
-          <w:sz w:val="26"/>
-          <w:szCs w:val="28"/>
-          <w:lang w:val="de-DE"/>
-        </w:rPr>
-        <w:t>] đồng</w:t>
-      </w:r>
-      <w:r>
-        <w:rPr>
-          <w:rFonts w:ascii="Times New Roman" w:eastAsia="Times New Roman" w:hAnsi="Times New Roman" w:cs="Times New Roman"/>
-          <w:sz w:val="26"/>
-          <w:szCs w:val="28"/>
-          <w:lang w:val="de-DE"/>
-        </w:rPr>
-        <w:t xml:space="preserve"> tại [TCTD.Tên TCTD]</w:t>
-      </w:r>
-      <w:r>
-        <w:rPr>
-          <w:rFonts w:ascii="Times New Roman" w:eastAsia="Calibri" w:hAnsi="Times New Roman" w:cs="Times New Roman"/>
-          <w:sz w:val="26"/>
-          <w:szCs w:val="28"/>
-          <w:lang w:val="de-DE"/>
-        </w:rPr>
-        <w:t xml:space="preserve">; </w:t>
-      </w:r>
-      <w:r>
-        <w:rPr>
-          <w:rFonts w:ascii="Times New Roman" w:eastAsia="Times New Roman" w:hAnsi="Times New Roman" w:cs="Times New Roman"/>
-          <w:sz w:val="26"/>
-          <w:szCs w:val="28"/>
-          <w:lang w:val="de-DE"/>
-        </w:rPr>
-        <w:t>Nhóm nợ</w:t>
-      </w:r>
-      <w:r>
-        <w:rPr>
-          <w:rFonts w:ascii="Times New Roman" w:eastAsia="Calibri" w:hAnsi="Times New Roman" w:cs="Times New Roman"/>
-          <w:sz w:val="26"/>
-          <w:szCs w:val="28"/>
-          <w:lang w:val="de-DE"/>
-        </w:rPr>
-        <w:t xml:space="preserve">: </w:t>
-      </w:r>
-      <w:r>
-        <w:rPr>
-          <w:rFonts w:ascii="Times New Roman" w:eastAsia="Calibri" w:hAnsi="Times New Roman" w:cs="Times New Roman"/>
-          <w:sz w:val="26"/>
-          <w:szCs w:val="28"/>
-          <w:lang w:val="de-DE"/>
-        </w:rPr>
-        <w:t>[HĐTD.Nhóm nợ]</w:t>
-      </w:r>
-      <w:r>
-        <w:rPr>
-          <w:rFonts w:ascii="Times New Roman" w:eastAsia="Calibri" w:hAnsi="Times New Roman" w:cs="Times New Roman"/>
-          <w:sz w:val="26"/>
-          <w:szCs w:val="28"/>
-          <w:lang w:val="de-DE"/>
-        </w:rPr>
-        <w:t>,</w:t>
-      </w:r>
-      <w:r>
-        <w:rPr>
-          <w:rFonts w:ascii="Times New Roman" w:eastAsia="Times New Roman" w:hAnsi="Times New Roman" w:cs="Times New Roman"/>
-          <w:sz w:val="26"/>
-          <w:szCs w:val="28"/>
-          <w:lang w:val="de-DE"/>
-        </w:rPr>
-        <w:t xml:space="preserve"> trong đó</w:t>
-      </w:r>
-      <w:r>
-        <w:rPr>
-          <w:rFonts w:ascii="Times New Roman" w:eastAsia="Times New Roman" w:hAnsi="Times New Roman" w:cs="Times New Roman"/>
-          <w:sz w:val="26"/>
-          <w:szCs w:val="28"/>
-          <w:lang w:val="de-DE"/>
-        </w:rPr>
-        <w:t>:</w:t>
-      </w:r>
-    </w:p>
-    <w:p>
-      <w:pPr>
-        <w:shd w:val="clear" w:color="auto" w:fill="FFFFFF"/>
-        <w:spacing w:after="0" w:line="276" w:lineRule="auto"/>
-        <w:ind w:firstLine="851"/>
-        <w:jc w:val="both"/>
-        <w:rPr>
-          <w:rFonts w:ascii="Times New Roman" w:eastAsia="Times New Roman" w:hAnsi="Times New Roman" w:cs="Times New Roman"/>
-          <w:sz w:val="26"/>
-          <w:szCs w:val="28"/>
-          <w:lang w:val="de-DE"/>
-        </w:rPr>
-      </w:pPr>
-      <w:r>
-        <w:rPr>
-          <w:rFonts w:ascii="Times New Roman" w:eastAsia="Times New Roman" w:hAnsi="Times New Roman" w:cs="Times New Roman"/>
-          <w:sz w:val="26"/>
-          <w:szCs w:val="28"/>
-          <w:lang w:val="de-DE"/>
-        </w:rPr>
-        <w:t>+</w:t>
-      </w:r>
-      <w:r>
-        <w:rPr>
-          <w:rFonts w:ascii="Times New Roman" w:eastAsia="Times New Roman" w:hAnsi="Times New Roman" w:cs="Times New Roman"/>
-          <w:sz w:val="26"/>
-          <w:szCs w:val="28"/>
-          <w:lang w:val="de-DE"/>
-        </w:rPr>
-        <w:t xml:space="preserve"> </w:t>
-      </w:r>
-      <w:r>
-        <w:rPr>
-          <w:rFonts w:ascii="Times New Roman" w:eastAsia="Times New Roman" w:hAnsi="Times New Roman" w:cs="Times New Roman"/>
-          <w:sz w:val="26"/>
-          <w:szCs w:val="28"/>
-          <w:lang w:val="de-DE"/>
-        </w:rPr>
-        <w:t>D</w:t>
-      </w:r>
-      <w:r>
-        <w:rPr>
-          <w:rFonts w:ascii="Times New Roman" w:eastAsia="Times New Roman" w:hAnsi="Times New Roman" w:cs="Times New Roman"/>
-          <w:sz w:val="26"/>
-          <w:szCs w:val="28"/>
-          <w:lang w:val="de-DE"/>
-        </w:rPr>
-        <w:t xml:space="preserve">ư nợ ngắn hạn là [TCTD.Dư nợ ngắn hạn] mục đích [TCTD.Mục đích ngắn hạn], </w:t>
-      </w:r>
-      <w:r>
-        <w:rPr>
-          <w:rFonts w:ascii="Times New Roman" w:eastAsia="Times New Roman" w:hAnsi="Times New Roman" w:cs="Times New Roman"/>
-          <w:sz w:val="26"/>
-          <w:szCs w:val="28"/>
-          <w:lang w:val="de-DE"/>
-        </w:rPr>
-        <w:t>nguồn trả nợ từ [TCTD.Nguồn trả nợ];</w:t>
-      </w:r>
-    </w:p>
-    <w:p>
-      <w:pPr>
-        <w:shd w:val="clear" w:color="auto" w:fill="FFFFFF"/>
-        <w:spacing w:after="0" w:line="276" w:lineRule="auto"/>
-        <w:ind w:firstLine="851"/>
-        <w:jc w:val="both"/>
-        <w:rPr>
-          <w:rFonts w:ascii="Times New Roman" w:eastAsia="Calibri" w:hAnsi="Times New Roman" w:cs="Times New Roman"/>
-          <w:sz w:val="26"/>
-          <w:szCs w:val="28"/>
-          <w:lang w:val="de-DE"/>
-        </w:rPr>
-      </w:pPr>
-      <w:r>
-        <w:rPr>
-          <w:rFonts w:ascii="Times New Roman" w:eastAsia="Times New Roman" w:hAnsi="Times New Roman" w:cs="Times New Roman"/>
-          <w:sz w:val="26"/>
-          <w:szCs w:val="28"/>
-          <w:lang w:val="de-DE"/>
-        </w:rPr>
-        <w:t>+ D</w:t>
-      </w:r>
-      <w:r>
-        <w:rPr>
-          <w:rFonts w:ascii="Times New Roman" w:eastAsia="Times New Roman" w:hAnsi="Times New Roman" w:cs="Times New Roman"/>
-          <w:sz w:val="26"/>
-          <w:szCs w:val="28"/>
-          <w:lang w:val="de-DE"/>
-        </w:rPr>
-        <w:t>ư nợ trung dài hạn là [TCTD.Dư nợ trung dài hạn] mục đích [TCTD.Mục đích trung dài hạn], nguồn trả nợ từ [TCTD.Nguồn trả nợ];</w:t>
+        </w:rPr>
+      </w:pPr>
+      <w:r>
+        <w:rPr>
+          <w:rFonts w:ascii="Times New Roman" w:eastAsia="Times New Roman" w:hAnsi="Times New Roman" w:cs="Times New Roman"/>
+          <w:sz w:val="26"/>
+          <w:szCs w:val="28"/>
+        </w:rPr>
+        <w:t>[/DUNỢ]</w:t>
       </w:r>
     </w:p>
     <w:p>
@@ -3853,17 +3572,7 @@
                 <w:sz w:val="26"/>
                 <w:szCs w:val="28"/>
               </w:rPr>
-              <w:t xml:space="preserve">ản in từ hệ </w:t>
-            </w:r>
-            <w:r>
-              <w:rPr>
-                <w:rFonts w:ascii="Times New Roman" w:eastAsia="Times New Roman" w:hAnsi="Times New Roman" w:cs="Times New Roman"/>
-                <w:bCs/>
-                <w:sz w:val="26"/>
-                <w:szCs w:val="28"/>
-              </w:rPr>
-              <w:lastRenderedPageBreak/>
-              <w:t>thống CIC</w:t>
+              <w:t>ản in từ hệ thống CIC</w:t>
             </w:r>
           </w:p>
         </w:tc>
@@ -3961,6 +3670,7 @@
                 <w:sz w:val="26"/>
                 <w:szCs w:val="28"/>
               </w:rPr>
+              <w:lastRenderedPageBreak/>
               <w:t>Phiếu thu thập thông tin khách hàng</w:t>
             </w:r>
           </w:p>
@@ -3992,6 +3702,7 @@
                 <w:sz w:val="26"/>
                 <w:szCs w:val="28"/>
               </w:rPr>
+              <w:lastRenderedPageBreak/>
               <w:t>Bản</w:t>
             </w:r>
             <w:r>
@@ -4445,7 +4156,7 @@
         <w:jc w:val="both"/>
         <w:rPr>
           <w:rFonts w:ascii="Times New Roman" w:eastAsia="Calibri" w:hAnsi="Times New Roman" w:cs="Times New Roman"/>
-          <w:b/>
+          <w:bCs/>
           <w:sz w:val="26"/>
           <w:szCs w:val="28"/>
           <w:lang w:val="de-DE"/>
@@ -4454,7 +4165,7 @@
       <w:r>
         <w:rPr>
           <w:rFonts w:ascii="Times New Roman" w:eastAsia="Calibri" w:hAnsi="Times New Roman" w:cs="Times New Roman"/>
-          <w:b/>
+          <w:bCs/>
           <w:sz w:val="26"/>
           <w:szCs w:val="28"/>
           <w:lang w:val="de-DE"/>
@@ -4473,6 +4184,7 @@
         <w:jc w:val="both"/>
         <w:rPr>
           <w:rFonts w:ascii="Times New Roman" w:eastAsia="Calibri" w:hAnsi="Times New Roman" w:cs="Times New Roman"/>
+          <w:bCs/>
           <w:sz w:val="26"/>
           <w:szCs w:val="28"/>
           <w:lang w:val="de-DE"/>
@@ -4481,6 +4193,7 @@
       <w:r>
         <w:rPr>
           <w:rFonts w:ascii="Times New Roman" w:eastAsia="MS Gothic" w:hAnsi="Times New Roman" w:cs="Times New Roman"/>
+          <w:bCs/>
           <w:sz w:val="26"/>
           <w:lang w:val="de-DE"/>
         </w:rPr>
@@ -4489,6 +4202,7 @@
       <w:r>
         <w:rPr>
           <w:rFonts w:ascii="Times New Roman" w:eastAsia="Calibri" w:hAnsi="Times New Roman" w:cs="Times New Roman"/>
+          <w:bCs/>
           <w:sz w:val="26"/>
           <w:szCs w:val="28"/>
           <w:lang w:val="de-DE"/>
@@ -4498,6 +4212,7 @@
       <w:r>
         <w:rPr>
           <w:rFonts w:ascii="Times New Roman" w:eastAsia="Calibri" w:hAnsi="Times New Roman" w:cs="Times New Roman"/>
+          <w:bCs/>
           <w:sz w:val="26"/>
           <w:lang w:val="de-DE"/>
         </w:rPr>
@@ -4506,20 +4221,12 @@
       <w:r>
         <w:rPr>
           <w:rFonts w:ascii="Times New Roman" w:eastAsia="Calibri" w:hAnsi="Times New Roman" w:cs="Times New Roman"/>
+          <w:bCs/>
           <w:sz w:val="26"/>
           <w:szCs w:val="28"/>
           <w:lang w:val="de-DE"/>
         </w:rPr>
-        <w:t xml:space="preserve"> dân sự</w:t>
-      </w:r>
-      <w:r>
-        <w:rPr>
-          <w:rFonts w:ascii="Times New Roman" w:eastAsia="Calibri" w:hAnsi="Times New Roman" w:cs="Times New Roman"/>
-          <w:sz w:val="26"/>
-          <w:szCs w:val="28"/>
-          <w:lang w:val="de-DE"/>
-        </w:rPr>
-        <w:t>;</w:t>
+        <w:t xml:space="preserve"> dân sự;</w:t>
       </w:r>
     </w:p>
     <w:p>
@@ -4533,6 +4240,7 @@
         <w:jc w:val="both"/>
         <w:rPr>
           <w:rFonts w:ascii="Times New Roman" w:eastAsia="Calibri" w:hAnsi="Times New Roman" w:cs="Times New Roman"/>
+          <w:bCs/>
           <w:sz w:val="26"/>
           <w:szCs w:val="28"/>
           <w:lang w:val="de-DE"/>
@@ -4541,6 +4249,7 @@
       <w:r>
         <w:rPr>
           <w:rFonts w:ascii="Times New Roman" w:eastAsia="Calibri" w:hAnsi="Times New Roman" w:cs="Times New Roman"/>
+          <w:bCs/>
           <w:sz w:val="26"/>
           <w:lang w:val="de-DE"/>
         </w:rPr>
@@ -4549,6 +4258,7 @@
       <w:r>
         <w:rPr>
           <w:rFonts w:ascii="Times New Roman" w:eastAsia="Calibri" w:hAnsi="Times New Roman" w:cs="Times New Roman"/>
+          <w:bCs/>
           <w:sz w:val="26"/>
           <w:szCs w:val="28"/>
           <w:lang w:val="de-DE"/>
@@ -4558,6 +4268,7 @@
       <w:r>
         <w:rPr>
           <w:rFonts w:ascii="Times New Roman" w:eastAsia="Calibri" w:hAnsi="Times New Roman" w:cs="Times New Roman"/>
+          <w:bCs/>
           <w:sz w:val="26"/>
           <w:lang w:val="de-DE"/>
         </w:rPr>
@@ -4566,20 +4277,12 @@
       <w:r>
         <w:rPr>
           <w:rFonts w:ascii="Times New Roman" w:eastAsia="Calibri" w:hAnsi="Times New Roman" w:cs="Times New Roman"/>
+          <w:bCs/>
           <w:sz w:val="26"/>
           <w:szCs w:val="28"/>
           <w:lang w:val="de-DE"/>
         </w:rPr>
-        <w:t xml:space="preserve"> đầy đủ</w:t>
-      </w:r>
-      <w:r>
-        <w:rPr>
-          <w:rFonts w:ascii="Times New Roman" w:eastAsia="Calibri" w:hAnsi="Times New Roman" w:cs="Times New Roman"/>
-          <w:sz w:val="26"/>
-          <w:szCs w:val="28"/>
-          <w:lang w:val="de-DE"/>
-        </w:rPr>
-        <w:t>.</w:t>
+        <w:t xml:space="preserve"> đầy đủ.</w:t>
       </w:r>
     </w:p>
     <w:p>
@@ -4590,7 +4293,7 @@
         <w:jc w:val="both"/>
         <w:rPr>
           <w:rFonts w:ascii="Times New Roman" w:eastAsia="Calibri" w:hAnsi="Times New Roman" w:cs="Times New Roman"/>
-          <w:b/>
+          <w:bCs/>
           <w:i/>
           <w:sz w:val="26"/>
           <w:szCs w:val="28"/>
@@ -4600,7 +4303,7 @@
       <w:r>
         <w:rPr>
           <w:rFonts w:ascii="Times New Roman" w:eastAsia="Calibri" w:hAnsi="Times New Roman" w:cs="Times New Roman"/>
-          <w:b/>
+          <w:bCs/>
           <w:sz w:val="26"/>
           <w:szCs w:val="28"/>
           <w:lang w:val="de-DE"/>
@@ -4610,7 +4313,7 @@
       <w:r>
         <w:rPr>
           <w:rFonts w:ascii="Times New Roman" w:eastAsia="Calibri" w:hAnsi="Times New Roman" w:cs="Times New Roman"/>
-          <w:b/>
+          <w:bCs/>
           <w:i/>
           <w:sz w:val="26"/>
           <w:szCs w:val="28"/>
@@ -4621,7 +4324,7 @@
       <w:r>
         <w:rPr>
           <w:rFonts w:ascii="Times New Roman" w:eastAsia="Calibri" w:hAnsi="Times New Roman" w:cs="Times New Roman"/>
-          <w:b/>
+          <w:bCs/>
           <w:sz w:val="26"/>
           <w:szCs w:val="28"/>
           <w:lang w:val="de-DE"/>
@@ -4640,6 +4343,7 @@
         <w:jc w:val="both"/>
         <w:rPr>
           <w:rFonts w:ascii="Times New Roman" w:eastAsia="Calibri" w:hAnsi="Times New Roman" w:cs="Times New Roman"/>
+          <w:bCs/>
           <w:sz w:val="26"/>
           <w:szCs w:val="28"/>
           <w:lang w:val="de-DE"/>
@@ -4648,6 +4352,7 @@
       <w:r>
         <w:rPr>
           <w:rFonts w:ascii="Times New Roman" w:eastAsia="MS Gothic" w:hAnsi="Times New Roman" w:cs="Times New Roman"/>
+          <w:bCs/>
           <w:sz w:val="26"/>
           <w:lang w:val="de-DE"/>
         </w:rPr>
@@ -4656,6 +4361,7 @@
       <w:r>
         <w:rPr>
           <w:rFonts w:ascii="Times New Roman" w:eastAsia="Calibri" w:hAnsi="Times New Roman" w:cs="Times New Roman"/>
+          <w:bCs/>
           <w:sz w:val="26"/>
           <w:szCs w:val="28"/>
           <w:lang w:val="de-DE"/>
@@ -4665,6 +4371,7 @@
       <w:r>
         <w:rPr>
           <w:rFonts w:ascii="Times New Roman" w:eastAsia="Calibri" w:hAnsi="Times New Roman" w:cs="Times New Roman"/>
+          <w:bCs/>
           <w:sz w:val="26"/>
           <w:lang w:val="de-DE"/>
         </w:rPr>
@@ -4673,20 +4380,12 @@
       <w:r>
         <w:rPr>
           <w:rFonts w:ascii="Times New Roman" w:eastAsia="Calibri" w:hAnsi="Times New Roman" w:cs="Times New Roman"/>
+          <w:bCs/>
           <w:sz w:val="26"/>
           <w:szCs w:val="28"/>
           <w:lang w:val="de-DE"/>
         </w:rPr>
-        <w:t xml:space="preserve"> dân sự</w:t>
-      </w:r>
-      <w:r>
-        <w:rPr>
-          <w:rFonts w:ascii="Times New Roman" w:eastAsia="Calibri" w:hAnsi="Times New Roman" w:cs="Times New Roman"/>
-          <w:sz w:val="26"/>
-          <w:szCs w:val="28"/>
-          <w:lang w:val="de-DE"/>
-        </w:rPr>
-        <w:t>;</w:t>
+        <w:t xml:space="preserve"> dân sự;</w:t>
       </w:r>
     </w:p>
     <w:p>
@@ -5039,7 +4738,7 @@
           <w:szCs w:val="28"/>
           <w:lang w:val="pt-BR"/>
         </w:rPr>
-        <w:t>[HĐTD.Tỷ lệ vốn đối ứng]%</w:t>
+        <w:t>[HĐTD.Tỷ lệ vốn đối ứng]</w:t>
       </w:r>
       <w:r>
         <w:rPr>
@@ -5352,7 +5051,6 @@
         <w:jc w:val="both"/>
         <w:rPr>
           <w:rFonts w:ascii="Times New Roman" w:hAnsi="Times New Roman" w:cs="Times New Roman"/>
-          <w:color w:val="C00000"/>
           <w:sz w:val="26"/>
           <w:szCs w:val="28"/>
         </w:rPr>
@@ -5361,7 +5059,6 @@
         <w:rPr>
           <w:rFonts w:ascii="Times New Roman" w:eastAsia="Times New Roman" w:hAnsi="Times New Roman" w:cs="Times New Roman"/>
           <w:bCs/>
-          <w:color w:val="C00000"/>
           <w:sz w:val="26"/>
           <w:szCs w:val="28"/>
           <w:lang w:val="vi-VN"/>
@@ -5371,27 +5068,142 @@
       <w:r>
         <w:rPr>
           <w:rFonts w:ascii="Times New Roman" w:hAnsi="Times New Roman" w:cs="Times New Roman"/>
-          <w:color w:val="C00000"/>
-          <w:sz w:val="26"/>
-          <w:szCs w:val="28"/>
-        </w:rPr>
-        <w:t xml:space="preserve">Các tài liệu liên quan đến phương án sử dụng vốn của khách hàng: </w:t>
-      </w:r>
-      <w:r>
-        <w:rPr>
-          <w:rFonts w:ascii="Times New Roman" w:eastAsia="Times New Roman" w:hAnsi="Times New Roman" w:cs="Times New Roman"/>
-          <w:sz w:val="26"/>
-          <w:szCs w:val="28"/>
-        </w:rPr>
-        <w:t xml:space="preserve">Tài liệu </w:t>
-      </w:r>
-      <w:r>
-        <w:rPr>
-          <w:rFonts w:ascii="Times New Roman" w:eastAsia="Times New Roman" w:hAnsi="Times New Roman" w:cs="Times New Roman"/>
-          <w:sz w:val="26"/>
-          <w:szCs w:val="28"/>
-        </w:rPr>
-        <w:t>chứng minh diện tích canh tác, hợp đồng mua bán.</w:t>
+          <w:sz w:val="26"/>
+          <w:szCs w:val="28"/>
+        </w:rPr>
+        <w:t>Các tài liệu liên quan đến phương án sử dụng vốn của khách hàng:</w:t>
+      </w:r>
+    </w:p>
+    <w:p>
+      <w:pPr>
+        <w:spacing w:after="0" w:line="276" w:lineRule="auto"/>
+        <w:ind w:firstLine="567"/>
+        <w:jc w:val="both"/>
+        <w:rPr>
+          <w:rFonts w:ascii="Times New Roman" w:eastAsia="Times New Roman" w:hAnsi="Times New Roman"/>
+          <w:sz w:val="26"/>
+          <w:szCs w:val="26"/>
+        </w:rPr>
+      </w:pPr>
+      <w:r>
+        <w:rPr>
+          <w:rFonts w:ascii="Times New Roman" w:eastAsia="Times New Roman" w:hAnsi="Times New Roman"/>
+          <w:sz w:val="26"/>
+          <w:szCs w:val="26"/>
+        </w:rPr>
+        <w:t>[#TLPA]</w:t>
+      </w:r>
+    </w:p>
+    <w:p>
+      <w:pPr>
+        <w:spacing w:after="0" w:line="276" w:lineRule="auto"/>
+        <w:ind w:firstLine="851"/>
+        <w:jc w:val="both"/>
+        <w:rPr>
+          <w:rFonts w:ascii="Times New Roman" w:eastAsia="Times New Roman" w:hAnsi="Times New Roman"/>
+          <w:sz w:val="26"/>
+          <w:szCs w:val="26"/>
+        </w:rPr>
+      </w:pPr>
+      <w:r>
+        <w:rPr>
+          <w:rFonts w:ascii="Times New Roman" w:eastAsia="Times New Roman" w:hAnsi="Times New Roman"/>
+          <w:sz w:val="26"/>
+          <w:szCs w:val="26"/>
+        </w:rPr>
+        <w:t>+</w:t>
+      </w:r>
+      <w:r>
+        <w:rPr>
+          <w:rFonts w:ascii="Times New Roman" w:eastAsia="Times New Roman" w:hAnsi="Times New Roman"/>
+          <w:sz w:val="26"/>
+          <w:szCs w:val="26"/>
+        </w:rPr>
+        <w:t xml:space="preserve"> [TLPA.Loại tài liệu]</w:t>
+      </w:r>
+      <w:r>
+        <w:rPr>
+          <w:rFonts w:ascii="Times New Roman" w:eastAsia="Times New Roman" w:hAnsi="Times New Roman"/>
+          <w:sz w:val="26"/>
+          <w:szCs w:val="26"/>
+        </w:rPr>
+        <w:t xml:space="preserve"> số </w:t>
+      </w:r>
+      <w:r>
+        <w:rPr>
+          <w:rFonts w:ascii="Times New Roman" w:eastAsia="Times New Roman" w:hAnsi="Times New Roman"/>
+          <w:sz w:val="26"/>
+          <w:szCs w:val="26"/>
+        </w:rPr>
+        <w:t>[TLPA.Số tài liệu]</w:t>
+      </w:r>
+      <w:r>
+        <w:rPr>
+          <w:rFonts w:ascii="Times New Roman" w:eastAsia="Times New Roman" w:hAnsi="Times New Roman"/>
+          <w:sz w:val="26"/>
+          <w:szCs w:val="26"/>
+        </w:rPr>
+        <w:t xml:space="preserve">; </w:t>
+      </w:r>
+      <w:r>
+        <w:rPr>
+          <w:rFonts w:ascii="Times New Roman" w:eastAsia="Times New Roman" w:hAnsi="Times New Roman"/>
+          <w:sz w:val="26"/>
+          <w:szCs w:val="26"/>
+        </w:rPr>
+        <w:t>Cơ quan cấp: [TLPA.Cơ quan cấp]</w:t>
+      </w:r>
+      <w:r>
+        <w:rPr>
+          <w:rFonts w:ascii="Times New Roman" w:eastAsia="Times New Roman" w:hAnsi="Times New Roman"/>
+          <w:sz w:val="26"/>
+          <w:szCs w:val="26"/>
+        </w:rPr>
+        <w:t xml:space="preserve">; </w:t>
+      </w:r>
+      <w:r>
+        <w:rPr>
+          <w:rFonts w:ascii="Times New Roman" w:eastAsia="Times New Roman" w:hAnsi="Times New Roman"/>
+          <w:sz w:val="26"/>
+          <w:szCs w:val="26"/>
+        </w:rPr>
+        <w:t>Ngày cấp: [TLPA.Ngày cấp]</w:t>
+      </w:r>
+      <w:r>
+        <w:rPr>
+          <w:rFonts w:ascii="Times New Roman" w:eastAsia="Times New Roman" w:hAnsi="Times New Roman"/>
+          <w:sz w:val="26"/>
+          <w:szCs w:val="26"/>
+        </w:rPr>
+        <w:t xml:space="preserve">; </w:t>
+      </w:r>
+      <w:r>
+        <w:rPr>
+          <w:rFonts w:ascii="Times New Roman" w:eastAsia="Times New Roman" w:hAnsi="Times New Roman"/>
+          <w:sz w:val="26"/>
+          <w:szCs w:val="26"/>
+        </w:rPr>
+        <w:t>[TLPA.Ghi chú]</w:t>
+      </w:r>
+    </w:p>
+    <w:p>
+      <w:pPr>
+        <w:spacing w:after="0" w:line="276" w:lineRule="auto"/>
+        <w:ind w:firstLine="567"/>
+        <w:jc w:val="both"/>
+        <w:rPr>
+          <w:rFonts w:ascii="Times New Roman" w:eastAsia="Times New Roman" w:hAnsi="Times New Roman"/>
+          <w:sz w:val="26"/>
+          <w:szCs w:val="26"/>
+        </w:rPr>
+      </w:pPr>
+      <w:r>
+        <w:rPr>
+          <w:rFonts w:ascii="Times New Roman" w:eastAsia="Times New Roman" w:hAnsi="Times New Roman"/>
+          <w:sz w:val="26"/>
+          <w:szCs w:val="26"/>
+        </w:rPr>
+        <w:t>[/TLPA]</w:t>
       </w:r>
     </w:p>
     <w:p>
@@ -5415,7 +5227,7 @@
           <w:sz w:val="26"/>
           <w:szCs w:val="28"/>
         </w:rPr>
-        <w:t>- Nguồn trả nợ:</w:t>
+        <w:t>- Nguồn trả nợ</w:t>
       </w:r>
       <w:r>
         <w:rPr>
@@ -5423,7 +5235,16 @@
           <w:sz w:val="26"/>
           <w:szCs w:val="28"/>
         </w:rPr>
-        <w:t xml:space="preserve"> từ </w:t>
+        <w:t>: từ doanh thu của hoạt động [</w:t>
+      </w:r>
+      <w:r>
+        <w:rPr>
+          <w:rFonts w:ascii="Times New Roman" w:eastAsia="Times New Roman" w:hAnsi="Times New Roman" w:cs="Times New Roman"/>
+          <w:sz w:val="26"/>
+          <w:szCs w:val="28"/>
+          <w:lang w:val="pt-BR"/>
+        </w:rPr>
+        <w:t>HĐTD.Mục đích vay]</w:t>
       </w:r>
       <w:r>
         <w:rPr>
@@ -5431,15 +5252,7 @@
           <w:sz w:val="26"/>
           <w:szCs w:val="28"/>
         </w:rPr>
-        <w:t>doanh thu của hoạt đồng trồng</w:t>
-      </w:r>
-      <w:r>
-        <w:rPr>
-          <w:rFonts w:ascii="Times New Roman" w:hAnsi="Times New Roman" w:cs="Times New Roman"/>
-          <w:sz w:val="26"/>
-          <w:szCs w:val="28"/>
-        </w:rPr>
-        <w:t xml:space="preserve"> hoa Ly:</w:t>
+        <w:t>:</w:t>
       </w:r>
       <w:r>
         <w:rPr>
@@ -5699,6 +5512,7 @@
           <w:sz w:val="26"/>
           <w:szCs w:val="26"/>
         </w:rPr>
+        <w:lastRenderedPageBreak/>
         <w:t>Chi tiết tài sản</w:t>
       </w:r>
       <w:r>
@@ -5731,16 +5545,7 @@
           <w:sz w:val="26"/>
           <w:szCs w:val="26"/>
         </w:rPr>
-        <w:t xml:space="preserve">a) Quyền sử dụng đất (theo [Tên Giấy chứng nhận] số [Số seri] do [Cơ quan cấp] cấp </w:t>
-      </w:r>
-      <w:r>
-        <w:rPr>
-          <w:rFonts w:ascii="Times New Roman" w:eastAsia="Times New Roman" w:hAnsi="Times New Roman" w:cs="Times New Roman"/>
-          <w:sz w:val="26"/>
-          <w:szCs w:val="26"/>
-        </w:rPr>
-        <w:lastRenderedPageBreak/>
-        <w:t>ngày [Cấp ngày])</w:t>
+        <w:t>a) Quyền sử dụng đất (theo [Tên Giấy chứng nhận] số [Số seri] do [Cơ quan cấp] cấp ngày [Cấp ngày])</w:t>
       </w:r>
     </w:p>
     <w:p>
@@ -6888,7 +6693,7 @@
           <w:p>
             <w:pPr>
               <w:spacing w:after="0"/>
-              <w:jc w:val="right"/>
+              <w:jc w:val="center"/>
               <w:rPr>
                 <w:rFonts w:ascii="Times New Roman" w:hAnsi="Times New Roman"/>
                 <w:sz w:val="26"/>
@@ -7058,7 +6863,6 @@
           <w:p>
             <w:pPr>
               <w:spacing w:after="0"/>
-              <w:jc w:val="center"/>
               <w:rPr>
                 <w:rFonts w:ascii="Times New Roman" w:hAnsi="Times New Roman"/>
                 <w:b/>
@@ -7405,7 +7209,17 @@
           <w:szCs w:val="26"/>
           <w:lang w:val="fr-FR"/>
         </w:rPr>
-        <w:t xml:space="preserve">- Bảo đảm cho nghĩa vụ trả nợ của khách hàng </w:t>
+        <w:t>- Bảo đảm cho nghĩa vụ trả nợ của khách hàng là</w:t>
+      </w:r>
+      <w:r>
+        <w:rPr>
+          <w:rFonts w:ascii="Times New Roman" w:eastAsia="Calibri" w:hAnsi="Times New Roman" w:cs="Times New Roman"/>
+          <w:bCs/>
+          <w:sz w:val="26"/>
+          <w:szCs w:val="26"/>
+          <w:lang w:val="vi-VN"/>
+        </w:rPr>
+        <w:t>:</w:t>
       </w:r>
       <w:r>
         <w:rPr>
@@ -7415,7 +7229,18 @@
           <w:szCs w:val="26"/>
           <w:lang w:val="fr-FR"/>
         </w:rPr>
-        <w:t>là</w:t>
+        <w:t xml:space="preserve"> [Danh xưng] [Tên khách hàng] và </w:t>
+      </w:r>
+      <w:r>
+        <w:rPr>
+          <w:rFonts w:ascii="Times New Roman" w:eastAsia="Calibri" w:hAnsi="Times New Roman" w:cs="Times New Roman"/>
+          <w:bCs/>
+          <w:sz w:val="26"/>
+          <w:szCs w:val="26"/>
+          <w:lang w:val="fr-FR"/>
+        </w:rPr>
+        <w:lastRenderedPageBreak/>
+        <w:t>[TV.Danh xưng] [TV.Họ và tên] với phạm vi bảo đảm như sau: Tổng dư nợ gốc và số dư bảo lãnh (nếu có) của tất cả các hợp đồng cấp tín dụng ký giữa Agribank [Tên chi nhánh/PGD] và khách hàng là</w:t>
       </w:r>
       <w:r>
         <w:rPr>
@@ -7435,199 +7260,7 @@
           <w:szCs w:val="26"/>
           <w:lang w:val="fr-FR"/>
         </w:rPr>
-        <w:t xml:space="preserve"> </w:t>
-      </w:r>
-      <w:r>
-        <w:rPr>
-          <w:rFonts w:ascii="Times New Roman" w:eastAsia="Calibri" w:hAnsi="Times New Roman" w:cs="Times New Roman"/>
-          <w:bCs/>
-          <w:sz w:val="26"/>
-          <w:szCs w:val="26"/>
-          <w:lang w:val="fr-FR"/>
-        </w:rPr>
-        <w:t>[Danh xưng] [Tên khách hàng]</w:t>
-      </w:r>
-      <w:r>
-        <w:rPr>
-          <w:rFonts w:ascii="Times New Roman" w:eastAsia="Calibri" w:hAnsi="Times New Roman" w:cs="Times New Roman"/>
-          <w:bCs/>
-          <w:sz w:val="26"/>
-          <w:szCs w:val="26"/>
-          <w:lang w:val="fr-FR"/>
-        </w:rPr>
-        <w:t xml:space="preserve"> và </w:t>
-      </w:r>
-      <w:r>
-        <w:rPr>
-          <w:rFonts w:ascii="Times New Roman" w:eastAsia="Calibri" w:hAnsi="Times New Roman" w:cs="Times New Roman"/>
-          <w:bCs/>
-          <w:sz w:val="26"/>
-          <w:szCs w:val="26"/>
-          <w:lang w:val="fr-FR"/>
-        </w:rPr>
-        <w:t>[TV.Danh xưng]</w:t>
-      </w:r>
-      <w:r>
-        <w:rPr>
-          <w:rFonts w:ascii="Times New Roman" w:eastAsia="Calibri" w:hAnsi="Times New Roman" w:cs="Times New Roman"/>
-          <w:bCs/>
-          <w:sz w:val="26"/>
-          <w:szCs w:val="26"/>
-          <w:lang w:val="fr-FR"/>
-        </w:rPr>
-        <w:t xml:space="preserve"> [TV.Họ và tên]</w:t>
-      </w:r>
-      <w:r>
-        <w:rPr>
-          <w:rFonts w:ascii="Times New Roman" w:eastAsia="Calibri" w:hAnsi="Times New Roman" w:cs="Times New Roman"/>
-          <w:bCs/>
-          <w:sz w:val="26"/>
-          <w:szCs w:val="26"/>
-          <w:lang w:val="fr-FR"/>
-        </w:rPr>
-        <w:t xml:space="preserve"> với phạm vi bảo đảm như sau: Tổng dư nợ gốc và số dư bảo lãnh (nếu có) của tất cả các hợp đồng cấp tín dụng ký giữa Agribank [Tên chi </w:t>
-      </w:r>
-      <w:r>
-        <w:rPr>
-          <w:rFonts w:ascii="Times New Roman" w:eastAsia="Calibri" w:hAnsi="Times New Roman" w:cs="Times New Roman"/>
-          <w:bCs/>
-          <w:sz w:val="26"/>
-          <w:szCs w:val="26"/>
-          <w:lang w:val="fr-FR"/>
-        </w:rPr>
-        <w:lastRenderedPageBreak/>
-        <w:t>nhánh/PGD</w:t>
-      </w:r>
-      <w:r>
-        <w:rPr>
-          <w:rFonts w:ascii="Times New Roman" w:eastAsia="Calibri" w:hAnsi="Times New Roman" w:cs="Times New Roman"/>
-          <w:bCs/>
-          <w:sz w:val="26"/>
-          <w:szCs w:val="26"/>
-          <w:lang w:val="fr-FR"/>
-        </w:rPr>
-        <w:t>]</w:t>
-      </w:r>
-      <w:r>
-        <w:rPr>
-          <w:rFonts w:ascii="Times New Roman" w:eastAsia="Calibri" w:hAnsi="Times New Roman" w:cs="Times New Roman"/>
-          <w:bCs/>
-          <w:sz w:val="26"/>
-          <w:szCs w:val="26"/>
-          <w:lang w:val="fr-FR"/>
-        </w:rPr>
-        <w:t xml:space="preserve"> và khách hàng </w:t>
-      </w:r>
-      <w:r>
-        <w:rPr>
-          <w:rFonts w:ascii="Times New Roman" w:eastAsia="Calibri" w:hAnsi="Times New Roman" w:cs="Times New Roman"/>
-          <w:bCs/>
-          <w:sz w:val="26"/>
-          <w:szCs w:val="26"/>
-          <w:lang w:val="fr-FR"/>
-        </w:rPr>
-        <w:t>là</w:t>
-      </w:r>
-      <w:r>
-        <w:rPr>
-          <w:rFonts w:ascii="Times New Roman" w:eastAsia="Calibri" w:hAnsi="Times New Roman" w:cs="Times New Roman"/>
-          <w:bCs/>
-          <w:sz w:val="26"/>
-          <w:szCs w:val="26"/>
-          <w:lang w:val="vi-VN"/>
-        </w:rPr>
-        <w:t>:</w:t>
-      </w:r>
-      <w:r>
-        <w:rPr>
-          <w:rFonts w:ascii="Times New Roman" w:eastAsia="Calibri" w:hAnsi="Times New Roman" w:cs="Times New Roman"/>
-          <w:bCs/>
-          <w:sz w:val="26"/>
-          <w:szCs w:val="26"/>
-          <w:lang w:val="fr-FR"/>
-        </w:rPr>
-        <w:t xml:space="preserve"> </w:t>
-      </w:r>
-      <w:r>
-        <w:rPr>
-          <w:rFonts w:ascii="Times New Roman" w:eastAsia="Calibri" w:hAnsi="Times New Roman" w:cs="Times New Roman"/>
-          <w:bCs/>
-          <w:sz w:val="26"/>
-          <w:szCs w:val="26"/>
-          <w:lang w:val="fr-FR"/>
-        </w:rPr>
-        <w:t>[Danh xưng]</w:t>
-      </w:r>
-      <w:r>
-        <w:rPr>
-          <w:rFonts w:ascii="Times New Roman" w:eastAsia="Calibri" w:hAnsi="Times New Roman" w:cs="Times New Roman"/>
-          <w:bCs/>
-          <w:sz w:val="26"/>
-          <w:szCs w:val="26"/>
-          <w:lang w:val="fr-FR"/>
-        </w:rPr>
-        <w:t xml:space="preserve"> [Tên khách hàng]</w:t>
-      </w:r>
-      <w:r>
-        <w:rPr>
-          <w:rFonts w:ascii="Times New Roman" w:eastAsia="Calibri" w:hAnsi="Times New Roman" w:cs="Times New Roman"/>
-          <w:bCs/>
-          <w:sz w:val="26"/>
-          <w:szCs w:val="26"/>
-          <w:lang w:val="fr-FR"/>
-        </w:rPr>
-        <w:t xml:space="preserve"> và </w:t>
-      </w:r>
-      <w:r>
-        <w:rPr>
-          <w:rFonts w:ascii="Times New Roman" w:eastAsia="Calibri" w:hAnsi="Times New Roman" w:cs="Times New Roman"/>
-          <w:bCs/>
-          <w:sz w:val="26"/>
-          <w:szCs w:val="26"/>
-          <w:lang w:val="fr-FR"/>
-        </w:rPr>
-        <w:t>[TV.Danh xưng]</w:t>
-      </w:r>
-      <w:r>
-        <w:rPr>
-          <w:rFonts w:ascii="Times New Roman" w:eastAsia="Calibri" w:hAnsi="Times New Roman" w:cs="Times New Roman"/>
-          <w:bCs/>
-          <w:sz w:val="26"/>
-          <w:szCs w:val="26"/>
-          <w:lang w:val="fr-FR"/>
-        </w:rPr>
-        <w:t xml:space="preserve"> [TV.Họ và tên]</w:t>
-      </w:r>
-      <w:r>
-        <w:rPr>
-          <w:rFonts w:ascii="Times New Roman" w:eastAsia="Calibri" w:hAnsi="Times New Roman" w:cs="Times New Roman"/>
-          <w:bCs/>
-          <w:sz w:val="26"/>
-          <w:szCs w:val="26"/>
-          <w:lang w:val="fr-FR"/>
-        </w:rPr>
-        <w:t xml:space="preserve"> không vượt quá </w:t>
-      </w:r>
-      <w:r>
-        <w:rPr>
-          <w:rFonts w:ascii="Times New Roman" w:eastAsia="Calibri" w:hAnsi="Times New Roman" w:cs="Times New Roman"/>
-          <w:b/>
-          <w:bCs/>
-          <w:sz w:val="26"/>
-          <w:szCs w:val="26"/>
-          <w:lang w:val="fr-FR"/>
-        </w:rPr>
-        <w:t>[SĐ.Nghĩa vụ bảo đảm]</w:t>
-      </w:r>
-      <w:r>
-        <w:rPr>
-          <w:rFonts w:ascii="Times New Roman" w:eastAsia="Calibri" w:hAnsi="Times New Roman" w:cs="Times New Roman"/>
-          <w:bCs/>
-          <w:sz w:val="26"/>
-          <w:szCs w:val="26"/>
-          <w:lang w:val="fr-FR"/>
-        </w:rPr>
-        <w:t xml:space="preserve"> đồng (</w:t>
+        <w:t xml:space="preserve"> [Danh xưng] [Tên khách hàng] và [TV.Danh xưng] [TV.Họ và tên] không vượt quá [SĐ.Nghĩa vụ bảo đảm] đồng (</w:t>
       </w:r>
       <w:r>
         <w:rPr>
@@ -7838,25 +7471,7 @@
           <w:szCs w:val="28"/>
           <w:lang w:val="pt-BR"/>
         </w:rPr>
-        <w:t xml:space="preserve">điểm </w:t>
-      </w:r>
-      <w:r>
-        <w:rPr>
-          <w:rFonts w:ascii="Times New Roman" w:eastAsia="Times New Roman" w:hAnsi="Times New Roman" w:cs="Times New Roman"/>
-          <w:sz w:val="26"/>
-          <w:szCs w:val="28"/>
-          <w:lang w:val="pt-BR"/>
-        </w:rPr>
-        <w:t xml:space="preserve">vay </w:t>
-      </w:r>
-      <w:r>
-        <w:rPr>
-          <w:rFonts w:ascii="Times New Roman" w:eastAsia="Times New Roman" w:hAnsi="Times New Roman" w:cs="Times New Roman"/>
-          <w:sz w:val="26"/>
-          <w:szCs w:val="28"/>
-          <w:lang w:val="pt-BR"/>
-        </w:rPr>
-        <w:t>vốn: đáp ứng.</w:t>
+        <w:t>điểm vay vốn: đáp ứng.</w:t>
       </w:r>
     </w:p>
     <w:p>
@@ -7900,16 +7515,7 @@
           <w:szCs w:val="28"/>
           <w:lang w:val="pt-BR"/>
         </w:rPr>
-        <w:t xml:space="preserve">d) </w:t>
-      </w:r>
-      <w:r>
-        <w:rPr>
-          <w:rFonts w:ascii="Times New Roman" w:eastAsia="Times New Roman" w:hAnsi="Times New Roman" w:cs="Times New Roman"/>
-          <w:sz w:val="26"/>
-          <w:szCs w:val="28"/>
-          <w:lang w:val="pt-BR"/>
-        </w:rPr>
-        <w:t>Tài sản bảo đảm: Đủ điều kiện nhận làm TSBĐ chính thức theo quy định</w:t>
+        <w:t>d) Tài sản bảo đảm: Đủ điều kiện nhận làm TSBĐ chính thức theo quy định</w:t>
       </w:r>
       <w:bookmarkEnd w:id="3"/>
     </w:p>
@@ -7931,42 +7537,7 @@
           <w:sz w:val="26"/>
           <w:szCs w:val="28"/>
         </w:rPr>
-        <w:t xml:space="preserve">- Giá trị định giá tài sản bảo đảm: </w:t>
-      </w:r>
-      <w:r>
-        <w:rPr>
-          <w:rFonts w:ascii="Times New Roman" w:eastAsia="Calibri" w:hAnsi="Times New Roman" w:cs="Times New Roman"/>
-          <w:b/>
-          <w:sz w:val="26"/>
-          <w:szCs w:val="28"/>
-        </w:rPr>
-        <w:t>[</w:t>
-      </w:r>
-      <w:r>
-        <w:rPr>
-          <w:rFonts w:ascii="Times New Roman" w:eastAsia="Calibri" w:hAnsi="Times New Roman" w:cs="Times New Roman"/>
-          <w:b/>
-          <w:sz w:val="26"/>
-          <w:szCs w:val="28"/>
-        </w:rPr>
-        <w:t>HĐTD.</w:t>
-      </w:r>
-      <w:r>
-        <w:rPr>
-          <w:rFonts w:ascii="Times New Roman" w:eastAsia="Calibri" w:hAnsi="Times New Roman" w:cs="Times New Roman"/>
-          <w:b/>
-          <w:sz w:val="26"/>
-          <w:szCs w:val="28"/>
-        </w:rPr>
-        <w:t>Tổng giá trị TSBĐ]</w:t>
-      </w:r>
-      <w:r>
-        <w:rPr>
-          <w:rFonts w:ascii="Times New Roman" w:eastAsia="Calibri" w:hAnsi="Times New Roman" w:cs="Times New Roman"/>
-          <w:sz w:val="26"/>
-          <w:szCs w:val="28"/>
-        </w:rPr>
-        <w:t xml:space="preserve"> đồng</w:t>
+        <w:t>- Giá trị định giá tài sản bảo đảm: [HĐTD.Tổng giá trị TSBĐ] đồng</w:t>
       </w:r>
     </w:p>
     <w:p>
@@ -7977,7 +7548,6 @@
         <w:jc w:val="both"/>
         <w:rPr>
           <w:rFonts w:ascii="Times New Roman" w:eastAsia="Calibri" w:hAnsi="Times New Roman" w:cs="Times New Roman"/>
-          <w:bCs/>
           <w:sz w:val="26"/>
           <w:szCs w:val="28"/>
           <w:lang w:val="fr-FR"/>
@@ -7986,55 +7556,11 @@
       <w:r>
         <w:rPr>
           <w:rFonts w:ascii="Times New Roman" w:eastAsia="Calibri" w:hAnsi="Times New Roman" w:cs="Times New Roman"/>
-          <w:bCs/>
           <w:sz w:val="26"/>
           <w:szCs w:val="28"/>
           <w:lang w:val="fr-FR"/>
         </w:rPr>
-        <w:t xml:space="preserve">- Nghĩa vụ được bảo đảm, phạm vi bảo đảm: </w:t>
-      </w:r>
-      <w:r>
-        <w:rPr>
-          <w:rFonts w:ascii="Times New Roman" w:eastAsia="Calibri" w:hAnsi="Times New Roman" w:cs="Times New Roman"/>
-          <w:b/>
-          <w:bCs/>
-          <w:sz w:val="26"/>
-          <w:szCs w:val="28"/>
-          <w:lang w:val="fr-FR"/>
-        </w:rPr>
-        <w:t>[</w:t>
-      </w:r>
-      <w:r>
-        <w:rPr>
-          <w:rFonts w:ascii="Times New Roman" w:eastAsia="Calibri" w:hAnsi="Times New Roman" w:cs="Times New Roman"/>
-          <w:b/>
-          <w:bCs/>
-          <w:sz w:val="26"/>
-          <w:szCs w:val="28"/>
-          <w:lang w:val="fr-FR"/>
-        </w:rPr>
-        <w:t>HĐTD.</w:t>
-      </w:r>
-      <w:r>
-        <w:rPr>
-          <w:rFonts w:ascii="Times New Roman" w:eastAsia="Calibri" w:hAnsi="Times New Roman" w:cs="Times New Roman"/>
-          <w:b/>
-          <w:bCs/>
-          <w:sz w:val="26"/>
-          <w:szCs w:val="28"/>
-          <w:lang w:val="fr-FR"/>
-        </w:rPr>
-        <w:t>Tổng nghĩa vụ bảo đảm]</w:t>
-      </w:r>
-      <w:r>
-        <w:rPr>
-          <w:rFonts w:ascii="Times New Roman" w:eastAsia="Calibri" w:hAnsi="Times New Roman" w:cs="Times New Roman"/>
-          <w:bCs/>
-          <w:sz w:val="26"/>
-          <w:szCs w:val="28"/>
-          <w:lang w:val="fr-FR"/>
-        </w:rPr>
-        <w:t xml:space="preserve"> đồng</w:t>
+        <w:t>- Nghĩa vụ được bảo đảm, phạm vi bảo đảm: [HĐTD.Tổng nghĩa vụ bảo đảm] đồng</w:t>
       </w:r>
     </w:p>
     <w:bookmarkEnd w:id="2"/>
@@ -8835,6 +8361,7 @@
           <w:szCs w:val="28"/>
           <w:lang w:val="de-DE"/>
         </w:rPr>
+        <w:lastRenderedPageBreak/>
         <w:t>2. Đánh giá tính hợp pháp của mục đích sử dụng tiền vay</w:t>
       </w:r>
       <w:r>
@@ -8897,7 +8424,6 @@
           <w:szCs w:val="28"/>
           <w:lang w:val="de-DE"/>
         </w:rPr>
-        <w:lastRenderedPageBreak/>
         <w:t xml:space="preserve">3. Thẩm định </w:t>
       </w:r>
       <w:r>
@@ -9063,12 +8589,12 @@
         <w:tblLook w:val="04A0" w:firstRow="1" w:lastRow="0" w:firstColumn="1" w:lastColumn="0" w:noHBand="0" w:noVBand="1"/>
       </w:tblPr>
       <w:tblGrid>
-        <w:gridCol w:w="1956"/>
-        <w:gridCol w:w="1701"/>
-        <w:gridCol w:w="1320"/>
-        <w:gridCol w:w="1161"/>
-        <w:gridCol w:w="1277"/>
-        <w:gridCol w:w="2438"/>
+        <w:gridCol w:w="1724"/>
+        <w:gridCol w:w="2317"/>
+        <w:gridCol w:w="1029"/>
+        <w:gridCol w:w="1259"/>
+        <w:gridCol w:w="1433"/>
+        <w:gridCol w:w="2091"/>
       </w:tblGrid>
       <w:tr>
         <w:trPr>
@@ -9076,7 +8602,7 @@
         </w:trPr>
         <w:tc>
           <w:tcPr>
-            <w:tcW w:w="993" w:type="pct"/>
+            <w:tcW w:w="874" w:type="pct"/>
             <w:tcBorders>
               <w:top w:val="single" w:sz="8" w:space="0" w:color="454545"/>
               <w:left w:val="single" w:sz="8" w:space="0" w:color="454545"/>
@@ -9113,7 +8639,7 @@
         </w:tc>
         <w:tc>
           <w:tcPr>
-            <w:tcW w:w="863" w:type="pct"/>
+            <w:tcW w:w="1176" w:type="pct"/>
             <w:tcBorders>
               <w:top w:val="single" w:sz="8" w:space="0" w:color="454545"/>
               <w:left w:val="nil"/>
@@ -9150,7 +8676,7 @@
         </w:tc>
         <w:tc>
           <w:tcPr>
-            <w:tcW w:w="670" w:type="pct"/>
+            <w:tcW w:w="522" w:type="pct"/>
             <w:tcBorders>
               <w:top w:val="single" w:sz="8" w:space="0" w:color="454545"/>
               <w:left w:val="nil"/>
@@ -9187,7 +8713,7 @@
         </w:tc>
         <w:tc>
           <w:tcPr>
-            <w:tcW w:w="589" w:type="pct"/>
+            <w:tcW w:w="639" w:type="pct"/>
             <w:tcBorders>
               <w:top w:val="single" w:sz="8" w:space="0" w:color="454545"/>
               <w:left w:val="nil"/>
@@ -9224,7 +8750,7 @@
         </w:tc>
         <w:tc>
           <w:tcPr>
-            <w:tcW w:w="648" w:type="pct"/>
+            <w:tcW w:w="727" w:type="pct"/>
             <w:tcBorders>
               <w:top w:val="single" w:sz="8" w:space="0" w:color="454545"/>
               <w:left w:val="nil"/>
@@ -9261,7 +8787,7 @@
         </w:tc>
         <w:tc>
           <w:tcPr>
-            <w:tcW w:w="1237" w:type="pct"/>
+            <w:tcW w:w="1061" w:type="pct"/>
             <w:tcBorders>
               <w:top w:val="single" w:sz="8" w:space="0" w:color="454545"/>
               <w:left w:val="nil"/>
@@ -9303,7 +8829,7 @@
         </w:trPr>
         <w:tc>
           <w:tcPr>
-            <w:tcW w:w="993" w:type="pct"/>
+            <w:tcW w:w="874" w:type="pct"/>
             <w:tcBorders>
               <w:top w:val="nil"/>
               <w:left w:val="single" w:sz="8" w:space="0" w:color="454545"/>
@@ -9336,7 +8862,7 @@
         </w:tc>
         <w:tc>
           <w:tcPr>
-            <w:tcW w:w="863" w:type="pct"/>
+            <w:tcW w:w="1176" w:type="pct"/>
             <w:tcBorders>
               <w:top w:val="nil"/>
               <w:left w:val="nil"/>
@@ -9368,7 +8894,7 @@
         </w:tc>
         <w:tc>
           <w:tcPr>
-            <w:tcW w:w="670" w:type="pct"/>
+            <w:tcW w:w="522" w:type="pct"/>
             <w:tcBorders>
               <w:top w:val="nil"/>
               <w:left w:val="nil"/>
@@ -9401,7 +8927,7 @@
         </w:tc>
         <w:tc>
           <w:tcPr>
-            <w:tcW w:w="589" w:type="pct"/>
+            <w:tcW w:w="639" w:type="pct"/>
             <w:tcBorders>
               <w:top w:val="nil"/>
               <w:left w:val="nil"/>
@@ -9433,7 +8959,7 @@
         </w:tc>
         <w:tc>
           <w:tcPr>
-            <w:tcW w:w="648" w:type="pct"/>
+            <w:tcW w:w="727" w:type="pct"/>
             <w:tcBorders>
               <w:top w:val="nil"/>
               <w:left w:val="nil"/>
@@ -9465,7 +8991,7 @@
         </w:tc>
         <w:tc>
           <w:tcPr>
-            <w:tcW w:w="1237" w:type="pct"/>
+            <w:tcW w:w="1061" w:type="pct"/>
             <w:tcBorders>
               <w:top w:val="nil"/>
               <w:left w:val="nil"/>
@@ -9502,7 +9028,7 @@
         </w:trPr>
         <w:tc>
           <w:tcPr>
-            <w:tcW w:w="993" w:type="pct"/>
+            <w:tcW w:w="874" w:type="pct"/>
             <w:tcBorders>
               <w:top w:val="nil"/>
               <w:left w:val="single" w:sz="8" w:space="0" w:color="454545"/>
@@ -9535,7 +9061,7 @@
         </w:tc>
         <w:tc>
           <w:tcPr>
-            <w:tcW w:w="863" w:type="pct"/>
+            <w:tcW w:w="1176" w:type="pct"/>
             <w:tcBorders>
               <w:top w:val="nil"/>
               <w:left w:val="nil"/>
@@ -9567,7 +9093,7 @@
         </w:tc>
         <w:tc>
           <w:tcPr>
-            <w:tcW w:w="670" w:type="pct"/>
+            <w:tcW w:w="522" w:type="pct"/>
             <w:tcBorders>
               <w:top w:val="nil"/>
               <w:left w:val="nil"/>
@@ -9600,7 +9126,7 @@
         </w:tc>
         <w:tc>
           <w:tcPr>
-            <w:tcW w:w="589" w:type="pct"/>
+            <w:tcW w:w="639" w:type="pct"/>
             <w:tcBorders>
               <w:top w:val="nil"/>
               <w:left w:val="nil"/>
@@ -9633,7 +9159,7 @@
         </w:tc>
         <w:tc>
           <w:tcPr>
-            <w:tcW w:w="648" w:type="pct"/>
+            <w:tcW w:w="727" w:type="pct"/>
             <w:tcBorders>
               <w:top w:val="nil"/>
               <w:left w:val="nil"/>
@@ -9666,7 +9192,7 @@
         </w:tc>
         <w:tc>
           <w:tcPr>
-            <w:tcW w:w="1237" w:type="pct"/>
+            <w:tcW w:w="1061" w:type="pct"/>
             <w:tcBorders>
               <w:top w:val="nil"/>
               <w:left w:val="nil"/>
@@ -9704,7 +9230,7 @@
         </w:trPr>
         <w:tc>
           <w:tcPr>
-            <w:tcW w:w="993" w:type="pct"/>
+            <w:tcW w:w="874" w:type="pct"/>
             <w:tcBorders>
               <w:top w:val="nil"/>
               <w:left w:val="single" w:sz="8" w:space="0" w:color="454545"/>
@@ -9737,7 +9263,7 @@
         </w:tc>
         <w:tc>
           <w:tcPr>
-            <w:tcW w:w="863" w:type="pct"/>
+            <w:tcW w:w="1176" w:type="pct"/>
             <w:tcBorders>
               <w:top w:val="nil"/>
               <w:left w:val="nil"/>
@@ -9769,7 +9295,7 @@
         </w:tc>
         <w:tc>
           <w:tcPr>
-            <w:tcW w:w="670" w:type="pct"/>
+            <w:tcW w:w="522" w:type="pct"/>
             <w:tcBorders>
               <w:top w:val="nil"/>
               <w:left w:val="nil"/>
@@ -9802,7 +9328,7 @@
         </w:tc>
         <w:tc>
           <w:tcPr>
-            <w:tcW w:w="589" w:type="pct"/>
+            <w:tcW w:w="639" w:type="pct"/>
             <w:tcBorders>
               <w:top w:val="nil"/>
               <w:left w:val="nil"/>
@@ -9835,7 +9361,7 @@
         </w:tc>
         <w:tc>
           <w:tcPr>
-            <w:tcW w:w="648" w:type="pct"/>
+            <w:tcW w:w="727" w:type="pct"/>
             <w:tcBorders>
               <w:top w:val="nil"/>
               <w:left w:val="nil"/>
@@ -9868,7 +9394,7 @@
         </w:tc>
         <w:tc>
           <w:tcPr>
-            <w:tcW w:w="1237" w:type="pct"/>
+            <w:tcW w:w="1061" w:type="pct"/>
             <w:tcBorders>
               <w:top w:val="nil"/>
               <w:left w:val="nil"/>
@@ -9906,7 +9432,7 @@
         </w:trPr>
         <w:tc>
           <w:tcPr>
-            <w:tcW w:w="993" w:type="pct"/>
+            <w:tcW w:w="874" w:type="pct"/>
             <w:tcBorders>
               <w:top w:val="nil"/>
               <w:left w:val="single" w:sz="8" w:space="0" w:color="454545"/>
@@ -9943,7 +9469,7 @@
         </w:tc>
         <w:tc>
           <w:tcPr>
-            <w:tcW w:w="863" w:type="pct"/>
+            <w:tcW w:w="1176" w:type="pct"/>
             <w:tcBorders>
               <w:top w:val="nil"/>
               <w:left w:val="nil"/>
@@ -9979,7 +9505,7 @@
         </w:tc>
         <w:tc>
           <w:tcPr>
-            <w:tcW w:w="670" w:type="pct"/>
+            <w:tcW w:w="522" w:type="pct"/>
             <w:tcBorders>
               <w:top w:val="nil"/>
               <w:left w:val="nil"/>
@@ -10016,7 +9542,7 @@
         </w:tc>
         <w:tc>
           <w:tcPr>
-            <w:tcW w:w="589" w:type="pct"/>
+            <w:tcW w:w="639" w:type="pct"/>
             <w:tcBorders>
               <w:top w:val="nil"/>
               <w:left w:val="nil"/>
@@ -10053,7 +9579,7 @@
         </w:tc>
         <w:tc>
           <w:tcPr>
-            <w:tcW w:w="648" w:type="pct"/>
+            <w:tcW w:w="727" w:type="pct"/>
             <w:tcBorders>
               <w:top w:val="nil"/>
               <w:left w:val="nil"/>
@@ -10090,7 +9616,7 @@
         </w:tc>
         <w:tc>
           <w:tcPr>
-            <w:tcW w:w="1237" w:type="pct"/>
+            <w:tcW w:w="1061" w:type="pct"/>
             <w:tcBorders>
               <w:top w:val="nil"/>
               <w:left w:val="nil"/>
@@ -10168,7 +9694,7 @@
           <w:szCs w:val="28"/>
           <w:lang w:val="pt-BR"/>
         </w:rPr>
-        <w:t>[PA.Tổng nhu cầu vốn]</w:t>
+        <w:t>[PA.Tổng chi phí trực tiếp]</w:t>
       </w:r>
       <w:r>
         <w:rPr>
@@ -10210,63 +9736,100 @@
           <w:rFonts w:ascii="Times New Roman" w:eastAsia="Times New Roman" w:hAnsi="Times New Roman" w:cs="Times New Roman"/>
           <w:sz w:val="26"/>
           <w:szCs w:val="28"/>
-          <w:lang w:val="pt-BR"/>
-        </w:rPr>
-        <w:t>Hoa Ly có chu kỳ sinh trưởng khoảng 3-4 tháng, bên cạnh đó k</w:t>
-      </w:r>
-      <w:r>
-        <w:rPr>
-          <w:rFonts w:ascii="Times New Roman" w:eastAsia="Times New Roman" w:hAnsi="Times New Roman" w:cs="Times New Roman"/>
-          <w:sz w:val="26"/>
-          <w:szCs w:val="28"/>
-          <w:lang w:val="pt-BR"/>
-        </w:rPr>
-        <w:t xml:space="preserve">hách hàng có chính sách bán hàng chậm trả, gối đầu một phần nên thời gian thu hồi vốn thường kéo dài từ 5-6 tháng. Vòng quay vốn lưu động tối đa 6 tháng </w:t>
-      </w:r>
-      <w:r>
-        <w:rPr>
-          <w:rFonts w:ascii="Times New Roman" w:eastAsia="Times New Roman" w:hAnsi="Times New Roman" w:cs="Times New Roman"/>
-          <w:sz w:val="26"/>
-          <w:szCs w:val="28"/>
-          <w:lang w:val="pt-BR"/>
-        </w:rPr>
-        <w:t>(2</w:t>
-      </w:r>
-      <w:r>
-        <w:rPr>
-          <w:rFonts w:ascii="Times New Roman" w:eastAsia="Times New Roman" w:hAnsi="Times New Roman" w:cs="Times New Roman"/>
-          <w:sz w:val="26"/>
-          <w:szCs w:val="28"/>
-          <w:lang w:val="pt-BR"/>
-        </w:rPr>
-        <w:t xml:space="preserve"> vòng/năm) ph</w:t>
-      </w:r>
-      <w:r>
-        <w:rPr>
-          <w:rFonts w:ascii="Times New Roman" w:eastAsia="Times New Roman" w:hAnsi="Times New Roman" w:cs="Times New Roman"/>
-          <w:sz w:val="26"/>
-          <w:szCs w:val="28"/>
-          <w:lang w:val="pt-BR"/>
-        </w:rPr>
-        <w:t xml:space="preserve">ù hợp với ngành nghề </w:t>
-      </w:r>
-      <w:r>
-        <w:rPr>
-          <w:rFonts w:ascii="Times New Roman" w:eastAsia="Times New Roman" w:hAnsi="Times New Roman" w:cs="Times New Roman"/>
-          <w:sz w:val="26"/>
-          <w:szCs w:val="28"/>
-          <w:lang w:val="pt-BR"/>
-        </w:rPr>
-        <w:t>sản xuất kinh doanh</w:t>
-      </w:r>
-      <w:r>
-        <w:rPr>
-          <w:rFonts w:ascii="Times New Roman" w:eastAsia="Times New Roman" w:hAnsi="Times New Roman" w:cs="Times New Roman"/>
-          <w:sz w:val="26"/>
-          <w:szCs w:val="28"/>
-          <w:lang w:val="pt-BR"/>
-        </w:rPr>
-        <w:t>;</w:t>
+        </w:rPr>
+        <w:t>[PA.Phân tích vòng quay vốn]</w:t>
+      </w:r>
+      <w:r>
+        <w:rPr>
+          <w:rFonts w:ascii="Times New Roman" w:eastAsia="Times New Roman" w:hAnsi="Times New Roman" w:cs="Times New Roman"/>
+          <w:sz w:val="26"/>
+          <w:szCs w:val="28"/>
+          <w:lang w:val="pt-BR"/>
+        </w:rPr>
+        <w:t xml:space="preserve">. Vòng quay vốn lưu động tối đa </w:t>
+      </w:r>
+      <w:r>
+        <w:rPr>
+          <w:rFonts w:ascii="Times New Roman" w:eastAsia="Times New Roman" w:hAnsi="Times New Roman" w:cs="Times New Roman"/>
+          <w:color w:val="C00000"/>
+          <w:sz w:val="26"/>
+          <w:szCs w:val="28"/>
+          <w:lang w:val="pt-BR"/>
+        </w:rPr>
+        <w:t>...</w:t>
+      </w:r>
+      <w:r>
+        <w:rPr>
+          <w:rFonts w:ascii="Times New Roman" w:eastAsia="Times New Roman" w:hAnsi="Times New Roman" w:cs="Times New Roman"/>
+          <w:color w:val="C00000"/>
+          <w:sz w:val="26"/>
+          <w:szCs w:val="28"/>
+          <w:lang w:val="pt-BR"/>
+        </w:rPr>
+        <w:t xml:space="preserve"> </w:t>
+      </w:r>
+      <w:r>
+        <w:rPr>
+          <w:rFonts w:ascii="Times New Roman" w:eastAsia="Times New Roman" w:hAnsi="Times New Roman" w:cs="Times New Roman"/>
+          <w:sz w:val="26"/>
+          <w:szCs w:val="28"/>
+          <w:lang w:val="pt-BR"/>
+        </w:rPr>
+        <w:t xml:space="preserve">tháng </w:t>
+      </w:r>
+      <w:r>
+        <w:rPr>
+          <w:rFonts w:ascii="Times New Roman" w:eastAsia="Times New Roman" w:hAnsi="Times New Roman" w:cs="Times New Roman"/>
+          <w:sz w:val="26"/>
+          <w:szCs w:val="28"/>
+          <w:lang w:val="pt-BR"/>
+        </w:rPr>
+        <w:t>(</w:t>
+      </w:r>
+      <w:r>
+        <w:rPr>
+          <w:rFonts w:ascii="Times New Roman" w:eastAsia="Times New Roman" w:hAnsi="Times New Roman" w:cs="Times New Roman"/>
+          <w:sz w:val="26"/>
+          <w:szCs w:val="28"/>
+          <w:lang w:val="pt-BR"/>
+        </w:rPr>
+        <w:t>[PA.Vòng quay vốn]</w:t>
+      </w:r>
+      <w:r>
+        <w:rPr>
+          <w:rFonts w:ascii="Times New Roman" w:eastAsia="Times New Roman" w:hAnsi="Times New Roman" w:cs="Times New Roman"/>
+          <w:sz w:val="26"/>
+          <w:szCs w:val="28"/>
+          <w:lang w:val="pt-BR"/>
+        </w:rPr>
+        <w:t xml:space="preserve"> vòng/năm) </w:t>
+      </w:r>
+      <w:r>
+        <w:rPr>
+          <w:rFonts w:ascii="Times New Roman" w:eastAsia="Times New Roman" w:hAnsi="Times New Roman" w:cs="Times New Roman"/>
+          <w:sz w:val="26"/>
+          <w:szCs w:val="28"/>
+          <w:lang w:val="pt-BR"/>
+        </w:rPr>
+        <w:t xml:space="preserve">là </w:t>
+      </w:r>
+      <w:r>
+        <w:rPr>
+          <w:rFonts w:ascii="Times New Roman" w:eastAsia="Times New Roman" w:hAnsi="Times New Roman" w:cs="Times New Roman"/>
+          <w:sz w:val="26"/>
+          <w:szCs w:val="28"/>
+          <w:lang w:val="pt-BR"/>
+        </w:rPr>
+        <w:t>ph</w:t>
+      </w:r>
+      <w:r>
+        <w:rPr>
+          <w:rFonts w:ascii="Times New Roman" w:eastAsia="Times New Roman" w:hAnsi="Times New Roman" w:cs="Times New Roman"/>
+          <w:sz w:val="26"/>
+          <w:szCs w:val="28"/>
+          <w:lang w:val="pt-BR"/>
+        </w:rPr>
+        <w:t>ù hợp;</w:t>
       </w:r>
     </w:p>
     <w:p>
@@ -10399,7 +9962,7 @@
           <w:szCs w:val="28"/>
           <w:lang w:val="pt-BR"/>
         </w:rPr>
-        <w:t>[HĐTD.Tỷ lệ vốn đối ứng]%, trong đó</w:t>
+        <w:t>[HĐTD.Tỷ lệ vốn đối ứng], trong đó</w:t>
       </w:r>
       <w:r>
         <w:rPr>
@@ -10742,90 +10305,17 @@
           <w:rFonts w:ascii="Times New Roman" w:eastAsia="Times New Roman" w:hAnsi="Times New Roman" w:cs="Times New Roman"/>
           <w:sz w:val="26"/>
           <w:szCs w:val="28"/>
+        </w:rPr>
+        <w:t>[HĐTD.Tính hợp pháp]</w:t>
+      </w:r>
+      <w:r>
+        <w:rPr>
+          <w:rFonts w:ascii="Times New Roman" w:eastAsia="Times New Roman" w:hAnsi="Times New Roman" w:cs="Times New Roman"/>
+          <w:sz w:val="26"/>
+          <w:szCs w:val="28"/>
           <w:lang w:val="de-DE"/>
         </w:rPr>
-        <w:t>Mục đích vay vốn phù hợp với quy định của pháp luật và Agribank</w:t>
-      </w:r>
-      <w:r>
-        <w:rPr>
-          <w:rFonts w:ascii="Times New Roman" w:eastAsia="Times New Roman" w:hAnsi="Times New Roman" w:cs="Times New Roman"/>
-          <w:sz w:val="26"/>
-          <w:szCs w:val="28"/>
-          <w:lang w:val="de-DE"/>
-        </w:rPr>
-        <w:t xml:space="preserve">. Khách hàng hiện đang canh tác trên diện tích </w:t>
-      </w:r>
-      <w:r>
-        <w:rPr>
-          <w:rFonts w:ascii="Times New Roman" w:eastAsia="Times New Roman" w:hAnsi="Times New Roman" w:cs="Times New Roman"/>
-          <w:sz w:val="26"/>
-          <w:szCs w:val="28"/>
-          <w:lang w:val="de-DE"/>
-        </w:rPr>
-        <w:t>[PA.Số sào đất]</w:t>
-      </w:r>
-      <w:r>
-        <w:rPr>
-          <w:rFonts w:ascii="Times New Roman" w:eastAsia="Times New Roman" w:hAnsi="Times New Roman" w:cs="Times New Roman"/>
-          <w:sz w:val="26"/>
-          <w:szCs w:val="28"/>
-          <w:lang w:val="de-DE"/>
-        </w:rPr>
-        <w:t xml:space="preserve"> sào đất nông nghiệp tại </w:t>
-      </w:r>
-      <w:r>
-        <w:rPr>
-          <w:rFonts w:ascii="Times New Roman" w:eastAsia="Times New Roman" w:hAnsi="Times New Roman" w:cs="Times New Roman"/>
-          <w:sz w:val="26"/>
-          <w:szCs w:val="28"/>
-          <w:lang w:val="de-DE"/>
-        </w:rPr>
-        <w:t>[PA.Địa chỉ đất NN]</w:t>
-      </w:r>
-      <w:r>
-        <w:rPr>
-          <w:rFonts w:ascii="Times New Roman" w:eastAsia="Times New Roman" w:hAnsi="Times New Roman" w:cs="Times New Roman"/>
-          <w:sz w:val="26"/>
-          <w:szCs w:val="28"/>
-          <w:lang w:val="de-DE"/>
-        </w:rPr>
-        <w:t xml:space="preserve"> và có nhu cầu vay vốn để trồng hoa </w:t>
-      </w:r>
-      <w:r>
-        <w:rPr>
-          <w:rFonts w:ascii="Times New Roman" w:eastAsia="Times New Roman" w:hAnsi="Times New Roman" w:cs="Times New Roman"/>
-          <w:sz w:val="26"/>
-          <w:szCs w:val="28"/>
-          <w:lang w:val="de-DE"/>
-        </w:rPr>
-        <w:t>Ly</w:t>
-      </w:r>
-      <w:r>
-        <w:rPr>
-          <w:rFonts w:ascii="Times New Roman" w:eastAsia="Times New Roman" w:hAnsi="Times New Roman" w:cs="Times New Roman"/>
-          <w:sz w:val="26"/>
-          <w:szCs w:val="28"/>
-          <w:lang w:val="de-DE"/>
-        </w:rPr>
-        <w:t xml:space="preserve"> trên </w:t>
-      </w:r>
-      <w:r>
-        <w:rPr>
-          <w:rFonts w:ascii="Times New Roman" w:eastAsia="Times New Roman" w:hAnsi="Times New Roman" w:cs="Times New Roman"/>
-          <w:sz w:val="26"/>
-          <w:szCs w:val="28"/>
-          <w:lang w:val="de-DE"/>
-        </w:rPr>
-        <w:t>diện tích</w:t>
-      </w:r>
-      <w:r>
-        <w:rPr>
-          <w:rFonts w:ascii="Times New Roman" w:eastAsia="Times New Roman" w:hAnsi="Times New Roman" w:cs="Times New Roman"/>
-          <w:sz w:val="26"/>
-          <w:szCs w:val="28"/>
-          <w:lang w:val="de-DE"/>
-        </w:rPr>
-        <w:t xml:space="preserve"> đất nói trên.</w:t>
+        <w:t>.</w:t>
       </w:r>
     </w:p>
     <w:p>
@@ -10837,17 +10327,32 @@
           <w:rFonts w:ascii="Times New Roman" w:eastAsia="Times New Roman" w:hAnsi="Times New Roman" w:cs="Times New Roman"/>
           <w:sz w:val="26"/>
           <w:szCs w:val="28"/>
+        </w:rPr>
+      </w:pPr>
+      <w:r>
+        <w:rPr>
+          <w:rFonts w:ascii="Times New Roman" w:eastAsia="Times New Roman" w:hAnsi="Times New Roman" w:cs="Times New Roman"/>
+          <w:sz w:val="26"/>
+          <w:szCs w:val="28"/>
           <w:lang w:val="de-DE"/>
         </w:rPr>
-      </w:pPr>
-      <w:r>
-        <w:rPr>
-          <w:rFonts w:ascii="Times New Roman" w:eastAsia="Times New Roman" w:hAnsi="Times New Roman" w:cs="Times New Roman"/>
-          <w:sz w:val="26"/>
-          <w:szCs w:val="28"/>
-          <w:lang w:val="de-DE"/>
-        </w:rPr>
-        <w:t>- Thị trường cung cấp nguyên, vật liệu và các yếu tố đầu vào khác: Khách hàng đã ký kết hợp đồng mua bán giống hoa, phân bón và thuốc bảo vệ thực vật với nhà cung cấp cây giống trên địa bàn Đà Lạt.</w:t>
+        <w:t xml:space="preserve">- Thị trường cung cấp nguyên, vật liệu và các yếu tố đầu vào khác: </w:t>
+      </w:r>
+      <w:r>
+        <w:rPr>
+          <w:rFonts w:ascii="Times New Roman" w:eastAsia="Times New Roman" w:hAnsi="Times New Roman" w:cs="Times New Roman"/>
+          <w:sz w:val="26"/>
+          <w:szCs w:val="28"/>
+        </w:rPr>
+        <w:t>[HĐTD.Thị trường NVL]</w:t>
+      </w:r>
+      <w:r>
+        <w:rPr>
+          <w:rFonts w:ascii="Times New Roman" w:eastAsia="Times New Roman" w:hAnsi="Times New Roman" w:cs="Times New Roman"/>
+          <w:sz w:val="26"/>
+          <w:szCs w:val="28"/>
+        </w:rPr>
+        <w:t>.</w:t>
       </w:r>
     </w:p>
     <w:p>
@@ -10869,7 +10374,24 @@
           <w:szCs w:val="28"/>
           <w:lang w:val="de-DE"/>
         </w:rPr>
-        <w:t>- Thị trường tiêu thụ sản phẩm: Khách hàng đã sản xuất nông nghiệp nhiều năm nên có số lượng bạn hàng lớn và ổn định. Bên cạnh đó, vì có mối quan hệ mua bán từ lâu với nhiều bạn hàng, mức độ uy tín cao, việc đặt hàng chủ yếu được thực hiện qua điện thoại nên không có hợp đồng tiêu thụ. Hoa được bán chủ yếu cho các khách hàng tại địa phương, các cửa hàng bán lẻ hoa trên địa bàn Đà Lạt và xuất đi TPHCM.</w:t>
+        <w:t xml:space="preserve">- Thị trường tiêu thụ sản phẩm: </w:t>
+      </w:r>
+      <w:r>
+        <w:rPr>
+          <w:rFonts w:ascii="Times New Roman" w:eastAsia="Times New Roman" w:hAnsi="Times New Roman" w:cs="Times New Roman"/>
+          <w:sz w:val="26"/>
+          <w:szCs w:val="28"/>
+        </w:rPr>
+        <w:t>[HĐTD.Thị trường tiêu thụ SP]</w:t>
+      </w:r>
+      <w:r>
+        <w:rPr>
+          <w:rFonts w:ascii="Times New Roman" w:eastAsia="Times New Roman" w:hAnsi="Times New Roman" w:cs="Times New Roman"/>
+          <w:sz w:val="26"/>
+          <w:szCs w:val="28"/>
+          <w:lang w:val="de-DE"/>
+        </w:rPr>
+        <w:t>.</w:t>
       </w:r>
     </w:p>
     <w:p>
@@ -10891,8 +10413,24 @@
           <w:szCs w:val="28"/>
           <w:lang w:val="de-DE"/>
         </w:rPr>
-        <w:lastRenderedPageBreak/>
-        <w:t>- Năng lực về máy móc, thiết bị, công nghệ: Khách hàng có đầy đủ cơ sở vật chất như nhà kính, hệ thống tưới và các thiết bị khác đảm bảo chất lượng đầu ra của hoa thành phẩm.</w:t>
+        <w:t xml:space="preserve">- Năng lực về máy móc, thiết bị, công nghệ: </w:t>
+      </w:r>
+      <w:r>
+        <w:rPr>
+          <w:rFonts w:ascii="Times New Roman" w:eastAsia="Times New Roman" w:hAnsi="Times New Roman" w:cs="Times New Roman"/>
+          <w:sz w:val="26"/>
+          <w:szCs w:val="28"/>
+        </w:rPr>
+        <w:t>[HĐTD.Năng lực về nhân công]</w:t>
+      </w:r>
+      <w:r>
+        <w:rPr>
+          <w:rFonts w:ascii="Times New Roman" w:eastAsia="Times New Roman" w:hAnsi="Times New Roman" w:cs="Times New Roman"/>
+          <w:sz w:val="26"/>
+          <w:szCs w:val="28"/>
+          <w:lang w:val="de-DE"/>
+        </w:rPr>
+        <w:t>.</w:t>
       </w:r>
     </w:p>
     <w:p>
@@ -10914,7 +10452,15 @@
           <w:szCs w:val="28"/>
           <w:lang w:val="de-DE"/>
         </w:rPr>
-        <w:t xml:space="preserve">- Năng lực về nhân công: Khách hàng </w:t>
+        <w:t xml:space="preserve">- Năng lực về nhân công: </w:t>
+      </w:r>
+      <w:r>
+        <w:rPr>
+          <w:rFonts w:ascii="Times New Roman" w:eastAsia="Times New Roman" w:hAnsi="Times New Roman" w:cs="Times New Roman"/>
+          <w:sz w:val="26"/>
+          <w:szCs w:val="28"/>
+        </w:rPr>
+        <w:t>[HĐTD.Năng lực về máy móc]</w:t>
       </w:r>
       <w:r>
         <w:rPr>
@@ -10923,16 +10469,7 @@
           <w:szCs w:val="28"/>
           <w:lang w:val="de-DE"/>
         </w:rPr>
-        <w:t xml:space="preserve">trực tiếp tham gia vào hoạt động sản xuất cũng như </w:t>
-      </w:r>
-      <w:r>
-        <w:rPr>
-          <w:rFonts w:ascii="Times New Roman" w:eastAsia="Times New Roman" w:hAnsi="Times New Roman" w:cs="Times New Roman"/>
-          <w:sz w:val="26"/>
-          <w:szCs w:val="28"/>
-          <w:lang w:val="de-DE"/>
-        </w:rPr>
-        <w:t>thuê nhân công lao động tại địa phương, có kinh nghiệm làm việc lâu năm trong lĩnh vực trồng trọt, đảm bảo hoạt động sản xuất kinh doanh luôn diễn ra liên tục và đúng tiêu chuẩn kĩ thuật.</w:t>
+        <w:t>.</w:t>
       </w:r>
     </w:p>
     <w:p>
@@ -10954,7 +10491,15 @@
           <w:szCs w:val="28"/>
           <w:lang w:val="de-DE"/>
         </w:rPr>
-        <w:t xml:space="preserve">- Các yếu tố khác để thực hiện phương án: Khách hàng có kinh nghiệm nhiều năm trong lĩnh vực trồng hoa </w:t>
+        <w:t xml:space="preserve">- Các yếu tố khác để thực hiện phương án: </w:t>
+      </w:r>
+      <w:r>
+        <w:rPr>
+          <w:rFonts w:ascii="Times New Roman" w:eastAsia="Times New Roman" w:hAnsi="Times New Roman" w:cs="Times New Roman"/>
+          <w:sz w:val="26"/>
+          <w:szCs w:val="28"/>
+        </w:rPr>
+        <w:t>[HĐTD.Các yếu tố khác]</w:t>
       </w:r>
       <w:r>
         <w:rPr>
@@ -10963,34 +10508,7 @@
           <w:szCs w:val="28"/>
           <w:lang w:val="de-DE"/>
         </w:rPr>
-        <w:t>Ly</w:t>
-      </w:r>
-      <w:r>
-        <w:rPr>
-          <w:rFonts w:ascii="Times New Roman" w:eastAsia="Times New Roman" w:hAnsi="Times New Roman" w:cs="Times New Roman"/>
-          <w:sz w:val="26"/>
-          <w:szCs w:val="28"/>
-          <w:lang w:val="de-DE"/>
-        </w:rPr>
-        <w:t xml:space="preserve"> và là người trực tiếp </w:t>
-      </w:r>
-      <w:r>
-        <w:rPr>
-          <w:rFonts w:ascii="Times New Roman" w:eastAsia="Times New Roman" w:hAnsi="Times New Roman" w:cs="Times New Roman"/>
-          <w:sz w:val="26"/>
-          <w:szCs w:val="28"/>
-          <w:lang w:val="de-DE"/>
-        </w:rPr>
-        <w:t>tham gia</w:t>
-      </w:r>
-      <w:r>
-        <w:rPr>
-          <w:rFonts w:ascii="Times New Roman" w:eastAsia="Times New Roman" w:hAnsi="Times New Roman" w:cs="Times New Roman"/>
-          <w:sz w:val="26"/>
-          <w:szCs w:val="28"/>
-          <w:lang w:val="de-DE"/>
-        </w:rPr>
-        <w:t xml:space="preserve"> hoạt động sản xuất đảm bảo thực hiện thành công phương án.</w:t>
+        <w:t>.</w:t>
       </w:r>
     </w:p>
     <w:p>
@@ -11149,6 +10667,7 @@
                 <w:sz w:val="24"/>
                 <w:szCs w:val="24"/>
               </w:rPr>
+              <w:lastRenderedPageBreak/>
               <w:t>STT</w:t>
             </w:r>
           </w:p>
@@ -13384,115 +12903,81 @@
     </w:p>
     <w:p>
       <w:pPr>
+        <w:tabs>
+          <w:tab w:val="left" w:pos="0"/>
+          <w:tab w:val="left" w:pos="426"/>
+          <w:tab w:val="left" w:pos="851"/>
+          <w:tab w:val="left" w:pos="993"/>
+        </w:tabs>
+        <w:spacing w:after="0" w:line="276" w:lineRule="auto"/>
+        <w:ind w:firstLine="567"/>
+        <w:jc w:val="both"/>
+        <w:rPr>
+          <w:rFonts w:ascii="Times New Roman" w:eastAsia="Times New Roman" w:hAnsi="Times New Roman" w:cs="Times New Roman"/>
+          <w:sz w:val="26"/>
+          <w:szCs w:val="28"/>
+          <w:lang w:val="de-DE"/>
+        </w:rPr>
+      </w:pPr>
+      <w:r>
+        <w:rPr>
+          <w:rFonts w:ascii="Times New Roman" w:eastAsia="Times New Roman" w:hAnsi="Times New Roman" w:cs="Times New Roman"/>
+          <w:sz w:val="26"/>
+          <w:szCs w:val="28"/>
+          <w:lang w:val="de-DE"/>
+        </w:rPr>
+        <w:t>*</w:t>
+      </w:r>
+      <w:r>
+        <w:rPr>
+          <w:rFonts w:ascii="Times New Roman" w:eastAsia="Times New Roman" w:hAnsi="Times New Roman" w:cs="Times New Roman"/>
+          <w:sz w:val="26"/>
+          <w:szCs w:val="28"/>
+          <w:lang w:val="de-DE"/>
+        </w:rPr>
+        <w:t xml:space="preserve"> Dư nợ của khách hàng:</w:t>
+      </w:r>
+    </w:p>
+    <w:p>
+      <w:pPr>
         <w:shd w:val="clear" w:color="auto" w:fill="FFFFFF"/>
         <w:spacing w:after="0" w:line="276" w:lineRule="auto"/>
         <w:ind w:firstLine="567"/>
         <w:jc w:val="both"/>
         <w:rPr>
-          <w:rFonts w:ascii="Times New Roman" w:eastAsia="Calibri" w:hAnsi="Times New Roman" w:cs="Times New Roman"/>
-          <w:sz w:val="26"/>
-          <w:szCs w:val="28"/>
-          <w:lang w:val="de-DE"/>
-        </w:rPr>
-      </w:pPr>
-      <w:r>
-        <w:rPr>
-          <w:rFonts w:ascii="Times New Roman" w:eastAsia="Times New Roman" w:hAnsi="Times New Roman" w:cs="Times New Roman"/>
-          <w:sz w:val="26"/>
-          <w:szCs w:val="28"/>
-          <w:lang w:val="de-DE"/>
-        </w:rPr>
-        <w:t>-</w:t>
-      </w:r>
-      <w:r>
-        <w:rPr>
-          <w:rFonts w:ascii="Times New Roman" w:eastAsia="Times New Roman" w:hAnsi="Times New Roman" w:cs="Times New Roman"/>
-          <w:sz w:val="26"/>
-          <w:szCs w:val="28"/>
-          <w:lang w:val="de-DE"/>
-        </w:rPr>
-        <w:t xml:space="preserve"> </w:t>
-      </w:r>
-      <w:r>
-        <w:rPr>
-          <w:rFonts w:ascii="Times New Roman" w:eastAsia="Times New Roman" w:hAnsi="Times New Roman" w:cs="Times New Roman"/>
-          <w:sz w:val="26"/>
-          <w:szCs w:val="28"/>
-          <w:lang w:val="de-DE"/>
-        </w:rPr>
-        <w:t>Dư nợ của khách hàng t</w:t>
-      </w:r>
-      <w:r>
-        <w:rPr>
-          <w:rFonts w:ascii="Times New Roman" w:eastAsia="Times New Roman" w:hAnsi="Times New Roman" w:cs="Times New Roman"/>
-          <w:sz w:val="26"/>
-          <w:szCs w:val="28"/>
-          <w:lang w:val="de-DE"/>
-        </w:rPr>
-        <w:t xml:space="preserve">ại Agribank: </w:t>
-      </w:r>
-      <w:r>
-        <w:rPr>
-          <w:rFonts w:ascii="Times New Roman" w:eastAsia="Times New Roman" w:hAnsi="Times New Roman" w:cs="Times New Roman"/>
-          <w:sz w:val="26"/>
-          <w:szCs w:val="28"/>
-          <w:lang w:val="de-DE"/>
-        </w:rPr>
-        <w:t xml:space="preserve">Khách hàng hiện có tổng dư nợ </w:t>
-      </w:r>
-      <w:r>
-        <w:rPr>
-          <w:rFonts w:ascii="Times New Roman" w:eastAsia="Times New Roman" w:hAnsi="Times New Roman" w:cs="Times New Roman"/>
-          <w:sz w:val="26"/>
-          <w:szCs w:val="28"/>
-          <w:lang w:val="de-DE"/>
-        </w:rPr>
-        <w:t>[HĐTD.Dư nợ tại Agribank] đồng</w:t>
-      </w:r>
-      <w:r>
-        <w:rPr>
-          <w:rFonts w:ascii="Times New Roman" w:eastAsia="Times New Roman" w:hAnsi="Times New Roman" w:cs="Times New Roman"/>
-          <w:sz w:val="26"/>
-          <w:szCs w:val="28"/>
-          <w:lang w:val="de-DE"/>
-        </w:rPr>
-        <w:t xml:space="preserve"> tại Agribank [Tên chi nhánh/PGD]</w:t>
-      </w:r>
-      <w:r>
-        <w:rPr>
-          <w:rFonts w:ascii="Times New Roman" w:eastAsia="Times New Roman" w:hAnsi="Times New Roman" w:cs="Times New Roman"/>
-          <w:sz w:val="26"/>
-          <w:szCs w:val="28"/>
-          <w:lang w:val="de-DE"/>
-        </w:rPr>
-        <w:t>; Nhóm nợ</w:t>
-      </w:r>
-      <w:r>
-        <w:rPr>
-          <w:rFonts w:ascii="Times New Roman" w:eastAsia="Calibri" w:hAnsi="Times New Roman" w:cs="Times New Roman"/>
-          <w:sz w:val="26"/>
-          <w:szCs w:val="28"/>
-          <w:lang w:val="de-DE"/>
-        </w:rPr>
-        <w:t xml:space="preserve">: </w:t>
-      </w:r>
-      <w:r>
-        <w:rPr>
-          <w:rFonts w:ascii="Times New Roman" w:eastAsia="Calibri" w:hAnsi="Times New Roman" w:cs="Times New Roman"/>
-          <w:sz w:val="26"/>
-          <w:szCs w:val="28"/>
-          <w:lang w:val="de-DE"/>
-        </w:rPr>
-        <w:t>[HĐTD.Nhóm nợ]</w:t>
-      </w:r>
-      <w:r>
-        <w:rPr>
-          <w:rFonts w:ascii="Times New Roman" w:eastAsia="Calibri" w:hAnsi="Times New Roman" w:cs="Times New Roman"/>
-          <w:sz w:val="26"/>
-          <w:szCs w:val="28"/>
-          <w:lang w:val="de-DE"/>
-        </w:rPr>
-        <w:t>. Trong đó:</w:t>
+          <w:rFonts w:ascii="Times New Roman" w:eastAsia="Times New Roman" w:hAnsi="Times New Roman" w:cs="Times New Roman"/>
+          <w:sz w:val="26"/>
+          <w:szCs w:val="28"/>
+        </w:rPr>
+      </w:pPr>
+      <w:r>
+        <w:rPr>
+          <w:rFonts w:ascii="Times New Roman" w:eastAsia="Times New Roman" w:hAnsi="Times New Roman" w:cs="Times New Roman"/>
+          <w:sz w:val="26"/>
+          <w:szCs w:val="28"/>
+        </w:rPr>
+        <w:t>[#DUNỢ]</w:t>
+      </w:r>
+    </w:p>
+    <w:p>
+      <w:pPr>
+        <w:shd w:val="clear" w:color="auto" w:fill="FFFFFF"/>
+        <w:spacing w:after="0" w:line="276" w:lineRule="auto"/>
+        <w:ind w:firstLine="567"/>
+        <w:jc w:val="both"/>
+        <w:rPr>
+          <w:rFonts w:ascii="Times New Roman" w:eastAsia="Times New Roman" w:hAnsi="Times New Roman" w:cs="Times New Roman"/>
+          <w:sz w:val="26"/>
+          <w:szCs w:val="28"/>
+        </w:rPr>
+      </w:pPr>
+      <w:r>
+        <w:rPr>
+          <w:rFonts w:ascii="Times New Roman" w:eastAsia="Times New Roman" w:hAnsi="Times New Roman" w:cs="Times New Roman"/>
+          <w:sz w:val="26"/>
+          <w:szCs w:val="28"/>
+        </w:rPr>
+        <w:t>- Tại [Tên tổ chức]: Tổng dư nợ [Tổng dư nợ] đồng; Nhóm nợ: [Nhóm nợ]</w:t>
       </w:r>
     </w:p>
     <w:p>
@@ -13505,26 +12990,15 @@
           <w:rFonts w:ascii="Times New Roman" w:eastAsia="Times New Roman" w:hAnsi="Times New Roman" w:cs="Times New Roman"/>
           <w:sz w:val="26"/>
           <w:szCs w:val="28"/>
-          <w:lang w:val="de-DE"/>
-        </w:rPr>
-      </w:pPr>
-      <w:r>
-        <w:rPr>
-          <w:rFonts w:ascii="Times New Roman" w:eastAsia="Calibri" w:hAnsi="Times New Roman" w:cs="Times New Roman"/>
-          <w:sz w:val="26"/>
-          <w:szCs w:val="28"/>
-          <w:lang w:val="de-DE"/>
-        </w:rPr>
-        <w:t>+ D</w:t>
-      </w:r>
-      <w:r>
-        <w:rPr>
-          <w:rFonts w:ascii="Times New Roman" w:eastAsia="Times New Roman" w:hAnsi="Times New Roman" w:cs="Times New Roman"/>
-          <w:sz w:val="26"/>
-          <w:szCs w:val="28"/>
-          <w:lang w:val="de-DE"/>
-        </w:rPr>
-        <w:t>ư nợ ngắn hạn là [VBA.Dư nợ ngắn hạn] mục đích [VBA.Mục đích ngắn hạn], nguồn trả nợ từ [VBA.Nguồn trả nợ];</w:t>
+        </w:rPr>
+      </w:pPr>
+      <w:r>
+        <w:rPr>
+          <w:rFonts w:ascii="Times New Roman" w:eastAsia="Times New Roman" w:hAnsi="Times New Roman" w:cs="Times New Roman"/>
+          <w:sz w:val="26"/>
+          <w:szCs w:val="28"/>
+        </w:rPr>
+        <w:t>+ Ngắn hạn: [Dư nợ ngắn hạn], mục đích [Mục đích ngắn hạn]</w:t>
       </w:r>
     </w:p>
     <w:p>
@@ -13534,20 +13008,39 @@
         <w:ind w:firstLine="851"/>
         <w:jc w:val="both"/>
         <w:rPr>
-          <w:rFonts w:ascii="Times New Roman" w:eastAsia="Calibri" w:hAnsi="Times New Roman" w:cs="Times New Roman"/>
-          <w:sz w:val="26"/>
-          <w:szCs w:val="28"/>
-          <w:lang w:val="de-DE"/>
-        </w:rPr>
-      </w:pPr>
-      <w:r>
-        <w:rPr>
-          <w:rFonts w:ascii="Times New Roman" w:eastAsia="Times New Roman" w:hAnsi="Times New Roman" w:cs="Times New Roman"/>
-          <w:sz w:val="26"/>
-          <w:szCs w:val="28"/>
-          <w:lang w:val="de-DE"/>
-        </w:rPr>
-        <w:t>+ Dư nợ trung dài hạn là [VBA.Dư nợ trung dài hạn] mục đích [VBA.Mục đích trung dài hạn], nguồn trả nợ từ [VBA.Nguồn trả nợ];</w:t>
+          <w:rFonts w:ascii="Times New Roman" w:eastAsia="Times New Roman" w:hAnsi="Times New Roman" w:cs="Times New Roman"/>
+          <w:sz w:val="26"/>
+          <w:szCs w:val="28"/>
+        </w:rPr>
+      </w:pPr>
+      <w:r>
+        <w:rPr>
+          <w:rFonts w:ascii="Times New Roman" w:eastAsia="Times New Roman" w:hAnsi="Times New Roman" w:cs="Times New Roman"/>
+          <w:sz w:val="26"/>
+          <w:szCs w:val="28"/>
+        </w:rPr>
+        <w:t>+ Trung dài hạn: [Dư nợ trung dài hạn], mục đích [Mục đích trung dài hạn]</w:t>
+      </w:r>
+    </w:p>
+    <w:p>
+      <w:pPr>
+        <w:shd w:val="clear" w:color="auto" w:fill="FFFFFF"/>
+        <w:spacing w:after="0" w:line="276" w:lineRule="auto"/>
+        <w:ind w:firstLine="851"/>
+        <w:jc w:val="both"/>
+        <w:rPr>
+          <w:rFonts w:ascii="Times New Roman" w:eastAsia="Times New Roman" w:hAnsi="Times New Roman" w:cs="Times New Roman"/>
+          <w:sz w:val="26"/>
+          <w:szCs w:val="28"/>
+        </w:rPr>
+      </w:pPr>
+      <w:r>
+        <w:rPr>
+          <w:rFonts w:ascii="Times New Roman" w:eastAsia="Times New Roman" w:hAnsi="Times New Roman" w:cs="Times New Roman"/>
+          <w:sz w:val="26"/>
+          <w:szCs w:val="28"/>
+        </w:rPr>
+        <w:t>+ Nguồn trả nợ: [Nguồn trả nợ]</w:t>
       </w:r>
     </w:p>
     <w:p>
@@ -13560,226 +13053,15 @@
           <w:rFonts w:ascii="Times New Roman" w:eastAsia="Times New Roman" w:hAnsi="Times New Roman" w:cs="Times New Roman"/>
           <w:sz w:val="26"/>
           <w:szCs w:val="28"/>
-          <w:lang w:val="de-DE"/>
-        </w:rPr>
-      </w:pPr>
-      <w:r>
-        <w:rPr>
-          <w:rFonts w:ascii="Times New Roman" w:eastAsia="Calibri" w:hAnsi="Times New Roman" w:cs="Times New Roman"/>
-          <w:sz w:val="26"/>
-          <w:szCs w:val="28"/>
-          <w:lang w:val="de-DE"/>
-        </w:rPr>
-        <w:t>-</w:t>
-      </w:r>
-      <w:r>
-        <w:rPr>
-          <w:rFonts w:ascii="Times New Roman" w:eastAsia="Calibri" w:hAnsi="Times New Roman" w:cs="Times New Roman"/>
-          <w:sz w:val="26"/>
-          <w:szCs w:val="28"/>
-          <w:lang w:val="de-DE"/>
-        </w:rPr>
-        <w:t xml:space="preserve"> </w:t>
-      </w:r>
-      <w:r>
-        <w:rPr>
-          <w:rFonts w:ascii="Times New Roman" w:eastAsia="Times New Roman" w:hAnsi="Times New Roman" w:cs="Times New Roman"/>
-          <w:sz w:val="26"/>
-          <w:szCs w:val="28"/>
-          <w:lang w:val="de-DE"/>
-        </w:rPr>
-        <w:t>Dư nợ của khách hàng t</w:t>
-      </w:r>
-      <w:r>
-        <w:rPr>
-          <w:rFonts w:ascii="Times New Roman" w:eastAsia="Times New Roman" w:hAnsi="Times New Roman" w:cs="Times New Roman"/>
-          <w:sz w:val="26"/>
-          <w:szCs w:val="28"/>
-          <w:lang w:val="de-DE"/>
-        </w:rPr>
-        <w:t>ại</w:t>
-      </w:r>
-      <w:r>
-        <w:rPr>
-          <w:rFonts w:ascii="Times New Roman" w:eastAsia="Calibri" w:hAnsi="Times New Roman" w:cs="Times New Roman"/>
-          <w:sz w:val="26"/>
-          <w:szCs w:val="28"/>
-          <w:lang w:val="de-DE"/>
-        </w:rPr>
-        <w:t xml:space="preserve"> các TCTD khác</w:t>
-      </w:r>
-      <w:r>
-        <w:rPr>
-          <w:rFonts w:ascii="Times New Roman" w:eastAsia="Calibri" w:hAnsi="Times New Roman" w:cs="Times New Roman"/>
-          <w:sz w:val="26"/>
-          <w:szCs w:val="28"/>
-          <w:lang w:val="de-DE"/>
-        </w:rPr>
-        <w:t xml:space="preserve"> </w:t>
-      </w:r>
-      <w:r>
-        <w:rPr>
-          <w:rFonts w:ascii="Times New Roman" w:eastAsia="Calibri" w:hAnsi="Times New Roman" w:cs="Times New Roman"/>
-          <w:sz w:val="26"/>
-          <w:szCs w:val="28"/>
-          <w:lang w:val="de-DE"/>
-        </w:rPr>
-        <w:t xml:space="preserve">Khách hàng hiện có tổng dư nợ </w:t>
-      </w:r>
-      <w:r>
-        <w:rPr>
-          <w:rFonts w:ascii="Times New Roman" w:eastAsia="Times New Roman" w:hAnsi="Times New Roman" w:cs="Times New Roman"/>
-          <w:sz w:val="26"/>
-          <w:szCs w:val="28"/>
-          <w:lang w:val="de-DE"/>
-        </w:rPr>
-        <w:t>[</w:t>
-      </w:r>
-      <w:r>
-        <w:rPr>
-          <w:rFonts w:ascii="Times New Roman" w:eastAsia="Times New Roman" w:hAnsi="Times New Roman" w:cs="Times New Roman"/>
-          <w:sz w:val="26"/>
-          <w:szCs w:val="28"/>
-          <w:lang w:val="de-DE"/>
-        </w:rPr>
-        <w:t>TCTD</w:t>
-      </w:r>
-      <w:r>
-        <w:rPr>
-          <w:rFonts w:ascii="Times New Roman" w:eastAsia="Times New Roman" w:hAnsi="Times New Roman" w:cs="Times New Roman"/>
-          <w:sz w:val="26"/>
-          <w:szCs w:val="28"/>
-          <w:lang w:val="de-DE"/>
-        </w:rPr>
-        <w:t>.</w:t>
-      </w:r>
-      <w:r>
-        <w:rPr>
-          <w:rFonts w:ascii="Times New Roman" w:eastAsia="Times New Roman" w:hAnsi="Times New Roman" w:cs="Times New Roman"/>
-          <w:sz w:val="26"/>
-          <w:szCs w:val="28"/>
-          <w:lang w:val="de-DE"/>
-        </w:rPr>
-        <w:t>Tổng dư nợ</w:t>
-      </w:r>
-      <w:r>
-        <w:rPr>
-          <w:rFonts w:ascii="Times New Roman" w:eastAsia="Times New Roman" w:hAnsi="Times New Roman" w:cs="Times New Roman"/>
-          <w:sz w:val="26"/>
-          <w:szCs w:val="28"/>
-          <w:lang w:val="de-DE"/>
-        </w:rPr>
-        <w:t>] đồng</w:t>
-      </w:r>
-      <w:r>
-        <w:rPr>
-          <w:rFonts w:ascii="Times New Roman" w:eastAsia="Times New Roman" w:hAnsi="Times New Roman" w:cs="Times New Roman"/>
-          <w:sz w:val="26"/>
-          <w:szCs w:val="28"/>
-          <w:lang w:val="de-DE"/>
-        </w:rPr>
-        <w:t xml:space="preserve"> tại [TCTD.Tên TCTD]</w:t>
-      </w:r>
-      <w:r>
-        <w:rPr>
-          <w:rFonts w:ascii="Times New Roman" w:eastAsia="Calibri" w:hAnsi="Times New Roman" w:cs="Times New Roman"/>
-          <w:sz w:val="26"/>
-          <w:szCs w:val="28"/>
-          <w:lang w:val="de-DE"/>
-        </w:rPr>
-        <w:t xml:space="preserve">; </w:t>
-      </w:r>
-      <w:r>
-        <w:rPr>
-          <w:rFonts w:ascii="Times New Roman" w:eastAsia="Times New Roman" w:hAnsi="Times New Roman" w:cs="Times New Roman"/>
-          <w:sz w:val="26"/>
-          <w:szCs w:val="28"/>
-          <w:lang w:val="de-DE"/>
-        </w:rPr>
-        <w:t>Nhóm nợ</w:t>
-      </w:r>
-      <w:r>
-        <w:rPr>
-          <w:rFonts w:ascii="Times New Roman" w:eastAsia="Calibri" w:hAnsi="Times New Roman" w:cs="Times New Roman"/>
-          <w:sz w:val="26"/>
-          <w:szCs w:val="28"/>
-          <w:lang w:val="de-DE"/>
-        </w:rPr>
-        <w:t xml:space="preserve">: </w:t>
-      </w:r>
-      <w:r>
-        <w:rPr>
-          <w:rFonts w:ascii="Times New Roman" w:eastAsia="Calibri" w:hAnsi="Times New Roman" w:cs="Times New Roman"/>
-          <w:sz w:val="26"/>
-          <w:szCs w:val="28"/>
-          <w:lang w:val="de-DE"/>
-        </w:rPr>
-        <w:t>[HĐTD.Nhóm nợ]</w:t>
-      </w:r>
-      <w:r>
-        <w:rPr>
-          <w:rFonts w:ascii="Times New Roman" w:eastAsia="Calibri" w:hAnsi="Times New Roman" w:cs="Times New Roman"/>
-          <w:sz w:val="26"/>
-          <w:szCs w:val="28"/>
-          <w:lang w:val="de-DE"/>
-        </w:rPr>
-        <w:t>,</w:t>
-      </w:r>
-      <w:r>
-        <w:rPr>
-          <w:rFonts w:ascii="Times New Roman" w:eastAsia="Times New Roman" w:hAnsi="Times New Roman" w:cs="Times New Roman"/>
-          <w:sz w:val="26"/>
-          <w:szCs w:val="28"/>
-          <w:lang w:val="de-DE"/>
-        </w:rPr>
-        <w:t xml:space="preserve"> trong đó:</w:t>
-      </w:r>
-    </w:p>
-    <w:p>
-      <w:pPr>
-        <w:shd w:val="clear" w:color="auto" w:fill="FFFFFF"/>
-        <w:spacing w:after="0" w:line="276" w:lineRule="auto"/>
-        <w:ind w:firstLine="851"/>
-        <w:jc w:val="both"/>
-        <w:rPr>
-          <w:rFonts w:ascii="Times New Roman" w:eastAsia="Times New Roman" w:hAnsi="Times New Roman" w:cs="Times New Roman"/>
-          <w:sz w:val="26"/>
-          <w:szCs w:val="28"/>
-          <w:lang w:val="de-DE"/>
-        </w:rPr>
-      </w:pPr>
-      <w:r>
-        <w:rPr>
-          <w:rFonts w:ascii="Times New Roman" w:eastAsia="Times New Roman" w:hAnsi="Times New Roman" w:cs="Times New Roman"/>
-          <w:sz w:val="26"/>
-          <w:szCs w:val="28"/>
-          <w:lang w:val="de-DE"/>
-        </w:rPr>
-        <w:lastRenderedPageBreak/>
-        <w:t>+ Dư nợ ngắn hạn là [TCTD.Dư nợ ngắn hạn] mục đích [TCTD.Mục đích ngắn hạn], nguồn trả nợ từ [TCTD.Nguồn trả nợ];</w:t>
-      </w:r>
-    </w:p>
-    <w:p>
-      <w:pPr>
-        <w:shd w:val="clear" w:color="auto" w:fill="FFFFFF"/>
-        <w:spacing w:after="0" w:line="276" w:lineRule="auto"/>
-        <w:ind w:firstLine="851"/>
-        <w:jc w:val="both"/>
-        <w:rPr>
-          <w:rFonts w:ascii="Times New Roman" w:eastAsia="Calibri" w:hAnsi="Times New Roman" w:cs="Times New Roman"/>
-          <w:sz w:val="26"/>
-          <w:szCs w:val="28"/>
-          <w:lang w:val="de-DE"/>
-        </w:rPr>
-      </w:pPr>
-      <w:r>
-        <w:rPr>
-          <w:rFonts w:ascii="Times New Roman" w:eastAsia="Times New Roman" w:hAnsi="Times New Roman" w:cs="Times New Roman"/>
-          <w:sz w:val="26"/>
-          <w:szCs w:val="28"/>
-          <w:lang w:val="de-DE"/>
-        </w:rPr>
-        <w:t>+ Dư nợ trung dài hạn là [TCTD.Dư nợ trung dài hạn] mục đích [TCTD.Mục đích trung dài hạn], nguồn trả nợ từ [TCTD.Nguồn trả nợ];</w:t>
+        </w:rPr>
+      </w:pPr>
+      <w:r>
+        <w:rPr>
+          <w:rFonts w:ascii="Times New Roman" w:eastAsia="Times New Roman" w:hAnsi="Times New Roman" w:cs="Times New Roman"/>
+          <w:sz w:val="26"/>
+          <w:szCs w:val="28"/>
+        </w:rPr>
+        <w:t>[/DUNỢ]</w:t>
       </w:r>
     </w:p>
     <w:p>
@@ -14467,25 +13749,12 @@
           <w:sz w:val="26"/>
         </w:rPr>
       </w:pPr>
-    </w:p>
-    <w:p>
-      <w:pPr>
-        <w:tabs>
-          <w:tab w:val="left" w:pos="567"/>
-        </w:tabs>
-        <w:spacing w:after="0" w:line="276" w:lineRule="auto"/>
-        <w:ind w:firstLine="567"/>
-        <w:jc w:val="both"/>
-        <w:rPr>
-          <w:rFonts w:ascii="Times New Roman" w:eastAsia="Calibri" w:hAnsi="Times New Roman" w:cs="Times New Roman"/>
-          <w:sz w:val="26"/>
-        </w:rPr>
-      </w:pPr>
-      <w:r>
-        <w:rPr>
-          <w:rFonts w:ascii="Times New Roman" w:eastAsia="Calibri" w:hAnsi="Times New Roman" w:cs="Times New Roman"/>
-          <w:sz w:val="26"/>
-        </w:rPr>
+      <w:r>
+        <w:rPr>
+          <w:rFonts w:ascii="Times New Roman" w:eastAsia="Calibri" w:hAnsi="Times New Roman" w:cs="Times New Roman"/>
+          <w:sz w:val="26"/>
+        </w:rPr>
+        <w:lastRenderedPageBreak/>
         <w:t>-</w:t>
       </w:r>
       <w:r>
@@ -14880,82 +14149,7 @@
           <w:sz w:val="26"/>
           <w:szCs w:val="28"/>
         </w:rPr>
-        <w:t xml:space="preserve">- Giá trị định giá tài sản bảo đảm: </w:t>
-      </w:r>
-      <w:r>
-        <w:rPr>
-          <w:rFonts w:ascii="Times New Roman" w:eastAsia="Calibri" w:hAnsi="Times New Roman" w:cs="Times New Roman"/>
-          <w:b/>
-          <w:sz w:val="26"/>
-          <w:szCs w:val="28"/>
-        </w:rPr>
-        <w:t>[</w:t>
-      </w:r>
-      <w:r>
-        <w:rPr>
-          <w:rFonts w:ascii="Times New Roman" w:eastAsia="Calibri" w:hAnsi="Times New Roman" w:cs="Times New Roman"/>
-          <w:b/>
-          <w:sz w:val="26"/>
-          <w:szCs w:val="28"/>
-        </w:rPr>
-        <w:t>HĐTD.</w:t>
-      </w:r>
-      <w:r>
-        <w:rPr>
-          <w:rFonts w:ascii="Times New Roman" w:eastAsia="Calibri" w:hAnsi="Times New Roman" w:cs="Times New Roman"/>
-          <w:b/>
-          <w:sz w:val="26"/>
-          <w:szCs w:val="28"/>
-        </w:rPr>
-        <w:t>Tổng giá trị TSBĐ]</w:t>
-      </w:r>
-      <w:r>
-        <w:rPr>
-          <w:rFonts w:ascii="Times New Roman" w:eastAsia="Calibri" w:hAnsi="Times New Roman" w:cs="Times New Roman"/>
-          <w:sz w:val="26"/>
-          <w:szCs w:val="28"/>
-        </w:rPr>
-        <w:t xml:space="preserve"> đồng</w:t>
-      </w:r>
-      <w:r>
-        <w:rPr>
-          <w:rFonts w:ascii="Times New Roman" w:eastAsia="Calibri" w:hAnsi="Times New Roman" w:cs="Times New Roman"/>
-          <w:sz w:val="26"/>
-          <w:szCs w:val="28"/>
-        </w:rPr>
-        <w:t xml:space="preserve"> </w:t>
-      </w:r>
-      <w:r>
-        <w:rPr>
-          <w:rFonts w:ascii="Times New Roman" w:eastAsia="Calibri" w:hAnsi="Times New Roman" w:cs="Times New Roman"/>
-          <w:sz w:val="26"/>
-          <w:szCs w:val="28"/>
-        </w:rPr>
-        <w:t>(Bằng chữ: [</w:t>
-      </w:r>
-      <w:r>
-        <w:rPr>
-          <w:rFonts w:ascii="Times New Roman" w:eastAsia="Calibri" w:hAnsi="Times New Roman" w:cs="Times New Roman"/>
-          <w:sz w:val="26"/>
-          <w:szCs w:val="28"/>
-        </w:rPr>
-        <w:t>HĐTD.</w:t>
-      </w:r>
-      <w:r>
-        <w:rPr>
-          <w:rFonts w:ascii="Times New Roman" w:eastAsia="Calibri" w:hAnsi="Times New Roman" w:cs="Times New Roman"/>
-          <w:sz w:val="26"/>
-          <w:szCs w:val="28"/>
-        </w:rPr>
-        <w:t>TGTTSBĐ bằng chữ])</w:t>
-      </w:r>
-      <w:r>
-        <w:rPr>
-          <w:rFonts w:ascii="Times New Roman" w:eastAsia="Calibri" w:hAnsi="Times New Roman" w:cs="Times New Roman"/>
-          <w:sz w:val="26"/>
-          <w:szCs w:val="28"/>
-        </w:rPr>
-        <w:t>.</w:t>
+        <w:t>- Giá trị định giá tài sản bảo đảm: [HĐTD.Tổng giá trị TSBĐ] đồng (Bằng chữ: [HĐTD.TGTTSBĐ bằng chữ]).</w:t>
       </w:r>
     </w:p>
     <w:p>
@@ -14966,7 +14160,6 @@
         <w:jc w:val="both"/>
         <w:rPr>
           <w:rFonts w:ascii="Times New Roman" w:eastAsia="Calibri" w:hAnsi="Times New Roman" w:cs="Times New Roman"/>
-          <w:bCs/>
           <w:sz w:val="26"/>
           <w:szCs w:val="28"/>
           <w:lang w:val="fr-FR"/>
@@ -14975,7 +14168,6 @@
       <w:r>
         <w:rPr>
           <w:rFonts w:ascii="Times New Roman" w:eastAsia="Calibri" w:hAnsi="Times New Roman" w:cs="Times New Roman"/>
-          <w:bCs/>
           <w:sz w:val="26"/>
           <w:szCs w:val="28"/>
           <w:lang w:val="fr-FR"/>
@@ -14985,7 +14177,6 @@
       <w:r>
         <w:rPr>
           <w:rFonts w:ascii="Times New Roman" w:eastAsia="Calibri" w:hAnsi="Times New Roman" w:cs="Times New Roman"/>
-          <w:b/>
           <w:sz w:val="26"/>
           <w:szCs w:val="26"/>
           <w:lang w:val="pt-BR"/>
@@ -14995,27 +14186,15 @@
       <w:r>
         <w:rPr>
           <w:rFonts w:ascii="Times New Roman" w:eastAsia="Calibri" w:hAnsi="Times New Roman" w:cs="Times New Roman"/>
-          <w:b/>
           <w:sz w:val="26"/>
           <w:szCs w:val="26"/>
           <w:lang w:val="pt-BR"/>
         </w:rPr>
-        <w:t xml:space="preserve"> </w:t>
-      </w:r>
-      <w:r>
-        <w:rPr>
-          <w:rFonts w:ascii="Times New Roman" w:eastAsia="Calibri" w:hAnsi="Times New Roman" w:cs="Times New Roman"/>
-          <w:bCs/>
-          <w:sz w:val="26"/>
-          <w:szCs w:val="26"/>
-          <w:lang w:val="pt-BR"/>
-        </w:rPr>
-        <w:t>đồng</w:t>
-      </w:r>
-      <w:r>
-        <w:rPr>
-          <w:rFonts w:ascii="Times New Roman" w:eastAsia="Calibri" w:hAnsi="Times New Roman" w:cs="Times New Roman"/>
-          <w:bCs/>
+        <w:t xml:space="preserve"> đồng</w:t>
+      </w:r>
+      <w:r>
+        <w:rPr>
+          <w:rFonts w:ascii="Times New Roman" w:eastAsia="Calibri" w:hAnsi="Times New Roman" w:cs="Times New Roman"/>
           <w:sz w:val="26"/>
           <w:szCs w:val="28"/>
           <w:lang w:val="fr-FR"/>
@@ -15031,7 +14210,6 @@
         <w:jc w:val="both"/>
         <w:rPr>
           <w:rFonts w:ascii="Times New Roman" w:eastAsia="Calibri" w:hAnsi="Times New Roman" w:cs="Times New Roman"/>
-          <w:bCs/>
           <w:sz w:val="26"/>
           <w:szCs w:val="28"/>
           <w:lang w:val="fr-FR"/>
@@ -15040,65 +14218,11 @@
       <w:r>
         <w:rPr>
           <w:rFonts w:ascii="Times New Roman" w:eastAsia="Calibri" w:hAnsi="Times New Roman" w:cs="Times New Roman"/>
-          <w:bCs/>
           <w:sz w:val="26"/>
           <w:szCs w:val="28"/>
           <w:lang w:val="fr-FR"/>
         </w:rPr>
-        <w:t xml:space="preserve">- Nghĩa vụ được bảo đảm, phạm vi bảo đảm: </w:t>
-      </w:r>
-      <w:r>
-        <w:rPr>
-          <w:rFonts w:ascii="Times New Roman" w:eastAsia="Calibri" w:hAnsi="Times New Roman" w:cs="Times New Roman"/>
-          <w:b/>
-          <w:bCs/>
-          <w:sz w:val="26"/>
-          <w:szCs w:val="28"/>
-          <w:lang w:val="fr-FR"/>
-        </w:rPr>
-        <w:t>[</w:t>
-      </w:r>
-      <w:r>
-        <w:rPr>
-          <w:rFonts w:ascii="Times New Roman" w:eastAsia="Calibri" w:hAnsi="Times New Roman" w:cs="Times New Roman"/>
-          <w:b/>
-          <w:bCs/>
-          <w:sz w:val="26"/>
-          <w:szCs w:val="28"/>
-          <w:lang w:val="fr-FR"/>
-        </w:rPr>
-        <w:t>HĐTD.</w:t>
-      </w:r>
-      <w:r>
-        <w:rPr>
-          <w:rFonts w:ascii="Times New Roman" w:eastAsia="Calibri" w:hAnsi="Times New Roman" w:cs="Times New Roman"/>
-          <w:b/>
-          <w:bCs/>
-          <w:sz w:val="26"/>
-          <w:szCs w:val="28"/>
-          <w:lang w:val="fr-FR"/>
-        </w:rPr>
-        <w:t>Tổng nghĩa vụ bảo đảm]</w:t>
-      </w:r>
-      <w:r>
-        <w:rPr>
-          <w:rFonts w:ascii="Times New Roman" w:eastAsia="Calibri" w:hAnsi="Times New Roman" w:cs="Times New Roman"/>
-          <w:bCs/>
-          <w:sz w:val="26"/>
-          <w:szCs w:val="28"/>
-          <w:lang w:val="fr-FR"/>
-        </w:rPr>
-        <w:t xml:space="preserve"> đồng</w:t>
-      </w:r>
-      <w:r>
-        <w:rPr>
-          <w:rFonts w:ascii="Times New Roman" w:eastAsia="Calibri" w:hAnsi="Times New Roman" w:cs="Times New Roman"/>
-          <w:bCs/>
-          <w:sz w:val="26"/>
-          <w:szCs w:val="28"/>
-          <w:lang w:val="fr-FR"/>
-        </w:rPr>
-        <w:t>.</w:t>
+        <w:t>- Nghĩa vụ được bảo đảm, phạm vi bảo đảm: [HĐTD.Tổng nghĩa vụ bảo đảm] đồng.</w:t>
       </w:r>
     </w:p>
     <w:p>
@@ -15108,7 +14232,6 @@
         <w:jc w:val="both"/>
         <w:rPr>
           <w:rFonts w:ascii="Times New Roman" w:eastAsia="Calibri" w:hAnsi="Times New Roman" w:cs="Times New Roman"/>
-          <w:bCs/>
           <w:sz w:val="26"/>
           <w:szCs w:val="28"/>
           <w:lang w:val="fr-FR"/>
@@ -15117,32 +14240,11 @@
       <w:r>
         <w:rPr>
           <w:rFonts w:ascii="Times New Roman" w:eastAsia="Calibri" w:hAnsi="Times New Roman" w:cs="Times New Roman"/>
-          <w:bCs/>
           <w:sz w:val="26"/>
           <w:szCs w:val="28"/>
           <w:lang w:val="fr-FR"/>
         </w:rPr>
-        <w:t xml:space="preserve">* Nhận xét về TSBĐ: </w:t>
-      </w:r>
-      <w:r>
-        <w:rPr>
-          <w:rFonts w:ascii="Times New Roman" w:eastAsia="Calibri" w:hAnsi="Times New Roman" w:cs="Times New Roman"/>
-          <w:bCs/>
-          <w:sz w:val="26"/>
-          <w:szCs w:val="28"/>
-          <w:lang w:val="fr-FR"/>
-        </w:rPr>
-        <w:t>tài sản bảo đảm không thuộc Danh mục tài sản không được nhận làm tài sản bảo đảm; đủ điều kiện nhận làm TSBĐ chính thức theo quy định</w:t>
-      </w:r>
-      <w:r>
-        <w:rPr>
-          <w:rFonts w:ascii="Times New Roman" w:eastAsia="Calibri" w:hAnsi="Times New Roman" w:cs="Times New Roman"/>
-          <w:bCs/>
-          <w:sz w:val="26"/>
-          <w:szCs w:val="28"/>
-          <w:lang w:val="fr-FR"/>
-        </w:rPr>
-        <w:t>.</w:t>
+        <w:t>* Nhận xét về TSBĐ: tài sản bảo đảm không thuộc Danh mục tài sản không được nhận làm tài sản bảo đảm; đủ điều kiện nhận làm TSBĐ chính thức theo quy định.</w:t>
       </w:r>
     </w:p>
     <w:p>
@@ -15191,7 +14293,6 @@
           <w:szCs w:val="28"/>
           <w:lang w:val="pt-BR"/>
         </w:rPr>
-        <w:lastRenderedPageBreak/>
         <w:t>Trên cơ sở hồ sơ vay vốn, đề xuất của Người quan hệ khách hàng, Người thẩm định đã tiến hành thẩm định và đề xuất như sau:</w:t>
       </w:r>
     </w:p>
@@ -15215,16 +14316,7 @@
           <w:szCs w:val="28"/>
           <w:lang w:val="pt-BR"/>
         </w:rPr>
-        <w:t>Đồ</w:t>
-      </w:r>
-      <w:r>
-        <w:rPr>
-          <w:rFonts w:ascii="Times New Roman" w:eastAsia="Calibri" w:hAnsi="Times New Roman" w:cs="Times New Roman"/>
-          <w:sz w:val="26"/>
-          <w:szCs w:val="28"/>
-          <w:lang w:val="pt-BR"/>
-        </w:rPr>
-        <w:t>ng ý cho vay:</w:t>
+        <w:t>Đồng ý cho vay:</w:t>
       </w:r>
     </w:p>
     <w:p>
@@ -15252,30 +14344,11 @@
       <w:r>
         <w:rPr>
           <w:rFonts w:ascii="Times New Roman" w:eastAsia="Calibri" w:hAnsi="Times New Roman" w:cs="Times New Roman"/>
-          <w:b/>
           <w:sz w:val="26"/>
           <w:szCs w:val="26"/>
           <w:lang w:val="pt-BR"/>
         </w:rPr>
-        <w:t>[HĐTD.Số tiền vay]</w:t>
-      </w:r>
-      <w:r>
-        <w:rPr>
-          <w:rFonts w:ascii="Times New Roman" w:eastAsia="Calibri" w:hAnsi="Times New Roman" w:cs="Times New Roman"/>
-          <w:sz w:val="26"/>
-          <w:szCs w:val="26"/>
-          <w:lang w:val="pt-BR"/>
-        </w:rPr>
-        <w:t xml:space="preserve"> đồng, (Bằng chữ: [HĐTD.Bằng chữ])</w:t>
-      </w:r>
-      <w:r>
-        <w:rPr>
-          <w:rFonts w:ascii="Times New Roman" w:eastAsia="Calibri" w:hAnsi="Times New Roman" w:cs="Times New Roman"/>
-          <w:sz w:val="26"/>
-          <w:szCs w:val="26"/>
-          <w:lang w:val="pt-BR"/>
-        </w:rPr>
-        <w:t>, bao gồm dư nợ từ HĐTD số [PA.Số HĐTD cũ] ngày [PA.Ngày HĐTD cũ] chuyển sang;</w:t>
+        <w:t>[HĐTD.Số tiền vay] đồng, (Bằng chữ: [HĐTD.Bằng chữ]), bao gồm dư nợ từ HĐTD số [PA.Số HĐTD cũ] ngày [PA.Ngày HĐTD cũ] chuyển sang;</w:t>
       </w:r>
     </w:p>
     <w:p>
@@ -15298,16 +14371,7 @@
           <w:szCs w:val="28"/>
           <w:lang w:val="pt-BR"/>
         </w:rPr>
-        <w:t>- Mục đích vay: [HĐTD.Mục đích vay]</w:t>
-      </w:r>
-      <w:r>
-        <w:rPr>
-          <w:rFonts w:ascii="Times New Roman" w:eastAsia="Calibri" w:hAnsi="Times New Roman" w:cs="Times New Roman"/>
-          <w:sz w:val="26"/>
-          <w:szCs w:val="28"/>
-          <w:lang w:val="pt-BR"/>
-        </w:rPr>
-        <w:t>.</w:t>
+        <w:t>- Mục đích vay: [HĐTD.Mục đích vay].</w:t>
       </w:r>
     </w:p>
     <w:p>
@@ -15330,25 +14394,7 @@
           <w:szCs w:val="28"/>
           <w:lang w:val="pt-BR"/>
         </w:rPr>
-        <w:t xml:space="preserve">- Phương thức cho vay: </w:t>
-      </w:r>
-      <w:r>
-        <w:rPr>
-          <w:rFonts w:ascii="Times New Roman" w:eastAsia="Calibri" w:hAnsi="Times New Roman" w:cs="Times New Roman"/>
-          <w:sz w:val="26"/>
-          <w:szCs w:val="28"/>
-          <w:lang w:val="pt-BR"/>
-        </w:rPr>
-        <w:t>[HĐTD.Phương thức cho vay]</w:t>
-      </w:r>
-      <w:r>
-        <w:rPr>
-          <w:rFonts w:ascii="Times New Roman" w:eastAsia="Calibri" w:hAnsi="Times New Roman" w:cs="Times New Roman"/>
-          <w:sz w:val="26"/>
-          <w:szCs w:val="28"/>
-          <w:lang w:val="pt-BR"/>
-        </w:rPr>
-        <w:t>.</w:t>
+        <w:t>- Phương thức cho vay: [HĐTD.Phương thức cho vay].</w:t>
       </w:r>
     </w:p>
     <w:p>
@@ -15403,7 +14449,6 @@
       <w:r>
         <w:rPr>
           <w:rFonts w:ascii="Times New Roman" w:eastAsia="Times New Roman" w:hAnsi="Times New Roman" w:cs="Times New Roman"/>
-          <w:b/>
           <w:sz w:val="26"/>
           <w:szCs w:val="26"/>
           <w:lang w:val="pt-BR"/>
@@ -15456,15 +14501,7 @@
           <w:sz w:val="26"/>
           <w:szCs w:val="26"/>
         </w:rPr>
-        <w:t>[HĐTD.Định kỳ trả gốc]. Định kỳ trả lãi: [HĐTD.Định kỳ trả lãi]</w:t>
-      </w:r>
-      <w:r>
-        <w:rPr>
-          <w:rFonts w:ascii="Times New Roman" w:eastAsia="Times New Roman" w:hAnsi="Times New Roman" w:cs="Times New Roman"/>
-          <w:sz w:val="26"/>
-          <w:szCs w:val="26"/>
-        </w:rPr>
-        <w:t>.</w:t>
+        <w:t>[HĐTD.Định kỳ trả gốc]. Định kỳ trả lãi: [HĐTD.Định kỳ trả lãi].</w:t>
       </w:r>
     </w:p>
     <w:p>
@@ -15505,34 +14542,7 @@
           <w:szCs w:val="28"/>
           <w:lang w:val="pt-BR"/>
         </w:rPr>
-        <w:t>.</w:t>
-      </w:r>
-      <w:r>
-        <w:rPr>
-          <w:rFonts w:ascii="Times New Roman" w:eastAsia="Times New Roman" w:hAnsi="Times New Roman" w:cs="Times New Roman"/>
-          <w:sz w:val="26"/>
-          <w:szCs w:val="28"/>
-          <w:lang w:val="pt-BR"/>
-        </w:rPr>
-        <w:t xml:space="preserve"> </w:t>
-      </w:r>
-      <w:r>
-        <w:rPr>
-          <w:rFonts w:ascii="Times New Roman" w:eastAsia="Times New Roman" w:hAnsi="Times New Roman" w:cs="Times New Roman"/>
-          <w:sz w:val="26"/>
-          <w:szCs w:val="28"/>
-          <w:lang w:val="pt-BR"/>
-        </w:rPr>
-        <w:t>Lãi suất quá hạn: [HĐTD.Lãi suất quá hạn]. Lãi chậm trả</w:t>
-      </w:r>
-      <w:r>
-        <w:rPr>
-          <w:rFonts w:ascii="Times New Roman" w:eastAsia="Times New Roman" w:hAnsi="Times New Roman" w:cs="Times New Roman"/>
-          <w:sz w:val="26"/>
-          <w:szCs w:val="28"/>
-          <w:lang w:val="pt-BR"/>
-        </w:rPr>
-        <w:t xml:space="preserve"> lãi: [HĐTD.Lãi suất chậm trả].</w:t>
+        <w:t>. Lãi suất quá hạn: [HĐTD.Lãi suất quá hạn]. Lãi chậm trả lãi: [HĐTD.Lãi suất chậm trả].</w:t>
       </w:r>
     </w:p>
     <w:p>
@@ -15553,15 +14563,7 @@
           <w:sz w:val="26"/>
           <w:szCs w:val="28"/>
         </w:rPr>
-        <w:t xml:space="preserve">- </w:t>
-      </w:r>
-      <w:r>
-        <w:rPr>
-          <w:rFonts w:ascii="Times New Roman" w:eastAsia="Calibri" w:hAnsi="Times New Roman" w:cs="Times New Roman"/>
-          <w:sz w:val="26"/>
-          <w:szCs w:val="28"/>
-        </w:rPr>
-        <w:t>Tài sản bảo đảm: Cho vay có bảo đảm 100% bằng tài sản</w:t>
+        <w:t>- Tài sản bảo đảm: Cho vay có bảo đảm 100% bằng tài sản</w:t>
       </w:r>
     </w:p>
     <w:tbl>
@@ -15832,6 +14834,7 @@
           <w:sz w:val="26"/>
           <w:szCs w:val="28"/>
         </w:rPr>
+        <w:lastRenderedPageBreak/>
         <w:t>C</w:t>
       </w:r>
       <w:r>
@@ -15915,30 +14918,11 @@
       <w:r>
         <w:rPr>
           <w:rFonts w:ascii="Times New Roman" w:eastAsia="Calibri" w:hAnsi="Times New Roman" w:cs="Times New Roman"/>
-          <w:b/>
           <w:sz w:val="26"/>
           <w:szCs w:val="26"/>
           <w:lang w:val="pt-BR"/>
         </w:rPr>
-        <w:t>[HĐTD.Số tiền vay]</w:t>
-      </w:r>
-      <w:r>
-        <w:rPr>
-          <w:rFonts w:ascii="Times New Roman" w:eastAsia="Calibri" w:hAnsi="Times New Roman" w:cs="Times New Roman"/>
-          <w:sz w:val="26"/>
-          <w:szCs w:val="26"/>
-          <w:lang w:val="pt-BR"/>
-        </w:rPr>
-        <w:t xml:space="preserve"> đồng, (Bằng chữ: [HĐTD.Bằng chữ])</w:t>
-      </w:r>
-      <w:r>
-        <w:rPr>
-          <w:rFonts w:ascii="Times New Roman" w:eastAsia="Calibri" w:hAnsi="Times New Roman" w:cs="Times New Roman"/>
-          <w:sz w:val="26"/>
-          <w:szCs w:val="26"/>
-          <w:lang w:val="pt-BR"/>
-        </w:rPr>
-        <w:t>, bao gồm dư nợ từ HĐTD số [PA.Số HĐTD cũ] ngày [PA.Ngày HĐTD cũ] chuyển sang;</w:t>
+        <w:t>[HĐTD.Số tiền vay] đồng, (Bằng chữ: [HĐTD.Bằng chữ]), bao gồm dư nợ từ HĐTD số [PA.Số HĐTD cũ] ngày [PA.Ngày HĐTD cũ] chuyển sang;</w:t>
       </w:r>
     </w:p>
     <w:p>
@@ -15964,16 +14948,7 @@
           <w:szCs w:val="28"/>
           <w:lang w:val="pt-BR"/>
         </w:rPr>
-        <w:t>- Mục đích vay: [HĐTD.Mục đích vay]</w:t>
-      </w:r>
-      <w:r>
-        <w:rPr>
-          <w:rFonts w:ascii="Times New Roman" w:eastAsia="Calibri" w:hAnsi="Times New Roman" w:cs="Times New Roman"/>
-          <w:sz w:val="26"/>
-          <w:szCs w:val="28"/>
-          <w:lang w:val="pt-BR"/>
-        </w:rPr>
-        <w:t>.</w:t>
+        <w:t>- Mục đích vay: [HĐTD.Mục đích vay].</w:t>
       </w:r>
     </w:p>
     <w:p>
@@ -15996,25 +14971,7 @@
           <w:szCs w:val="28"/>
           <w:lang w:val="pt-BR"/>
         </w:rPr>
-        <w:t xml:space="preserve">- Phương thức cho vay: </w:t>
-      </w:r>
-      <w:r>
-        <w:rPr>
-          <w:rFonts w:ascii="Times New Roman" w:eastAsia="Calibri" w:hAnsi="Times New Roman" w:cs="Times New Roman"/>
-          <w:sz w:val="26"/>
-          <w:szCs w:val="28"/>
-          <w:lang w:val="pt-BR"/>
-        </w:rPr>
-        <w:t>[HĐTD.Phương thức cho vay]</w:t>
-      </w:r>
-      <w:r>
-        <w:rPr>
-          <w:rFonts w:ascii="Times New Roman" w:eastAsia="Calibri" w:hAnsi="Times New Roman" w:cs="Times New Roman"/>
-          <w:sz w:val="26"/>
-          <w:szCs w:val="28"/>
-          <w:lang w:val="pt-BR"/>
-        </w:rPr>
-        <w:t>.</w:t>
+        <w:t>- Phương thức cho vay: [HĐTD.Phương thức cho vay].</w:t>
       </w:r>
     </w:p>
     <w:p>
@@ -16037,16 +14994,7 @@
           <w:szCs w:val="28"/>
           <w:lang w:val="pt-BR"/>
         </w:rPr>
-        <w:t xml:space="preserve">- Thời hạn </w:t>
-      </w:r>
-      <w:r>
-        <w:rPr>
-          <w:rFonts w:ascii="Times New Roman" w:eastAsia="Times New Roman" w:hAnsi="Times New Roman" w:cs="Times New Roman"/>
-          <w:sz w:val="26"/>
-          <w:szCs w:val="28"/>
-          <w:lang w:val="pt-BR"/>
-        </w:rPr>
-        <w:t>duy trì hạn mức</w:t>
+        <w:t>- Thời hạn duy trì hạn mức</w:t>
       </w:r>
       <w:r>
         <w:rPr>
@@ -16069,7 +15017,6 @@
       <w:r>
         <w:rPr>
           <w:rFonts w:ascii="Times New Roman" w:eastAsia="Times New Roman" w:hAnsi="Times New Roman" w:cs="Times New Roman"/>
-          <w:b/>
           <w:sz w:val="26"/>
           <w:szCs w:val="26"/>
           <w:lang w:val="pt-BR"/>
@@ -16125,15 +15072,7 @@
           <w:sz w:val="26"/>
           <w:szCs w:val="26"/>
         </w:rPr>
-        <w:t>[HĐTD.Định kỳ trả gốc]. Định kỳ trả lãi: [HĐTD.Định kỳ trả lãi]</w:t>
-      </w:r>
-      <w:r>
-        <w:rPr>
-          <w:rFonts w:ascii="Times New Roman" w:eastAsia="Times New Roman" w:hAnsi="Times New Roman" w:cs="Times New Roman"/>
-          <w:sz w:val="26"/>
-          <w:szCs w:val="26"/>
-        </w:rPr>
-        <w:t>.</w:t>
+        <w:t>[HĐTD.Định kỳ trả gốc]. Định kỳ trả lãi: [HĐTD.Định kỳ trả lãi].</w:t>
       </w:r>
     </w:p>
     <w:p>
@@ -16177,25 +15116,7 @@
           <w:szCs w:val="28"/>
           <w:lang w:val="pt-BR"/>
         </w:rPr>
-        <w:t xml:space="preserve">. </w:t>
-      </w:r>
-      <w:r>
-        <w:rPr>
-          <w:rFonts w:ascii="Times New Roman" w:eastAsia="Times New Roman" w:hAnsi="Times New Roman" w:cs="Times New Roman"/>
-          <w:sz w:val="26"/>
-          <w:szCs w:val="28"/>
-          <w:lang w:val="pt-BR"/>
-        </w:rPr>
-        <w:t>Lãi suất quá hạn: [HĐTD.Lãi suất quá hạn]. Lãi chậm trả</w:t>
-      </w:r>
-      <w:r>
-        <w:rPr>
-          <w:rFonts w:ascii="Times New Roman" w:eastAsia="Times New Roman" w:hAnsi="Times New Roman" w:cs="Times New Roman"/>
-          <w:sz w:val="26"/>
-          <w:szCs w:val="28"/>
-          <w:lang w:val="pt-BR"/>
-        </w:rPr>
-        <w:t xml:space="preserve"> lãi: [HĐTD.Lãi suất chậm trả].</w:t>
+        <w:t>. Lãi suất quá hạn: [HĐTD.Lãi suất quá hạn]. Lãi chậm trả lãi: [HĐTD.Lãi suất chậm trả].</w:t>
       </w:r>
     </w:p>
     <w:p>
@@ -16219,15 +15140,7 @@
           <w:sz w:val="26"/>
           <w:szCs w:val="28"/>
         </w:rPr>
-        <w:t xml:space="preserve">- </w:t>
-      </w:r>
-      <w:r>
-        <w:rPr>
-          <w:rFonts w:ascii="Times New Roman" w:eastAsia="Calibri" w:hAnsi="Times New Roman" w:cs="Times New Roman"/>
-          <w:sz w:val="26"/>
-          <w:szCs w:val="28"/>
-        </w:rPr>
-        <w:t>Tài sản bảo đảm: Cho vay có bảo đảm 100% bằng tài sản</w:t>
+        <w:t>- Tài sản bảo đảm: Cho vay có bảo đảm 100% bằng tài sản</w:t>
       </w:r>
       <w:r>
         <w:rPr>
@@ -16259,23 +15172,7 @@
           <w:sz w:val="26"/>
           <w:szCs w:val="28"/>
         </w:rPr>
-        <w:t xml:space="preserve">- Nội dung khác (nếu có): </w:t>
-      </w:r>
-      <w:r>
-        <w:rPr>
-          <w:rFonts w:ascii="Times New Roman" w:eastAsia="Calibri" w:hAnsi="Times New Roman" w:cs="Times New Roman"/>
-          <w:sz w:val="26"/>
-          <w:szCs w:val="28"/>
-        </w:rPr>
-        <w:t>[HĐTD.Bổ sung BCĐX cho vay]</w:t>
-      </w:r>
-      <w:r>
-        <w:rPr>
-          <w:rFonts w:ascii="Times New Roman" w:eastAsia="Calibri" w:hAnsi="Times New Roman" w:cs="Times New Roman"/>
-          <w:sz w:val="26"/>
-          <w:szCs w:val="28"/>
-        </w:rPr>
-        <w:t>.</w:t>
+        <w:t>- Nội dung khác (nếu có): [HĐTD.Bổ sung BCĐX cho vay].</w:t>
       </w:r>
     </w:p>
     <w:tbl>
@@ -18590,7 +17487,6 @@
   <w:style w:type="character" w:default="1" w:styleId="DefaultParagraphFont">
     <w:name w:val="Default Paragraph Font"/>
     <w:uiPriority w:val="1"/>
-    <w:semiHidden/>
     <w:unhideWhenUsed/>
   </w:style>
   <w:style w:type="table" w:default="1" w:styleId="TableNormal">

</xml_diff>

<commit_message>
chore: update KHCN disbursement templates and add new assets
- Update invoice templates: HoaDon NongSan, TapHoa, ThietBiYTe, VatLieuXayDung
- Rename Mau1-4 → HoaDon_* (cleaner naming)
- Update Hop dong cung ung vat tu, Bien ban giao nhan hang hoa
- Update 2268.02B BCDXCV ngan han HMTD, 2268.06A HDTD, 2268.01E PASDV
- Add Dinh muc KTKT 2026.xls
</commit_message>
<xml_diff>
--- a/report_assets/KHCN templates/Báo cáo đề xuất/2268.02B BCDXCV ngan han HMTD.docx
+++ b/report_assets/KHCN templates/Báo cáo đề xuất/2268.02B BCDXCV ngan han HMTD.docx
@@ -114,7 +114,7 @@
                 </mc:Choice>
                 <mc:Fallback>
                   <w:pict>
-                    <v:line w14:anchorId="633AD5A9" id="Straight Connector 1" o:spid="_x0000_s1026" style="position:absolute;z-index:251660288;visibility:visible;mso-wrap-style:square;mso-wrap-distance-left:9pt;mso-wrap-distance-top:0;mso-wrap-distance-right:9pt;mso-wrap-distance-bottom:0;mso-position-horizontal:center;mso-position-horizontal-relative:margin;mso-position-vertical:absolute;mso-position-vertical-relative:text" from="0,16.5pt" to="108pt,16.5pt" o:gfxdata="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">
+                    <v:line w14:anchorId="58C47098" id="Straight Connector 1" o:spid="_x0000_s1026" style="position:absolute;z-index:251660288;visibility:visible;mso-wrap-style:square;mso-wrap-distance-left:9pt;mso-wrap-distance-top:0;mso-wrap-distance-right:9pt;mso-wrap-distance-bottom:0;mso-position-horizontal:center;mso-position-horizontal-relative:margin;mso-position-vertical:absolute;mso-position-vertical-relative:text" from="0,16.5pt" to="108pt,16.5pt" o:gfxdata="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">
                       <w10:wrap anchorx="margin"/>
                     </v:line>
                   </w:pict>
@@ -266,7 +266,7 @@
                 </mc:Choice>
                 <mc:Fallback>
                   <w:pict>
-                    <v:shapetype w14:anchorId="3F3D8372" id="_x0000_t32" coordsize="21600,21600" o:spt="32" o:oned="t" path="m,l21600,21600e" filled="f">
+                    <v:shapetype w14:anchorId="6C1F6AAF" id="_x0000_t32" coordsize="21600,21600" o:spt="32" o:oned="t" path="m,l21600,21600e" filled="f">
                       <v:path arrowok="t" fillok="f" o:connecttype="none"/>
                       <o:lock v:ext="edit" shapetype="t"/>
                     </v:shapetype>
@@ -4570,7 +4570,16 @@
           <w:szCs w:val="28"/>
           <w:lang w:val="pt-BR"/>
         </w:rPr>
-        <w:t>- Tổng nhu cầu vốn: [HĐTD.Tổng nhu cầu vốn]</w:t>
+        <w:t xml:space="preserve">- Tổng nhu cầu vốn: </w:t>
+      </w:r>
+      <w:r>
+        <w:rPr>
+          <w:rFonts w:ascii="Times New Roman" w:eastAsia="Times New Roman" w:hAnsi="Times New Roman" w:cs="Times New Roman"/>
+          <w:sz w:val="26"/>
+          <w:szCs w:val="28"/>
+          <w:lang w:val="pt-BR"/>
+        </w:rPr>
+        <w:t>[PA.Tổng chi phí trực tiếp]</w:t>
       </w:r>
       <w:r>
         <w:rPr>
@@ -4588,16 +4597,7 @@
           <w:szCs w:val="28"/>
           <w:lang w:val="pt-BR"/>
         </w:rPr>
-        <w:t>,</w:t>
-      </w:r>
-      <w:r>
-        <w:rPr>
-          <w:rFonts w:ascii="Times New Roman" w:eastAsia="Times New Roman" w:hAnsi="Times New Roman" w:cs="Times New Roman"/>
-          <w:sz w:val="26"/>
-          <w:szCs w:val="28"/>
-          <w:lang w:val="pt-BR"/>
-        </w:rPr>
-        <w:t xml:space="preserve"> bằng chữ: [HĐTD.TNCV bằng chữ];</w:t>
+        <w:t>.</w:t>
       </w:r>
     </w:p>
     <w:p>
@@ -4667,43 +4667,43 @@
           <w:szCs w:val="28"/>
           <w:lang w:val="pt-BR"/>
         </w:rPr>
-        <w:t>- Vốn đối ứng: [HĐTD.Vốn đối ứng] đồng</w:t>
-      </w:r>
-      <w:r>
-        <w:rPr>
-          <w:rFonts w:ascii="Times New Roman" w:eastAsia="Times New Roman" w:hAnsi="Times New Roman" w:cs="Times New Roman"/>
-          <w:sz w:val="26"/>
-          <w:szCs w:val="28"/>
-          <w:lang w:val="pt-BR"/>
-        </w:rPr>
-        <w:t xml:space="preserve">, tỷ lệ vốn đối ứng </w:t>
-      </w:r>
-      <w:r>
-        <w:rPr>
-          <w:rFonts w:ascii="Times New Roman" w:eastAsia="Times New Roman" w:hAnsi="Times New Roman" w:cs="Times New Roman"/>
-          <w:sz w:val="26"/>
-          <w:szCs w:val="28"/>
-          <w:lang w:val="pt-BR"/>
-        </w:rPr>
-        <w:t>[HĐTD.Tỷ lệ vốn đối ứng]</w:t>
-      </w:r>
-      <w:r>
-        <w:rPr>
-          <w:rFonts w:ascii="Times New Roman" w:eastAsia="Times New Roman" w:hAnsi="Times New Roman" w:cs="Times New Roman"/>
-          <w:sz w:val="26"/>
-          <w:szCs w:val="28"/>
-          <w:lang w:val="pt-BR"/>
-        </w:rPr>
-        <w:t>, trong đó</w:t>
-      </w:r>
-      <w:r>
-        <w:rPr>
-          <w:rFonts w:ascii="Times New Roman" w:eastAsia="Times New Roman" w:hAnsi="Times New Roman" w:cs="Times New Roman"/>
-          <w:sz w:val="26"/>
-          <w:szCs w:val="28"/>
-          <w:lang w:val="pt-BR"/>
-        </w:rPr>
-        <w:t>:</w:t>
+        <w:t xml:space="preserve">- Nhu cầu vốn/01 vòng quay: </w:t>
+      </w:r>
+      <w:r>
+        <w:rPr>
+          <w:rFonts w:ascii="Times New Roman" w:eastAsia="Times New Roman" w:hAnsi="Times New Roman" w:cs="Times New Roman"/>
+          <w:sz w:val="26"/>
+          <w:szCs w:val="28"/>
+          <w:lang w:val="pt-BR"/>
+        </w:rPr>
+        <w:t>[HĐTD.Tổng nhu cầu vốn]</w:t>
+      </w:r>
+      <w:r>
+        <w:rPr>
+          <w:rFonts w:ascii="Times New Roman" w:eastAsia="Times New Roman" w:hAnsi="Times New Roman" w:cs="Times New Roman"/>
+          <w:sz w:val="26"/>
+          <w:szCs w:val="28"/>
+          <w:lang w:val="pt-BR"/>
+        </w:rPr>
+        <w:t xml:space="preserve"> đồng</w:t>
+      </w:r>
+      <w:r>
+        <w:rPr>
+          <w:rFonts w:ascii="Times New Roman" w:eastAsia="Times New Roman" w:hAnsi="Times New Roman" w:cs="Times New Roman"/>
+          <w:sz w:val="26"/>
+          <w:szCs w:val="28"/>
+          <w:lang w:val="pt-BR"/>
+        </w:rPr>
+        <w:t>,</w:t>
+      </w:r>
+      <w:r>
+        <w:rPr>
+          <w:rFonts w:ascii="Times New Roman" w:eastAsia="Times New Roman" w:hAnsi="Times New Roman" w:cs="Times New Roman"/>
+          <w:sz w:val="26"/>
+          <w:szCs w:val="28"/>
+          <w:lang w:val="pt-BR"/>
+        </w:rPr>
+        <w:t xml:space="preserve"> bằng chữ: [HĐTD.TNCV bằng chữ];</w:t>
       </w:r>
     </w:p>
     <w:p>
@@ -4713,32 +4713,59 @@
           <w:tab w:val="left" w:leader="dot" w:pos="8647"/>
         </w:tabs>
         <w:spacing w:after="0" w:line="276" w:lineRule="auto"/>
-        <w:ind w:firstLine="851"/>
-        <w:jc w:val="both"/>
-        <w:rPr>
-          <w:rFonts w:ascii="Times New Roman" w:eastAsia="Times New Roman" w:hAnsi="Times New Roman" w:cs="Times New Roman"/>
-          <w:sz w:val="26"/>
-          <w:szCs w:val="28"/>
-          <w:lang w:val="pt-BR"/>
-        </w:rPr>
-      </w:pPr>
-      <w:r>
-        <w:rPr>
-          <w:rFonts w:ascii="Times New Roman" w:eastAsia="Times New Roman" w:hAnsi="Times New Roman" w:cs="Times New Roman"/>
-          <w:sz w:val="26"/>
-          <w:szCs w:val="28"/>
-          <w:lang w:val="pt-BR"/>
-        </w:rPr>
-        <w:t>+</w:t>
-      </w:r>
-      <w:r>
-        <w:rPr>
-          <w:rFonts w:ascii="Times New Roman" w:eastAsia="Times New Roman" w:hAnsi="Times New Roman" w:cs="Times New Roman"/>
-          <w:sz w:val="26"/>
-          <w:szCs w:val="28"/>
-          <w:lang w:val="pt-BR"/>
-        </w:rPr>
-        <w:t xml:space="preserve"> Vốn bằng tiền: [HĐTD.Tr.đó: Vốn bằng tiền] đồng.</w:t>
+        <w:ind w:firstLine="567"/>
+        <w:jc w:val="both"/>
+        <w:rPr>
+          <w:rFonts w:ascii="Times New Roman" w:eastAsia="Times New Roman" w:hAnsi="Times New Roman" w:cs="Times New Roman"/>
+          <w:sz w:val="26"/>
+          <w:szCs w:val="28"/>
+          <w:lang w:val="pt-BR"/>
+        </w:rPr>
+      </w:pPr>
+      <w:r>
+        <w:rPr>
+          <w:rFonts w:ascii="Times New Roman" w:eastAsia="Times New Roman" w:hAnsi="Times New Roman" w:cs="Times New Roman"/>
+          <w:sz w:val="26"/>
+          <w:szCs w:val="28"/>
+          <w:lang w:val="pt-BR"/>
+        </w:rPr>
+        <w:t>- Vốn đối ứng: [HĐTD.Vốn đối ứng] đồng</w:t>
+      </w:r>
+      <w:r>
+        <w:rPr>
+          <w:rFonts w:ascii="Times New Roman" w:eastAsia="Times New Roman" w:hAnsi="Times New Roman" w:cs="Times New Roman"/>
+          <w:sz w:val="26"/>
+          <w:szCs w:val="28"/>
+          <w:lang w:val="pt-BR"/>
+        </w:rPr>
+        <w:t xml:space="preserve">, tỷ lệ vốn đối ứng </w:t>
+      </w:r>
+      <w:r>
+        <w:rPr>
+          <w:rFonts w:ascii="Times New Roman" w:eastAsia="Times New Roman" w:hAnsi="Times New Roman" w:cs="Times New Roman"/>
+          <w:sz w:val="26"/>
+          <w:szCs w:val="28"/>
+          <w:lang w:val="pt-BR"/>
+        </w:rPr>
+        <w:t>[HĐTD.Tỷ lệ vốn đối ứng]</w:t>
+      </w:r>
+      <w:r>
+        <w:rPr>
+          <w:rFonts w:ascii="Times New Roman" w:eastAsia="Times New Roman" w:hAnsi="Times New Roman" w:cs="Times New Roman"/>
+          <w:sz w:val="26"/>
+          <w:szCs w:val="28"/>
+          <w:lang w:val="pt-BR"/>
+        </w:rPr>
+        <w:t>, trong đó</w:t>
+      </w:r>
+      <w:r>
+        <w:rPr>
+          <w:rFonts w:ascii="Times New Roman" w:eastAsia="Times New Roman" w:hAnsi="Times New Roman" w:cs="Times New Roman"/>
+          <w:sz w:val="26"/>
+          <w:szCs w:val="28"/>
+          <w:lang w:val="pt-BR"/>
+        </w:rPr>
+        <w:t>:</w:t>
       </w:r>
     </w:p>
     <w:p>
@@ -4764,43 +4791,16 @@
           <w:szCs w:val="28"/>
           <w:lang w:val="pt-BR"/>
         </w:rPr>
-        <w:t>+ Giá trị ngày công lao động của khách hàng: [HĐTD.</w:t>
-      </w:r>
-      <w:r>
-        <w:rPr>
-          <w:rFonts w:ascii="Times New Roman" w:eastAsia="Times New Roman" w:hAnsi="Times New Roman" w:cs="Times New Roman"/>
-          <w:sz w:val="26"/>
-          <w:szCs w:val="28"/>
-          <w:lang w:val="pt-BR"/>
-        </w:rPr>
-        <w:t xml:space="preserve">Vốn bằng </w:t>
-      </w:r>
-      <w:r>
-        <w:rPr>
-          <w:rFonts w:ascii="Times New Roman" w:eastAsia="Times New Roman" w:hAnsi="Times New Roman" w:cs="Times New Roman"/>
-          <w:sz w:val="26"/>
-          <w:szCs w:val="28"/>
-          <w:lang w:val="pt-BR"/>
-        </w:rPr>
-        <w:t>sức</w:t>
-      </w:r>
-      <w:r>
-        <w:rPr>
-          <w:rFonts w:ascii="Times New Roman" w:eastAsia="Times New Roman" w:hAnsi="Times New Roman" w:cs="Times New Roman"/>
-          <w:sz w:val="26"/>
-          <w:szCs w:val="28"/>
-          <w:lang w:val="pt-BR"/>
-        </w:rPr>
-        <w:t xml:space="preserve"> lao động] </w:t>
-      </w:r>
-      <w:r>
-        <w:rPr>
-          <w:rFonts w:ascii="Times New Roman" w:eastAsia="Times New Roman" w:hAnsi="Times New Roman" w:cs="Times New Roman"/>
-          <w:sz w:val="26"/>
-          <w:szCs w:val="28"/>
-          <w:lang w:val="pt-BR"/>
-        </w:rPr>
-        <w:t>đồng.</w:t>
+        <w:t>+</w:t>
+      </w:r>
+      <w:r>
+        <w:rPr>
+          <w:rFonts w:ascii="Times New Roman" w:eastAsia="Times New Roman" w:hAnsi="Times New Roman" w:cs="Times New Roman"/>
+          <w:sz w:val="26"/>
+          <w:szCs w:val="28"/>
+          <w:lang w:val="pt-BR"/>
+        </w:rPr>
+        <w:t xml:space="preserve"> Vốn bằng tiền: [HĐTD.Tr.đó: Vốn bằng tiền] đồng.</w:t>
       </w:r>
     </w:p>
     <w:p>
@@ -4826,16 +4826,43 @@
           <w:szCs w:val="28"/>
           <w:lang w:val="pt-BR"/>
         </w:rPr>
-        <w:t>+</w:t>
-      </w:r>
-      <w:r>
-        <w:rPr>
-          <w:rFonts w:ascii="Times New Roman" w:eastAsia="Times New Roman" w:hAnsi="Times New Roman" w:cs="Times New Roman"/>
-          <w:sz w:val="26"/>
-          <w:szCs w:val="28"/>
-          <w:lang w:val="pt-BR"/>
-        </w:rPr>
-        <w:t xml:space="preserve"> Vốn vay TCTD khác: [HĐTD.Vốn vay TCTD khác] đồng.</w:t>
+        <w:t>+ Giá trị ngày công lao động của khách hàng: [HĐTD.</w:t>
+      </w:r>
+      <w:r>
+        <w:rPr>
+          <w:rFonts w:ascii="Times New Roman" w:eastAsia="Times New Roman" w:hAnsi="Times New Roman" w:cs="Times New Roman"/>
+          <w:sz w:val="26"/>
+          <w:szCs w:val="28"/>
+          <w:lang w:val="pt-BR"/>
+        </w:rPr>
+        <w:t xml:space="preserve">Vốn bằng </w:t>
+      </w:r>
+      <w:r>
+        <w:rPr>
+          <w:rFonts w:ascii="Times New Roman" w:eastAsia="Times New Roman" w:hAnsi="Times New Roman" w:cs="Times New Roman"/>
+          <w:sz w:val="26"/>
+          <w:szCs w:val="28"/>
+          <w:lang w:val="pt-BR"/>
+        </w:rPr>
+        <w:t>sức</w:t>
+      </w:r>
+      <w:r>
+        <w:rPr>
+          <w:rFonts w:ascii="Times New Roman" w:eastAsia="Times New Roman" w:hAnsi="Times New Roman" w:cs="Times New Roman"/>
+          <w:sz w:val="26"/>
+          <w:szCs w:val="28"/>
+          <w:lang w:val="pt-BR"/>
+        </w:rPr>
+        <w:t xml:space="preserve"> lao động] </w:t>
+      </w:r>
+      <w:r>
+        <w:rPr>
+          <w:rFonts w:ascii="Times New Roman" w:eastAsia="Times New Roman" w:hAnsi="Times New Roman" w:cs="Times New Roman"/>
+          <w:sz w:val="26"/>
+          <w:szCs w:val="28"/>
+          <w:lang w:val="pt-BR"/>
+        </w:rPr>
+        <w:t>đồng.</w:t>
       </w:r>
     </w:p>
     <w:p>
@@ -4870,7 +4897,7 @@
           <w:szCs w:val="28"/>
           <w:lang w:val="pt-BR"/>
         </w:rPr>
-        <w:t xml:space="preserve"> Vốn khác: [HĐTD.Vốn bằng tài sản khác] đồng.</w:t>
+        <w:t xml:space="preserve"> Vốn vay TCTD khác: [HĐTD.Vốn vay TCTD khác] đồng.</w:t>
       </w:r>
     </w:p>
     <w:p>
@@ -4880,6 +4907,41 @@
           <w:tab w:val="left" w:leader="dot" w:pos="8647"/>
         </w:tabs>
         <w:spacing w:after="0" w:line="276" w:lineRule="auto"/>
+        <w:ind w:firstLine="851"/>
+        <w:jc w:val="both"/>
+        <w:rPr>
+          <w:rFonts w:ascii="Times New Roman" w:eastAsia="Times New Roman" w:hAnsi="Times New Roman" w:cs="Times New Roman"/>
+          <w:sz w:val="26"/>
+          <w:szCs w:val="28"/>
+          <w:lang w:val="pt-BR"/>
+        </w:rPr>
+      </w:pPr>
+      <w:r>
+        <w:rPr>
+          <w:rFonts w:ascii="Times New Roman" w:eastAsia="Times New Roman" w:hAnsi="Times New Roman" w:cs="Times New Roman"/>
+          <w:sz w:val="26"/>
+          <w:szCs w:val="28"/>
+          <w:lang w:val="pt-BR"/>
+        </w:rPr>
+        <w:t>+</w:t>
+      </w:r>
+      <w:r>
+        <w:rPr>
+          <w:rFonts w:ascii="Times New Roman" w:eastAsia="Times New Roman" w:hAnsi="Times New Roman" w:cs="Times New Roman"/>
+          <w:sz w:val="26"/>
+          <w:szCs w:val="28"/>
+          <w:lang w:val="pt-BR"/>
+        </w:rPr>
+        <w:t xml:space="preserve"> Vốn khác: [HĐTD.Vốn bằng tài sản khác] đồng.</w:t>
+      </w:r>
+    </w:p>
+    <w:p>
+      <w:pPr>
+        <w:shd w:val="clear" w:color="auto" w:fill="FFFFFF"/>
+        <w:tabs>
+          <w:tab w:val="left" w:leader="dot" w:pos="8647"/>
+        </w:tabs>
+        <w:spacing w:after="0" w:line="276" w:lineRule="auto"/>
         <w:ind w:firstLine="567"/>
         <w:jc w:val="both"/>
         <w:rPr>
@@ -5433,6 +5495,7 @@
           <w:sz w:val="26"/>
           <w:szCs w:val="26"/>
         </w:rPr>
+        <w:lastRenderedPageBreak/>
         <w:t>[#TSBD_CHI_TIET]</w:t>
       </w:r>
     </w:p>
@@ -5459,7 +5522,6 @@
           <w:sz w:val="26"/>
           <w:szCs w:val="26"/>
         </w:rPr>
-        <w:lastRenderedPageBreak/>
         <w:t xml:space="preserve">4.[STT]. </w:t>
       </w:r>
       <w:r>
@@ -7166,6 +7228,7 @@
           <w:szCs w:val="26"/>
           <w:lang w:val="fr-FR"/>
         </w:rPr>
+        <w:lastRenderedPageBreak/>
         <w:t>- Bảo đảm cho nghĩa vụ trả nợ của khách hàng là</w:t>
       </w:r>
       <w:r>
@@ -7186,18 +7249,7 @@
           <w:szCs w:val="26"/>
           <w:lang w:val="fr-FR"/>
         </w:rPr>
-        <w:t xml:space="preserve"> [Danh xưng] [Tên khách hàng] và </w:t>
-      </w:r>
-      <w:r>
-        <w:rPr>
-          <w:rFonts w:ascii="Times New Roman" w:eastAsia="Calibri" w:hAnsi="Times New Roman" w:cs="Times New Roman"/>
-          <w:bCs/>
-          <w:sz w:val="26"/>
-          <w:szCs w:val="26"/>
-          <w:lang w:val="fr-FR"/>
-        </w:rPr>
-        <w:lastRenderedPageBreak/>
-        <w:t>[TV.Danh xưng] [TV.Họ và tên] với phạm vi bảo đảm như sau: Tổng dư nợ gốc và số dư bảo lãnh (nếu có) của tất cả các hợp đồng cấp tín dụng ký giữa Agribank [Tên chi nhánh/PGD] và khách hàng là</w:t>
+        <w:t xml:space="preserve"> [Danh xưng] [Tên khách hàng] và [TV.Danh xưng] [TV.Họ và tên] với phạm vi bảo đảm như sau: Tổng dư nợ gốc và số dư bảo lãnh (nếu có) của tất cả các hợp đồng cấp tín dụng ký giữa Agribank [Tên chi nhánh/PGD] và khách hàng là</w:t>
       </w:r>
       <w:r>
         <w:rPr>
@@ -8254,6 +8306,7 @@
           <w:sz w:val="26"/>
           <w:lang w:val="de-DE"/>
         </w:rPr>
+        <w:lastRenderedPageBreak/>
         <w:t xml:space="preserve">+ </w:t>
       </w:r>
       <w:r>
@@ -8318,7 +8371,6 @@
           <w:szCs w:val="28"/>
           <w:lang w:val="de-DE"/>
         </w:rPr>
-        <w:lastRenderedPageBreak/>
         <w:t>2. Đánh giá tính hợp pháp của mục đích sử dụng tiền vay</w:t>
       </w:r>
       <w:r>
@@ -10492,6 +10544,7 @@
           <w:szCs w:val="26"/>
           <w:lang w:val="de-DE"/>
         </w:rPr>
+        <w:lastRenderedPageBreak/>
         <w:t>4. Thẩm định khả năng trả nợ của khách hàng</w:t>
       </w:r>
     </w:p>
@@ -10516,7 +10569,6 @@
           <w:szCs w:val="28"/>
           <w:lang w:val="de-DE"/>
         </w:rPr>
-        <w:lastRenderedPageBreak/>
         <w:t>4.1. Khả năng trả nợ của khách hàng:</w:t>
       </w:r>
     </w:p>
@@ -13450,7 +13502,7 @@
                 <w:color w:val="000000"/>
                 <w:sz w:val="26"/>
               </w:rPr>
-              <w:t>NLQ.TV.S</w:t>
+              <w:t>NLQ.T</w:t>
             </w:r>
             <w:r>
               <w:rPr>
@@ -13459,7 +13511,7 @@
                 <w:sz w:val="26"/>
               </w:rPr>
               <w:lastRenderedPageBreak/>
-              <w:t>TT]</w:t>
+              <w:t>V.STT]</w:t>
             </w:r>
           </w:p>
         </w:tc>
@@ -13920,7 +13972,23 @@
           <w:sz w:val="26"/>
           <w:szCs w:val="28"/>
         </w:rPr>
-        <w:t>- Nhóm nợ của khách hàng trong 36 tháng liền kề thời điểm vay vốn: [HĐTD.Nhóm nợ]</w:t>
+        <w:t>- Nhóm nợ của khách hàng trong 36 tháng liền kề thời điểm vay vốn:</w:t>
+      </w:r>
+      <w:r>
+        <w:rPr>
+          <w:rFonts w:ascii="Times New Roman" w:eastAsia="Times New Roman" w:hAnsi="Times New Roman" w:cs="Times New Roman"/>
+          <w:sz w:val="26"/>
+          <w:szCs w:val="28"/>
+        </w:rPr>
+        <w:t xml:space="preserve"> Nhóm</w:t>
+      </w:r>
+      <w:r>
+        <w:rPr>
+          <w:rFonts w:ascii="Times New Roman" w:eastAsia="Times New Roman" w:hAnsi="Times New Roman" w:cs="Times New Roman"/>
+          <w:sz w:val="26"/>
+          <w:szCs w:val="28"/>
+        </w:rPr>
+        <w:t xml:space="preserve"> [HĐTD.Nhóm nợ]</w:t>
       </w:r>
       <w:r>
         <w:rPr>
@@ -14009,7 +14077,7 @@
           <w:szCs w:val="28"/>
           <w:lang w:val="de-DE"/>
         </w:rPr>
-        <w:t>* Đánh giá việc đáp ứng các tiêu chí khách hàng có tình hình tài chính minh bạch, lành mạnh: [HĐTD.</w:t>
+        <w:t xml:space="preserve">* Đánh giá việc đáp ứng các tiêu chí khách hàng có tình hình tài chính minh bạch, lành mạnh: </w:t>
       </w:r>
       <w:r>
         <w:rPr>
@@ -14018,7 +14086,7 @@
           <w:szCs w:val="28"/>
           <w:lang w:val="de-DE"/>
         </w:rPr>
-        <w:t>Tài chính</w:t>
+        <w:t>Không</w:t>
       </w:r>
       <w:r>
         <w:rPr>
@@ -14027,7 +14095,7 @@
           <w:szCs w:val="28"/>
           <w:lang w:val="de-DE"/>
         </w:rPr>
-        <w:t xml:space="preserve"> minh bạch, </w:t>
+        <w:t xml:space="preserve"> đáp ứng</w:t>
       </w:r>
       <w:r>
         <w:rPr>
@@ -14036,16 +14104,7 @@
           <w:szCs w:val="28"/>
           <w:lang w:val="de-DE"/>
         </w:rPr>
-        <w:t>LM</w:t>
-      </w:r>
-      <w:r>
-        <w:rPr>
-          <w:rFonts w:ascii="Times New Roman" w:eastAsia="Times New Roman" w:hAnsi="Times New Roman" w:cs="Times New Roman"/>
-          <w:sz w:val="26"/>
-          <w:szCs w:val="28"/>
-          <w:lang w:val="de-DE"/>
-        </w:rPr>
-        <w:t>]. Lý do: [HĐTD.Lý do đáp ứng/không đáp ứng TCMBLM]</w:t>
+        <w:t>. Lý do: [HĐTD.Lý do đáp ứng/không đáp ứng TCMBLM]</w:t>
       </w:r>
       <w:r>
         <w:rPr>
@@ -14306,7 +14365,25 @@
           <w:szCs w:val="26"/>
           <w:lang w:val="pt-BR"/>
         </w:rPr>
-        <w:t>[HĐTD.Số tiền vay] đồng, (Bằng chữ: [HĐTD.Bằng chữ]), bao gồm dư nợ từ HĐTD số [PA.Số HĐTD cũ] ngày [PA.Ngày HĐTD cũ] chuyển sang;</w:t>
+        <w:t xml:space="preserve">[HĐTD.Số tiền vay] đồng, (Bằng chữ: [HĐTD.Bằng chữ]), bao gồm dư nợ </w:t>
+      </w:r>
+      <w:r>
+        <w:rPr>
+          <w:rFonts w:ascii="Times New Roman" w:eastAsia="Calibri" w:hAnsi="Times New Roman" w:cs="Times New Roman"/>
+          <w:sz w:val="26"/>
+          <w:szCs w:val="26"/>
+          <w:lang w:val="pt-BR"/>
+        </w:rPr>
+        <w:t>tại</w:t>
+      </w:r>
+      <w:r>
+        <w:rPr>
+          <w:rFonts w:ascii="Times New Roman" w:eastAsia="Calibri" w:hAnsi="Times New Roman" w:cs="Times New Roman"/>
+          <w:sz w:val="26"/>
+          <w:szCs w:val="26"/>
+          <w:lang w:val="pt-BR"/>
+        </w:rPr>
+        <w:t xml:space="preserve"> HĐTD số [PA.Số HĐTD cũ] ngày [PA.Ngày HĐTD cũ] chuyển sang;</w:t>
       </w:r>
     </w:p>
     <w:p>
@@ -14491,7 +14568,25 @@
           <w:szCs w:val="28"/>
           <w:lang w:val="pt-BR"/>
         </w:rPr>
-        <w:t>ất vay: [HĐTD.Lãi suất vay]</w:t>
+        <w:t xml:space="preserve">ất vay: </w:t>
+      </w:r>
+      <w:r>
+        <w:rPr>
+          <w:rFonts w:ascii="Times New Roman" w:eastAsia="Times New Roman" w:hAnsi="Times New Roman" w:cs="Times New Roman"/>
+          <w:sz w:val="26"/>
+          <w:szCs w:val="28"/>
+          <w:lang w:val="pt-BR"/>
+        </w:rPr>
+        <w:t xml:space="preserve">Theo từng Báo cáo đề xuất giải ngân kiêm Giấy nhận nợ. Lãi suất tại thời điểm thẩm định là </w:t>
+      </w:r>
+      <w:r>
+        <w:rPr>
+          <w:rFonts w:ascii="Times New Roman" w:eastAsia="Times New Roman" w:hAnsi="Times New Roman" w:cs="Times New Roman"/>
+          <w:sz w:val="26"/>
+          <w:szCs w:val="28"/>
+          <w:lang w:val="pt-BR"/>
+        </w:rPr>
+        <w:t>[HĐTD.Lãi suất vay]</w:t>
       </w:r>
       <w:r>
         <w:rPr>
@@ -14714,84 +14809,17 @@
           <w:b/>
           <w:sz w:val="26"/>
           <w:szCs w:val="28"/>
-        </w:rPr>
-      </w:pPr>
-    </w:p>
-    <w:p>
-      <w:pPr>
-        <w:shd w:val="clear" w:color="auto" w:fill="FFFFFF"/>
-        <w:tabs>
-          <w:tab w:val="left" w:pos="180"/>
-        </w:tabs>
-        <w:spacing w:after="0" w:line="240" w:lineRule="auto"/>
-        <w:ind w:firstLine="567"/>
-        <w:jc w:val="both"/>
+          <w:lang w:val="vi-VN"/>
+        </w:rPr>
+      </w:pPr>
+      <w:r>
         <w:rPr>
           <w:rFonts w:ascii="Times New Roman" w:eastAsia="Times New Roman" w:hAnsi="Times New Roman" w:cs="Times New Roman"/>
           <w:b/>
           <w:sz w:val="26"/>
           <w:szCs w:val="28"/>
         </w:rPr>
-      </w:pPr>
-    </w:p>
-    <w:p>
-      <w:pPr>
-        <w:shd w:val="clear" w:color="auto" w:fill="FFFFFF"/>
-        <w:tabs>
-          <w:tab w:val="left" w:pos="180"/>
-        </w:tabs>
-        <w:spacing w:after="0" w:line="240" w:lineRule="auto"/>
-        <w:ind w:firstLine="567"/>
-        <w:jc w:val="both"/>
-        <w:rPr>
-          <w:rFonts w:ascii="Times New Roman" w:eastAsia="Times New Roman" w:hAnsi="Times New Roman" w:cs="Times New Roman"/>
-          <w:b/>
-          <w:sz w:val="26"/>
-          <w:szCs w:val="28"/>
-        </w:rPr>
-      </w:pPr>
-    </w:p>
-    <w:p>
-      <w:pPr>
-        <w:shd w:val="clear" w:color="auto" w:fill="FFFFFF"/>
-        <w:tabs>
-          <w:tab w:val="left" w:pos="180"/>
-        </w:tabs>
-        <w:spacing w:after="0" w:line="240" w:lineRule="auto"/>
-        <w:ind w:firstLine="567"/>
-        <w:jc w:val="both"/>
-        <w:rPr>
-          <w:rFonts w:ascii="Times New Roman" w:eastAsia="Times New Roman" w:hAnsi="Times New Roman" w:cs="Times New Roman"/>
-          <w:b/>
-          <w:sz w:val="26"/>
-          <w:szCs w:val="28"/>
-        </w:rPr>
-      </w:pPr>
-    </w:p>
-    <w:p>
-      <w:pPr>
-        <w:shd w:val="clear" w:color="auto" w:fill="FFFFFF"/>
-        <w:tabs>
-          <w:tab w:val="left" w:pos="180"/>
-        </w:tabs>
-        <w:spacing w:after="0" w:line="240" w:lineRule="auto"/>
-        <w:ind w:firstLine="567"/>
-        <w:jc w:val="both"/>
-        <w:rPr>
-          <w:rFonts w:ascii="Times New Roman" w:eastAsia="Times New Roman" w:hAnsi="Times New Roman" w:cs="Times New Roman"/>
-          <w:b/>
-          <w:sz w:val="26"/>
-          <w:szCs w:val="28"/>
-          <w:lang w:val="vi-VN"/>
-        </w:rPr>
-      </w:pPr>
-      <w:r>
-        <w:rPr>
-          <w:rFonts w:ascii="Times New Roman" w:eastAsia="Times New Roman" w:hAnsi="Times New Roman" w:cs="Times New Roman"/>
-          <w:b/>
-          <w:sz w:val="26"/>
-          <w:szCs w:val="28"/>
-        </w:rPr>
+        <w:lastRenderedPageBreak/>
         <w:t>C</w:t>
       </w:r>
       <w:r>
@@ -15035,9 +15063,6 @@
     <w:p>
       <w:pPr>
         <w:shd w:val="clear" w:color="auto" w:fill="FFFFFF"/>
-        <w:tabs>
-          <w:tab w:val="left" w:leader="dot" w:pos="9214"/>
-        </w:tabs>
         <w:spacing w:after="0" w:line="276" w:lineRule="auto"/>
         <w:ind w:firstLine="567"/>
         <w:jc w:val="both"/>
@@ -15055,25 +15080,25 @@
           <w:szCs w:val="28"/>
           <w:lang w:val="pt-BR"/>
         </w:rPr>
-        <w:t xml:space="preserve">- Lãi suất </w:t>
-      </w:r>
-      <w:r>
-        <w:rPr>
-          <w:rFonts w:ascii="Times New Roman" w:eastAsia="Times New Roman" w:hAnsi="Times New Roman" w:cs="Times New Roman"/>
-          <w:sz w:val="26"/>
-          <w:szCs w:val="28"/>
-          <w:lang w:val="pt-BR"/>
-        </w:rPr>
-        <w:t>vay: [HĐTD.Lãi suất vay]</w:t>
-      </w:r>
-      <w:r>
-        <w:rPr>
-          <w:rFonts w:ascii="Times New Roman" w:eastAsia="Times New Roman" w:hAnsi="Times New Roman" w:cs="Times New Roman"/>
-          <w:sz w:val="26"/>
-          <w:szCs w:val="28"/>
-          <w:lang w:val="pt-BR"/>
-        </w:rPr>
-        <w:t>. Lãi suất quá hạn: [HĐTD.Lãi suất quá hạn]. Lãi chậm trả lãi: [HĐTD.Lãi suất chậm trả].</w:t>
+        <w:t xml:space="preserve">- Lãi suất vay: </w:t>
+      </w:r>
+      <w:r>
+        <w:rPr>
+          <w:rFonts w:ascii="Times New Roman" w:eastAsia="Times New Roman" w:hAnsi="Times New Roman" w:cs="Times New Roman"/>
+          <w:sz w:val="26"/>
+          <w:szCs w:val="28"/>
+          <w:lang w:val="pt-BR"/>
+        </w:rPr>
+        <w:t xml:space="preserve">Theo từng Báo cáo đề xuất giải ngân kiêm Giấy nhận nợ. Lãi suất tại thời điểm thẩm định là </w:t>
+      </w:r>
+      <w:r>
+        <w:rPr>
+          <w:rFonts w:ascii="Times New Roman" w:eastAsia="Times New Roman" w:hAnsi="Times New Roman" w:cs="Times New Roman"/>
+          <w:sz w:val="26"/>
+          <w:szCs w:val="28"/>
+          <w:lang w:val="pt-BR"/>
+        </w:rPr>
+        <w:t>[HĐTD.Lãi suất vay]. Lãi suất quá hạn: [HĐTD.Lãi suất quá hạn]. Lãi chậm trả lãi: [HĐTD.Lãi suất chậm trả].</w:t>
       </w:r>
     </w:p>
     <w:p>
@@ -15284,8 +15309,8 @@
     </w:p>
     <w:p/>
     <w:sectPr>
-      <w:headerReference w:type="default" r:id="rId7"/>
-      <w:headerReference w:type="first" r:id="rId8"/>
+      <w:headerReference w:type="default" r:id="rId8"/>
+      <w:headerReference w:type="first" r:id="rId9"/>
       <w:pgSz w:w="11906" w:h="16838" w:code="9"/>
       <w:pgMar w:top="1134" w:right="851" w:bottom="1134" w:left="1418" w:header="567" w:footer="567" w:gutter="0"/>
       <w:cols w:space="720"/>
@@ -18157,4 +18182,16 @@
     </a:ext>
   </a:extLst>
 </a:theme>
+</file>
+
+<file path=customXml/item1.xml><?xml version="1.0" encoding="utf-8"?>
+<b:Sources xmlns:b="http://schemas.openxmlformats.org/officeDocument/2006/bibliography" xmlns="http://schemas.openxmlformats.org/officeDocument/2006/bibliography" SelectedStyle="\APASixthEditionOfficeOnline.xsl" StyleName="APA" Version="6"/>
+</file>
+
+<file path=customXml/itemProps1.xml><?xml version="1.0" encoding="utf-8"?>
+<ds:datastoreItem xmlns:ds="http://schemas.openxmlformats.org/officeDocument/2006/customXml" ds:itemID="{C30D3248-9A5E-4357-968D-4A548B0D4404}">
+  <ds:schemaRefs>
+    <ds:schemaRef ds:uri="http://schemas.openxmlformats.org/officeDocument/2006/bibliography"/>
+  </ds:schemaRefs>
+</ds:datastoreItem>
 </file>
</xml_diff>